<commit_message>
Phase 5: corpus to 74 records; write Sections 5-8, 13-14 with grounded content; add Jweihan/Georgouli late finds; fix cross-format Unicode issues; 23-page clean render
</commit_message>
<xml_diff>
--- a/output/manuscript.docx
+++ b/output/manuscript.docx
@@ -679,25 +679,43 @@
         <w:t xml:space="preserve"> </w:t>
       </w:r>
       <w:r>
-        <w:t xml:space="preserve">network-level decisions. Two very recent contributions come closer to the diagnosis</w:t>
-      </w:r>
-      <w:r>
-        <w:t xml:space="preserve"> </w:t>
-      </w:r>
-      <w:r>
-        <w:t xml:space="preserve">this review develops: Tamagusko and Ferreira name standardisation, interpretability</w:t>
-      </w:r>
-      <w:r>
-        <w:t xml:space="preserve"> </w:t>
-      </w:r>
-      <w:r>
-        <w:t xml:space="preserve">and replicability as open problems specifically for roughness prediction on flexible</w:t>
-      </w:r>
-      <w:r>
-        <w:t xml:space="preserve"> </w:t>
-      </w:r>
-      <w:r>
-        <w:t xml:space="preserve">pavements, and M’harzi Alaoui et al.</w:t>
+        <w:t xml:space="preserve">network-level decisions. Three very recent contributions come closer to the</w:t>
+      </w:r>
+      <w:r>
+        <w:t xml:space="preserve"> </w:t>
+      </w:r>
+      <w:r>
+        <w:t xml:space="preserve">diagnosis this review develops, and each must be distinguished on its own terms</w:t>
+      </w:r>
+      <w:r>
+        <w:t xml:space="preserve"> </w:t>
+      </w:r>
+      <w:r>
+        <w:t xml:space="preserve">rather than folded quietly into a single</w:t>
+      </w:r>
+      <w:r>
+        <w:t xml:space="preserve"> </w:t>
+      </w:r>
+      <w:r>
+        <w:t xml:space="preserve">“gap”</w:t>
+      </w:r>
+      <w:r>
+        <w:t xml:space="preserve"> </w:t>
+      </w:r>
+      <w:r>
+        <w:t xml:space="preserve">claim. Tamagusko and Ferreira name</w:t>
+      </w:r>
+      <w:r>
+        <w:t xml:space="preserve"> </w:t>
+      </w:r>
+      <w:r>
+        <w:t xml:space="preserve">standardisation, interpretability and replicability as open problems specifically</w:t>
+      </w:r>
+      <w:r>
+        <w:t xml:space="preserve"> </w:t>
+      </w:r>
+      <w:r>
+        <w:t xml:space="preserve">for roughness prediction on flexible pavements. M’harzi Alaoui et al.</w:t>
       </w:r>
       <w:r>
         <w:t xml:space="preserve"> </w:t>
@@ -727,49 +745,151 @@
         <w:t xml:space="preserve"> </w:t>
       </w:r>
       <w:r>
-        <w:t xml:space="preserve">and a lab-to-field gap across 180 soil-stabilisation</w:t>
-      </w:r>
-      <w:r>
-        <w:t xml:space="preserve"> </w:t>
-      </w:r>
-      <w:r>
-        <w:t xml:space="preserve">studies. Both are right, and both are confined to a sub-domain and stop short of a</w:t>
-      </w:r>
-      <w:r>
-        <w:t xml:space="preserve"> </w:t>
-      </w:r>
-      <w:r>
-        <w:t xml:space="preserve">per-study coding instrument. What has not been done, in any of this literature, is</w:t>
-      </w:r>
-      <w:r>
-        <w:t xml:space="preserve"> </w:t>
-      </w:r>
-      <w:r>
-        <w:t xml:space="preserve">to (i) define hybridity structurally rather than lexically so that the algorithm-</w:t>
-      </w:r>
-      <w:r>
-        <w:t xml:space="preserve"> </w:t>
-      </w:r>
-      <w:r>
-        <w:t xml:space="preserve">vocabulary studies are not missed, (ii) code a consistent rigour rubric across the</w:t>
-      </w:r>
-      <w:r>
-        <w:t xml:space="preserve"> </w:t>
-      </w:r>
-      <w:r>
-        <w:t xml:space="preserve">full range of pavement sub-domains rather than one at a time, and (iii) convert the</w:t>
-      </w:r>
-      <w:r>
-        <w:t xml:space="preserve"> </w:t>
-      </w:r>
-      <w:r>
-        <w:t xml:space="preserve">resulting evidence into a quantified premium and a reusable reporting instrument.</w:t>
-      </w:r>
-      <w:r>
-        <w:t xml:space="preserve"> </w:t>
-      </w:r>
-      <w:r>
-        <w:t xml:space="preserve">That is the gap this review occupies.</w:t>
+        <w:t xml:space="preserve">and a</w:t>
+      </w:r>
+      <w:r>
+        <w:t xml:space="preserve"> </w:t>
+      </w:r>
+      <w:r>
+        <w:t xml:space="preserve">lab-to-field gap across 180 soil-stabilisation studies. Closest of all, Jweihan</w:t>
+      </w:r>
+      <w:r>
+        <w:t xml:space="preserve"> </w:t>
+      </w:r>
+      <w:r>
+        <w:t xml:space="preserve">(Jweihan, 2026)</w:t>
+      </w:r>
+      <w:r>
+        <w:t xml:space="preserve"> </w:t>
+      </w:r>
+      <w:r>
+        <w:t xml:space="preserve">conducts a PRISMA-ScR scoping review of 163 studies on</w:t>
+      </w:r>
+      <w:r>
+        <w:t xml:space="preserve"> </w:t>
+      </w:r>
+      <w:r>
+        <w:t xml:space="preserve">explainable and interpretable machine learning specifically in asphalt pavement</w:t>
+      </w:r>
+      <w:r>
+        <w:t xml:space="preserve"> </w:t>
+      </w:r>
+      <w:r>
+        <w:t xml:space="preserve">engineering, and proposes a five-layer appraisal framework — data provenance, model</w:t>
+      </w:r>
+      <w:r>
+        <w:t xml:space="preserve"> </w:t>
+      </w:r>
+      <w:r>
+        <w:t xml:space="preserve">performance, explanation quality, physical plausibility, decision utility — that</w:t>
+      </w:r>
+      <w:r>
+        <w:t xml:space="preserve"> </w:t>
+      </w:r>
+      <w:r>
+        <w:t xml:space="preserve">overlaps conceptually with more than one domain of the instrument this review</w:t>
+      </w:r>
+      <w:r>
+        <w:t xml:space="preserve"> </w:t>
+      </w:r>
+      <w:r>
+        <w:t xml:space="preserve">proposes in §10. The honest distinction is not that this territory is unoccupied;</w:t>
+      </w:r>
+      <w:r>
+        <w:t xml:space="preserve"> </w:t>
+      </w:r>
+      <w:r>
+        <w:t xml:space="preserve">it is that Jweihan’s review is organised around explainability as the object of</w:t>
+      </w:r>
+      <w:r>
+        <w:t xml:space="preserve"> </w:t>
+      </w:r>
+      <w:r>
+        <w:t xml:space="preserve">study and conducted at scoping-review depth (breadth of coverage, not per-study</w:t>
+      </w:r>
+      <w:r>
+        <w:t xml:space="preserve"> </w:t>
+      </w:r>
+      <w:r>
+        <w:t xml:space="preserve">methodological coding), whereas the present review is organised around</w:t>
+      </w:r>
+      <w:r>
+        <w:t xml:space="preserve"> </w:t>
+      </w:r>
+      <w:r>
+        <w:t xml:space="preserve">hybridisation — the optimiser-learner coupling itself — as the object of study, uses</w:t>
+      </w:r>
+      <w:r>
+        <w:t xml:space="preserve"> </w:t>
+      </w:r>
+      <w:r>
+        <w:t xml:space="preserve">a full systematic protocol with per-study rigour coding (leakage risk, external</w:t>
+      </w:r>
+      <w:r>
+        <w:t xml:space="preserve"> </w:t>
+      </w:r>
+      <w:r>
+        <w:t xml:space="preserve">validation, baseline strength, search-budget parity), and reports the coded audit</w:t>
+      </w:r>
+      <w:r>
+        <w:t xml:space="preserve"> </w:t>
+      </w:r>
+      <w:r>
+        <w:t xml:space="preserve">as a quantified premium rather than as a coverage synthesis. Interpretability is one</w:t>
+      </w:r>
+      <w:r>
+        <w:t xml:space="preserve"> </w:t>
+      </w:r>
+      <w:r>
+        <w:t xml:space="preserve">of several PAVE-ML domains in this review, not its organising question; the two</w:t>
+      </w:r>
+      <w:r>
+        <w:t xml:space="preserve"> </w:t>
+      </w:r>
+      <w:r>
+        <w:t xml:space="preserve">instruments are complementary rather than competing, and §10 states explicitly</w:t>
+      </w:r>
+      <w:r>
+        <w:t xml:space="preserve"> </w:t>
+      </w:r>
+      <w:r>
+        <w:t xml:space="preserve">where PAVE-ML’s interpretability items and Jweihan’s five-layer framework agree and</w:t>
+      </w:r>
+      <w:r>
+        <w:t xml:space="preserve"> </w:t>
+      </w:r>
+      <w:r>
+        <w:t xml:space="preserve">where they diverge. What none of these three contributions does — and what remains</w:t>
+      </w:r>
+      <w:r>
+        <w:t xml:space="preserve"> </w:t>
+      </w:r>
+      <w:r>
+        <w:t xml:space="preserve">this review’s distinguishing claim — is define hybridity structurally rather than</w:t>
+      </w:r>
+      <w:r>
+        <w:t xml:space="preserve"> </w:t>
+      </w:r>
+      <w:r>
+        <w:t xml:space="preserve">lexically so that algorithm-vocabulary studies are not missed, code a consistent</w:t>
+      </w:r>
+      <w:r>
+        <w:t xml:space="preserve"> </w:t>
+      </w:r>
+      <w:r>
+        <w:t xml:space="preserve">rigour rubric across the full range of pavement sub-domains rather than one at a</w:t>
+      </w:r>
+      <w:r>
+        <w:t xml:space="preserve"> </w:t>
+      </w:r>
+      <w:r>
+        <w:t xml:space="preserve">time, and convert the resulting evidence into a quantified premium and a reusable</w:t>
+      </w:r>
+      <w:r>
+        <w:t xml:space="preserve"> </w:t>
+      </w:r>
+      <w:r>
+        <w:t xml:space="preserve">reporting instrument built around that specific construct.</w:t>
       </w:r>
     </w:p>
     <w:tbl>
@@ -794,7 +914,7 @@
             <w:r>
               <w:drawing>
                 <wp:inline>
-                  <wp:extent cx="5334000" cy="2728745"/>
+                  <wp:extent cx="5334000" cy="2728066"/>
                   <wp:effectExtent b="0" l="0" r="0" t="0"/>
                   <wp:docPr descr="" title="" id="10" name="Picture"/>
                   <a:graphic>
@@ -815,7 +935,7 @@
                         <pic:spPr bwMode="auto">
                           <a:xfrm>
                             <a:off x="0" y="0"/>
-                            <a:ext cx="5334000" cy="2728745"/>
+                            <a:ext cx="5334000" cy="2728066"/>
                           </a:xfrm>
                           <a:prstGeom prst="rect">
                             <a:avLst/>
@@ -1189,7 +1309,7 @@
         <w:t xml:space="preserve"> </w:t>
       </w:r>
       <w:r>
-        <w:t xml:space="preserve">14 prior reviews listed in</w:t>
+        <w:t xml:space="preserve">15 prior reviews listed in</w:t>
       </w:r>
       <w:r>
         <w:t xml:space="preserve"> </w:t>
@@ -2005,6 +2125,56 @@
                 </w:p>
               </w:tc>
             </w:tr>
+            <w:tr>
+              <w:tc>
+                <w:tcPr/>
+                <w:p>
+                  <w:pPr>
+                    <w:pStyle w:val="Compact"/>
+                    <w:jc w:val="center"/>
+                  </w:pPr>
+                  <w:r>
+                    <w:t xml:space="preserve">Jweihan</w:t>
+                  </w:r>
+                </w:p>
+              </w:tc>
+              <w:tc>
+                <w:tcPr/>
+                <w:p>
+                  <w:pPr>
+                    <w:pStyle w:val="Compact"/>
+                    <w:jc w:val="center"/>
+                  </w:pPr>
+                  <w:r>
+                    <w:t xml:space="preserve">2026</w:t>
+                  </w:r>
+                </w:p>
+              </w:tc>
+              <w:tc>
+                <w:tcPr/>
+                <w:p>
+                  <w:pPr>
+                    <w:pStyle w:val="Compact"/>
+                    <w:jc w:val="center"/>
+                  </w:pPr>
+                  <w:r>
+                    <w:t xml:space="preserve">Applied System Innovation</w:t>
+                  </w:r>
+                </w:p>
+              </w:tc>
+              <w:tc>
+                <w:tcPr/>
+                <w:p>
+                  <w:pPr>
+                    <w:pStyle w:val="Compact"/>
+                    <w:jc w:val="center"/>
+                  </w:pPr>
+                  <w:r>
+                    <w:t xml:space="preserve">materials/performance-prediction</w:t>
+                  </w:r>
+                </w:p>
+              </w:tc>
+            </w:tr>
           </w:tbl>
           <w:bookmarkEnd w:id="17"/>
           <w:p/>
@@ -2465,7 +2635,7 @@
         <w:pStyle w:val="FirstParagraph"/>
       </w:pPr>
       <w:r>
-        <w:t xml:space="preserve">Of the 56 primary studies coded so far,</w:t>
+        <w:t xml:space="preserve">Of the 59 primary studies coded so far,</w:t>
       </w:r>
       <w:r>
         <w:t xml:space="preserve"> </w:t>
@@ -2500,7 +2670,7 @@
         <w:t xml:space="preserve"> </w:t>
       </w:r>
       <w:r>
-        <w:t xml:space="preserve">of 56 — do not qualify as hybrid under the structural test in</w:t>
+        <w:t xml:space="preserve">of 59 — do not qualify as hybrid under the structural test in</w:t>
       </w:r>
       <w:r>
         <w:t xml:space="preserve"> </w:t>
@@ -2742,10 +2912,10 @@
               <w:tblLook w:firstRow="1" w:lastRow="0" w:firstColumn="0" w:lastColumn="0" w:noHBand="0" w:noVBand="0" w:val="0020"/>
             </w:tblPr>
             <w:tblGrid>
-              <w:gridCol w:w="1980"/>
-              <w:gridCol w:w="1980"/>
-              <w:gridCol w:w="1980"/>
-              <w:gridCol w:w="1980"/>
+              <w:gridCol w:w="475"/>
+              <w:gridCol w:w="1742"/>
+              <w:gridCol w:w="2851"/>
+              <w:gridCol w:w="2851"/>
             </w:tblGrid>
             <w:tr>
               <w:trPr>
@@ -3400,7 +3570,340 @@
         <w:pStyle w:val="FirstParagraph"/>
       </w:pPr>
       <w:r>
-        <w:t xml:space="preserve">PLACEHOLDER.</w:t>
+        <w:t xml:space="preserve">Material-property modelling is the sub-domain where the seed corpus shows the</w:t>
+      </w:r>
+      <w:r>
+        <w:t xml:space="preserve"> </w:t>
+      </w:r>
+      <w:r>
+        <w:t xml:space="preserve">heaviest concentration of H1 (metaheuristic-tuned hyperparameters) and H7</w:t>
+      </w:r>
+      <w:r>
+        <w:t xml:space="preserve"> </w:t>
+      </w:r>
+      <w:r>
+        <w:t xml:space="preserve">(symbolic</w:t>
+      </w:r>
+      <w:r>
+        <w:t xml:space="preserve">numeric) activity, and it is also where the tuned-baseline</w:t>
+      </w:r>
+      <w:r>
+        <w:t xml:space="preserve"> </w:t>
+      </w:r>
+      <w:r>
+        <w:t xml:space="preserve">problem identified in §9 is most visible, because the target properties —</w:t>
+      </w:r>
+      <w:r>
+        <w:t xml:space="preserve"> </w:t>
+      </w:r>
+      <w:r>
+        <w:t xml:space="preserve">resilient modulus, dynamic modulus, unconfined compressive strength, air-void</w:t>
+      </w:r>
+      <w:r>
+        <w:t xml:space="preserve"> </w:t>
+      </w:r>
+      <w:r>
+        <w:t xml:space="preserve">content — are exactly the properties for which competitor mechanistic or empirical</w:t>
+      </w:r>
+      <w:r>
+        <w:t xml:space="preserve"> </w:t>
+      </w:r>
+      <w:r>
+        <w:t xml:space="preserve">models already exist and are routinely, though not universally, available for</w:t>
+      </w:r>
+      <w:r>
+        <w:t xml:space="preserve"> </w:t>
+      </w:r>
+      <w:r>
+        <w:t xml:space="preserve">comparison.</w:t>
+      </w:r>
+    </w:p>
+    <w:p>
+      <w:pPr>
+        <w:pStyle w:val="BodyText"/>
+      </w:pPr>
+      <w:r>
+        <w:t xml:space="preserve">The resilient-modulus literature illustrates both the promise and the recurring</w:t>
+      </w:r>
+      <w:r>
+        <w:t xml:space="preserve"> </w:t>
+      </w:r>
+      <w:r>
+        <w:t xml:space="preserve">weakness. Ghorbani et al.</w:t>
+      </w:r>
+      <w:r>
+        <w:t xml:space="preserve"> </w:t>
+      </w:r>
+      <w:r>
+        <w:t xml:space="preserve">(</w:t>
+      </w:r>
+      <w:r>
+        <w:t xml:space="preserve">Ghorbani et al.</w:t>
+      </w:r>
+      <w:r>
+        <w:t xml:space="preserve">, 2020)</w:t>
+      </w:r>
+      <w:r>
+        <w:t xml:space="preserve"> </w:t>
+      </w:r>
+      <w:r>
+        <w:t xml:space="preserve">fit two related models on the same</w:t>
+      </w:r>
+      <w:r>
+        <w:t xml:space="preserve"> </w:t>
+      </w:r>
+      <w:r>
+        <w:t xml:space="preserve">repeated-load triaxial dataset — a genetic-algorithm-derived symbolic equation and</w:t>
+      </w:r>
+      <w:r>
+        <w:t xml:space="preserve"> </w:t>
+      </w:r>
+      <w:r>
+        <w:t xml:space="preserve">an ANN whose weights the same genetic algorithm sets (H2) — and report the hybrid</w:t>
+      </w:r>
+      <w:r>
+        <w:t xml:space="preserve"> </w:t>
+      </w:r>
+      <w:r>
+        <w:t xml:space="preserve">ANN-GA model as the more accurate of the two, a rare instance in the corpus of a</w:t>
+      </w:r>
+      <w:r>
+        <w:t xml:space="preserve"> </w:t>
+      </w:r>
+      <w:r>
+        <w:t xml:space="preserve">true head-to-head comparison between two hybridisation types on identical data</w:t>
+      </w:r>
+      <w:r>
+        <w:t xml:space="preserve"> </w:t>
+      </w:r>
+      <w:r>
+        <w:t xml:space="preserve">rather than between a hybrid and an unspecified baseline. Azam et al.</w:t>
+      </w:r>
+      <w:r>
+        <w:t xml:space="preserve"> </w:t>
+      </w:r>
+      <w:r>
+        <w:t xml:space="preserve">(</w:t>
+      </w:r>
+      <w:r>
+        <w:t xml:space="preserve">Azam et al.</w:t>
+      </w:r>
+      <w:r>
+        <w:t xml:space="preserve">, 2022)</w:t>
+      </w:r>
+      <w:r>
+        <w:t xml:space="preserve"> </w:t>
+      </w:r>
+      <w:r>
+        <w:t xml:space="preserve">instead compare six swarm-optimised variants of a single base</w:t>
+      </w:r>
+      <w:r>
+        <w:t xml:space="preserve"> </w:t>
+      </w:r>
+      <w:r>
+        <w:t xml:space="preserve">learner (LSSVM) against one another; the top three separate by RMSE values of 6.72,</w:t>
+      </w:r>
+      <w:r>
+        <w:t xml:space="preserve"> </w:t>
+      </w:r>
+      <w:r>
+        <w:t xml:space="preserve">6.78 and 6.79 MPa and R</w:t>
+      </w:r>
+      <w:r>
+        <w:rPr>
+          <w:vertAlign w:val="superscript"/>
+        </w:rPr>
+        <w:t xml:space="preserve">2</w:t>
+      </w:r>
+      <w:r>
+        <w:t xml:space="preserve"> </w:t>
+      </w:r>
+      <w:r>
+        <w:t xml:space="preserve">values of 0.942, 0.940 and 0.940 — a spread well inside</w:t>
+      </w:r>
+      <w:r>
+        <w:t xml:space="preserve"> </w:t>
+      </w:r>
+      <w:r>
+        <w:t xml:space="preserve">what a different random seed would plausibly produce — and none is compared against</w:t>
+      </w:r>
+      <w:r>
+        <w:t xml:space="preserve"> </w:t>
+      </w:r>
+      <w:r>
+        <w:t xml:space="preserve">a conventionally tuned, non-hybrid LSSVM, so no premium is computable from the paper</w:t>
+      </w:r>
+      <w:r>
+        <w:t xml:space="preserve"> </w:t>
+      </w:r>
+      <w:r>
+        <w:t xml:space="preserve">as published (§9). Kaloop et al.</w:t>
+      </w:r>
+      <w:r>
+        <w:t xml:space="preserve"> </w:t>
+      </w:r>
+      <w:r>
+        <w:t xml:space="preserve">(</w:t>
+      </w:r>
+      <w:r>
+        <w:t xml:space="preserve">Kaloop et al.</w:t>
+      </w:r>
+      <w:r>
+        <w:t xml:space="preserve">, 2019)</w:t>
+      </w:r>
+      <w:r>
+        <w:t xml:space="preserve"> </w:t>
+      </w:r>
+      <w:r>
+        <w:t xml:space="preserve">report a similar</w:t>
+      </w:r>
+      <w:r>
+        <w:t xml:space="preserve"> </w:t>
+      </w:r>
+      <w:r>
+        <w:t xml:space="preserve">optimiser-held-constant, learner-varied design (PSO-ANN vs. PSO-ELM vs. kernel-ELM),</w:t>
+      </w:r>
+      <w:r>
+        <w:t xml:space="preserve"> </w:t>
+      </w:r>
+      <w:r>
+        <w:t xml:space="preserve">useful for isolating base-learner choice but not, by itself, for isolating the</w:t>
+      </w:r>
+      <w:r>
+        <w:t xml:space="preserve"> </w:t>
+      </w:r>
+      <w:r>
+        <w:t xml:space="preserve">optimiser’s contribution.</w:t>
+      </w:r>
+    </w:p>
+    <w:p>
+      <w:pPr>
+        <w:pStyle w:val="BodyText"/>
+      </w:pPr>
+      <w:r>
+        <w:t xml:space="preserve">The clearest positive exemplar in this section is not a hybrid at all in the H1–H7</w:t>
+      </w:r>
+      <w:r>
+        <w:t xml:space="preserve"> </w:t>
+      </w:r>
+      <w:r>
+        <w:t xml:space="preserve">sense: Zeiada et al.</w:t>
+      </w:r>
+      <w:r>
+        <w:t xml:space="preserve"> </w:t>
+      </w:r>
+      <w:r>
+        <w:t xml:space="preserve">(</w:t>
+      </w:r>
+      <w:r>
+        <w:t xml:space="preserve">Zeiada et al.</w:t>
+      </w:r>
+      <w:r>
+        <w:t xml:space="preserve">, 2025)</w:t>
+      </w:r>
+      <w:r>
+        <w:t xml:space="preserve"> </w:t>
+      </w:r>
+      <w:r>
+        <w:t xml:space="preserve">individually tune eight learners,</w:t>
+      </w:r>
+      <w:r>
+        <w:t xml:space="preserve"> </w:t>
+      </w:r>
+      <w:r>
+        <w:t xml:space="preserve">including deep architectures, and benchmark every one of them against the Witczak</w:t>
+      </w:r>
+      <w:r>
+        <w:t xml:space="preserve"> </w:t>
+      </w:r>
+      <w:r>
+        <w:t xml:space="preserve">1-40D and Hirsch mechanistic models for dynamic modulus. Under that design, the</w:t>
+      </w:r>
+      <w:r>
+        <w:t xml:space="preserve"> </w:t>
+      </w:r>
+      <w:r>
+        <w:t xml:space="preserve">winner is a tuned bagging ensemble — not a hybrid and not a deep network — which is</w:t>
+      </w:r>
+      <w:r>
+        <w:t xml:space="preserve"> </w:t>
+      </w:r>
+      <w:r>
+        <w:t xml:space="preserve">precisely the finding a hybridisation-premium framework should produce when tuning</w:t>
+      </w:r>
+      <w:r>
+        <w:t xml:space="preserve"> </w:t>
+      </w:r>
+      <w:r>
+        <w:t xml:space="preserve">is held fair across all competitors, and it is the paper this review returns to</w:t>
+      </w:r>
+      <w:r>
+        <w:t xml:space="preserve"> </w:t>
+      </w:r>
+      <w:r>
+        <w:t xml:space="preserve">repeatedly (§1, §9) as the standard the rest of the sub-domain should be read</w:t>
+      </w:r>
+      <w:r>
+        <w:t xml:space="preserve"> </w:t>
+      </w:r>
+      <w:r>
+        <w:t xml:space="preserve">against.</w:t>
+      </w:r>
+    </w:p>
+    <w:p>
+      <w:pPr>
+        <w:pStyle w:val="BodyText"/>
+      </w:pPr>
+      <w:r>
+        <w:t xml:space="preserve">On the symbolic side, Ghanizadeh et al.</w:t>
+      </w:r>
+      <w:r>
+        <w:t xml:space="preserve"> </w:t>
+      </w:r>
+      <w:r>
+        <w:t xml:space="preserve">(</w:t>
+      </w:r>
+      <w:r>
+        <w:t xml:space="preserve">Ghanizadeh et al.</w:t>
+      </w:r>
+      <w:r>
+        <w:t xml:space="preserve">, 2024)</w:t>
+      </w:r>
+      <w:r>
+        <w:t xml:space="preserve"> </w:t>
+      </w:r>
+      <w:r>
+        <w:t xml:space="preserve">fit a</w:t>
+      </w:r>
+      <w:r>
+        <w:t xml:space="preserve"> </w:t>
+      </w:r>
+      <w:r>
+        <w:t xml:space="preserve">TLBO-optimised evolutionary polynomial regression and multi-gene genetic</w:t>
+      </w:r>
+      <w:r>
+        <w:t xml:space="preserve"> </w:t>
+      </w:r>
+      <w:r>
+        <w:t xml:space="preserve">programming model (H7) for asphalt air-void evolution, producing a closed-form,</w:t>
+      </w:r>
+      <w:r>
+        <w:t xml:space="preserve"> </w:t>
+      </w:r>
+      <w:r>
+        <w:t xml:space="preserve">inspectable expression rather than an opaque predictor — a property that recurs as</w:t>
+      </w:r>
+      <w:r>
+        <w:t xml:space="preserve"> </w:t>
+      </w:r>
+      <w:r>
+        <w:t xml:space="preserve">a theme in §10’s discussion of what interpretability should mean for a validated,</w:t>
+      </w:r>
+      <w:r>
+        <w:t xml:space="preserve"> </w:t>
+      </w:r>
+      <w:r>
+        <w:t xml:space="preserve">not merely a post-hoc-explained, model.</w:t>
       </w:r>
     </w:p>
     <w:bookmarkEnd w:id="28"/>
@@ -3418,7 +3921,25 @@
         <w:pStyle w:val="FirstParagraph"/>
       </w:pPr>
       <w:r>
-        <w:t xml:space="preserve">PLACEHOLDER — anchored on back-calculation</w:t>
+        <w:t xml:space="preserve">Structural evaluation and inverse analysis — principally back-calculation of layer</w:t>
+      </w:r>
+      <w:r>
+        <w:t xml:space="preserve"> </w:t>
+      </w:r>
+      <w:r>
+        <w:t xml:space="preserve">moduli from deflection data — is the sub-domain with the strongest example of</w:t>
+      </w:r>
+      <w:r>
+        <w:t xml:space="preserve"> </w:t>
+      </w:r>
+      <w:r>
+        <w:t xml:space="preserve">external validation in the entire seed corpus, and for that reason anchors much of</w:t>
+      </w:r>
+      <w:r>
+        <w:t xml:space="preserve"> </w:t>
+      </w:r>
+      <w:r>
+        <w:t xml:space="preserve">the argument in §11 as well as this section. Elbagalati et al.</w:t>
       </w:r>
       <w:r>
         <w:t xml:space="preserve"> </w:t>
@@ -3430,10 +3951,209 @@
         <w:t xml:space="preserve">Elbagalati et al.</w:t>
       </w:r>
       <w:r>
-        <w:t xml:space="preserve">, 2017; Ghanizadeh et al., 2025, 2020)</w:t>
-      </w:r>
-      <w:r>
-        <w:t xml:space="preserve">.</w:t>
+        <w:t xml:space="preserve">, 2017)</w:t>
+      </w:r>
+      <w:r>
+        <w:t xml:space="preserve"> </w:t>
+      </w:r>
+      <w:r>
+        <w:t xml:space="preserve">train an ANN model on a Louisiana continuous-deflection</w:t>
+      </w:r>
+      <w:r>
+        <w:t xml:space="preserve"> </w:t>
+      </w:r>
+      <w:r>
+        <w:t xml:space="preserve">programme and evaluate it on an independent Minnesota programme; R</w:t>
+      </w:r>
+      <w:r>
+        <w:rPr>
+          <w:vertAlign w:val="superscript"/>
+        </w:rPr>
+        <w:t xml:space="preserve">2</w:t>
+      </w:r>
+      <w:r>
+        <w:t xml:space="preserve"> </w:t>
+      </w:r>
+      <w:r>
+        <w:t xml:space="preserve">falls only</w:t>
+      </w:r>
+      <w:r>
+        <w:t xml:space="preserve"> </w:t>
+      </w:r>
+      <w:r>
+        <w:t xml:space="preserve">from 0.73 to 0.72 across that transfer, which is the benchmark against which the</w:t>
+      </w:r>
+      <w:r>
+        <w:t xml:space="preserve"> </w:t>
+      </w:r>
+      <w:r>
+        <w:t xml:space="preserve">field’s more typical 0.99-on-random-holdout results should be read, and the paper</w:t>
+      </w:r>
+      <w:r>
+        <w:t xml:space="preserve"> </w:t>
+      </w:r>
+      <w:r>
+        <w:t xml:space="preserve">is cited repeatedly in this review precisely because it is the exception rather</w:t>
+      </w:r>
+      <w:r>
+        <w:t xml:space="preserve"> </w:t>
+      </w:r>
+      <w:r>
+        <w:t xml:space="preserve">than the rule.</w:t>
+      </w:r>
+    </w:p>
+    <w:p>
+      <w:pPr>
+        <w:pStyle w:val="BodyText"/>
+      </w:pPr>
+      <w:r>
+        <w:t xml:space="preserve">Ghanizadeh and colleagues’ own back-calculation work traces a coherent five-year arc</w:t>
+      </w:r>
+      <w:r>
+        <w:t xml:space="preserve"> </w:t>
+      </w:r>
+      <w:r>
+        <w:t xml:space="preserve">that this section follows in sequence: an ANN back-calculation model with Garson and</w:t>
+      </w:r>
+      <w:r>
+        <w:t xml:space="preserve"> </w:t>
+      </w:r>
+      <w:r>
+        <w:t xml:space="preserve">connection-weight sensitivity analysis</w:t>
+      </w:r>
+      <w:r>
+        <w:t xml:space="preserve"> </w:t>
+      </w:r>
+      <w:r>
+        <w:t xml:space="preserve">(Ghanizadeh et al., 2020)</w:t>
+      </w:r>
+      <w:r>
+        <w:t xml:space="preserve"> </w:t>
+      </w:r>
+      <w:r>
+        <w:t xml:space="preserve">establishes the</w:t>
+      </w:r>
+      <w:r>
+        <w:t xml:space="preserve"> </w:t>
+      </w:r>
+      <w:r>
+        <w:t xml:space="preserve">baseline single-architecture approach with post-hoc interpretability; METABACKCAL</w:t>
+      </w:r>
+      <w:r>
+        <w:t xml:space="preserve"> </w:t>
+      </w:r>
+      <w:r>
+        <w:t xml:space="preserve">(Ghanizadeh et al., 2025)</w:t>
+      </w:r>
+      <w:r>
+        <w:t xml:space="preserve"> </w:t>
+      </w:r>
+      <w:r>
+        <w:t xml:space="preserve">replaces the neural surrogate with a metaheuristic-driven</w:t>
+      </w:r>
+      <w:r>
+        <w:t xml:space="preserve"> </w:t>
+      </w:r>
+      <w:r>
+        <w:t xml:space="preserve">inverse solver directly (H2, in the sense that the metaheuristic operates on the</w:t>
+      </w:r>
+      <w:r>
+        <w:t xml:space="preserve"> </w:t>
+      </w:r>
+      <w:r>
+        <w:t xml:space="preserve">inverse problem itself rather than on a learned model’s hyperparameters), and is</w:t>
+      </w:r>
+      <w:r>
+        <w:t xml:space="preserve"> </w:t>
+      </w:r>
+      <w:r>
+        <w:t xml:space="preserve">released as a named tool — one of very few entries in the seed corpus with</w:t>
+      </w:r>
+      <w:r>
+        <w:t xml:space="preserve"> </w:t>
+      </w:r>
+      <w:r>
+        <w:t xml:space="preserve">deployment evidence beyond a closed-form equation. Reading the two together sets up</w:t>
+      </w:r>
+      <w:r>
+        <w:t xml:space="preserve"> </w:t>
+      </w:r>
+      <w:r>
+        <w:t xml:space="preserve">a natural question for the completed review: does the metaheuristic-driven solver</w:t>
+      </w:r>
+      <w:r>
+        <w:t xml:space="preserve"> </w:t>
+      </w:r>
+      <w:r>
+        <w:t xml:space="preserve">in the later paper report an accuracy gain over the earlier ANN surrogate under a</w:t>
+      </w:r>
+      <w:r>
+        <w:t xml:space="preserve"> </w:t>
+      </w:r>
+      <w:r>
+        <w:t xml:space="preserve">comparable computational budget, and if so, of what size? That comparison is</w:t>
+      </w:r>
+      <w:r>
+        <w:t xml:space="preserve"> </w:t>
+      </w:r>
+      <w:r>
+        <w:t xml:space="preserve">identified but not yet completed, since it requires a full-text extraction from</w:t>
+      </w:r>
+      <w:r>
+        <w:t xml:space="preserve"> </w:t>
+      </w:r>
+      <w:r>
+        <w:t xml:space="preserve">both papers rather than the abstract-level record currently in the database.</w:t>
+      </w:r>
+    </w:p>
+    <w:p>
+      <w:pPr>
+        <w:pStyle w:val="BodyText"/>
+      </w:pPr>
+      <w:r>
+        <w:t xml:space="preserve">Pasupunuri, Thom and Li</w:t>
+      </w:r>
+      <w:r>
+        <w:t xml:space="preserve"> </w:t>
+      </w:r>
+      <w:r>
+        <w:t xml:space="preserve">(Pasupunuri et al., 2024)</w:t>
+      </w:r>
+      <w:r>
+        <w:t xml:space="preserve"> </w:t>
+      </w:r>
+      <w:r>
+        <w:t xml:space="preserve">supply this review’s clearest H3</w:t>
+      </w:r>
+      <w:r>
+        <w:t xml:space="preserve"> </w:t>
+      </w:r>
+      <w:r>
+        <w:t xml:space="preserve">(physics-informed) exemplar, embedding the MEPDG roughness model itself as the</w:t>
+      </w:r>
+      <w:r>
+        <w:t xml:space="preserve"> </w:t>
+      </w:r>
+      <w:r>
+        <w:t xml:space="preserve">physics-loss term of a PINN for jointed plain concrete pavement roughness — the</w:t>
+      </w:r>
+      <w:r>
+        <w:t xml:space="preserve"> </w:t>
+      </w:r>
+      <w:r>
+        <w:t xml:space="preserve">single clearest published case in the corpus of a mechanics-constrained learner in</w:t>
+      </w:r>
+      <w:r>
+        <w:t xml:space="preserve"> </w:t>
+      </w:r>
+      <w:r>
+        <w:t xml:space="preserve">pavement engineering, and a useful counterpoint to the purely data-driven H1/H2</w:t>
+      </w:r>
+      <w:r>
+        <w:t xml:space="preserve"> </w:t>
+      </w:r>
+      <w:r>
+        <w:t xml:space="preserve">work that dominates the rest of this section.</w:t>
       </w:r>
     </w:p>
     <w:bookmarkEnd w:id="29"/>
@@ -3451,7 +4171,242 @@
         <w:pStyle w:val="FirstParagraph"/>
       </w:pPr>
       <w:r>
-        <w:t xml:space="preserve">PLACEHOLDER.</w:t>
+        <w:t xml:space="preserve">Performance and deterioration prediction — international roughness index, rutting,</w:t>
+      </w:r>
+      <w:r>
+        <w:t xml:space="preserve"> </w:t>
+      </w:r>
+      <w:r>
+        <w:t xml:space="preserve">cracking, faulting, remaining service life — is the sub-domain most heavily</w:t>
+      </w:r>
+      <w:r>
+        <w:t xml:space="preserve"> </w:t>
+      </w:r>
+      <w:r>
+        <w:t xml:space="preserve">dependent on the Long-Term Pavement Performance (LTPP) database in the seed corpus,</w:t>
+      </w:r>
+      <w:r>
+        <w:t xml:space="preserve"> </w:t>
+      </w:r>
+      <w:r>
+        <w:t xml:space="preserve">and correspondingly the sub-domain where the near-duplicate-substrate problem named</w:t>
+      </w:r>
+      <w:r>
+        <w:t xml:space="preserve"> </w:t>
+      </w:r>
+      <w:r>
+        <w:t xml:space="preserve">in the review methodology is most concrete rather than abstract. Two studies by</w:t>
+      </w:r>
+      <w:r>
+        <w:t xml:space="preserve"> </w:t>
+      </w:r>
+      <w:r>
+        <w:t xml:space="preserve">overlapping author teams,</w:t>
+      </w:r>
+      <w:r>
+        <w:t xml:space="preserve"> </w:t>
+      </w:r>
+      <w:r>
+        <w:t xml:space="preserve">Alnaqbi et al. (2025)</w:t>
+      </w:r>
+      <w:r>
+        <w:t xml:space="preserve"> </w:t>
+      </w:r>
+      <w:r>
+        <w:t xml:space="preserve">and a related 2026 gradient-boosting</w:t>
+      </w:r>
+      <w:r>
+        <w:t xml:space="preserve"> </w:t>
+      </w:r>
+      <w:r>
+        <w:t xml:space="preserve">variant, both draw on the same 395-observation, 33-section continuously-reinforced-</w:t>
+      </w:r>
+      <w:r>
+        <w:t xml:space="preserve"> </w:t>
+      </w:r>
+      <w:r>
+        <w:t xml:space="preserve">concrete-pavement LTPP substrate and both report R</w:t>
+      </w:r>
+      <w:r>
+        <w:rPr>
+          <w:vertAlign w:val="superscript"/>
+        </w:rPr>
+        <w:t xml:space="preserve">2</w:t>
+      </w:r>
+      <w:r>
+        <w:t xml:space="preserve"> </w:t>
+      </w:r>
+      <w:r>
+        <w:t xml:space="preserve">above 0.99 under five-fold</w:t>
+      </w:r>
+      <w:r>
+        <w:t xml:space="preserve"> </w:t>
+      </w:r>
+      <w:r>
+        <w:t xml:space="preserve">cross-validation; whether the cross-validation folds respect the 33-section grouping</w:t>
+      </w:r>
+      <w:r>
+        <w:t xml:space="preserve"> </w:t>
+      </w:r>
+      <w:r>
+        <w:t xml:space="preserve">(so that no section contributes records to both the training and test partition</w:t>
+      </w:r>
+      <w:r>
+        <w:t xml:space="preserve"> </w:t>
+      </w:r>
+      <w:r>
+        <w:t xml:space="preserve">within a fold) is the single full-text question that would resolve whether these</w:t>
+      </w:r>
+      <w:r>
+        <w:t xml:space="preserve"> </w:t>
+      </w:r>
+      <w:r>
+        <w:t xml:space="preserve">results reflect genuine predictive skill or record-level leakage of the kind §2.3</w:t>
+      </w:r>
+      <w:r>
+        <w:t xml:space="preserve"> </w:t>
+      </w:r>
+      <w:r>
+        <w:t xml:space="preserve">and the PAVE-ML leakage-risk rule (§10) are built to detect, and it is flagged</w:t>
+      </w:r>
+      <w:r>
+        <w:t xml:space="preserve"> </w:t>
+      </w:r>
+      <w:r>
+        <w:t xml:space="preserve">explicitly for priority full-text extraction.</w:t>
+      </w:r>
+    </w:p>
+    <w:p>
+      <w:pPr>
+        <w:pStyle w:val="BodyText"/>
+      </w:pPr>
+      <w:r>
+        <w:t xml:space="preserve">Wei et al.</w:t>
+      </w:r>
+      <w:r>
+        <w:t xml:space="preserve"> </w:t>
+      </w:r>
+      <w:r>
+        <w:t xml:space="preserve">(</w:t>
+      </w:r>
+      <w:r>
+        <w:t xml:space="preserve">Wei et al.</w:t>
+      </w:r>
+      <w:r>
+        <w:t xml:space="preserve">, 2023)</w:t>
+      </w:r>
+      <w:r>
+        <w:t xml:space="preserve"> </w:t>
+      </w:r>
+      <w:r>
+        <w:t xml:space="preserve">illustrate the same concern in a different form: a</w:t>
+      </w:r>
+      <w:r>
+        <w:t xml:space="preserve"> </w:t>
+      </w:r>
+      <w:r>
+        <w:t xml:space="preserve">tree-structured Parzen estimator tunes a CatBoost model for rigid-pavement faulting</w:t>
+      </w:r>
+      <w:r>
+        <w:t xml:space="preserve"> </w:t>
+      </w:r>
+      <w:r>
+        <w:t xml:space="preserve">on 160 LTPP observations across 17 candidate variables, with Boruta feature</w:t>
+      </w:r>
+      <w:r>
+        <w:t xml:space="preserve"> </w:t>
+      </w:r>
+      <w:r>
+        <w:t xml:space="preserve">selection applied as a preprocessing step whose position relative to the train/test</w:t>
+      </w:r>
+      <w:r>
+        <w:t xml:space="preserve"> </w:t>
+      </w:r>
+      <w:r>
+        <w:t xml:space="preserve">split is not established from the abstract alone — precisely the ambiguous case the</w:t>
+      </w:r>
+      <w:r>
+        <w:t xml:space="preserve"> </w:t>
+      </w:r>
+      <w:r>
+        <w:t xml:space="preserve">PAVE-ML leakage-risk rule (§10) codes as</w:t>
+      </w:r>
+      <w:r>
+        <w:t xml:space="preserve"> </w:t>
+      </w:r>
+      <w:r>
+        <w:rPr>
+          <w:rStyle w:val="VerbatimChar"/>
+        </w:rPr>
+        <w:t xml:space="preserve">moderate</w:t>
+      </w:r>
+      <w:r>
+        <w:t xml:space="preserve"> </w:t>
+      </w:r>
+      <w:r>
+        <w:t xml:space="preserve">pending full-text confirmation,</w:t>
+      </w:r>
+      <w:r>
+        <w:t xml:space="preserve"> </w:t>
+      </w:r>
+      <w:r>
+        <w:t xml:space="preserve">rather than assumed innocent or guilty by default.</w:t>
+      </w:r>
+    </w:p>
+    <w:p>
+      <w:pPr>
+        <w:pStyle w:val="BodyText"/>
+      </w:pPr>
+      <w:r>
+        <w:t xml:space="preserve">Deng and Shi’s practitioner-facing review of rutting models</w:t>
+      </w:r>
+      <w:r>
+        <w:t xml:space="preserve"> </w:t>
+      </w:r>
+      <w:r>
+        <w:t xml:space="preserve">(Deng and Shi, 2023)</w:t>
+      </w:r>
+      <w:r>
+        <w:t xml:space="preserve"> </w:t>
+      </w:r>
+      <w:r>
+        <w:t xml:space="preserve">adds</w:t>
+      </w:r>
+      <w:r>
+        <w:t xml:space="preserve"> </w:t>
+      </w:r>
+      <w:r>
+        <w:t xml:space="preserve">a data point this review’s own audit cannot generate on its own: a survey of which</w:t>
+      </w:r>
+      <w:r>
+        <w:t xml:space="preserve"> </w:t>
+      </w:r>
+      <w:r>
+        <w:t xml:space="preserve">rutting-prediction models highway agencies actually report using in practice. That</w:t>
+      </w:r>
+      <w:r>
+        <w:t xml:space="preserve"> </w:t>
+      </w:r>
+      <w:r>
+        <w:t xml:space="preserve">detail belongs with the deployment-evidence discussion in §9 and §10 as one of the</w:t>
+      </w:r>
+      <w:r>
+        <w:t xml:space="preserve"> </w:t>
+      </w:r>
+      <w:r>
+        <w:t xml:space="preserve">only direct looks, anywhere in the surrounding literature, at the demand side of</w:t>
+      </w:r>
+      <w:r>
+        <w:t xml:space="preserve"> </w:t>
+      </w:r>
+      <w:r>
+        <w:t xml:space="preserve">the deployment gap this review otherwise infers only from what published papers do</w:t>
+      </w:r>
+      <w:r>
+        <w:t xml:space="preserve"> </w:t>
+      </w:r>
+      <w:r>
+        <w:t xml:space="preserve">not report.</w:t>
       </w:r>
     </w:p>
     <w:bookmarkEnd w:id="30"/>
@@ -3469,37 +4424,387 @@
         <w:pStyle w:val="FirstParagraph"/>
       </w:pPr>
       <w:r>
-        <w:t xml:space="preserve">PLACEHOLDER —</w:t>
-      </w:r>
-      <w:r>
-        <w:t xml:space="preserve"> </w:t>
-      </w:r>
-      <w:r>
-        <w:t xml:space="preserve">Pasupunuri et al. (2024)</w:t>
-      </w:r>
-      <w:r>
-        <w:t xml:space="preserve"> </w:t>
-      </w:r>
-      <w:r>
-        <w:t xml:space="preserve">for the physics-informed case;</w:t>
-      </w:r>
-      <w:r>
-        <w:t xml:space="preserve"> </w:t>
+        <w:t xml:space="preserve">The five hybridisation types beyond direct metaheuristic-hyperparameter coupling</w:t>
+      </w:r>
+      <w:r>
+        <w:t xml:space="preserve"> </w:t>
+      </w:r>
+      <w:r>
+        <w:t xml:space="preserve">(H3</w:t>
+      </w:r>
+      <w:r>
+        <w:t xml:space="preserve">H7) are less numerous in the seed corpus than H1, but each supplies</w:t>
+      </w:r>
+      <w:r>
+        <w:t xml:space="preserve"> </w:t>
+      </w:r>
+      <w:r>
+        <w:t xml:space="preserve">at least one clear exemplar worth setting out in detail because each illustrates a</w:t>
+      </w:r>
+      <w:r>
+        <w:t xml:space="preserve"> </w:t>
+      </w:r>
+      <w:r>
+        <w:t xml:space="preserve">distinct failure mode that a reader unfamiliar with the taxonomy in §4 would not</w:t>
+      </w:r>
+      <w:r>
+        <w:t xml:space="preserve"> </w:t>
+      </w:r>
+      <w:r>
+        <w:t xml:space="preserve">otherwise anticipate.</w:t>
+      </w:r>
+    </w:p>
+    <w:p>
+      <w:pPr>
+        <w:pStyle w:val="BodyText"/>
+      </w:pPr>
+      <w:r>
+        <w:rPr>
+          <w:b/>
+          <w:bCs/>
+        </w:rPr>
+        <w:t xml:space="preserve">H4, architecture fusion</w:t>
+      </w:r>
+      <w:r>
+        <w:t xml:space="preserve">, is best represented in the seed corpus by three vision</w:t>
+      </w:r>
+      <w:r>
+        <w:t xml:space="preserve"> </w:t>
+      </w:r>
+      <w:r>
+        <w:t xml:space="preserve">studies. Sun et al.’s PCDETR</w:t>
+      </w:r>
+      <w:r>
+        <w:t xml:space="preserve"> </w:t>
+      </w:r>
+      <w:r>
+        <w:t xml:space="preserve">(</w:t>
+      </w:r>
+      <w:r>
+        <w:t xml:space="preserve">Sun et al.</w:t>
+      </w:r>
+      <w:r>
+        <w:t xml:space="preserve">, 2023)</w:t>
+      </w:r>
+      <w:r>
+        <w:t xml:space="preserve"> </w:t>
+      </w:r>
+      <w:r>
+        <w:t xml:space="preserve">fuses a Swin-Transformer and a</w:t>
+      </w:r>
+      <w:r>
+        <w:t xml:space="preserve"> </w:t>
+      </w:r>
+      <w:r>
+        <w:t xml:space="preserve">ResNet backbone for pavement crack detection and reports near-identical average</w:t>
+      </w:r>
+      <w:r>
+        <w:t xml:space="preserve"> </w:t>
+      </w:r>
+      <w:r>
+        <w:t xml:space="preserve">precision on the authors’ own dataset and on COCO (45.6% vs. 45.8%) — a similarity</w:t>
+      </w:r>
+      <w:r>
+        <w:t xml:space="preserve"> </w:t>
+      </w:r>
+      <w:r>
+        <w:t xml:space="preserve">close enough across two very different image domains to warrant scrutiny rather</w:t>
+      </w:r>
+      <w:r>
+        <w:t xml:space="preserve"> </w:t>
+      </w:r>
+      <w:r>
+        <w:t xml:space="preserve">than to be read at face value as evidence of robust transfer. Alshawabkeh et al.</w:t>
+      </w:r>
+      <w:r>
+        <w:t xml:space="preserve"> </w:t>
+      </w:r>
+      <w:r>
+        <w:t xml:space="preserve">(</w:t>
+      </w:r>
+      <w:r>
+        <w:t xml:space="preserve">Alshawabkeh et al.</w:t>
+      </w:r>
+      <w:r>
+        <w:t xml:space="preserve">, 2023)</w:t>
+      </w:r>
+      <w:r>
+        <w:t xml:space="preserve"> </w:t>
+      </w:r>
+      <w:r>
+        <w:t xml:space="preserve">and Elhariri et al.</w:t>
+      </w:r>
+      <w:r>
+        <w:t xml:space="preserve"> </w:t>
+      </w:r>
+      <w:r>
+        <w:t xml:space="preserve">(Elhariri et al., 2020)</w:t>
+      </w:r>
+      <w:r>
+        <w:t xml:space="preserve"> </w:t>
+      </w:r>
+      <w:r>
+        <w:t xml:space="preserve">both couple</w:t>
+      </w:r>
+      <w:r>
+        <w:t xml:space="preserve"> </w:t>
+      </w:r>
+      <w:r>
+        <w:t xml:space="preserve">deep and hand-crafted feature extraction with a metaheuristic feature-selection</w:t>
+      </w:r>
+      <w:r>
+        <w:t xml:space="preserve"> </w:t>
+      </w:r>
+      <w:r>
+        <w:t xml:space="preserve">stage (jointly H1 and H4 under the taxonomy in §4), and both report a staged,</w:t>
+      </w:r>
+      <w:r>
+        <w:t xml:space="preserve"> </w:t>
+      </w:r>
+      <w:r>
+        <w:t xml:space="preserve">within-paper ablation — deep features alone, then with the added classifier, then</w:t>
+      </w:r>
+      <w:r>
+        <w:t xml:space="preserve"> </w:t>
+      </w:r>
+      <w:r>
+        <w:t xml:space="preserve">with the added optimiser — which is the design §9’s premium construct depends on</w:t>
+      </w:r>
+      <w:r>
+        <w:t xml:space="preserve"> </w:t>
+      </w:r>
+      <w:r>
+        <w:t xml:space="preserve">and which most H1 studies elsewhere in the corpus do not provide.</w:t>
+      </w:r>
+    </w:p>
+    <w:p>
+      <w:pPr>
+        <w:pStyle w:val="BodyText"/>
+      </w:pPr>
+      <w:r>
+        <w:rPr>
+          <w:b/>
+          <w:bCs/>
+        </w:rPr>
+        <w:t xml:space="preserve">H5, heterogeneous stacking</w:t>
+      </w:r>
+      <w:r>
+        <w:t xml:space="preserve">, has one clear positive and one ambiguous exemplar</w:t>
+      </w:r>
+      <w:r>
+        <w:t xml:space="preserve"> </w:t>
+      </w:r>
+      <w:r>
+        <w:t xml:space="preserve">in the corpus, both already introduced in §9: Huang et al.</w:t>
+      </w:r>
+      <w:r>
+        <w:t xml:space="preserve"> </w:t>
+      </w:r>
+      <w:r>
+        <w:t xml:space="preserve">(</w:t>
+      </w:r>
+      <w:r>
+        <w:t xml:space="preserve">Huang et al.</w:t>
+      </w:r>
+      <w:r>
+        <w:t xml:space="preserve">, 2025)</w:t>
+      </w:r>
+      <w:r>
+        <w:t xml:space="preserve"> </w:t>
+      </w:r>
+      <w:r>
+        <w:t xml:space="preserve">train their meta-learner on cross-validated rather than</w:t>
+      </w:r>
+      <w:r>
+        <w:t xml:space="preserve"> </w:t>
+      </w:r>
+      <w:r>
+        <w:t xml:space="preserve">in-fold base-model predictions specifically to avoid leakage, and is cited</w:t>
+      </w:r>
+      <w:r>
+        <w:t xml:space="preserve"> </w:t>
+      </w:r>
+      <w:r>
+        <w:t xml:space="preserve">throughout this review (§9, §10) as the type’s positive case; Yu et al.</w:t>
+      </w:r>
+      <w:r>
+        <w:t xml:space="preserve"> </w:t>
+      </w:r>
+      <w:r>
+        <w:t xml:space="preserve">(</w:t>
+      </w:r>
+      <w:r>
+        <w:t xml:space="preserve">Yu et al.</w:t>
+      </w:r>
+      <w:r>
+        <w:t xml:space="preserve">, 2020)</w:t>
+      </w:r>
+      <w:r>
+        <w:t xml:space="preserve"> </w:t>
+      </w:r>
+      <w:r>
+        <w:t xml:space="preserve">stack five heterogeneous learners for tunnel pavement performance</w:t>
+      </w:r>
+      <w:r>
+        <w:t xml:space="preserve"> </w:t>
+      </w:r>
+      <w:r>
+        <w:t xml:space="preserve">within a digital-twin framework and report strong deployment integration, but</w:t>
+      </w:r>
+      <w:r>
+        <w:t xml:space="preserve"> </w:t>
+      </w:r>
+      <w:r>
+        <w:t xml:space="preserve">without the explicit leakage-avoidance statement that distinguishes Huang et al.’s</w:t>
+      </w:r>
+      <w:r>
+        <w:t xml:space="preserve"> </w:t>
+      </w:r>
+      <w:r>
+        <w:t xml:space="preserve">design.</w:t>
+      </w:r>
+    </w:p>
+    <w:p>
+      <w:pPr>
+        <w:pStyle w:val="BodyText"/>
+      </w:pPr>
+      <w:r>
+        <w:rPr>
+          <w:b/>
+          <w:bCs/>
+        </w:rPr>
+        <w:t xml:space="preserve">H6, decomposition then learn</w:t>
+      </w:r>
+      <w:r>
+        <w:t xml:space="preserve">, is the one taxonomy type with, at the time of</w:t>
+      </w:r>
+      <w:r>
+        <w:t xml:space="preserve"> </w:t>
+      </w:r>
+      <w:r>
+        <w:t xml:space="preserve">writing, no confirmed pavement-specific exemplar in the seed corpus — every</w:t>
+      </w:r>
+      <w:r>
+        <w:t xml:space="preserve"> </w:t>
+      </w:r>
+      <w:r>
+        <w:t xml:space="preserve">wavelet- or VMD-based candidate located in the search so far belongs to an adjacent</w:t>
+      </w:r>
+      <w:r>
+        <w:t xml:space="preserve"> </w:t>
+      </w:r>
+      <w:r>
+        <w:t xml:space="preserve">domain (bridge deflection monitoring, energy-price forecasting) rather than to</w:t>
+      </w:r>
+      <w:r>
+        <w:t xml:space="preserve"> </w:t>
+      </w:r>
+      <w:r>
+        <w:t xml:space="preserve">pavement engineering directly. Its absence is reported here as a finding in its own</w:t>
+      </w:r>
+      <w:r>
+        <w:t xml:space="preserve"> </w:t>
+      </w:r>
+      <w:r>
+        <w:t xml:space="preserve">right, to be confirmed or overturned once the completed harvest is available, rather</w:t>
+      </w:r>
+      <w:r>
+        <w:t xml:space="preserve"> </w:t>
+      </w:r>
+      <w:r>
+        <w:t xml:space="preserve">than silently omitted.</w:t>
+      </w:r>
+    </w:p>
+    <w:p>
+      <w:pPr>
+        <w:pStyle w:val="BodyText"/>
+      </w:pPr>
+      <w:r>
+        <w:rPr>
+          <w:b/>
+          <w:bCs/>
+        </w:rPr>
+        <w:t xml:space="preserve">H3 (physics-informed)</w:t>
+      </w:r>
+      <w:r>
+        <w:t xml:space="preserve"> </w:t>
+      </w:r>
+      <w:r>
+        <w:t xml:space="preserve">and</w:t>
+      </w:r>
+      <w:r>
+        <w:t xml:space="preserve"> </w:t>
+      </w:r>
+      <w:r>
+        <w:rPr>
+          <w:b/>
+          <w:bCs/>
+        </w:rPr>
+        <w:t xml:space="preserve">H7 (symbolic</w:t>
+      </w:r>
+      <w:r>
+        <w:rPr>
+          <w:b/>
+          <w:bCs/>
+        </w:rPr>
+        <w:t xml:space="preserve">numeric)</w:t>
+      </w:r>
+      <w:r>
+        <w:t xml:space="preserve"> </w:t>
+      </w:r>
+      <w:r>
+        <w:t xml:space="preserve">are each</w:t>
+      </w:r>
+      <w:r>
+        <w:t xml:space="preserve"> </w:t>
+      </w:r>
+      <w:r>
+        <w:t xml:space="preserve">introduced in §6 and §5 respectively</w:t>
+      </w:r>
+      <w:r>
+        <w:t xml:space="preserve"> </w:t>
+      </w:r>
+      <w:r>
+        <w:t xml:space="preserve">(</w:t>
       </w:r>
       <w:r>
         <w:t xml:space="preserve">Ghanizadeh et al.</w:t>
       </w:r>
       <w:r>
-        <w:t xml:space="preserve"> </w:t>
-      </w:r>
-      <w:r>
-        <w:t xml:space="preserve">(2024)</w:t>
-      </w:r>
-      <w:r>
-        <w:t xml:space="preserve"> </w:t>
-      </w:r>
-      <w:r>
-        <w:t xml:space="preserve">for the symbolic–numeric case.</w:t>
+        <w:t xml:space="preserve">, 2024;</w:t>
+      </w:r>
+      <w:r>
+        <w:t xml:space="preserve"> </w:t>
+      </w:r>
+      <w:r>
+        <w:t xml:space="preserve">Ghorbani et al.</w:t>
+      </w:r>
+      <w:r>
+        <w:t xml:space="preserve">, 2020; Pasupunuri et al., 2024)</w:t>
+      </w:r>
+      <w:r>
+        <w:t xml:space="preserve"> </w:t>
+      </w:r>
+      <w:r>
+        <w:t xml:space="preserve">and are not repeated here in</w:t>
+      </w:r>
+      <w:r>
+        <w:t xml:space="preserve"> </w:t>
+      </w:r>
+      <w:r>
+        <w:t xml:space="preserve">full; both recur in §10’s discussion of what a validated, mechanically consistent</w:t>
+      </w:r>
+      <w:r>
+        <w:t xml:space="preserve"> </w:t>
+      </w:r>
+      <w:r>
+        <w:t xml:space="preserve">model should be able to claim about its own interpretability that a purely post-hoc</w:t>
+      </w:r>
+      <w:r>
+        <w:t xml:space="preserve"> </w:t>
+      </w:r>
+      <w:r>
+        <w:t xml:space="preserve">explanation of an unvalidated model cannot.</w:t>
       </w:r>
     </w:p>
     <w:bookmarkEnd w:id="31"/>
@@ -4865,7 +6170,19 @@
         <w:pStyle w:val="FirstParagraph"/>
       </w:pPr>
       <w:r>
-        <w:t xml:space="preserve">A premium, once measured, still needs to be worth having. Hosseini and Smadi</w:t>
+        <w:t xml:space="preserve">A premium, once measured, still needs to be worth having. Two studies, from either</w:t>
+      </w:r>
+      <w:r>
+        <w:t xml:space="preserve"> </w:t>
+      </w:r>
+      <w:r>
+        <w:t xml:space="preserve">end of the pavement management hierarchy, supply a yardstick for judging that.</w:t>
+      </w:r>
+      <w:r>
+        <w:t xml:space="preserve"> </w:t>
+      </w:r>
+      <w:r>
+        <w:t xml:space="preserve">Hosseini and Smadi</w:t>
       </w:r>
       <w:r>
         <w:t xml:space="preserve"> </w:t>
@@ -4877,43 +6194,76 @@
         <w:t xml:space="preserve"> </w:t>
       </w:r>
       <w:r>
-        <w:t xml:space="preserve">provide the sharpest available answer to that question,</w:t>
-      </w:r>
-      <w:r>
-        <w:t xml:space="preserve"> </w:t>
-      </w:r>
-      <w:r>
-        <w:t xml:space="preserve">though the paper itself is about prediction error rather than hybridisation as</w:t>
-      </w:r>
-      <w:r>
-        <w:t xml:space="preserve"> </w:t>
-      </w:r>
-      <w:r>
-        <w:t xml:space="preserve">such: injecting 10–90% error into a pavement performance prediction and</w:t>
-      </w:r>
-      <w:r>
-        <w:t xml:space="preserve"> </w:t>
-      </w:r>
-      <w:r>
-        <w:t xml:space="preserve">propagating it through a 20-year network-level maintenance and rehabilitation</w:t>
-      </w:r>
-      <w:r>
-        <w:t xml:space="preserve"> </w:t>
-      </w:r>
-      <w:r>
-        <w:t xml:space="preserve">schedule, they price the resulting treatment-cost consequence directly. That result</w:t>
-      </w:r>
-      <w:r>
-        <w:t xml:space="preserve"> </w:t>
-      </w:r>
-      <w:r>
-        <w:t xml:space="preserve">supplies the yardstick a hybridisation premium should be measured against — not</w:t>
-      </w:r>
-      <w:r>
-        <w:t xml:space="preserve"> </w:t>
-      </w:r>
-      <w:r>
-        <w:t xml:space="preserve">whether</w:t>
+        <w:t xml:space="preserve">work at the network level: injecting</w:t>
+      </w:r>
+      <w:r>
+        <w:t xml:space="preserve"> </w:t>
+      </w:r>
+      <w:r>
+        <w:t xml:space="preserve">10–90% error into a pavement performance prediction and propagating it through a</w:t>
+      </w:r>
+      <w:r>
+        <w:t xml:space="preserve"> </w:t>
+      </w:r>
+      <w:r>
+        <w:t xml:space="preserve">20-year network-level maintenance and rehabilitation schedule, they price the</w:t>
+      </w:r>
+      <w:r>
+        <w:t xml:space="preserve"> </w:t>
+      </w:r>
+      <w:r>
+        <w:t xml:space="preserve">resulting treatment-cost consequence directly. Georgouli, Plati and Loizos</w:t>
+      </w:r>
+      <w:r>
+        <w:t xml:space="preserve"> </w:t>
+      </w:r>
+      <w:r>
+        <w:t xml:space="preserve">(Georgouli et al., 2026)</w:t>
+      </w:r>
+      <w:r>
+        <w:t xml:space="preserve">, newer and at the project level, price the same kind of</w:t>
+      </w:r>
+      <w:r>
+        <w:t xml:space="preserve"> </w:t>
+      </w:r>
+      <w:r>
+        <w:t xml:space="preserve">consequence for a single input rather than a whole prediction: they show that the</w:t>
+      </w:r>
+      <w:r>
+        <w:t xml:space="preserve"> </w:t>
+      </w:r>
+      <w:r>
+        <w:t xml:space="preserve">choice between the NCHRP 1-37A dynamic-modulus model and a locally calibrated</w:t>
+      </w:r>
+      <w:r>
+        <w:t xml:space="preserve"> </w:t>
+      </w:r>
+      <w:r>
+        <w:t xml:space="preserve">alternative propagates through a mechanistic-empirical rutting simulation (3D-Move)</w:t>
+      </w:r>
+      <w:r>
+        <w:t xml:space="preserve"> </w:t>
+      </w:r>
+      <w:r>
+        <w:t xml:space="preserve">into a materially different rutting estimate, with the uncalibrated model</w:t>
+      </w:r>
+      <w:r>
+        <w:t xml:space="preserve"> </w:t>
+      </w:r>
+      <w:r>
+        <w:t xml:space="preserve">systematically overestimating deformation. Read together, the two studies supply a</w:t>
+      </w:r>
+      <w:r>
+        <w:t xml:space="preserve"> </w:t>
+      </w:r>
+      <w:r>
+        <w:t xml:space="preserve">yardstick for a hybridisation premium at both ends of the pavement management</w:t>
+      </w:r>
+      <w:r>
+        <w:t xml:space="preserve"> </w:t>
+      </w:r>
+      <w:r>
+        <w:t xml:space="preserve">hierarchy — not whether</w:t>
       </w:r>
       <w:r>
         <w:t xml:space="preserve"> </w:t>
@@ -4953,19 +6303,25 @@
         <w:t xml:space="preserve"> </w:t>
       </w:r>
       <w:r>
-        <w:t xml:space="preserve">is large enough, at the accuracy level</w:t>
-      </w:r>
-      <w:r>
-        <w:t xml:space="preserve"> </w:t>
-      </w:r>
-      <w:r>
-        <w:t xml:space="preserve">the underlying prediction task already operates at, to change which treatment gets</w:t>
-      </w:r>
-      <w:r>
-        <w:t xml:space="preserve"> </w:t>
-      </w:r>
-      <w:r>
-        <w:t xml:space="preserve">scheduled, or when. A premium of a few hundredths of a unit of R</w:t>
+        <w:t xml:space="preserve">is large enough, at the</w:t>
+      </w:r>
+      <w:r>
+        <w:t xml:space="preserve"> </w:t>
+      </w:r>
+      <w:r>
+        <w:t xml:space="preserve">accuracy level the underlying prediction task already operates at, to change which</w:t>
+      </w:r>
+      <w:r>
+        <w:t xml:space="preserve"> </w:t>
+      </w:r>
+      <w:r>
+        <w:t xml:space="preserve">treatment gets scheduled, when, or how a single input propagates through a</w:t>
+      </w:r>
+      <w:r>
+        <w:t xml:space="preserve"> </w:t>
+      </w:r>
+      <w:r>
+        <w:t xml:space="preserve">downstream design calculation. A premium of a few hundredths of a unit of R</w:t>
       </w:r>
       <w:r>
         <w:rPr>
@@ -4974,13 +6330,13 @@
         <w:t xml:space="preserve">2</w:t>
       </w:r>
       <w:r>
-        <w:t xml:space="preserve">, of the kind</w:t>
-      </w:r>
-      <w:r>
-        <w:t xml:space="preserve"> </w:t>
-      </w:r>
-      <w:r>
-        <w:t xml:space="preserve">several rows in</w:t>
+        <w:t xml:space="preserve">, of</w:t>
+      </w:r>
+      <w:r>
+        <w:t xml:space="preserve"> </w:t>
+      </w:r>
+      <w:r>
+        <w:t xml:space="preserve">the kind several rows in</w:t>
       </w:r>
       <w:r>
         <w:t xml:space="preserve"> </w:t>
@@ -4997,37 +6353,37 @@
         <w:t xml:space="preserve"> </w:t>
       </w:r>
       <w:r>
-        <w:t xml:space="preserve">report or gesture toward, is a strong</w:t>
-      </w:r>
-      <w:r>
-        <w:t xml:space="preserve"> </w:t>
-      </w:r>
-      <w:r>
-        <w:t xml:space="preserve">candidate for being decision-irrelevant by this standard; the completed audit will</w:t>
-      </w:r>
-      <w:r>
-        <w:t xml:space="preserve"> </w:t>
-      </w:r>
-      <w:r>
-        <w:t xml:space="preserve">report, for every study where both a premium and enough contextual detail are</w:t>
-      </w:r>
-      <w:r>
-        <w:t xml:space="preserve"> </w:t>
-      </w:r>
-      <w:r>
-        <w:t xml:space="preserve">available, whether the premium plausibly clears this bar or not. This section will</w:t>
-      </w:r>
-      <w:r>
-        <w:t xml:space="preserve"> </w:t>
-      </w:r>
-      <w:r>
-        <w:t xml:space="preserve">be completed once that judgement can be made study by study rather than asserted</w:t>
-      </w:r>
-      <w:r>
-        <w:t xml:space="preserve"> </w:t>
-      </w:r>
-      <w:r>
-        <w:t xml:space="preserve">in general.</w:t>
+        <w:t xml:space="preserve">report or gesture toward, is a</w:t>
+      </w:r>
+      <w:r>
+        <w:t xml:space="preserve"> </w:t>
+      </w:r>
+      <w:r>
+        <w:t xml:space="preserve">strong candidate for being decision-irrelevant by this standard; the completed</w:t>
+      </w:r>
+      <w:r>
+        <w:t xml:space="preserve"> </w:t>
+      </w:r>
+      <w:r>
+        <w:t xml:space="preserve">audit will report, for every study where both a premium and enough contextual</w:t>
+      </w:r>
+      <w:r>
+        <w:t xml:space="preserve"> </w:t>
+      </w:r>
+      <w:r>
+        <w:t xml:space="preserve">detail are available, whether the premium plausibly clears this bar or not. This</w:t>
+      </w:r>
+      <w:r>
+        <w:t xml:space="preserve"> </w:t>
+      </w:r>
+      <w:r>
+        <w:t xml:space="preserve">section will be completed once that judgement can be made study by study rather</w:t>
+      </w:r>
+      <w:r>
+        <w:t xml:space="preserve"> </w:t>
+      </w:r>
+      <w:r>
+        <w:t xml:space="preserve">than asserted in general.</w:t>
       </w:r>
     </w:p>
     <w:bookmarkEnd w:id="38"/>
@@ -5353,7 +6709,521 @@
         <w:pStyle w:val="FirstParagraph"/>
       </w:pPr>
       <w:r>
-        <w:t xml:space="preserve">PLACEHOLDER.</w:t>
+        <w:t xml:space="preserve">The seed corpus and the taxonomy built from it are sufficient to state a research</w:t>
+      </w:r>
+      <w:r>
+        <w:t xml:space="preserve"> </w:t>
+      </w:r>
+      <w:r>
+        <w:t xml:space="preserve">agenda now, even though the systematic audit that will refine it is not yet</w:t>
+      </w:r>
+      <w:r>
+        <w:t xml:space="preserve"> </w:t>
+      </w:r>
+      <w:r>
+        <w:t xml:space="preserve">complete. Ten directions follow, each stated as a testable question paired with the</w:t>
+      </w:r>
+      <w:r>
+        <w:t xml:space="preserve"> </w:t>
+      </w:r>
+      <w:r>
+        <w:t xml:space="preserve">data and method that would settle it, rather than as a general aspiration.</w:t>
+      </w:r>
+    </w:p>
+    <w:p>
+      <w:pPr>
+        <w:pStyle w:val="Compact"/>
+        <w:numPr>
+          <w:ilvl w:val="0"/>
+          <w:numId w:val="1001"/>
+        </w:numPr>
+      </w:pPr>
+      <w:r>
+        <w:rPr>
+          <w:b/>
+          <w:bCs/>
+        </w:rPr>
+        <w:t xml:space="preserve">The missing baseline.</w:t>
+      </w:r>
+      <w:r>
+        <w:t xml:space="preserve"> </w:t>
+      </w:r>
+      <w:r>
+        <w:t xml:space="preserve">For every H1/H2 study reporting a hybrid model,</w:t>
+      </w:r>
+      <w:r>
+        <w:t xml:space="preserve"> </w:t>
+      </w:r>
+      <w:r>
+        <w:t xml:space="preserve">does the paper also report the same base learner tuned conventionally, on the</w:t>
+      </w:r>
+      <w:r>
+        <w:t xml:space="preserve"> </w:t>
+      </w:r>
+      <w:r>
+        <w:t xml:space="preserve">same partition and metric, under a comparable search budget? §9’s preliminary</w:t>
+      </w:r>
+      <w:r>
+        <w:t xml:space="preserve"> </w:t>
+      </w:r>
+      <w:r>
+        <w:t xml:space="preserve">evidence suggests the answer is usually no; the completed audit will report how</w:t>
+      </w:r>
+      <w:r>
+        <w:t xml:space="preserve"> </w:t>
+      </w:r>
+      <w:r>
+        <w:t xml:space="preserve">often, across the full corpus, not just the five within-paper cases examined</w:t>
+      </w:r>
+      <w:r>
+        <w:t xml:space="preserve"> </w:t>
+      </w:r>
+      <w:r>
+        <w:t xml:space="preserve">so far.</w:t>
+      </w:r>
+    </w:p>
+    <w:p>
+      <w:pPr>
+        <w:pStyle w:val="Compact"/>
+        <w:numPr>
+          <w:ilvl w:val="0"/>
+          <w:numId w:val="1001"/>
+        </w:numPr>
+      </w:pPr>
+      <w:r>
+        <w:rPr>
+          <w:b/>
+          <w:bCs/>
+        </w:rPr>
+        <w:t xml:space="preserve">Search-budget parity.</w:t>
+      </w:r>
+      <w:r>
+        <w:t xml:space="preserve"> </w:t>
+      </w:r>
+      <w:r>
+        <w:t xml:space="preserve">Among H1/H2 studies, what fraction report the number</w:t>
+      </w:r>
+      <w:r>
+        <w:t xml:space="preserve"> </w:t>
+      </w:r>
+      <w:r>
+        <w:t xml:space="preserve">of function evaluations, iterations, or wall-clock time spent tuning the hybrid</w:t>
+      </w:r>
+      <w:r>
+        <w:t xml:space="preserve"> </w:t>
+      </w:r>
+      <w:r>
+        <w:t xml:space="preserve">arm versus the baseline arm? PAVE-ML item 12b is designed to make this</w:t>
+      </w:r>
+      <w:r>
+        <w:t xml:space="preserve"> </w:t>
+      </w:r>
+      <w:r>
+        <w:t xml:space="preserve">answerable at scale.</w:t>
+      </w:r>
+    </w:p>
+    <w:p>
+      <w:pPr>
+        <w:pStyle w:val="Compact"/>
+        <w:numPr>
+          <w:ilvl w:val="0"/>
+          <w:numId w:val="1001"/>
+        </w:numPr>
+      </w:pPr>
+      <w:r>
+        <w:rPr>
+          <w:b/>
+          <w:bCs/>
+        </w:rPr>
+        <w:t xml:space="preserve">Optimiser proliferation versus optimiser value.</w:t>
+      </w:r>
+      <w:r>
+        <w:t xml:space="preserve"> </w:t>
+      </w:r>
+      <w:r>
+        <w:t xml:space="preserve">Dozens of named</w:t>
+      </w:r>
+      <w:r>
+        <w:t xml:space="preserve"> </w:t>
+      </w:r>
+      <w:r>
+        <w:t xml:space="preserve">metaheuristics recur across this literature (§4). Does a newly proposed</w:t>
+      </w:r>
+      <w:r>
+        <w:t xml:space="preserve"> </w:t>
+      </w:r>
+      <w:r>
+        <w:t xml:space="preserve">optimiser outperform two or more established optimisers on the same pavement</w:t>
+      </w:r>
+      <w:r>
+        <w:t xml:space="preserve"> </w:t>
+      </w:r>
+      <w:r>
+        <w:t xml:space="preserve">problem, or only outperform an unspecified or untuned baseline? PAVE-ML item</w:t>
+      </w:r>
+      <w:r>
+        <w:t xml:space="preserve"> </w:t>
+      </w:r>
+      <w:r>
+        <w:t xml:space="preserve">12d targets this directly.</w:t>
+      </w:r>
+    </w:p>
+    <w:p>
+      <w:pPr>
+        <w:pStyle w:val="Compact"/>
+        <w:numPr>
+          <w:ilvl w:val="0"/>
+          <w:numId w:val="1001"/>
+        </w:numPr>
+      </w:pPr>
+      <w:r>
+        <w:rPr>
+          <w:b/>
+          <w:bCs/>
+        </w:rPr>
+        <w:t xml:space="preserve">Section-grouped partitioning for LTPP-derived studies.</w:t>
+      </w:r>
+      <w:r>
+        <w:t xml:space="preserve"> </w:t>
+      </w:r>
+      <w:r>
+        <w:t xml:space="preserve">Several</w:t>
+      </w:r>
+      <w:r>
+        <w:t xml:space="preserve"> </w:t>
+      </w:r>
+      <w:r>
+        <w:t xml:space="preserve">performance-prediction studies share overlapping LTPP substrates (§7). A</w:t>
+      </w:r>
+      <w:r>
+        <w:t xml:space="preserve"> </w:t>
+      </w:r>
+      <w:r>
+        <w:t xml:space="preserve">systematic re-derivation, from the LTPP database directly, of whether published</w:t>
+      </w:r>
+      <w:r>
+        <w:t xml:space="preserve"> </w:t>
+      </w:r>
+      <w:r>
+        <w:t xml:space="preserve">cross-validation folds respect section-level grouping would settle a question</w:t>
+      </w:r>
+      <w:r>
+        <w:t xml:space="preserve"> </w:t>
+      </w:r>
+      <w:r>
+        <w:t xml:space="preserve">the published papers’ abstracts cannot.</w:t>
+      </w:r>
+    </w:p>
+    <w:p>
+      <w:pPr>
+        <w:pStyle w:val="Compact"/>
+        <w:numPr>
+          <w:ilvl w:val="0"/>
+          <w:numId w:val="1001"/>
+        </w:numPr>
+      </w:pPr>
+      <w:r>
+        <w:rPr>
+          <w:b/>
+          <w:bCs/>
+        </w:rPr>
+        <w:t xml:space="preserve">The H6 gap.</w:t>
+      </w:r>
+      <w:r>
+        <w:t xml:space="preserve"> </w:t>
+      </w:r>
+      <w:r>
+        <w:t xml:space="preserve">No pavement-specific decomposition-then-learn (H6) study was</w:t>
+      </w:r>
+      <w:r>
+        <w:t xml:space="preserve"> </w:t>
+      </w:r>
+      <w:r>
+        <w:t xml:space="preserve">located in the seed corpus (§8). Is this a genuine absence in the pavement</w:t>
+      </w:r>
+      <w:r>
+        <w:t xml:space="preserve"> </w:t>
+      </w:r>
+      <w:r>
+        <w:t xml:space="preserve">literature, or an artefact of the search terms used so far? The completed</w:t>
+      </w:r>
+      <w:r>
+        <w:t xml:space="preserve"> </w:t>
+      </w:r>
+      <w:r>
+        <w:t xml:space="preserve">harvest, with its wider algorithm-name coverage, will distinguish the two.</w:t>
+      </w:r>
+    </w:p>
+    <w:p>
+      <w:pPr>
+        <w:pStyle w:val="Compact"/>
+        <w:numPr>
+          <w:ilvl w:val="0"/>
+          <w:numId w:val="1001"/>
+        </w:numPr>
+      </w:pPr>
+      <w:r>
+        <w:rPr>
+          <w:b/>
+          <w:bCs/>
+        </w:rPr>
+        <w:t xml:space="preserve">Physics-informed learning beyond one exemplar.</w:t>
+      </w:r>
+      <w:r>
+        <w:t xml:space="preserve"> </w:t>
+      </w:r>
+      <w:r>
+        <w:t xml:space="preserve">Pasupunuri et al. (2024)</w:t>
+      </w:r>
+      <w:r>
+        <w:t xml:space="preserve"> </w:t>
+      </w:r>
+      <w:r>
+        <w:t xml:space="preserve">is</w:t>
+      </w:r>
+      <w:r>
+        <w:t xml:space="preserve"> </w:t>
+      </w:r>
+      <w:r>
+        <w:t xml:space="preserve">presently the seed corpus’s only clear H3 case. Does the completed harvest find</w:t>
+      </w:r>
+      <w:r>
+        <w:t xml:space="preserve"> </w:t>
+      </w:r>
+      <w:r>
+        <w:t xml:space="preserve">others, and if genuinely few exist, why has physics-constrained learning been</w:t>
+      </w:r>
+      <w:r>
+        <w:t xml:space="preserve"> </w:t>
+      </w:r>
+      <w:r>
+        <w:t xml:space="preserve">adopted so much more slowly in pavement engineering than in adjacent fields</w:t>
+      </w:r>
+      <w:r>
+        <w:t xml:space="preserve"> </w:t>
+      </w:r>
+      <w:r>
+        <w:t xml:space="preserve">such as structural health monitoring?</w:t>
+      </w:r>
+    </w:p>
+    <w:p>
+      <w:pPr>
+        <w:pStyle w:val="Compact"/>
+        <w:numPr>
+          <w:ilvl w:val="0"/>
+          <w:numId w:val="1001"/>
+        </w:numPr>
+      </w:pPr>
+      <w:r>
+        <w:rPr>
+          <w:b/>
+          <w:bCs/>
+        </w:rPr>
+        <w:t xml:space="preserve">Interpretability on validated models only.</w:t>
+      </w:r>
+      <w:r>
+        <w:t xml:space="preserve"> </w:t>
+      </w:r>
+      <w:r>
+        <w:t xml:space="preserve">§10 and §11 argue that a SHAP or</w:t>
+      </w:r>
+      <w:r>
+        <w:t xml:space="preserve"> </w:t>
+      </w:r>
+      <w:r>
+        <w:t xml:space="preserve">Garson decomposition computed on a model with no external validation ranks the</w:t>
+      </w:r>
+      <w:r>
+        <w:t xml:space="preserve"> </w:t>
+      </w:r>
+      <w:r>
+        <w:t xml:space="preserve">structure of the training data rather than the physics of the pavement. What</w:t>
+      </w:r>
+      <w:r>
+        <w:t xml:space="preserve"> </w:t>
+      </w:r>
+      <w:r>
+        <w:t xml:space="preserve">share of the corpus’s interpretability-method studies pair the explanation with</w:t>
+      </w:r>
+      <w:r>
+        <w:t xml:space="preserve"> </w:t>
+      </w:r>
+      <w:r>
+        <w:t xml:space="preserve">a validated model, by the external-validation criterion in §2.3?</w:t>
+      </w:r>
+    </w:p>
+    <w:p>
+      <w:pPr>
+        <w:pStyle w:val="Compact"/>
+        <w:numPr>
+          <w:ilvl w:val="0"/>
+          <w:numId w:val="1001"/>
+        </w:numPr>
+      </w:pPr>
+      <w:r>
+        <w:rPr>
+          <w:b/>
+          <w:bCs/>
+        </w:rPr>
+        <w:t xml:space="preserve">The efficiency dimension of hybridisation.</w:t>
+      </w:r>
+      <w:r>
+        <w:t xml:space="preserve"> </w:t>
+      </w:r>
+      <w:r>
+        <w:t xml:space="preserve">Most studies in this corpus</w:t>
+      </w:r>
+      <w:r>
+        <w:t xml:space="preserve"> </w:t>
+      </w:r>
+      <w:r>
+        <w:t xml:space="preserve">report only accuracy gains.</w:t>
+      </w:r>
+      <w:r>
+        <w:t xml:space="preserve"> </w:t>
+      </w:r>
+      <w:r>
+        <w:t xml:space="preserve">Elhariri et al. (2020)</w:t>
+      </w:r>
+      <w:r>
+        <w:t xml:space="preserve"> </w:t>
+      </w:r>
+      <w:r>
+        <w:t xml:space="preserve">is the seed corpus’s only</w:t>
+      </w:r>
+      <w:r>
+        <w:t xml:space="preserve"> </w:t>
+      </w:r>
+      <w:r>
+        <w:t xml:space="preserve">example reporting a feature-set reduction alongside an accuracy claim. A</w:t>
+      </w:r>
+      <w:r>
+        <w:t xml:space="preserve"> </w:t>
+      </w:r>
+      <w:r>
+        <w:t xml:space="preserve">systematic accounting of computational-cost reporting (PAVE-ML item 19) would</w:t>
+      </w:r>
+      <w:r>
+        <w:t xml:space="preserve"> </w:t>
+      </w:r>
+      <w:r>
+        <w:t xml:space="preserve">establish whether hybridisation’s practical case rests on accuracy, efficiency,</w:t>
+      </w:r>
+      <w:r>
+        <w:t xml:space="preserve"> </w:t>
+      </w:r>
+      <w:r>
+        <w:t xml:space="preserve">or an unexamined mixture of both.</w:t>
+      </w:r>
+    </w:p>
+    <w:p>
+      <w:pPr>
+        <w:pStyle w:val="Compact"/>
+        <w:numPr>
+          <w:ilvl w:val="0"/>
+          <w:numId w:val="1001"/>
+        </w:numPr>
+      </w:pPr>
+      <w:r>
+        <w:rPr>
+          <w:b/>
+          <w:bCs/>
+        </w:rPr>
+        <w:t xml:space="preserve">Deployment evidence as an outcome variable.</w:t>
+      </w:r>
+      <w:r>
+        <w:t xml:space="preserve"> </w:t>
+      </w:r>
+      <w:r>
+        <w:t xml:space="preserve">§9’s deployment-evidence ladder</w:t>
+      </w:r>
+      <w:r>
+        <w:t xml:space="preserve"> </w:t>
+      </w:r>
+      <w:r>
+        <w:t xml:space="preserve">(none through field trial) is, on current evidence, heavily weighted toward its</w:t>
+      </w:r>
+      <w:r>
+        <w:t xml:space="preserve"> </w:t>
+      </w:r>
+      <w:r>
+        <w:t xml:space="preserve">lower rungs. Does deployment evidence correlate with any of the rigour-audit</w:t>
+      </w:r>
+      <w:r>
+        <w:t xml:space="preserve"> </w:t>
+      </w:r>
+      <w:r>
+        <w:t xml:space="preserve">fields — external validation, baseline strength — or are the two independent,</w:t>
+      </w:r>
+      <w:r>
+        <w:t xml:space="preserve"> </w:t>
+      </w:r>
+      <w:r>
+        <w:t xml:space="preserve">which would itself be a notable finding about how this field’s incentives</w:t>
+      </w:r>
+      <w:r>
+        <w:t xml:space="preserve"> </w:t>
+      </w:r>
+      <w:r>
+        <w:t xml:space="preserve">currently operate?</w:t>
+      </w:r>
+    </w:p>
+    <w:p>
+      <w:pPr>
+        <w:pStyle w:val="Compact"/>
+        <w:numPr>
+          <w:ilvl w:val="0"/>
+          <w:numId w:val="1001"/>
+        </w:numPr>
+      </w:pPr>
+      <w:r>
+        <w:rPr>
+          <w:b/>
+          <w:bCs/>
+        </w:rPr>
+        <w:t xml:space="preserve">Replication of the premium construct outside pavement engineering.</w:t>
+      </w:r>
+      <w:r>
+        <w:t xml:space="preserve"> </w:t>
+      </w:r>
+      <w:r>
+        <w:t xml:space="preserve">The</w:t>
+      </w:r>
+      <w:r>
+        <w:t xml:space="preserve"> </w:t>
+      </w:r>
+      <w:r>
+        <w:t xml:space="preserve">tuned-baseline problem this review documents is unlikely to be unique to</w:t>
+      </w:r>
+      <w:r>
+        <w:t xml:space="preserve"> </w:t>
+      </w:r>
+      <w:r>
+        <w:t xml:space="preserve">pavement engineering. A parallel audit in an adjacent data-driven civil</w:t>
+      </w:r>
+      <w:r>
+        <w:t xml:space="preserve"> </w:t>
+      </w:r>
+      <w:r>
+        <w:t xml:space="preserve">engineering literature — concrete mix design, geotechnical site</w:t>
+      </w:r>
+      <w:r>
+        <w:t xml:space="preserve"> </w:t>
+      </w:r>
+      <w:r>
+        <w:t xml:space="preserve">characterisation — would establish whether the pattern is domain-specific or</w:t>
+      </w:r>
+      <w:r>
+        <w:t xml:space="preserve"> </w:t>
+      </w:r>
+      <w:r>
+        <w:t xml:space="preserve">a broader feature of how metaheuristic-learner hybrids are currently reported</w:t>
+      </w:r>
+      <w:r>
+        <w:t xml:space="preserve"> </w:t>
+      </w:r>
+      <w:r>
+        <w:t xml:space="preserve">across civil engineering.</w:t>
       </w:r>
     </w:p>
     <w:bookmarkEnd w:id="40"/>
@@ -5371,7 +7241,234 @@
         <w:pStyle w:val="FirstParagraph"/>
       </w:pPr>
       <w:r>
-        <w:t xml:space="preserve">PLACEHOLDER.</w:t>
+        <w:t xml:space="preserve">Four conclusions follow from the evidence assembled so far.</w:t>
+      </w:r>
+    </w:p>
+    <w:p>
+      <w:pPr>
+        <w:pStyle w:val="BodyText"/>
+      </w:pPr>
+      <w:r>
+        <w:t xml:space="preserve">First, a literature search restricted to the vocabulary of</w:t>
+      </w:r>
+      <w:r>
+        <w:t xml:space="preserve"> </w:t>
+      </w:r>
+      <w:r>
+        <w:t xml:space="preserve">“hybrid”</w:t>
+      </w:r>
+      <w:r>
+        <w:t xml:space="preserve"> </w:t>
+      </w:r>
+      <w:r>
+        <w:t xml:space="preserve">models</w:t>
+      </w:r>
+      <w:r>
+        <w:t xml:space="preserve"> </w:t>
+      </w:r>
+      <w:r>
+        <w:t xml:space="preserve">undercounts this field’s actual hybridisation activity, because a meaningful share</w:t>
+      </w:r>
+      <w:r>
+        <w:t xml:space="preserve"> </w:t>
+      </w:r>
+      <w:r>
+        <w:t xml:space="preserve">of qualifying studies describe themselves through optimiser names, not through the</w:t>
+      </w:r>
+      <w:r>
+        <w:t xml:space="preserve"> </w:t>
+      </w:r>
+      <w:r>
+        <w:t xml:space="preserve">word hybrid itself. The algorithm-driven search protocol in §2 is offered as a</w:t>
+      </w:r>
+      <w:r>
+        <w:t xml:space="preserve"> </w:t>
+      </w:r>
+      <w:r>
+        <w:t xml:space="preserve">partial remedy, and the completed manuscript will report, from the finished</w:t>
+      </w:r>
+      <w:r>
+        <w:t xml:space="preserve"> </w:t>
+      </w:r>
+      <w:r>
+        <w:t xml:space="preserve">harvest, what fraction of the eligible literature a label-only search would have</w:t>
+      </w:r>
+      <w:r>
+        <w:t xml:space="preserve"> </w:t>
+      </w:r>
+      <w:r>
+        <w:t xml:space="preserve">missed.</w:t>
+      </w:r>
+    </w:p>
+    <w:p>
+      <w:pPr>
+        <w:pStyle w:val="BodyText"/>
+      </w:pPr>
+      <w:r>
+        <w:t xml:space="preserve">Second, the taxonomy in §4 shows that</w:t>
+      </w:r>
+      <w:r>
+        <w:t xml:space="preserve"> </w:t>
+      </w:r>
+      <w:r>
+        <w:t xml:space="preserve">“hybrid”</w:t>
+      </w:r>
+      <w:r>
+        <w:t xml:space="preserve"> </w:t>
+      </w:r>
+      <w:r>
+        <w:t xml:space="preserve">currently functions as a single</w:t>
+      </w:r>
+      <w:r>
+        <w:t xml:space="preserve"> </w:t>
+      </w:r>
+      <w:r>
+        <w:t xml:space="preserve">label over at least seven structurally and theoretically distinct couplings, each</w:t>
+      </w:r>
+      <w:r>
+        <w:t xml:space="preserve"> </w:t>
+      </w:r>
+      <w:r>
+        <w:t xml:space="preserve">with its own characteristic failure mode. Collapsing them, as the field’s current</w:t>
+      </w:r>
+      <w:r>
+        <w:t xml:space="preserve"> </w:t>
+      </w:r>
+      <w:r>
+        <w:t xml:space="preserve">vocabulary does, obscures exactly the distinctions — between a metaheuristic</w:t>
+      </w:r>
+      <w:r>
+        <w:t xml:space="preserve"> </w:t>
+      </w:r>
+      <w:r>
+        <w:t xml:space="preserve">searching hyperparameters and one searching weights, between architecture fusion</w:t>
+      </w:r>
+      <w:r>
+        <w:t xml:space="preserve"> </w:t>
+      </w:r>
+      <w:r>
+        <w:t xml:space="preserve">and heterogeneous stacking — that determine whether a given failure mode is even</w:t>
+      </w:r>
+      <w:r>
+        <w:t xml:space="preserve"> </w:t>
+      </w:r>
+      <w:r>
+        <w:t xml:space="preserve">in principle detectable from what a paper reports.</w:t>
+      </w:r>
+    </w:p>
+    <w:p>
+      <w:pPr>
+        <w:pStyle w:val="BodyText"/>
+      </w:pPr>
+      <w:r>
+        <w:t xml:space="preserve">Third, and most consequentially, the comparison required to state a hybridisation</w:t>
+      </w:r>
+      <w:r>
+        <w:t xml:space="preserve"> </w:t>
+      </w:r>
+      <w:r>
+        <w:t xml:space="preserve">premium — the same base learner, tuned conventionally, on the same data, under a</w:t>
+      </w:r>
+      <w:r>
+        <w:t xml:space="preserve"> </w:t>
+      </w:r>
+      <w:r>
+        <w:t xml:space="preserve">comparable budget — is rarely made available by the studies that would need to</w:t>
+      </w:r>
+      <w:r>
+        <w:t xml:space="preserve"> </w:t>
+      </w:r>
+      <w:r>
+        <w:t xml:space="preserve">report it. Of the studies examined closely enough in the seed corpus to test this</w:t>
+      </w:r>
+      <w:r>
+        <w:t xml:space="preserve"> </w:t>
+      </w:r>
+      <w:r>
+        <w:t xml:space="preserve">directly, the missing baseline, not an unfavourable premium, is the dominant</w:t>
+      </w:r>
+      <w:r>
+        <w:t xml:space="preserve"> </w:t>
+      </w:r>
+      <w:r>
+        <w:t xml:space="preserve">pattern (§9). Where the comparison approaches fairness, as in</w:t>
+      </w:r>
+      <w:r>
+        <w:t xml:space="preserve"> </w:t>
+      </w:r>
+      <w:r>
+        <w:t xml:space="preserve">Zeiada et al.</w:t>
+      </w:r>
+      <w:r>
+        <w:t xml:space="preserve"> </w:t>
+      </w:r>
+      <w:r>
+        <w:t xml:space="preserve">(2025)</w:t>
+      </w:r>
+      <w:r>
+        <w:t xml:space="preserve">, the hybrid or deep-architecture advantage narrows or</w:t>
+      </w:r>
+      <w:r>
+        <w:t xml:space="preserve"> </w:t>
+      </w:r>
+      <w:r>
+        <w:t xml:space="preserve">disappears against a properly tuned conventional alternative.</w:t>
+      </w:r>
+    </w:p>
+    <w:p>
+      <w:pPr>
+        <w:pStyle w:val="BodyText"/>
+      </w:pPr>
+      <w:r>
+        <w:t xml:space="preserve">Fourth, the field has the practical means to fix this at essentially no added</w:t>
+      </w:r>
+      <w:r>
+        <w:t xml:space="preserve"> </w:t>
+      </w:r>
+      <w:r>
+        <w:t xml:space="preserve">cost. None of the four hybrid-specific PAVE-ML items (§10) requires new data</w:t>
+      </w:r>
+      <w:r>
+        <w:t xml:space="preserve"> </w:t>
+      </w:r>
+      <w:r>
+        <w:t xml:space="preserve">collection or a new experiment — reporting the base learner’s own tuned</w:t>
+      </w:r>
+      <w:r>
+        <w:t xml:space="preserve"> </w:t>
+      </w:r>
+      <w:r>
+        <w:t xml:space="preserve">performance, the search budget for each arm, the spread across repeated stochastic</w:t>
+      </w:r>
+      <w:r>
+        <w:t xml:space="preserve"> </w:t>
+      </w:r>
+      <w:r>
+        <w:t xml:space="preserve">runs, and a comparison against established optimisers are all computable from runs</w:t>
+      </w:r>
+      <w:r>
+        <w:t xml:space="preserve"> </w:t>
+      </w:r>
+      <w:r>
+        <w:t xml:space="preserve">a study has, in most cases, already performed. The gap this review documents is</w:t>
+      </w:r>
+      <w:r>
+        <w:t xml:space="preserve"> </w:t>
+      </w:r>
+      <w:r>
+        <w:t xml:space="preserve">therefore substantially a reporting gap rather than a capability gap, which is the</w:t>
+      </w:r>
+      <w:r>
+        <w:t xml:space="preserve"> </w:t>
+      </w:r>
+      <w:r>
+        <w:t xml:space="preserve">most optimistic reading available of an otherwise uncomfortable set of findings —</w:t>
+      </w:r>
+      <w:r>
+        <w:t xml:space="preserve"> </w:t>
+      </w:r>
+      <w:r>
+        <w:t xml:space="preserve">and the reading the completed audit is designed to test.</w:t>
       </w:r>
     </w:p>
     <w:bookmarkEnd w:id="41"/>
@@ -5465,7 +7562,7 @@
       </w:r>
     </w:p>
     <w:bookmarkEnd w:id="44"/>
-    <w:bookmarkStart w:id="86" w:name="references"/>
+    <w:bookmarkStart w:id="106" w:name="references"/>
     <w:p>
       <w:pPr>
         <w:pStyle w:val="Heading1"/>
@@ -5474,7 +7571,7 @@
         <w:t xml:space="preserve">References</w:t>
       </w:r>
     </w:p>
-    <w:bookmarkStart w:id="85" w:name="refs"/>
+    <w:bookmarkStart w:id="105" w:name="refs"/>
     <w:bookmarkStart w:id="46" w:name="ref-Alhussan2022pothole"/>
     <w:p>
       <w:pPr>
@@ -5496,12 +7593,57 @@
       </w:hyperlink>
     </w:p>
     <w:bookmarkEnd w:id="46"/>
-    <w:bookmarkStart w:id="48" w:name="ref-Azam2022resilient"/>
+    <w:bookmarkStart w:id="48" w:name="ref-Alnaqbi2025learning"/>
     <w:p>
       <w:pPr>
         <w:pStyle w:val="Bibliography"/>
       </w:pPr>
       <w:r>
+        <w:t xml:space="preserve">Alnaqbi, A., Zeiada, W., Al-Khateeb, G.G., 2025. A hybrid machine learning method of support vector regression with particle swarm optimization for predicting IRI in continuously reinforced concrete pavement. J. Eng. Appl. Sci.</w:t>
+      </w:r>
+      <w:r>
+        <w:t xml:space="preserve"> </w:t>
+      </w:r>
+      <w:hyperlink r:id="rId47">
+        <w:r>
+          <w:rPr>
+            <w:rStyle w:val="Hyperlink"/>
+          </w:rPr>
+          <w:t xml:space="preserve">https://doi.org/10.1186/s44147-025-00706-9</w:t>
+        </w:r>
+      </w:hyperlink>
+    </w:p>
+    <w:bookmarkEnd w:id="48"/>
+    <w:bookmarkStart w:id="50" w:name="ref-Alshawabkeh2023automated"/>
+    <w:p>
+      <w:pPr>
+        <w:pStyle w:val="Bibliography"/>
+      </w:pPr>
+      <w:r>
+        <w:t xml:space="preserve">Alshawabkeh, S., Wu, L., Dong, D., others</w:t>
+      </w:r>
+      <w:r>
+        <w:t xml:space="preserve">, 2023. Automated pavement crack detection using deep feature selection and whale optimization algorithm. Computers, Materials &amp; Continua.</w:t>
+      </w:r>
+      <w:r>
+        <w:t xml:space="preserve"> </w:t>
+      </w:r>
+      <w:hyperlink r:id="rId49">
+        <w:r>
+          <w:rPr>
+            <w:rStyle w:val="Hyperlink"/>
+          </w:rPr>
+          <w:t xml:space="preserve">https://doi.org/10.32604/cmc.2023.042183</w:t>
+        </w:r>
+      </w:hyperlink>
+    </w:p>
+    <w:bookmarkEnd w:id="50"/>
+    <w:bookmarkStart w:id="52" w:name="ref-Azam2022resilient"/>
+    <w:p>
+      <w:pPr>
+        <w:pStyle w:val="Bibliography"/>
+      </w:pPr>
+      <w:r>
         <w:t xml:space="preserve">Azam, A., Bardhan, A., Kaloop, M.R., others</w:t>
       </w:r>
       <w:r>
@@ -5510,7 +7652,7 @@
       <w:r>
         <w:t xml:space="preserve"> </w:t>
       </w:r>
-      <w:hyperlink r:id="rId47">
+      <w:hyperlink r:id="rId51">
         <w:r>
           <w:rPr>
             <w:rStyle w:val="Hyperlink"/>
@@ -5519,8 +7661,8 @@
         </w:r>
       </w:hyperlink>
     </w:p>
-    <w:bookmarkEnd w:id="48"/>
-    <w:bookmarkStart w:id="50" w:name="ref-Cao2020pavement"/>
+    <w:bookmarkEnd w:id="52"/>
+    <w:bookmarkStart w:id="54" w:name="ref-Cao2020pavement"/>
     <w:p>
       <w:pPr>
         <w:pStyle w:val="Bibliography"/>
@@ -5531,7 +7673,7 @@
       <w:r>
         <w:t xml:space="preserve"> </w:t>
       </w:r>
-      <w:hyperlink r:id="rId49">
+      <w:hyperlink r:id="rId53">
         <w:r>
           <w:rPr>
             <w:rStyle w:val="Hyperlink"/>
@@ -5540,13 +7682,34 @@
         </w:r>
       </w:hyperlink>
     </w:p>
-    <w:bookmarkEnd w:id="50"/>
-    <w:bookmarkStart w:id="52" w:name="ref-Elbagalati2017neural"/>
+    <w:bookmarkEnd w:id="54"/>
+    <w:bookmarkStart w:id="56" w:name="ref-Deng2023rutting"/>
     <w:p>
       <w:pPr>
         <w:pStyle w:val="Bibliography"/>
       </w:pPr>
       <w:r>
+        <w:t xml:space="preserve">Deng, Y., Shi, X., 2023. Modeling the rutting performance of asphalt pavements: A review. J. Infrastruct. Preserv. Resil.</w:t>
+      </w:r>
+      <w:r>
+        <w:t xml:space="preserve"> </w:t>
+      </w:r>
+      <w:hyperlink r:id="rId55">
+        <w:r>
+          <w:rPr>
+            <w:rStyle w:val="Hyperlink"/>
+          </w:rPr>
+          <w:t xml:space="preserve">https://doi.org/10.1186/s43065-023-00082-9</w:t>
+        </w:r>
+      </w:hyperlink>
+    </w:p>
+    <w:bookmarkEnd w:id="56"/>
+    <w:bookmarkStart w:id="58" w:name="ref-Elbagalati2017neural"/>
+    <w:p>
+      <w:pPr>
+        <w:pStyle w:val="Bibliography"/>
+      </w:pPr>
+      <w:r>
         <w:t xml:space="preserve">Elbagalati, O., Elseifi, M.A., Gaspard, K., others</w:t>
       </w:r>
       <w:r>
@@ -5555,7 +7718,7 @@
       <w:r>
         <w:t xml:space="preserve"> </w:t>
       </w:r>
-      <w:hyperlink r:id="rId51">
+      <w:hyperlink r:id="rId57">
         <w:r>
           <w:rPr>
             <w:rStyle w:val="Hyperlink"/>
@@ -5564,19 +7727,61 @@
         </w:r>
       </w:hyperlink>
     </w:p>
-    <w:bookmarkEnd w:id="52"/>
-    <w:bookmarkStart w:id="54" w:name="ref-Ghanizadeh2020neural"/>
+    <w:bookmarkEnd w:id="58"/>
+    <w:bookmarkStart w:id="60" w:name="ref-Elhariri2020filter"/>
     <w:p>
       <w:pPr>
         <w:pStyle w:val="Bibliography"/>
       </w:pPr>
       <w:r>
+        <w:t xml:space="preserve">Elhariri, E., El-Bendary, N., Taie, S.A., 2020. Using hybrid filter-wrapper feature selection with multi-objective improved-salp optimization for crack severity recognition. IEEE Access.</w:t>
+      </w:r>
+      <w:r>
+        <w:t xml:space="preserve"> </w:t>
+      </w:r>
+      <w:hyperlink r:id="rId59">
+        <w:r>
+          <w:rPr>
+            <w:rStyle w:val="Hyperlink"/>
+          </w:rPr>
+          <w:t xml:space="preserve">https://doi.org/10.1109/access.2020.2991968</w:t>
+        </w:r>
+      </w:hyperlink>
+    </w:p>
+    <w:bookmarkEnd w:id="60"/>
+    <w:bookmarkStart w:id="62" w:name="ref-Georgouli2026impact"/>
+    <w:p>
+      <w:pPr>
+        <w:pStyle w:val="Bibliography"/>
+      </w:pPr>
+      <w:r>
+        <w:t xml:space="preserve">Georgouli, K., Plati, C., Loizos, A., 2026. Impact of dynamic modulus prediction errors on rutting estimates in sustainable flexible pavements. Infrastructures.</w:t>
+      </w:r>
+      <w:r>
+        <w:t xml:space="preserve"> </w:t>
+      </w:r>
+      <w:hyperlink r:id="rId61">
+        <w:r>
+          <w:rPr>
+            <w:rStyle w:val="Hyperlink"/>
+          </w:rPr>
+          <w:t xml:space="preserve">https://doi.org/10.3390/infrastructures11040127</w:t>
+        </w:r>
+      </w:hyperlink>
+    </w:p>
+    <w:bookmarkEnd w:id="62"/>
+    <w:bookmarkStart w:id="64" w:name="ref-Ghanizadeh2020neural"/>
+    <w:p>
+      <w:pPr>
+        <w:pStyle w:val="Bibliography"/>
+      </w:pPr>
+      <w:r>
         <w:t xml:space="preserve">Ghanizadeh, A.R., Heidarabadizadeh, N., Jalali, F., 2020. Artificial neural network back-calculation of flexible pavements with sensitivity analysis using garson’s and connection weights algorithms. Innov. Infrastruct. Solut.</w:t>
       </w:r>
       <w:r>
         <w:t xml:space="preserve"> </w:t>
       </w:r>
-      <w:hyperlink r:id="rId53">
+      <w:hyperlink r:id="rId63">
         <w:r>
           <w:rPr>
             <w:rStyle w:val="Hyperlink"/>
@@ -5585,8 +7790,8 @@
         </w:r>
       </w:hyperlink>
     </w:p>
-    <w:bookmarkEnd w:id="54"/>
-    <w:bookmarkStart w:id="56" w:name="ref-Ghanizadeh2025metabackcal"/>
+    <w:bookmarkEnd w:id="64"/>
+    <w:bookmarkStart w:id="66" w:name="ref-Ghanizadeh2025metabackcal"/>
     <w:p>
       <w:pPr>
         <w:pStyle w:val="Bibliography"/>
@@ -5597,7 +7802,7 @@
       <w:r>
         <w:t xml:space="preserve"> </w:t>
       </w:r>
-      <w:hyperlink r:id="rId55">
+      <w:hyperlink r:id="rId65">
         <w:r>
           <w:rPr>
             <w:rStyle w:val="Hyperlink"/>
@@ -5606,8 +7811,8 @@
         </w:r>
       </w:hyperlink>
     </w:p>
-    <w:bookmarkEnd w:id="56"/>
-    <w:bookmarkStart w:id="58" w:name="ref-Ghanizadeh2024formulation"/>
+    <w:bookmarkEnd w:id="66"/>
+    <w:bookmarkStart w:id="68" w:name="ref-Ghanizadeh2024formulation"/>
     <w:p>
       <w:pPr>
         <w:pStyle w:val="Bibliography"/>
@@ -5621,7 +7826,7 @@
       <w:r>
         <w:t xml:space="preserve"> </w:t>
       </w:r>
-      <w:hyperlink r:id="rId57">
+      <w:hyperlink r:id="rId67">
         <w:r>
           <w:rPr>
             <w:rStyle w:val="Hyperlink"/>
@@ -5630,8 +7835,8 @@
         </w:r>
       </w:hyperlink>
     </w:p>
-    <w:bookmarkEnd w:id="58"/>
-    <w:bookmarkStart w:id="60" w:name="ref-Ghorbani2020genetic"/>
+    <w:bookmarkEnd w:id="68"/>
+    <w:bookmarkStart w:id="70" w:name="ref-Ghorbani2020genetic"/>
     <w:p>
       <w:pPr>
         <w:pStyle w:val="Bibliography"/>
@@ -5645,7 +7850,7 @@
       <w:r>
         <w:t xml:space="preserve"> </w:t>
       </w:r>
-      <w:hyperlink r:id="rId59">
+      <w:hyperlink r:id="rId69">
         <w:r>
           <w:rPr>
             <w:rStyle w:val="Hyperlink"/>
@@ -5654,8 +7859,8 @@
         </w:r>
       </w:hyperlink>
     </w:p>
-    <w:bookmarkEnd w:id="60"/>
-    <w:bookmarkStart w:id="62" w:name="ref-Gopalakrishnan2018learning"/>
+    <w:bookmarkEnd w:id="70"/>
+    <w:bookmarkStart w:id="72" w:name="ref-Gopalakrishnan2018learning"/>
     <w:p>
       <w:pPr>
         <w:pStyle w:val="Bibliography"/>
@@ -5666,7 +7871,7 @@
       <w:r>
         <w:t xml:space="preserve"> </w:t>
       </w:r>
-      <w:hyperlink r:id="rId61">
+      <w:hyperlink r:id="rId71">
         <w:r>
           <w:rPr>
             <w:rStyle w:val="Hyperlink"/>
@@ -5675,8 +7880,8 @@
         </w:r>
       </w:hyperlink>
     </w:p>
-    <w:bookmarkEnd w:id="62"/>
-    <w:bookmarkStart w:id="64" w:name="ref-Guo2025learning"/>
+    <w:bookmarkEnd w:id="72"/>
+    <w:bookmarkStart w:id="74" w:name="ref-Guo2025learning"/>
     <w:p>
       <w:pPr>
         <w:pStyle w:val="Bibliography"/>
@@ -5690,7 +7895,7 @@
       <w:r>
         <w:t xml:space="preserve"> </w:t>
       </w:r>
-      <w:hyperlink r:id="rId63">
+      <w:hyperlink r:id="rId73">
         <w:r>
           <w:rPr>
             <w:rStyle w:val="Hyperlink"/>
@@ -5699,8 +7904,8 @@
         </w:r>
       </w:hyperlink>
     </w:p>
-    <w:bookmarkEnd w:id="64"/>
-    <w:bookmarkStart w:id="66" w:name="ref-Hanandeh2022introducing"/>
+    <w:bookmarkEnd w:id="74"/>
+    <w:bookmarkStart w:id="76" w:name="ref-Hanandeh2022introducing"/>
     <w:p>
       <w:pPr>
         <w:pStyle w:val="Bibliography"/>
@@ -5711,7 +7916,7 @@
       <w:r>
         <w:t xml:space="preserve"> </w:t>
       </w:r>
-      <w:hyperlink r:id="rId65">
+      <w:hyperlink r:id="rId75">
         <w:r>
           <w:rPr>
             <w:rStyle w:val="Hyperlink"/>
@@ -5720,8 +7925,8 @@
         </w:r>
       </w:hyperlink>
     </w:p>
-    <w:bookmarkEnd w:id="66"/>
-    <w:bookmarkStart w:id="68" w:name="ref-Hosseini2021accuracy"/>
+    <w:bookmarkEnd w:id="76"/>
+    <w:bookmarkStart w:id="78" w:name="ref-Hosseini2021accuracy"/>
     <w:p>
       <w:pPr>
         <w:pStyle w:val="Bibliography"/>
@@ -5732,7 +7937,7 @@
       <w:r>
         <w:t xml:space="preserve"> </w:t>
       </w:r>
-      <w:hyperlink r:id="rId67">
+      <w:hyperlink r:id="rId77">
         <w:r>
           <w:rPr>
             <w:rStyle w:val="Hyperlink"/>
@@ -5741,8 +7946,8 @@
         </w:r>
       </w:hyperlink>
     </w:p>
-    <w:bookmarkEnd w:id="68"/>
-    <w:bookmarkStart w:id="70" w:name="ref-Hou2020state"/>
+    <w:bookmarkEnd w:id="78"/>
+    <w:bookmarkStart w:id="80" w:name="ref-Hou2020state"/>
     <w:p>
       <w:pPr>
         <w:pStyle w:val="Bibliography"/>
@@ -5756,7 +7961,7 @@
       <w:r>
         <w:t xml:space="preserve"> </w:t>
       </w:r>
-      <w:hyperlink r:id="rId69">
+      <w:hyperlink r:id="rId79">
         <w:r>
           <w:rPr>
             <w:rStyle w:val="Hyperlink"/>
@@ -5765,8 +7970,8 @@
         </w:r>
       </w:hyperlink>
     </w:p>
-    <w:bookmarkEnd w:id="70"/>
-    <w:bookmarkStart w:id="72" w:name="ref-Huang2025rheological"/>
+    <w:bookmarkEnd w:id="80"/>
+    <w:bookmarkStart w:id="82" w:name="ref-Huang2025rheological"/>
     <w:p>
       <w:pPr>
         <w:pStyle w:val="Bibliography"/>
@@ -5780,7 +7985,7 @@
       <w:r>
         <w:t xml:space="preserve"> </w:t>
       </w:r>
-      <w:hyperlink r:id="rId71">
+      <w:hyperlink r:id="rId81">
         <w:r>
           <w:rPr>
             <w:rStyle w:val="Hyperlink"/>
@@ -5789,13 +7994,58 @@
         </w:r>
       </w:hyperlink>
     </w:p>
-    <w:bookmarkEnd w:id="72"/>
-    <w:bookmarkStart w:id="74" w:name="ref-Latifi2021reinforcement"/>
+    <w:bookmarkEnd w:id="82"/>
+    <w:bookmarkStart w:id="84" w:name="ref-Jweihan2026trustworthy"/>
     <w:p>
       <w:pPr>
         <w:pStyle w:val="Bibliography"/>
       </w:pPr>
       <w:r>
+        <w:t xml:space="preserve">Jweihan, Y.S., 2026. Trustworthy explainable AI for asphalt pavement engineering: A systematic scoping review of materials, performance, and decision support. Applied System Innovation.</w:t>
+      </w:r>
+      <w:r>
+        <w:t xml:space="preserve"> </w:t>
+      </w:r>
+      <w:hyperlink r:id="rId83">
+        <w:r>
+          <w:rPr>
+            <w:rStyle w:val="Hyperlink"/>
+          </w:rPr>
+          <w:t xml:space="preserve">https://doi.org/10.3390/asi9070133</w:t>
+        </w:r>
+      </w:hyperlink>
+    </w:p>
+    <w:bookmarkEnd w:id="84"/>
+    <w:bookmarkStart w:id="86" w:name="ref-Kaloop2019particle"/>
+    <w:p>
+      <w:pPr>
+        <w:pStyle w:val="Bibliography"/>
+      </w:pPr>
+      <w:r>
+        <w:t xml:space="preserve">Kaloop, M.R., Kumar, D., Samui, P., others</w:t>
+      </w:r>
+      <w:r>
+        <w:t xml:space="preserve">, 2019. Particle swarm optimization algorithm-extreme learning machine (PSO-ELM) model for predicting resilient modulus of stabilized aggregate bases. Applied Sciences.</w:t>
+      </w:r>
+      <w:r>
+        <w:t xml:space="preserve"> </w:t>
+      </w:r>
+      <w:hyperlink r:id="rId85">
+        <w:r>
+          <w:rPr>
+            <w:rStyle w:val="Hyperlink"/>
+          </w:rPr>
+          <w:t xml:space="preserve">https://doi.org/10.3390/app9163221</w:t>
+        </w:r>
+      </w:hyperlink>
+    </w:p>
+    <w:bookmarkEnd w:id="86"/>
+    <w:bookmarkStart w:id="88" w:name="ref-Latifi2021reinforcement"/>
+    <w:p>
+      <w:pPr>
+        <w:pStyle w:val="Bibliography"/>
+      </w:pPr>
+      <w:r>
         <w:t xml:space="preserve">Latifi, M., Golivand Darvishvand, F., Khandel, O., others</w:t>
       </w:r>
       <w:r>
@@ -5804,7 +8054,7 @@
       <w:r>
         <w:t xml:space="preserve"> </w:t>
       </w:r>
-      <w:hyperlink r:id="rId73">
+      <w:hyperlink r:id="rId87">
         <w:r>
           <w:rPr>
             <w:rStyle w:val="Hyperlink"/>
@@ -5813,8 +8063,8 @@
         </w:r>
       </w:hyperlink>
     </w:p>
-    <w:bookmarkEnd w:id="74"/>
-    <w:bookmarkStart w:id="76" w:name="ref-MharziAlaoui2026algorithm"/>
+    <w:bookmarkEnd w:id="88"/>
+    <w:bookmarkStart w:id="90" w:name="ref-MharziAlaoui2026algorithm"/>
     <w:p>
       <w:pPr>
         <w:pStyle w:val="Bibliography"/>
@@ -5828,7 +8078,7 @@
       <w:r>
         <w:t xml:space="preserve"> </w:t>
       </w:r>
-      <w:hyperlink r:id="rId75">
+      <w:hyperlink r:id="rId89">
         <w:r>
           <w:rPr>
             <w:rStyle w:val="Hyperlink"/>
@@ -5837,8 +8087,8 @@
         </w:r>
       </w:hyperlink>
     </w:p>
-    <w:bookmarkEnd w:id="76"/>
-    <w:bookmarkStart w:id="78" w:name="ref-Pasupunuri2024roughness"/>
+    <w:bookmarkEnd w:id="90"/>
+    <w:bookmarkStart w:id="92" w:name="ref-Pasupunuri2024roughness"/>
     <w:p>
       <w:pPr>
         <w:pStyle w:val="Bibliography"/>
@@ -5849,7 +8099,7 @@
       <w:r>
         <w:t xml:space="preserve"> </w:t>
       </w:r>
-      <w:hyperlink r:id="rId77">
+      <w:hyperlink r:id="rId91">
         <w:r>
           <w:rPr>
             <w:rStyle w:val="Hyperlink"/>
@@ -5858,13 +8108,61 @@
         </w:r>
       </w:hyperlink>
     </w:p>
-    <w:bookmarkEnd w:id="78"/>
-    <w:bookmarkStart w:id="80" w:name="ref-Yang2021research"/>
+    <w:bookmarkEnd w:id="92"/>
+    <w:bookmarkStart w:id="94" w:name="ref-Sun2023automatic"/>
     <w:p>
       <w:pPr>
         <w:pStyle w:val="Bibliography"/>
       </w:pPr>
       <w:r>
+        <w:t xml:space="preserve">Sun, Z., Zhai, J., Pei, L., others</w:t>
+      </w:r>
+      <w:r>
+        <w:t xml:space="preserve">, 2023. Automatic pavement crack detection transformer based on convolutional and sequential feature fusion. Sensors.</w:t>
+      </w:r>
+      <w:r>
+        <w:t xml:space="preserve"> </w:t>
+      </w:r>
+      <w:hyperlink r:id="rId93">
+        <w:r>
+          <w:rPr>
+            <w:rStyle w:val="Hyperlink"/>
+          </w:rPr>
+          <w:t xml:space="preserve">https://doi.org/10.3390/s23073772</w:t>
+        </w:r>
+      </w:hyperlink>
+    </w:p>
+    <w:bookmarkEnd w:id="94"/>
+    <w:bookmarkStart w:id="96" w:name="ref-Wei2023optimizing"/>
+    <w:p>
+      <w:pPr>
+        <w:pStyle w:val="Bibliography"/>
+      </w:pPr>
+      <w:r>
+        <w:t xml:space="preserve">Wei, X., Wang, C., Liu, J., others</w:t>
+      </w:r>
+      <w:r>
+        <w:t xml:space="preserve">, 2023. Optimizing faulting prediction for rigid pavements using a hybrid SHAP-TPE-CatBoost model. Applied Sciences.</w:t>
+      </w:r>
+      <w:r>
+        <w:t xml:space="preserve"> </w:t>
+      </w:r>
+      <w:hyperlink r:id="rId95">
+        <w:r>
+          <w:rPr>
+            <w:rStyle w:val="Hyperlink"/>
+          </w:rPr>
+          <w:t xml:space="preserve">https://doi.org/10.3390/app132312862</w:t>
+        </w:r>
+      </w:hyperlink>
+    </w:p>
+    <w:bookmarkEnd w:id="96"/>
+    <w:bookmarkStart w:id="98" w:name="ref-Yang2021research"/>
+    <w:p>
+      <w:pPr>
+        <w:pStyle w:val="Bibliography"/>
+      </w:pPr>
+      <w:r>
         <w:t xml:space="preserve">Yang, X., Guan, J., Ding, L., others</w:t>
       </w:r>
       <w:r>
@@ -5873,7 +8171,7 @@
       <w:r>
         <w:t xml:space="preserve"> </w:t>
       </w:r>
-      <w:hyperlink r:id="rId79">
+      <w:hyperlink r:id="rId97">
         <w:r>
           <w:rPr>
             <w:rStyle w:val="Hyperlink"/>
@@ -5882,8 +8180,8 @@
         </w:r>
       </w:hyperlink>
     </w:p>
-    <w:bookmarkEnd w:id="80"/>
-    <w:bookmarkStart w:id="82" w:name="ref-Yao2022large"/>
+    <w:bookmarkEnd w:id="98"/>
+    <w:bookmarkStart w:id="100" w:name="ref-Yao2022large"/>
     <w:p>
       <w:pPr>
         <w:pStyle w:val="Bibliography"/>
@@ -5897,7 +8195,7 @@
       <w:r>
         <w:t xml:space="preserve"> </w:t>
       </w:r>
-      <w:hyperlink r:id="rId81">
+      <w:hyperlink r:id="rId99">
         <w:r>
           <w:rPr>
             <w:rStyle w:val="Hyperlink"/>
@@ -5906,13 +8204,37 @@
         </w:r>
       </w:hyperlink>
     </w:p>
-    <w:bookmarkEnd w:id="82"/>
-    <w:bookmarkStart w:id="84" w:name="ref-Zeiada2025benchmarking"/>
+    <w:bookmarkEnd w:id="100"/>
+    <w:bookmarkStart w:id="102" w:name="ref-Yu2020highway"/>
     <w:p>
       <w:pPr>
         <w:pStyle w:val="Bibliography"/>
       </w:pPr>
       <w:r>
+        <w:t xml:space="preserve">Yu, G., Zhang, S., Hu, M., others</w:t>
+      </w:r>
+      <w:r>
+        <w:t xml:space="preserve">, 2020. Prediction of highway tunnel pavement performance based on digital twin and multiple time series stacking. Adv. Civ. Eng.</w:t>
+      </w:r>
+      <w:r>
+        <w:t xml:space="preserve"> </w:t>
+      </w:r>
+      <w:hyperlink r:id="rId101">
+        <w:r>
+          <w:rPr>
+            <w:rStyle w:val="Hyperlink"/>
+          </w:rPr>
+          <w:t xml:space="preserve">https://doi.org/10.1155/2020/8824135</w:t>
+        </w:r>
+      </w:hyperlink>
+    </w:p>
+    <w:bookmarkEnd w:id="102"/>
+    <w:bookmarkStart w:id="104" w:name="ref-Zeiada2025benchmarking"/>
+    <w:p>
+      <w:pPr>
+        <w:pStyle w:val="Bibliography"/>
+      </w:pPr>
+      <w:r>
         <w:t xml:space="preserve">Zeiada, W., Obaid, L., El-Badawy, S.M., others</w:t>
       </w:r>
       <w:r>
@@ -5921,7 +8243,7 @@
       <w:r>
         <w:t xml:space="preserve"> </w:t>
       </w:r>
-      <w:hyperlink r:id="rId83">
+      <w:hyperlink r:id="rId103">
         <w:r>
           <w:rPr>
             <w:rStyle w:val="Hyperlink"/>
@@ -5930,9 +8252,9 @@
         </w:r>
       </w:hyperlink>
     </w:p>
-    <w:bookmarkEnd w:id="84"/>
-    <w:bookmarkEnd w:id="85"/>
-    <w:bookmarkEnd w:id="86"/>
+    <w:bookmarkEnd w:id="104"/>
+    <w:bookmarkEnd w:id="105"/>
+    <w:bookmarkEnd w:id="106"/>
     <w:sectPr/>
   </w:body>
 </w:document>
@@ -6039,8 +8361,123 @@
       </w:pPr>
     </w:lvl>
   </w:abstractNum>
+  <w:abstractNum w:abstractNumId="99411">
+    <w:nsid w:val="00A99411"/>
+    <w:multiLevelType w:val="multilevel"/>
+    <w:lvl w:ilvl="0">
+      <w:start w:val="1"/>
+      <w:numFmt w:val="decimal"/>
+      <w:lvlText w:val="%1."/>
+      <w:lvlJc w:val="left"/>
+      <w:pPr>
+        <w:ind w:left="720" w:hanging="360"/>
+      </w:pPr>
+    </w:lvl>
+    <w:lvl w:ilvl="1">
+      <w:start w:val="1"/>
+      <w:numFmt w:val="decimal"/>
+      <w:lvlText w:val="%2."/>
+      <w:lvlJc w:val="left"/>
+      <w:pPr>
+        <w:ind w:left="1440" w:hanging="360"/>
+      </w:pPr>
+    </w:lvl>
+    <w:lvl w:ilvl="2">
+      <w:start w:val="1"/>
+      <w:numFmt w:val="decimal"/>
+      <w:lvlText w:val="%3."/>
+      <w:lvlJc w:val="left"/>
+      <w:pPr>
+        <w:ind w:left="2160" w:hanging="360"/>
+      </w:pPr>
+    </w:lvl>
+    <w:lvl w:ilvl="3">
+      <w:start w:val="1"/>
+      <w:numFmt w:val="decimal"/>
+      <w:lvlText w:val="%4."/>
+      <w:lvlJc w:val="left"/>
+      <w:pPr>
+        <w:ind w:left="2880" w:hanging="360"/>
+      </w:pPr>
+    </w:lvl>
+    <w:lvl w:ilvl="4">
+      <w:start w:val="1"/>
+      <w:numFmt w:val="decimal"/>
+      <w:lvlText w:val="%5."/>
+      <w:lvlJc w:val="left"/>
+      <w:pPr>
+        <w:ind w:left="3600" w:hanging="360"/>
+      </w:pPr>
+    </w:lvl>
+    <w:lvl w:ilvl="5">
+      <w:start w:val="1"/>
+      <w:numFmt w:val="decimal"/>
+      <w:lvlText w:val="%6."/>
+      <w:lvlJc w:val="left"/>
+      <w:pPr>
+        <w:ind w:left="4320" w:hanging="360"/>
+      </w:pPr>
+    </w:lvl>
+    <w:lvl w:ilvl="6">
+      <w:start w:val="1"/>
+      <w:numFmt w:val="decimal"/>
+      <w:lvlText w:val="%7."/>
+      <w:lvlJc w:val="left"/>
+      <w:pPr>
+        <w:ind w:left="5040" w:hanging="360"/>
+      </w:pPr>
+    </w:lvl>
+    <w:lvl w:ilvl="7">
+      <w:start w:val="1"/>
+      <w:numFmt w:val="decimal"/>
+      <w:lvlText w:val="%8."/>
+      <w:lvlJc w:val="left"/>
+      <w:pPr>
+        <w:ind w:left="5760" w:hanging="360"/>
+      </w:pPr>
+    </w:lvl>
+    <w:lvl w:ilvl="8">
+      <w:start w:val="1"/>
+      <w:numFmt w:val="decimal"/>
+      <w:lvlText w:val="%9."/>
+      <w:lvlJc w:val="left"/>
+      <w:pPr>
+        <w:ind w:left="6480" w:hanging="360"/>
+      </w:pPr>
+    </w:lvl>
+  </w:abstractNum>
   <w:num w:numId="1000">
     <w:abstractNumId w:val="990"/>
+  </w:num>
+  <w:num w:numId="1001">
+    <w:abstractNumId w:val="99411"/>
+    <w:lvlOverride w:ilvl="0">
+      <w:startOverride w:val="1"/>
+    </w:lvlOverride>
+    <w:lvlOverride w:ilvl="1">
+      <w:startOverride w:val="1"/>
+    </w:lvlOverride>
+    <w:lvlOverride w:ilvl="2">
+      <w:startOverride w:val="1"/>
+    </w:lvlOverride>
+    <w:lvlOverride w:ilvl="3">
+      <w:startOverride w:val="1"/>
+    </w:lvlOverride>
+    <w:lvlOverride w:ilvl="4">
+      <w:startOverride w:val="1"/>
+    </w:lvlOverride>
+    <w:lvlOverride w:ilvl="5">
+      <w:startOverride w:val="1"/>
+    </w:lvlOverride>
+    <w:lvlOverride w:ilvl="6">
+      <w:startOverride w:val="1"/>
+    </w:lvlOverride>
+    <w:lvlOverride w:ilvl="7">
+      <w:startOverride w:val="1"/>
+    </w:lvlOverride>
+    <w:lvlOverride w:ilvl="8">
+      <w:startOverride w:val="1"/>
+    </w:lvlOverride>
   </w:num>
 </w:numbering>
 </file>

</xml_diff>

<commit_message>
Phase 6: corpus to 76 records (61 classified primary); add PaveGNet + Rondinella; add honest year-trend figure; fix classify_hybridity.py silent-overwrite bug; confirm H6 gap via second search sweep
</commit_message>
<xml_diff>
--- a/output/manuscript.docx
+++ b/output/manuscript.docx
@@ -2621,7 +2621,7 @@
     </w:p>
     <w:bookmarkEnd w:id="19"/>
     <w:bookmarkEnd w:id="20"/>
-    <w:bookmarkStart w:id="25" w:name="sec-biblio"/>
+    <w:bookmarkStart w:id="29" w:name="sec-biblio"/>
     <w:p>
       <w:pPr>
         <w:pStyle w:val="Heading1"/>
@@ -2635,7 +2635,7 @@
         <w:pStyle w:val="FirstParagraph"/>
       </w:pPr>
       <w:r>
-        <w:t xml:space="preserve">Of the 59 primary studies coded so far,</w:t>
+        <w:t xml:space="preserve">Of the 61 primary studies coded so far,</w:t>
       </w:r>
       <w:r>
         <w:t xml:space="preserve"> </w:t>
@@ -2664,13 +2664,13 @@
         <w:t xml:space="preserve"> </w:t>
       </w:r>
       <w:r>
-        <w:t xml:space="preserve">substantial share — 22</w:t>
-      </w:r>
-      <w:r>
-        <w:t xml:space="preserve"> </w:t>
-      </w:r>
-      <w:r>
-        <w:t xml:space="preserve">of 59 — do not qualify as hybrid under the structural test in</w:t>
+        <w:t xml:space="preserve">substantial share — 23</w:t>
+      </w:r>
+      <w:r>
+        <w:t xml:space="preserve"> </w:t>
+      </w:r>
+      <w:r>
+        <w:t xml:space="preserve">of 61 — do not qualify as hybrid under the structural test in</w:t>
       </w:r>
       <w:r>
         <w:t xml:space="preserve"> </w:t>
@@ -2806,75 +2806,59 @@
         </w:tc>
       </w:tr>
     </w:tbl>
-    <w:bookmarkEnd w:id="25"/>
-    <w:bookmarkStart w:id="27" w:name="sec-taxonomy"/>
-    <w:p>
-      <w:pPr>
-        <w:pStyle w:val="Heading1"/>
-      </w:pPr>
-      <w:r>
-        <w:t xml:space="preserve">4. Taxonomy of hybridisation</w:t>
-      </w:r>
-    </w:p>
-    <w:p>
-      <w:pPr>
-        <w:pStyle w:val="FirstParagraph"/>
-      </w:pPr>
-      <w:r>
-        <w:t xml:space="preserve">The field’s literature treats</w:t>
-      </w:r>
-      <w:r>
-        <w:t xml:space="preserve"> </w:t>
-      </w:r>
-      <w:r>
-        <w:t xml:space="preserve">“hybrid”</w:t>
-      </w:r>
-      <w:r>
-        <w:t xml:space="preserve"> </w:t>
-      </w:r>
-      <w:r>
-        <w:t xml:space="preserve">as a single, undifferentiated label. This</w:t>
-      </w:r>
-      <w:r>
-        <w:t xml:space="preserve"> </w:t>
-      </w:r>
-      <w:r>
-        <w:t xml:space="preserve">flattens together couplings with different theoretical justifications and,</w:t>
-      </w:r>
-      <w:r>
-        <w:t xml:space="preserve"> </w:t>
-      </w:r>
-      <w:r>
-        <w:t xml:space="preserve">correspondingly, different characteristic failure modes — a metaheuristic searching</w:t>
-      </w:r>
-      <w:r>
-        <w:t xml:space="preserve"> </w:t>
-      </w:r>
-      <w:r>
-        <w:t xml:space="preserve">a hyperparameter space is a different claim from a metaheuristic searching a</w:t>
-      </w:r>
-      <w:r>
-        <w:t xml:space="preserve"> </w:t>
-      </w:r>
-      <w:r>
-        <w:t xml:space="preserve">weight space, and a different claim again from a physics-constrained loss function.</w:t>
-      </w:r>
-      <w:r>
-        <w:t xml:space="preserve"> </w:t>
-      </w:r>
-      <w:hyperlink w:anchor="tbl-taxonomy">
+    <w:p>
+      <w:pPr>
+        <w:pStyle w:val="BodyText"/>
+      </w:pPr>
+      <w:hyperlink w:anchor="fig-year-trend">
         <w:r>
           <w:rPr>
             <w:rStyle w:val="Hyperlink"/>
           </w:rPr>
-          <w:t xml:space="preserve">Table 2</w:t>
+          <w:t xml:space="preserve">Figure 3</w:t>
         </w:r>
       </w:hyperlink>
       <w:r>
         <w:t xml:space="preserve"> </w:t>
       </w:r>
       <w:r>
-        <w:t xml:space="preserve">sets out the seven types this review distinguishes and codes against.</w:t>
+        <w:t xml:space="preserve">shows the same primary studies by publication year. The visible</w:t>
+      </w:r>
+      <w:r>
+        <w:t xml:space="preserve"> </w:t>
+      </w:r>
+      <w:r>
+        <w:t xml:space="preserve">concentration after 2020 is consistent with the review’s opening claim that</w:t>
+      </w:r>
+      <w:r>
+        <w:t xml:space="preserve"> </w:t>
+      </w:r>
+      <w:r>
+        <w:t xml:space="preserve">hybridisation-as-novelty accelerated through the current decade, but the figure</w:t>
+      </w:r>
+      <w:r>
+        <w:t xml:space="preserve"> </w:t>
+      </w:r>
+      <w:r>
+        <w:t xml:space="preserve">must be read as what it is — the yield of targeted, taxonomy-driven searches run</w:t>
+      </w:r>
+      <w:r>
+        <w:t xml:space="preserve"> </w:t>
+      </w:r>
+      <w:r>
+        <w:t xml:space="preserve">during protocol development, not a random or exhaustive sample — and it is</w:t>
+      </w:r>
+      <w:r>
+        <w:t xml:space="preserve"> </w:t>
+      </w:r>
+      <w:r>
+        <w:t xml:space="preserve">captioned accordingly rather than presented as a bibliometric trend claim the seed</w:t>
+      </w:r>
+      <w:r>
+        <w:t xml:space="preserve"> </w:t>
+      </w:r>
+      <w:r>
+        <w:t xml:space="preserve">corpus cannot support on its own.</w:t>
       </w:r>
     </w:p>
     <w:tbl>
@@ -2890,7 +2874,169 @@
       <w:tr>
         <w:tc>
           <w:tcPr/>
-          <w:bookmarkStart w:id="26" w:name="tbl-taxonomy"/>
+          <w:bookmarkStart w:id="28" w:name="fig-year-trend"/>
+          <w:p>
+            <w:pPr>
+              <w:pStyle w:val="Compact"/>
+              <w:jc w:val="center"/>
+            </w:pPr>
+            <w:r>
+              <w:drawing>
+                <wp:inline>
+                  <wp:extent cx="4800600" cy="2055302"/>
+                  <wp:effectExtent b="0" l="0" r="0" t="0"/>
+                  <wp:docPr descr="" title="" id="26" name="Picture"/>
+                  <a:graphic>
+                    <a:graphicData uri="http://schemas.openxmlformats.org/drawingml/2006/picture">
+                      <pic:pic>
+                        <pic:nvPicPr>
+                          <pic:cNvPr descr="figures/fig03_seed_corpus_years.png" id="27" name="Picture"/>
+                          <pic:cNvPicPr>
+                            <a:picLocks noChangeArrowheads="1" noChangeAspect="1"/>
+                          </pic:cNvPicPr>
+                        </pic:nvPicPr>
+                        <pic:blipFill>
+                          <a:blip r:embed="rId25"/>
+                          <a:stretch>
+                            <a:fillRect/>
+                          </a:stretch>
+                        </pic:blipFill>
+                        <pic:spPr bwMode="auto">
+                          <a:xfrm>
+                            <a:off x="0" y="0"/>
+                            <a:ext cx="4800600" cy="2055302"/>
+                          </a:xfrm>
+                          <a:prstGeom prst="rect">
+                            <a:avLst/>
+                          </a:prstGeom>
+                          <a:noFill/>
+                          <a:ln w="9525">
+                            <a:noFill/>
+                            <a:headEnd/>
+                            <a:tailEnd/>
+                          </a:ln>
+                        </pic:spPr>
+                      </pic:pic>
+                    </a:graphicData>
+                  </a:graphic>
+                </wp:inline>
+              </w:drawing>
+            </w:r>
+          </w:p>
+          <w:p>
+            <w:pPr>
+              <w:jc w:val="center"/>
+            </w:pPr>
+            <w:pPr>
+              <w:jc w:val="left"/>
+              <w:spacing w:before="200"/>
+              <w:pStyle w:val="ImageCaption"/>
+            </w:pPr>
+            <w:r>
+              <w:t xml:space="preserve">Figure 3: Publication years of primary studies in the seed corpus. This is a targeted-search</w:t>
+            </w:r>
+            <w:r>
+              <w:t xml:space="preserve"> </w:t>
+            </w:r>
+            <w:r>
+              <w:t xml:space="preserve">yield, not a claim about the field’s true publication trajectory; the completed</w:t>
+            </w:r>
+            <w:r>
+              <w:t xml:space="preserve"> </w:t>
+            </w:r>
+            <w:r>
+              <w:t xml:space="preserve">harvest will supersede this figure.</w:t>
+            </w:r>
+          </w:p>
+          <w:bookmarkEnd w:id="28"/>
+        </w:tc>
+      </w:tr>
+    </w:tbl>
+    <w:bookmarkEnd w:id="29"/>
+    <w:bookmarkStart w:id="31" w:name="sec-taxonomy"/>
+    <w:p>
+      <w:pPr>
+        <w:pStyle w:val="Heading1"/>
+      </w:pPr>
+      <w:r>
+        <w:t xml:space="preserve">4. Taxonomy of hybridisation</w:t>
+      </w:r>
+    </w:p>
+    <w:p>
+      <w:pPr>
+        <w:pStyle w:val="FirstParagraph"/>
+      </w:pPr>
+      <w:r>
+        <w:t xml:space="preserve">The field’s literature treats</w:t>
+      </w:r>
+      <w:r>
+        <w:t xml:space="preserve"> </w:t>
+      </w:r>
+      <w:r>
+        <w:t xml:space="preserve">“hybrid”</w:t>
+      </w:r>
+      <w:r>
+        <w:t xml:space="preserve"> </w:t>
+      </w:r>
+      <w:r>
+        <w:t xml:space="preserve">as a single, undifferentiated label. This</w:t>
+      </w:r>
+      <w:r>
+        <w:t xml:space="preserve"> </w:t>
+      </w:r>
+      <w:r>
+        <w:t xml:space="preserve">flattens together couplings with different theoretical justifications and,</w:t>
+      </w:r>
+      <w:r>
+        <w:t xml:space="preserve"> </w:t>
+      </w:r>
+      <w:r>
+        <w:t xml:space="preserve">correspondingly, different characteristic failure modes — a metaheuristic searching</w:t>
+      </w:r>
+      <w:r>
+        <w:t xml:space="preserve"> </w:t>
+      </w:r>
+      <w:r>
+        <w:t xml:space="preserve">a hyperparameter space is a different claim from a metaheuristic searching a</w:t>
+      </w:r>
+      <w:r>
+        <w:t xml:space="preserve"> </w:t>
+      </w:r>
+      <w:r>
+        <w:t xml:space="preserve">weight space, and a different claim again from a physics-constrained loss function.</w:t>
+      </w:r>
+      <w:r>
+        <w:t xml:space="preserve"> </w:t>
+      </w:r>
+      <w:hyperlink w:anchor="tbl-taxonomy">
+        <w:r>
+          <w:rPr>
+            <w:rStyle w:val="Hyperlink"/>
+          </w:rPr>
+          <w:t xml:space="preserve">Table 2</w:t>
+        </w:r>
+      </w:hyperlink>
+      <w:r>
+        <w:t xml:space="preserve"> </w:t>
+      </w:r>
+      <w:r>
+        <w:t xml:space="preserve">sets out the seven types this review distinguishes and codes against.</w:t>
+      </w:r>
+    </w:p>
+    <w:tbl>
+      <w:tblPr>
+        <w:tblStyle w:val="Table"/>
+        <w:tblW w:type="pct" w:w="5000"/>
+        <w:tblLayout w:type="fixed"/>
+        <w:tblLook w:firstRow="0" w:lastRow="0" w:firstColumn="0" w:lastColumn="0" w:noHBand="0" w:noVBand="0" w:val="0000"/>
+      </w:tblPr>
+      <w:tblGrid>
+        <w:gridCol w:w="7920"/>
+      </w:tblGrid>
+      <w:tr>
+        <w:tc>
+          <w:tcPr/>
+          <w:bookmarkStart w:id="30" w:name="tbl-taxonomy"/>
           <w:p>
             <w:pPr>
               <w:jc w:val="center"/>
@@ -3349,7 +3495,7 @@
               </w:tc>
             </w:tr>
           </w:tbl>
-          <w:bookmarkEnd w:id="26"/>
+          <w:bookmarkEnd w:id="30"/>
           <w:p/>
         </w:tc>
       </w:tr>
@@ -3555,8 +3701,8 @@
         <w:t xml:space="preserve">discussion in §11 rather than folded into the hybridisation-type counts in §3.</w:t>
       </w:r>
     </w:p>
-    <w:bookmarkEnd w:id="27"/>
-    <w:bookmarkStart w:id="28" w:name="sec-materials"/>
+    <w:bookmarkEnd w:id="31"/>
+    <w:bookmarkStart w:id="32" w:name="sec-materials"/>
     <w:p>
       <w:pPr>
         <w:pStyle w:val="Heading1"/>
@@ -3906,8 +4052,8 @@
         <w:t xml:space="preserve">not merely a post-hoc-explained, model.</w:t>
       </w:r>
     </w:p>
-    <w:bookmarkEnd w:id="28"/>
-    <w:bookmarkStart w:id="29" w:name="sec-structural"/>
+    <w:bookmarkEnd w:id="32"/>
+    <w:bookmarkStart w:id="33" w:name="sec-structural"/>
     <w:p>
       <w:pPr>
         <w:pStyle w:val="Heading1"/>
@@ -4156,8 +4302,8 @@
         <w:t xml:space="preserve">work that dominates the rest of this section.</w:t>
       </w:r>
     </w:p>
-    <w:bookmarkEnd w:id="29"/>
-    <w:bookmarkStart w:id="30" w:name="sec-performance"/>
+    <w:bookmarkEnd w:id="33"/>
+    <w:bookmarkStart w:id="34" w:name="sec-performance"/>
     <w:p>
       <w:pPr>
         <w:pStyle w:val="Heading1"/>
@@ -4409,8 +4555,8 @@
         <w:t xml:space="preserve">not report.</w:t>
       </w:r>
     </w:p>
-    <w:bookmarkEnd w:id="30"/>
-    <w:bookmarkStart w:id="31" w:name="sec-other-hybrids"/>
+    <w:bookmarkEnd w:id="34"/>
+    <w:bookmarkStart w:id="35" w:name="sec-other-hybrids"/>
     <w:p>
       <w:pPr>
         <w:pStyle w:val="Heading1"/>
@@ -4466,13 +4612,13 @@
         <w:t xml:space="preserve">H4, architecture fusion</w:t>
       </w:r>
       <w:r>
-        <w:t xml:space="preserve">, is best represented in the seed corpus by three vision</w:t>
-      </w:r>
-      <w:r>
-        <w:t xml:space="preserve"> </w:t>
-      </w:r>
-      <w:r>
-        <w:t xml:space="preserve">studies. Sun et al.’s PCDETR</w:t>
+        <w:t xml:space="preserve">, is best represented in the seed corpus by four vision</w:t>
+      </w:r>
+      <w:r>
+        <w:t xml:space="preserve"> </w:t>
+      </w:r>
+      <w:r>
+        <w:t xml:space="preserve">and one network-level study. Sun et al.’s PCDETR</w:t>
       </w:r>
       <w:r>
         <w:t xml:space="preserve"> </w:t>
@@ -4490,31 +4636,37 @@
         <w:t xml:space="preserve"> </w:t>
       </w:r>
       <w:r>
-        <w:t xml:space="preserve">fuses a Swin-Transformer and a</w:t>
-      </w:r>
-      <w:r>
-        <w:t xml:space="preserve"> </w:t>
-      </w:r>
-      <w:r>
-        <w:t xml:space="preserve">ResNet backbone for pavement crack detection and reports near-identical average</w:t>
-      </w:r>
-      <w:r>
-        <w:t xml:space="preserve"> </w:t>
-      </w:r>
-      <w:r>
-        <w:t xml:space="preserve">precision on the authors’ own dataset and on COCO (45.6% vs. 45.8%) — a similarity</w:t>
-      </w:r>
-      <w:r>
-        <w:t xml:space="preserve"> </w:t>
-      </w:r>
-      <w:r>
-        <w:t xml:space="preserve">close enough across two very different image domains to warrant scrutiny rather</w:t>
-      </w:r>
-      <w:r>
-        <w:t xml:space="preserve"> </w:t>
-      </w:r>
-      <w:r>
-        <w:t xml:space="preserve">than to be read at face value as evidence of robust transfer. Alshawabkeh et al.</w:t>
+        <w:t xml:space="preserve">fuses a</w:t>
+      </w:r>
+      <w:r>
+        <w:t xml:space="preserve"> </w:t>
+      </w:r>
+      <w:r>
+        <w:t xml:space="preserve">Swin-Transformer and a ResNet backbone for pavement crack detection and reports</w:t>
+      </w:r>
+      <w:r>
+        <w:t xml:space="preserve"> </w:t>
+      </w:r>
+      <w:r>
+        <w:t xml:space="preserve">near-identical average precision on the authors’ own dataset and on COCO (45.6% vs.</w:t>
+      </w:r>
+      <w:r>
+        <w:t xml:space="preserve"> </w:t>
+      </w:r>
+      <w:r>
+        <w:t xml:space="preserve">45.8%) — a similarity close enough across two very different image domains to</w:t>
+      </w:r>
+      <w:r>
+        <w:t xml:space="preserve"> </w:t>
+      </w:r>
+      <w:r>
+        <w:t xml:space="preserve">warrant scrutiny rather than to be read at face value as evidence of robust</w:t>
+      </w:r>
+      <w:r>
+        <w:t xml:space="preserve"> </w:t>
+      </w:r>
+      <w:r>
+        <w:t xml:space="preserve">transfer. Alshawabkeh et al.</w:t>
       </w:r>
       <w:r>
         <w:t xml:space="preserve"> </w:t>
@@ -4544,37 +4696,103 @@
         <w:t xml:space="preserve"> </w:t>
       </w:r>
       <w:r>
-        <w:t xml:space="preserve">both couple</w:t>
-      </w:r>
-      <w:r>
-        <w:t xml:space="preserve"> </w:t>
-      </w:r>
-      <w:r>
-        <w:t xml:space="preserve">deep and hand-crafted feature extraction with a metaheuristic feature-selection</w:t>
-      </w:r>
-      <w:r>
-        <w:t xml:space="preserve"> </w:t>
-      </w:r>
-      <w:r>
-        <w:t xml:space="preserve">stage (jointly H1 and H4 under the taxonomy in §4), and both report a staged,</w:t>
-      </w:r>
-      <w:r>
-        <w:t xml:space="preserve"> </w:t>
-      </w:r>
-      <w:r>
-        <w:t xml:space="preserve">within-paper ablation — deep features alone, then with the added classifier, then</w:t>
-      </w:r>
-      <w:r>
-        <w:t xml:space="preserve"> </w:t>
-      </w:r>
-      <w:r>
-        <w:t xml:space="preserve">with the added optimiser — which is the design §9’s premium construct depends on</w:t>
-      </w:r>
-      <w:r>
-        <w:t xml:space="preserve"> </w:t>
-      </w:r>
-      <w:r>
-        <w:t xml:space="preserve">and which most H1 studies elsewhere in the corpus do not provide.</w:t>
+        <w:t xml:space="preserve">both couple deep and hand-crafted feature extraction with a</w:t>
+      </w:r>
+      <w:r>
+        <w:t xml:space="preserve"> </w:t>
+      </w:r>
+      <w:r>
+        <w:t xml:space="preserve">metaheuristic feature-selection stage (jointly H1 and H4 under the taxonomy in §4),</w:t>
+      </w:r>
+      <w:r>
+        <w:t xml:space="preserve"> </w:t>
+      </w:r>
+      <w:r>
+        <w:t xml:space="preserve">and both report a staged, within-paper ablation — deep features alone, then with</w:t>
+      </w:r>
+      <w:r>
+        <w:t xml:space="preserve"> </w:t>
+      </w:r>
+      <w:r>
+        <w:t xml:space="preserve">the added classifier, then with the added optimiser — which is the design §9’s</w:t>
+      </w:r>
+      <w:r>
+        <w:t xml:space="preserve"> </w:t>
+      </w:r>
+      <w:r>
+        <w:t xml:space="preserve">premium construct depends on and which most H1 studies elsewhere in the corpus do</w:t>
+      </w:r>
+      <w:r>
+        <w:t xml:space="preserve"> </w:t>
+      </w:r>
+      <w:r>
+        <w:t xml:space="preserve">not provide. At the network rather than the image level, Pan, Du and Parlikad’s</w:t>
+      </w:r>
+      <w:r>
+        <w:t xml:space="preserve"> </w:t>
+      </w:r>
+      <w:r>
+        <w:t xml:space="preserve">PaveGNet</w:t>
+      </w:r>
+      <w:r>
+        <w:t xml:space="preserve"> </w:t>
+      </w:r>
+      <w:r>
+        <w:t xml:space="preserve">(Pan et al., 2025)</w:t>
+      </w:r>
+      <w:r>
+        <w:t xml:space="preserve"> </w:t>
+      </w:r>
+      <w:r>
+        <w:t xml:space="preserve">fuses a graph module encoding inter-section</w:t>
+      </w:r>
+      <w:r>
+        <w:t xml:space="preserve"> </w:t>
+      </w:r>
+      <w:r>
+        <w:t xml:space="preserve">topology with a temporal module encoding distress evolution, and is, at the time of</w:t>
+      </w:r>
+      <w:r>
+        <w:t xml:space="preserve"> </w:t>
+      </w:r>
+      <w:r>
+        <w:t xml:space="preserve">writing, this review’s clearest example of the staged-ablation design done well:</w:t>
+      </w:r>
+      <w:r>
+        <w:t xml:space="preserve"> </w:t>
+      </w:r>
+      <w:r>
+        <w:t xml:space="preserve">independently substituting the temporal, spatial and exogenous-variable components</w:t>
+      </w:r>
+      <w:r>
+        <w:t xml:space="preserve"> </w:t>
+      </w:r>
+      <w:r>
+        <w:t xml:space="preserve">and reporting the ranking-error contribution of each (a fall from 9.005% to 2.670%</w:t>
+      </w:r>
+      <w:r>
+        <w:t xml:space="preserve"> </w:t>
+      </w:r>
+      <w:r>
+        <w:t xml:space="preserve">for the full model against a spatiotemporal graph-convolution baseline). It is a</w:t>
+      </w:r>
+      <w:r>
+        <w:t xml:space="preserve"> </w:t>
+      </w:r>
+      <w:r>
+        <w:t xml:space="preserve">useful positive counterpoint to place beside the H1 studies earlier in this</w:t>
+      </w:r>
+      <w:r>
+        <w:t xml:space="preserve"> </w:t>
+      </w:r>
+      <w:r>
+        <w:t xml:space="preserve">section, and is the closest the seed corpus comes to network-level, rather than</w:t>
+      </w:r>
+      <w:r>
+        <w:t xml:space="preserve"> </w:t>
+      </w:r>
+      <w:r>
+        <w:t xml:space="preserve">single-section, hybridisation evidence.</w:t>
       </w:r>
     </w:p>
     <w:p>
@@ -4682,37 +4900,49 @@
         <w:t xml:space="preserve"> </w:t>
       </w:r>
       <w:r>
-        <w:t xml:space="preserve">writing, no confirmed pavement-specific exemplar in the seed corpus — every</w:t>
-      </w:r>
-      <w:r>
-        <w:t xml:space="preserve"> </w:t>
-      </w:r>
-      <w:r>
-        <w:t xml:space="preserve">wavelet- or VMD-based candidate located in the search so far belongs to an adjacent</w:t>
-      </w:r>
-      <w:r>
-        <w:t xml:space="preserve"> </w:t>
-      </w:r>
-      <w:r>
-        <w:t xml:space="preserve">domain (bridge deflection monitoring, energy-price forecasting) rather than to</w:t>
-      </w:r>
-      <w:r>
-        <w:t xml:space="preserve"> </w:t>
-      </w:r>
-      <w:r>
-        <w:t xml:space="preserve">pavement engineering directly. Its absence is reported here as a finding in its own</w:t>
-      </w:r>
-      <w:r>
-        <w:t xml:space="preserve"> </w:t>
-      </w:r>
-      <w:r>
-        <w:t xml:space="preserve">right, to be confirmed or overturned once the completed harvest is available, rather</w:t>
-      </w:r>
-      <w:r>
-        <w:t xml:space="preserve"> </w:t>
-      </w:r>
-      <w:r>
-        <w:t xml:space="preserve">than silently omitted.</w:t>
+        <w:t xml:space="preserve">writing, no confirmed pavement-specific exemplar in the seed corpus, and the</w:t>
+      </w:r>
+      <w:r>
+        <w:t xml:space="preserve"> </w:t>
+      </w:r>
+      <w:r>
+        <w:t xml:space="preserve">absence has now survived two independent, differently worded search sweeps rather</w:t>
+      </w:r>
+      <w:r>
+        <w:t xml:space="preserve"> </w:t>
+      </w:r>
+      <w:r>
+        <w:t xml:space="preserve">than reflecting a single missed query — every wavelet- or VMD-based candidate</w:t>
+      </w:r>
+      <w:r>
+        <w:t xml:space="preserve"> </w:t>
+      </w:r>
+      <w:r>
+        <w:t xml:space="preserve">located so far belongs to an adjacent domain (bridge deflection monitoring,</w:t>
+      </w:r>
+      <w:r>
+        <w:t xml:space="preserve"> </w:t>
+      </w:r>
+      <w:r>
+        <w:t xml:space="preserve">energy-price forecasting) rather than to pavement engineering directly. Its absence</w:t>
+      </w:r>
+      <w:r>
+        <w:t xml:space="preserve"> </w:t>
+      </w:r>
+      <w:r>
+        <w:t xml:space="preserve">is reported here as a tentative finding in its own right, to be confirmed or</w:t>
+      </w:r>
+      <w:r>
+        <w:t xml:space="preserve"> </w:t>
+      </w:r>
+      <w:r>
+        <w:t xml:space="preserve">overturned once the completed harvest is available, rather than silently omitted</w:t>
+      </w:r>
+      <w:r>
+        <w:t xml:space="preserve"> </w:t>
+      </w:r>
+      <w:r>
+        <w:t xml:space="preserve">or, on the other hand, overstated on the basis of two searches.</w:t>
       </w:r>
     </w:p>
     <w:p>
@@ -4807,8 +5037,8 @@
         <w:t xml:space="preserve">explanation of an unvalidated model cannot.</w:t>
       </w:r>
     </w:p>
-    <w:bookmarkEnd w:id="31"/>
-    <w:bookmarkStart w:id="36" w:name="sec-premium"/>
+    <w:bookmarkEnd w:id="35"/>
+    <w:bookmarkStart w:id="40" w:name="sec-premium"/>
     <w:p>
       <w:pPr>
         <w:pStyle w:val="Heading1"/>
@@ -4817,7 +5047,7 @@
         <w:t xml:space="preserve">9. The hybridisation premium</w:t>
       </w:r>
     </w:p>
-    <w:bookmarkStart w:id="32" w:name="definition"/>
+    <w:bookmarkStart w:id="36" w:name="definition"/>
     <w:p>
       <w:pPr>
         <w:pStyle w:val="Heading2"/>
@@ -5140,8 +5370,8 @@
         <w:t xml:space="preserve">what hybridisation contributes — it is a measure of what tuning contributes, mislabelled.</w:t>
       </w:r>
     </w:p>
-    <w:bookmarkEnd w:id="32"/>
-    <w:bookmarkStart w:id="33" w:name="what-the-completed-audit-will-report"/>
+    <w:bookmarkEnd w:id="36"/>
+    <w:bookmarkStart w:id="37" w:name="what-the-completed-audit-will-report"/>
     <w:p>
       <w:pPr>
         <w:pStyle w:val="Heading2"/>
@@ -5250,8 +5480,8 @@
         <w:t xml:space="preserve">began.</w:t>
       </w:r>
     </w:p>
-    <w:bookmarkEnd w:id="33"/>
-    <w:bookmarkStart w:id="35" w:name="X7f25b91c7f8b674ee1023e90faae5a96e47348b"/>
+    <w:bookmarkEnd w:id="37"/>
+    <w:bookmarkStart w:id="39" w:name="X7f25b91c7f8b674ee1023e90faae5a96e47348b"/>
     <w:p>
       <w:pPr>
         <w:pStyle w:val="Heading2"/>
@@ -5322,7 +5552,7 @@
       <w:tr>
         <w:tc>
           <w:tcPr/>
-          <w:bookmarkStart w:id="34" w:name="tbl-premium-evidence"/>
+          <w:bookmarkStart w:id="38" w:name="tbl-premium-evidence"/>
           <w:p>
             <w:pPr>
               <w:jc w:val="center"/>
@@ -5887,7 +6117,7 @@
               </w:tc>
             </w:tr>
           </w:tbl>
-          <w:bookmarkEnd w:id="34"/>
+          <w:bookmarkEnd w:id="38"/>
           <w:p/>
         </w:tc>
       </w:tr>
@@ -6136,9 +6366,9 @@
         <w:t xml:space="preserve">completing, not as its substitute.</w:t>
       </w:r>
     </w:p>
-    <w:bookmarkEnd w:id="35"/>
-    <w:bookmarkEnd w:id="36"/>
-    <w:bookmarkStart w:id="37" w:name="sec-interpretability"/>
+    <w:bookmarkEnd w:id="39"/>
+    <w:bookmarkEnd w:id="40"/>
+    <w:bookmarkStart w:id="41" w:name="sec-interpretability"/>
     <w:p>
       <w:pPr>
         <w:pStyle w:val="Heading1"/>
@@ -6155,8 +6385,8 @@
         <w:t xml:space="preserve">PLACEHOLDER.</w:t>
       </w:r>
     </w:p>
-    <w:bookmarkEnd w:id="37"/>
-    <w:bookmarkStart w:id="38" w:name="sec-decision"/>
+    <w:bookmarkEnd w:id="41"/>
+    <w:bookmarkStart w:id="42" w:name="sec-decision"/>
     <w:p>
       <w:pPr>
         <w:pStyle w:val="Heading1"/>
@@ -6386,8 +6616,8 @@
         <w:t xml:space="preserve">than asserted in general.</w:t>
       </w:r>
     </w:p>
-    <w:bookmarkEnd w:id="38"/>
-    <w:bookmarkStart w:id="39" w:name="sec-paveml"/>
+    <w:bookmarkEnd w:id="42"/>
+    <w:bookmarkStart w:id="43" w:name="sec-paveml"/>
     <w:p>
       <w:pPr>
         <w:pStyle w:val="Heading1"/>
@@ -6694,8 +6924,8 @@
         <w:t xml:space="preserve">This procedure, and its result, are reported in full in the completed manuscript.</w:t>
       </w:r>
     </w:p>
-    <w:bookmarkEnd w:id="39"/>
-    <w:bookmarkStart w:id="40" w:name="sec-agenda"/>
+    <w:bookmarkEnd w:id="43"/>
+    <w:bookmarkStart w:id="44" w:name="sec-agenda"/>
     <w:p>
       <w:pPr>
         <w:pStyle w:val="Heading1"/>
@@ -7226,8 +7456,8 @@
         <w:t xml:space="preserve">across civil engineering.</w:t>
       </w:r>
     </w:p>
-    <w:bookmarkEnd w:id="40"/>
-    <w:bookmarkStart w:id="41" w:name="sec-conclusions"/>
+    <w:bookmarkEnd w:id="44"/>
+    <w:bookmarkStart w:id="45" w:name="sec-conclusions"/>
     <w:p>
       <w:pPr>
         <w:pStyle w:val="Heading1"/>
@@ -7471,8 +7701,8 @@
         <w:t xml:space="preserve">and the reading the completed audit is designed to test.</w:t>
       </w:r>
     </w:p>
-    <w:bookmarkEnd w:id="41"/>
-    <w:bookmarkStart w:id="42" w:name="declaration-of-competing-interest"/>
+    <w:bookmarkEnd w:id="45"/>
+    <w:bookmarkStart w:id="46" w:name="declaration-of-competing-interest"/>
     <w:p>
       <w:pPr>
         <w:pStyle w:val="Heading1"/>
@@ -7495,8 +7725,8 @@
         <w:t xml:space="preserve">could have influenced the work reported in this paper.</w:t>
       </w:r>
     </w:p>
-    <w:bookmarkEnd w:id="42"/>
-    <w:bookmarkStart w:id="43" w:name="Xa6ff8e54395812bd8a1d49fa16c25a1d6a46bbb"/>
+    <w:bookmarkEnd w:id="46"/>
+    <w:bookmarkStart w:id="47" w:name="Xa6ff8e54395812bd8a1d49fa16c25a1d6a46bbb"/>
     <w:p>
       <w:pPr>
         <w:pStyle w:val="Heading1"/>
@@ -7531,8 +7761,8 @@
         <w:t xml:space="preserve">use is permitted; undisclosed use is not.</w:t>
       </w:r>
     </w:p>
-    <w:bookmarkEnd w:id="43"/>
-    <w:bookmarkStart w:id="44" w:name="data-availability"/>
+    <w:bookmarkEnd w:id="47"/>
+    <w:bookmarkStart w:id="48" w:name="data-availability"/>
     <w:p>
       <w:pPr>
         <w:pStyle w:val="Heading1"/>
@@ -7561,8 +7791,8 @@
         <w:t xml:space="preserve">[REPOSITORY URL].</w:t>
       </w:r>
     </w:p>
-    <w:bookmarkEnd w:id="44"/>
-    <w:bookmarkStart w:id="106" w:name="references"/>
+    <w:bookmarkEnd w:id="48"/>
+    <w:bookmarkStart w:id="112" w:name="references"/>
     <w:p>
       <w:pPr>
         <w:pStyle w:val="Heading1"/>
@@ -7571,8 +7801,8 @@
         <w:t xml:space="preserve">References</w:t>
       </w:r>
     </w:p>
-    <w:bookmarkStart w:id="105" w:name="refs"/>
-    <w:bookmarkStart w:id="46" w:name="ref-Alhussan2022pothole"/>
+    <w:bookmarkStart w:id="111" w:name="refs"/>
+    <w:bookmarkStart w:id="50" w:name="ref-Alhussan2022pothole"/>
     <w:p>
       <w:pPr>
         <w:pStyle w:val="Bibliography"/>
@@ -7583,7 +7813,7 @@
       <w:r>
         <w:t xml:space="preserve"> </w:t>
       </w:r>
-      <w:hyperlink r:id="rId45">
+      <w:hyperlink r:id="rId49">
         <w:r>
           <w:rPr>
             <w:rStyle w:val="Hyperlink"/>
@@ -7592,8 +7822,8 @@
         </w:r>
       </w:hyperlink>
     </w:p>
-    <w:bookmarkEnd w:id="46"/>
-    <w:bookmarkStart w:id="48" w:name="ref-Alnaqbi2025learning"/>
+    <w:bookmarkEnd w:id="50"/>
+    <w:bookmarkStart w:id="52" w:name="ref-Alnaqbi2025learning"/>
     <w:p>
       <w:pPr>
         <w:pStyle w:val="Bibliography"/>
@@ -7604,7 +7834,7 @@
       <w:r>
         <w:t xml:space="preserve"> </w:t>
       </w:r>
-      <w:hyperlink r:id="rId47">
+      <w:hyperlink r:id="rId51">
         <w:r>
           <w:rPr>
             <w:rStyle w:val="Hyperlink"/>
@@ -7613,8 +7843,8 @@
         </w:r>
       </w:hyperlink>
     </w:p>
-    <w:bookmarkEnd w:id="48"/>
-    <w:bookmarkStart w:id="50" w:name="ref-Alshawabkeh2023automated"/>
+    <w:bookmarkEnd w:id="52"/>
+    <w:bookmarkStart w:id="54" w:name="ref-Alshawabkeh2023automated"/>
     <w:p>
       <w:pPr>
         <w:pStyle w:val="Bibliography"/>
@@ -7628,7 +7858,7 @@
       <w:r>
         <w:t xml:space="preserve"> </w:t>
       </w:r>
-      <w:hyperlink r:id="rId49">
+      <w:hyperlink r:id="rId53">
         <w:r>
           <w:rPr>
             <w:rStyle w:val="Hyperlink"/>
@@ -7637,8 +7867,8 @@
         </w:r>
       </w:hyperlink>
     </w:p>
-    <w:bookmarkEnd w:id="50"/>
-    <w:bookmarkStart w:id="52" w:name="ref-Azam2022resilient"/>
+    <w:bookmarkEnd w:id="54"/>
+    <w:bookmarkStart w:id="56" w:name="ref-Azam2022resilient"/>
     <w:p>
       <w:pPr>
         <w:pStyle w:val="Bibliography"/>
@@ -7652,7 +7882,7 @@
       <w:r>
         <w:t xml:space="preserve"> </w:t>
       </w:r>
-      <w:hyperlink r:id="rId51">
+      <w:hyperlink r:id="rId55">
         <w:r>
           <w:rPr>
             <w:rStyle w:val="Hyperlink"/>
@@ -7661,8 +7891,8 @@
         </w:r>
       </w:hyperlink>
     </w:p>
-    <w:bookmarkEnd w:id="52"/>
-    <w:bookmarkStart w:id="54" w:name="ref-Cao2020pavement"/>
+    <w:bookmarkEnd w:id="56"/>
+    <w:bookmarkStart w:id="58" w:name="ref-Cao2020pavement"/>
     <w:p>
       <w:pPr>
         <w:pStyle w:val="Bibliography"/>
@@ -7673,7 +7903,7 @@
       <w:r>
         <w:t xml:space="preserve"> </w:t>
       </w:r>
-      <w:hyperlink r:id="rId53">
+      <w:hyperlink r:id="rId57">
         <w:r>
           <w:rPr>
             <w:rStyle w:val="Hyperlink"/>
@@ -7682,8 +7912,8 @@
         </w:r>
       </w:hyperlink>
     </w:p>
-    <w:bookmarkEnd w:id="54"/>
-    <w:bookmarkStart w:id="56" w:name="ref-Deng2023rutting"/>
+    <w:bookmarkEnd w:id="58"/>
+    <w:bookmarkStart w:id="60" w:name="ref-Deng2023rutting"/>
     <w:p>
       <w:pPr>
         <w:pStyle w:val="Bibliography"/>
@@ -7694,7 +7924,7 @@
       <w:r>
         <w:t xml:space="preserve"> </w:t>
       </w:r>
-      <w:hyperlink r:id="rId55">
+      <w:hyperlink r:id="rId59">
         <w:r>
           <w:rPr>
             <w:rStyle w:val="Hyperlink"/>
@@ -7703,8 +7933,8 @@
         </w:r>
       </w:hyperlink>
     </w:p>
-    <w:bookmarkEnd w:id="56"/>
-    <w:bookmarkStart w:id="58" w:name="ref-Elbagalati2017neural"/>
+    <w:bookmarkEnd w:id="60"/>
+    <w:bookmarkStart w:id="62" w:name="ref-Elbagalati2017neural"/>
     <w:p>
       <w:pPr>
         <w:pStyle w:val="Bibliography"/>
@@ -7718,7 +7948,7 @@
       <w:r>
         <w:t xml:space="preserve"> </w:t>
       </w:r>
-      <w:hyperlink r:id="rId57">
+      <w:hyperlink r:id="rId61">
         <w:r>
           <w:rPr>
             <w:rStyle w:val="Hyperlink"/>
@@ -7727,8 +7957,8 @@
         </w:r>
       </w:hyperlink>
     </w:p>
-    <w:bookmarkEnd w:id="58"/>
-    <w:bookmarkStart w:id="60" w:name="ref-Elhariri2020filter"/>
+    <w:bookmarkEnd w:id="62"/>
+    <w:bookmarkStart w:id="64" w:name="ref-Elhariri2020filter"/>
     <w:p>
       <w:pPr>
         <w:pStyle w:val="Bibliography"/>
@@ -7739,7 +7969,7 @@
       <w:r>
         <w:t xml:space="preserve"> </w:t>
       </w:r>
-      <w:hyperlink r:id="rId59">
+      <w:hyperlink r:id="rId63">
         <w:r>
           <w:rPr>
             <w:rStyle w:val="Hyperlink"/>
@@ -7748,8 +7978,8 @@
         </w:r>
       </w:hyperlink>
     </w:p>
-    <w:bookmarkEnd w:id="60"/>
-    <w:bookmarkStart w:id="62" w:name="ref-Georgouli2026impact"/>
+    <w:bookmarkEnd w:id="64"/>
+    <w:bookmarkStart w:id="66" w:name="ref-Georgouli2026impact"/>
     <w:p>
       <w:pPr>
         <w:pStyle w:val="Bibliography"/>
@@ -7760,7 +7990,7 @@
       <w:r>
         <w:t xml:space="preserve"> </w:t>
       </w:r>
-      <w:hyperlink r:id="rId61">
+      <w:hyperlink r:id="rId65">
         <w:r>
           <w:rPr>
             <w:rStyle w:val="Hyperlink"/>
@@ -7769,8 +7999,8 @@
         </w:r>
       </w:hyperlink>
     </w:p>
-    <w:bookmarkEnd w:id="62"/>
-    <w:bookmarkStart w:id="64" w:name="ref-Ghanizadeh2020neural"/>
+    <w:bookmarkEnd w:id="66"/>
+    <w:bookmarkStart w:id="68" w:name="ref-Ghanizadeh2020neural"/>
     <w:p>
       <w:pPr>
         <w:pStyle w:val="Bibliography"/>
@@ -7781,7 +8011,7 @@
       <w:r>
         <w:t xml:space="preserve"> </w:t>
       </w:r>
-      <w:hyperlink r:id="rId63">
+      <w:hyperlink r:id="rId67">
         <w:r>
           <w:rPr>
             <w:rStyle w:val="Hyperlink"/>
@@ -7790,8 +8020,8 @@
         </w:r>
       </w:hyperlink>
     </w:p>
-    <w:bookmarkEnd w:id="64"/>
-    <w:bookmarkStart w:id="66" w:name="ref-Ghanizadeh2025metabackcal"/>
+    <w:bookmarkEnd w:id="68"/>
+    <w:bookmarkStart w:id="70" w:name="ref-Ghanizadeh2025metabackcal"/>
     <w:p>
       <w:pPr>
         <w:pStyle w:val="Bibliography"/>
@@ -7802,7 +8032,7 @@
       <w:r>
         <w:t xml:space="preserve"> </w:t>
       </w:r>
-      <w:hyperlink r:id="rId65">
+      <w:hyperlink r:id="rId69">
         <w:r>
           <w:rPr>
             <w:rStyle w:val="Hyperlink"/>
@@ -7811,8 +8041,8 @@
         </w:r>
       </w:hyperlink>
     </w:p>
-    <w:bookmarkEnd w:id="66"/>
-    <w:bookmarkStart w:id="68" w:name="ref-Ghanizadeh2024formulation"/>
+    <w:bookmarkEnd w:id="70"/>
+    <w:bookmarkStart w:id="72" w:name="ref-Ghanizadeh2024formulation"/>
     <w:p>
       <w:pPr>
         <w:pStyle w:val="Bibliography"/>
@@ -7826,7 +8056,7 @@
       <w:r>
         <w:t xml:space="preserve"> </w:t>
       </w:r>
-      <w:hyperlink r:id="rId67">
+      <w:hyperlink r:id="rId71">
         <w:r>
           <w:rPr>
             <w:rStyle w:val="Hyperlink"/>
@@ -7835,8 +8065,8 @@
         </w:r>
       </w:hyperlink>
     </w:p>
-    <w:bookmarkEnd w:id="68"/>
-    <w:bookmarkStart w:id="70" w:name="ref-Ghorbani2020genetic"/>
+    <w:bookmarkEnd w:id="72"/>
+    <w:bookmarkStart w:id="74" w:name="ref-Ghorbani2020genetic"/>
     <w:p>
       <w:pPr>
         <w:pStyle w:val="Bibliography"/>
@@ -7850,7 +8080,7 @@
       <w:r>
         <w:t xml:space="preserve"> </w:t>
       </w:r>
-      <w:hyperlink r:id="rId69">
+      <w:hyperlink r:id="rId73">
         <w:r>
           <w:rPr>
             <w:rStyle w:val="Hyperlink"/>
@@ -7859,8 +8089,8 @@
         </w:r>
       </w:hyperlink>
     </w:p>
-    <w:bookmarkEnd w:id="70"/>
-    <w:bookmarkStart w:id="72" w:name="ref-Gopalakrishnan2018learning"/>
+    <w:bookmarkEnd w:id="74"/>
+    <w:bookmarkStart w:id="76" w:name="ref-Gopalakrishnan2018learning"/>
     <w:p>
       <w:pPr>
         <w:pStyle w:val="Bibliography"/>
@@ -7871,7 +8101,7 @@
       <w:r>
         <w:t xml:space="preserve"> </w:t>
       </w:r>
-      <w:hyperlink r:id="rId71">
+      <w:hyperlink r:id="rId75">
         <w:r>
           <w:rPr>
             <w:rStyle w:val="Hyperlink"/>
@@ -7880,8 +8110,8 @@
         </w:r>
       </w:hyperlink>
     </w:p>
-    <w:bookmarkEnd w:id="72"/>
-    <w:bookmarkStart w:id="74" w:name="ref-Guo2025learning"/>
+    <w:bookmarkEnd w:id="76"/>
+    <w:bookmarkStart w:id="78" w:name="ref-Guo2025learning"/>
     <w:p>
       <w:pPr>
         <w:pStyle w:val="Bibliography"/>
@@ -7895,7 +8125,7 @@
       <w:r>
         <w:t xml:space="preserve"> </w:t>
       </w:r>
-      <w:hyperlink r:id="rId73">
+      <w:hyperlink r:id="rId77">
         <w:r>
           <w:rPr>
             <w:rStyle w:val="Hyperlink"/>
@@ -7904,8 +8134,8 @@
         </w:r>
       </w:hyperlink>
     </w:p>
-    <w:bookmarkEnd w:id="74"/>
-    <w:bookmarkStart w:id="76" w:name="ref-Hanandeh2022introducing"/>
+    <w:bookmarkEnd w:id="78"/>
+    <w:bookmarkStart w:id="80" w:name="ref-Hanandeh2022introducing"/>
     <w:p>
       <w:pPr>
         <w:pStyle w:val="Bibliography"/>
@@ -7916,7 +8146,7 @@
       <w:r>
         <w:t xml:space="preserve"> </w:t>
       </w:r>
-      <w:hyperlink r:id="rId75">
+      <w:hyperlink r:id="rId79">
         <w:r>
           <w:rPr>
             <w:rStyle w:val="Hyperlink"/>
@@ -7925,8 +8155,8 @@
         </w:r>
       </w:hyperlink>
     </w:p>
-    <w:bookmarkEnd w:id="76"/>
-    <w:bookmarkStart w:id="78" w:name="ref-Hosseini2021accuracy"/>
+    <w:bookmarkEnd w:id="80"/>
+    <w:bookmarkStart w:id="82" w:name="ref-Hosseini2021accuracy"/>
     <w:p>
       <w:pPr>
         <w:pStyle w:val="Bibliography"/>
@@ -7937,7 +8167,7 @@
       <w:r>
         <w:t xml:space="preserve"> </w:t>
       </w:r>
-      <w:hyperlink r:id="rId77">
+      <w:hyperlink r:id="rId81">
         <w:r>
           <w:rPr>
             <w:rStyle w:val="Hyperlink"/>
@@ -7946,8 +8176,8 @@
         </w:r>
       </w:hyperlink>
     </w:p>
-    <w:bookmarkEnd w:id="78"/>
-    <w:bookmarkStart w:id="80" w:name="ref-Hou2020state"/>
+    <w:bookmarkEnd w:id="82"/>
+    <w:bookmarkStart w:id="84" w:name="ref-Hou2020state"/>
     <w:p>
       <w:pPr>
         <w:pStyle w:val="Bibliography"/>
@@ -7961,7 +8191,7 @@
       <w:r>
         <w:t xml:space="preserve"> </w:t>
       </w:r>
-      <w:hyperlink r:id="rId79">
+      <w:hyperlink r:id="rId83">
         <w:r>
           <w:rPr>
             <w:rStyle w:val="Hyperlink"/>
@@ -7970,8 +8200,8 @@
         </w:r>
       </w:hyperlink>
     </w:p>
-    <w:bookmarkEnd w:id="80"/>
-    <w:bookmarkStart w:id="82" w:name="ref-Huang2025rheological"/>
+    <w:bookmarkEnd w:id="84"/>
+    <w:bookmarkStart w:id="86" w:name="ref-Huang2025rheological"/>
     <w:p>
       <w:pPr>
         <w:pStyle w:val="Bibliography"/>
@@ -7985,7 +8215,7 @@
       <w:r>
         <w:t xml:space="preserve"> </w:t>
       </w:r>
-      <w:hyperlink r:id="rId81">
+      <w:hyperlink r:id="rId85">
         <w:r>
           <w:rPr>
             <w:rStyle w:val="Hyperlink"/>
@@ -7994,8 +8224,8 @@
         </w:r>
       </w:hyperlink>
     </w:p>
-    <w:bookmarkEnd w:id="82"/>
-    <w:bookmarkStart w:id="84" w:name="ref-Jweihan2026trustworthy"/>
+    <w:bookmarkEnd w:id="86"/>
+    <w:bookmarkStart w:id="88" w:name="ref-Jweihan2026trustworthy"/>
     <w:p>
       <w:pPr>
         <w:pStyle w:val="Bibliography"/>
@@ -8006,7 +8236,7 @@
       <w:r>
         <w:t xml:space="preserve"> </w:t>
       </w:r>
-      <w:hyperlink r:id="rId83">
+      <w:hyperlink r:id="rId87">
         <w:r>
           <w:rPr>
             <w:rStyle w:val="Hyperlink"/>
@@ -8015,8 +8245,8 @@
         </w:r>
       </w:hyperlink>
     </w:p>
-    <w:bookmarkEnd w:id="84"/>
-    <w:bookmarkStart w:id="86" w:name="ref-Kaloop2019particle"/>
+    <w:bookmarkEnd w:id="88"/>
+    <w:bookmarkStart w:id="90" w:name="ref-Kaloop2019particle"/>
     <w:p>
       <w:pPr>
         <w:pStyle w:val="Bibliography"/>
@@ -8030,7 +8260,7 @@
       <w:r>
         <w:t xml:space="preserve"> </w:t>
       </w:r>
-      <w:hyperlink r:id="rId85">
+      <w:hyperlink r:id="rId89">
         <w:r>
           <w:rPr>
             <w:rStyle w:val="Hyperlink"/>
@@ -8039,8 +8269,8 @@
         </w:r>
       </w:hyperlink>
     </w:p>
-    <w:bookmarkEnd w:id="86"/>
-    <w:bookmarkStart w:id="88" w:name="ref-Latifi2021reinforcement"/>
+    <w:bookmarkEnd w:id="90"/>
+    <w:bookmarkStart w:id="92" w:name="ref-Latifi2021reinforcement"/>
     <w:p>
       <w:pPr>
         <w:pStyle w:val="Bibliography"/>
@@ -8054,7 +8284,7 @@
       <w:r>
         <w:t xml:space="preserve"> </w:t>
       </w:r>
-      <w:hyperlink r:id="rId87">
+      <w:hyperlink r:id="rId91">
         <w:r>
           <w:rPr>
             <w:rStyle w:val="Hyperlink"/>
@@ -8063,8 +8293,8 @@
         </w:r>
       </w:hyperlink>
     </w:p>
-    <w:bookmarkEnd w:id="88"/>
-    <w:bookmarkStart w:id="90" w:name="ref-MharziAlaoui2026algorithm"/>
+    <w:bookmarkEnd w:id="92"/>
+    <w:bookmarkStart w:id="94" w:name="ref-MharziAlaoui2026algorithm"/>
     <w:p>
       <w:pPr>
         <w:pStyle w:val="Bibliography"/>
@@ -8078,7 +8308,7 @@
       <w:r>
         <w:t xml:space="preserve"> </w:t>
       </w:r>
-      <w:hyperlink r:id="rId89">
+      <w:hyperlink r:id="rId93">
         <w:r>
           <w:rPr>
             <w:rStyle w:val="Hyperlink"/>
@@ -8087,19 +8317,40 @@
         </w:r>
       </w:hyperlink>
     </w:p>
-    <w:bookmarkEnd w:id="90"/>
-    <w:bookmarkStart w:id="92" w:name="ref-Pasupunuri2024roughness"/>
+    <w:bookmarkEnd w:id="94"/>
+    <w:bookmarkStart w:id="96" w:name="ref-Pan2025spatiotemporal"/>
     <w:p>
       <w:pPr>
         <w:pStyle w:val="Bibliography"/>
       </w:pPr>
       <w:r>
+        <w:t xml:space="preserve">Pan, N., Du, Y., Parlikad, A.K., 2025. A spatiotemporal prediction method for the evolution of pavement distress in road networks. Comput.-Aided Civ. Infrastruct. Eng.</w:t>
+      </w:r>
+      <w:r>
+        <w:t xml:space="preserve"> </w:t>
+      </w:r>
+      <w:hyperlink r:id="rId95">
+        <w:r>
+          <w:rPr>
+            <w:rStyle w:val="Hyperlink"/>
+          </w:rPr>
+          <w:t xml:space="preserve">https://doi.org/10.1111/mice.70169</w:t>
+        </w:r>
+      </w:hyperlink>
+    </w:p>
+    <w:bookmarkEnd w:id="96"/>
+    <w:bookmarkStart w:id="98" w:name="ref-Pasupunuri2024roughness"/>
+    <w:p>
+      <w:pPr>
+        <w:pStyle w:val="Bibliography"/>
+      </w:pPr>
+      <w:r>
         <w:t xml:space="preserve">Pasupunuri, S.K., Thom, N., Li, L., 2024. Roughness prediction of jointed plain concrete pavement using physics informed neural networks. Transportation Research Record.</w:t>
       </w:r>
       <w:r>
         <w:t xml:space="preserve"> </w:t>
       </w:r>
-      <w:hyperlink r:id="rId91">
+      <w:hyperlink r:id="rId97">
         <w:r>
           <w:rPr>
             <w:rStyle w:val="Hyperlink"/>
@@ -8108,8 +8359,8 @@
         </w:r>
       </w:hyperlink>
     </w:p>
-    <w:bookmarkEnd w:id="92"/>
-    <w:bookmarkStart w:id="94" w:name="ref-Sun2023automatic"/>
+    <w:bookmarkEnd w:id="98"/>
+    <w:bookmarkStart w:id="100" w:name="ref-Sun2023automatic"/>
     <w:p>
       <w:pPr>
         <w:pStyle w:val="Bibliography"/>
@@ -8123,7 +8374,7 @@
       <w:r>
         <w:t xml:space="preserve"> </w:t>
       </w:r>
-      <w:hyperlink r:id="rId93">
+      <w:hyperlink r:id="rId99">
         <w:r>
           <w:rPr>
             <w:rStyle w:val="Hyperlink"/>
@@ -8132,8 +8383,8 @@
         </w:r>
       </w:hyperlink>
     </w:p>
-    <w:bookmarkEnd w:id="94"/>
-    <w:bookmarkStart w:id="96" w:name="ref-Wei2023optimizing"/>
+    <w:bookmarkEnd w:id="100"/>
+    <w:bookmarkStart w:id="102" w:name="ref-Wei2023optimizing"/>
     <w:p>
       <w:pPr>
         <w:pStyle w:val="Bibliography"/>
@@ -8147,7 +8398,7 @@
       <w:r>
         <w:t xml:space="preserve"> </w:t>
       </w:r>
-      <w:hyperlink r:id="rId95">
+      <w:hyperlink r:id="rId101">
         <w:r>
           <w:rPr>
             <w:rStyle w:val="Hyperlink"/>
@@ -8156,8 +8407,8 @@
         </w:r>
       </w:hyperlink>
     </w:p>
-    <w:bookmarkEnd w:id="96"/>
-    <w:bookmarkStart w:id="98" w:name="ref-Yang2021research"/>
+    <w:bookmarkEnd w:id="102"/>
+    <w:bookmarkStart w:id="104" w:name="ref-Yang2021research"/>
     <w:p>
       <w:pPr>
         <w:pStyle w:val="Bibliography"/>
@@ -8171,7 +8422,7 @@
       <w:r>
         <w:t xml:space="preserve"> </w:t>
       </w:r>
-      <w:hyperlink r:id="rId97">
+      <w:hyperlink r:id="rId103">
         <w:r>
           <w:rPr>
             <w:rStyle w:val="Hyperlink"/>
@@ -8180,8 +8431,8 @@
         </w:r>
       </w:hyperlink>
     </w:p>
-    <w:bookmarkEnd w:id="98"/>
-    <w:bookmarkStart w:id="100" w:name="ref-Yao2022large"/>
+    <w:bookmarkEnd w:id="104"/>
+    <w:bookmarkStart w:id="106" w:name="ref-Yao2022large"/>
     <w:p>
       <w:pPr>
         <w:pStyle w:val="Bibliography"/>
@@ -8195,7 +8446,7 @@
       <w:r>
         <w:t xml:space="preserve"> </w:t>
       </w:r>
-      <w:hyperlink r:id="rId99">
+      <w:hyperlink r:id="rId105">
         <w:r>
           <w:rPr>
             <w:rStyle w:val="Hyperlink"/>
@@ -8204,8 +8455,8 @@
         </w:r>
       </w:hyperlink>
     </w:p>
-    <w:bookmarkEnd w:id="100"/>
-    <w:bookmarkStart w:id="102" w:name="ref-Yu2020highway"/>
+    <w:bookmarkEnd w:id="106"/>
+    <w:bookmarkStart w:id="108" w:name="ref-Yu2020highway"/>
     <w:p>
       <w:pPr>
         <w:pStyle w:val="Bibliography"/>
@@ -8219,7 +8470,7 @@
       <w:r>
         <w:t xml:space="preserve"> </w:t>
       </w:r>
-      <w:hyperlink r:id="rId101">
+      <w:hyperlink r:id="rId107">
         <w:r>
           <w:rPr>
             <w:rStyle w:val="Hyperlink"/>
@@ -8228,8 +8479,8 @@
         </w:r>
       </w:hyperlink>
     </w:p>
-    <w:bookmarkEnd w:id="102"/>
-    <w:bookmarkStart w:id="104" w:name="ref-Zeiada2025benchmarking"/>
+    <w:bookmarkEnd w:id="108"/>
+    <w:bookmarkStart w:id="110" w:name="ref-Zeiada2025benchmarking"/>
     <w:p>
       <w:pPr>
         <w:pStyle w:val="Bibliography"/>
@@ -8243,7 +8494,7 @@
       <w:r>
         <w:t xml:space="preserve"> </w:t>
       </w:r>
-      <w:hyperlink r:id="rId103">
+      <w:hyperlink r:id="rId109">
         <w:r>
           <w:rPr>
             <w:rStyle w:val="Hyperlink"/>
@@ -8252,9 +8503,9 @@
         </w:r>
       </w:hyperlink>
     </w:p>
-    <w:bookmarkEnd w:id="104"/>
-    <w:bookmarkEnd w:id="105"/>
-    <w:bookmarkEnd w:id="106"/>
+    <w:bookmarkEnd w:id="110"/>
+    <w:bookmarkEnd w:id="111"/>
+    <w:bookmarkEnd w:id="112"/>
     <w:sectPr/>
   </w:body>
 </w:document>

</xml_diff>

<commit_message>
Phase 7: corrected transposed author name (Xiao, not Wei); documented 8-paper same-substrate series by one author team (CRCP LTPP, 33 sections) with concrete leakage-risk argument; corpus to 83 records, 68 classified primary; 24-page clean render
</commit_message>
<xml_diff>
--- a/output/manuscript.docx
+++ b/output/manuscript.docx
@@ -2635,7 +2635,7 @@
         <w:pStyle w:val="FirstParagraph"/>
       </w:pPr>
       <w:r>
-        <w:t xml:space="preserve">Of the 61 primary studies coded so far,</w:t>
+        <w:t xml:space="preserve">Of the 68 primary studies coded so far,</w:t>
       </w:r>
       <w:r>
         <w:t xml:space="preserve"> </w:t>
@@ -2670,7 +2670,7 @@
         <w:t xml:space="preserve"> </w:t>
       </w:r>
       <w:r>
-        <w:t xml:space="preserve">of 61 — do not qualify as hybrid under the structural test in</w:t>
+        <w:t xml:space="preserve">of 68 — do not qualify as hybrid under the structural test in</w:t>
       </w:r>
       <w:r>
         <w:t xml:space="preserve"> </w:t>
@@ -4341,37 +4341,115 @@
         <w:t xml:space="preserve"> </w:t>
       </w:r>
       <w:r>
-        <w:t xml:space="preserve">in the review methodology is most concrete rather than abstract. Two studies by</w:t>
-      </w:r>
-      <w:r>
-        <w:t xml:space="preserve"> </w:t>
-      </w:r>
-      <w:r>
-        <w:t xml:space="preserve">overlapping author teams,</w:t>
-      </w:r>
-      <w:r>
-        <w:t xml:space="preserve"> </w:t>
-      </w:r>
-      <w:r>
-        <w:t xml:space="preserve">Alnaqbi et al. (2025)</w:t>
-      </w:r>
-      <w:r>
-        <w:t xml:space="preserve"> </w:t>
-      </w:r>
-      <w:r>
-        <w:t xml:space="preserve">and a related 2026 gradient-boosting</w:t>
-      </w:r>
-      <w:r>
-        <w:t xml:space="preserve"> </w:t>
-      </w:r>
-      <w:r>
-        <w:t xml:space="preserve">variant, both draw on the same 395-observation, 33-section continuously-reinforced-</w:t>
-      </w:r>
-      <w:r>
-        <w:t xml:space="preserve"> </w:t>
-      </w:r>
-      <w:r>
-        <w:t xml:space="preserve">concrete-pavement LTPP substrate and both report R</w:t>
+        <w:t xml:space="preserve">in the review methodology is most concrete rather than abstract. A single</w:t>
+      </w:r>
+      <w:r>
+        <w:t xml:space="preserve"> </w:t>
+      </w:r>
+      <w:r>
+        <w:t xml:space="preserve">overlapping author team — Alnaqbi, Zeiada and Al-Khateeb, joined variously by</w:t>
+      </w:r>
+      <w:r>
+        <w:t xml:space="preserve"> </w:t>
+      </w:r>
+      <w:r>
+        <w:t xml:space="preserve">Abuzwidah, Hamad and Barakat across different papers — has published at least</w:t>
+      </w:r>
+      <w:r>
+        <w:t xml:space="preserve"> </w:t>
+      </w:r>
+      <w:r>
+        <w:t xml:space="preserve">eight studies located so far, all drawing on what appears to be the same</w:t>
+      </w:r>
+      <w:r>
+        <w:t xml:space="preserve"> </w:t>
+      </w:r>
+      <w:r>
+        <w:t xml:space="preserve">approximately 33-section, 385–395-observation continuously-reinforced-concrete-</w:t>
+      </w:r>
+      <w:r>
+        <w:t xml:space="preserve"> </w:t>
+      </w:r>
+      <w:r>
+        <w:t xml:space="preserve">pavement substrate from LTPP, each pairing a different metaheuristic (chiefly PSO</w:t>
+      </w:r>
+      <w:r>
+        <w:t xml:space="preserve"> </w:t>
+      </w:r>
+      <w:r>
+        <w:t xml:space="preserve">or a genetic algorithm) with a different base learner (chiefly SVR or a gradient</w:t>
+      </w:r>
+      <w:r>
+        <w:t xml:space="preserve"> </w:t>
+      </w:r>
+      <w:r>
+        <w:t xml:space="preserve">boosting machine) to predict a different single target variable — international</w:t>
+      </w:r>
+      <w:r>
+        <w:t xml:space="preserve"> </w:t>
+      </w:r>
+      <w:r>
+        <w:t xml:space="preserve">roughness index</w:t>
+      </w:r>
+      <w:r>
+        <w:t xml:space="preserve"> </w:t>
+      </w:r>
+      <w:r>
+        <w:t xml:space="preserve">(Alnaqbi et al., 2025f, 2025e, 2025a)</w:t>
+      </w:r>
+      <w:r>
+        <w:t xml:space="preserve">,</w:t>
+      </w:r>
+      <w:r>
+        <w:t xml:space="preserve"> </w:t>
+      </w:r>
+      <w:r>
+        <w:t xml:space="preserve">longitudinal cracking</w:t>
+      </w:r>
+      <w:r>
+        <w:t xml:space="preserve"> </w:t>
+      </w:r>
+      <w:r>
+        <w:t xml:space="preserve">(Alnaqbi et al., 2025d, 2025b)</w:t>
+      </w:r>
+      <w:r>
+        <w:t xml:space="preserve">, spalling</w:t>
+      </w:r>
+      <w:r>
+        <w:t xml:space="preserve"> </w:t>
+      </w:r>
+      <w:r>
+        <w:t xml:space="preserve">(Alnaqbi et al., 2024)</w:t>
+      </w:r>
+      <w:r>
+        <w:t xml:space="preserve">, friction number</w:t>
+      </w:r>
+      <w:r>
+        <w:t xml:space="preserve"> </w:t>
+      </w:r>
+      <w:r>
+        <w:t xml:space="preserve">(Alnaqbi et al., 2026)</w:t>
+      </w:r>
+      <w:r>
+        <w:t xml:space="preserve">, and punchouts</w:t>
+      </w:r>
+      <w:r>
+        <w:t xml:space="preserve"> </w:t>
+      </w:r>
+      <w:r>
+        <w:t xml:space="preserve">(Alnaqbi et al., 2025c)</w:t>
+      </w:r>
+      <w:r>
+        <w:t xml:space="preserve"> </w:t>
+      </w:r>
+      <w:r>
+        <w:t xml:space="preserve">— each reported as a separate publication, each evaluated</w:t>
+      </w:r>
+      <w:r>
+        <w:t xml:space="preserve"> </w:t>
+      </w:r>
+      <w:r>
+        <w:t xml:space="preserve">by five-fold cross-validation, and each reporting R</w:t>
       </w:r>
       <w:r>
         <w:rPr>
@@ -4383,43 +4461,97 @@
         <w:t xml:space="preserve"> </w:t>
       </w:r>
       <w:r>
-        <w:t xml:space="preserve">above 0.99 under five-fold</w:t>
-      </w:r>
-      <w:r>
-        <w:t xml:space="preserve"> </w:t>
-      </w:r>
-      <w:r>
-        <w:t xml:space="preserve">cross-validation; whether the cross-validation folds respect the 33-section grouping</w:t>
-      </w:r>
-      <w:r>
-        <w:t xml:space="preserve"> </w:t>
-      </w:r>
-      <w:r>
-        <w:t xml:space="preserve">(so that no section contributes records to both the training and test partition</w:t>
-      </w:r>
-      <w:r>
-        <w:t xml:space="preserve"> </w:t>
-      </w:r>
-      <w:r>
-        <w:t xml:space="preserve">within a fold) is the single full-text question that would resolve whether these</w:t>
-      </w:r>
-      <w:r>
-        <w:t xml:space="preserve"> </w:t>
-      </w:r>
-      <w:r>
-        <w:t xml:space="preserve">results reflect genuine predictive skill or record-level leakage of the kind §2.3</w:t>
-      </w:r>
-      <w:r>
-        <w:t xml:space="preserve"> </w:t>
-      </w:r>
-      <w:r>
-        <w:t xml:space="preserve">and the PAVE-ML leakage-risk rule (§10) are built to detect, and it is flagged</w:t>
-      </w:r>
-      <w:r>
-        <w:t xml:space="preserve"> </w:t>
-      </w:r>
-      <w:r>
-        <w:t xml:space="preserve">explicitly for priority full-text extraction.</w:t>
+        <w:t xml:space="preserve">in the 0.90–0.99 range. Two</w:t>
+      </w:r>
+      <w:r>
+        <w:t xml:space="preserve"> </w:t>
+      </w:r>
+      <w:r>
+        <w:t xml:space="preserve">pairs within this set differ from one another only in which metaheuristic tunes</w:t>
+      </w:r>
+      <w:r>
+        <w:t xml:space="preserve"> </w:t>
+      </w:r>
+      <w:r>
+        <w:t xml:space="preserve">the same base learner on the same target and the same substrate:</w:t>
+      </w:r>
+      <w:r>
+        <w:t xml:space="preserve"> </w:t>
+      </w:r>
+      <w:r>
+        <w:t xml:space="preserve">Alnaqbi et al. (2025d)</w:t>
+      </w:r>
+      <w:r>
+        <w:t xml:space="preserve"> </w:t>
+      </w:r>
+      <w:r>
+        <w:t xml:space="preserve">(PSO-GBM) and</w:t>
+      </w:r>
+      <w:r>
+        <w:t xml:space="preserve"> </w:t>
+      </w:r>
+      <w:r>
+        <w:t xml:space="preserve">Alnaqbi et al. (2025b)</w:t>
+      </w:r>
+      <w:r>
+        <w:t xml:space="preserve"> </w:t>
+      </w:r>
+      <w:r>
+        <w:t xml:space="preserve">(GA-GBM) both predict</w:t>
+      </w:r>
+      <w:r>
+        <w:t xml:space="preserve"> </w:t>
+      </w:r>
+      <w:r>
+        <w:t xml:space="preserve">longitudinal cracking;</w:t>
+      </w:r>
+      <w:r>
+        <w:t xml:space="preserve"> </w:t>
+      </w:r>
+      <w:r>
+        <w:t xml:space="preserve">Alnaqbi et al. (2025f)</w:t>
+      </w:r>
+      <w:r>
+        <w:t xml:space="preserve"> </w:t>
+      </w:r>
+      <w:r>
+        <w:t xml:space="preserve">(PSO-SVR),</w:t>
+      </w:r>
+      <w:r>
+        <w:t xml:space="preserve"> </w:t>
+      </w:r>
+      <w:r>
+        <w:t xml:space="preserve">Alnaqbi et al. (2025e)</w:t>
+      </w:r>
+      <w:r>
+        <w:t xml:space="preserve"> </w:t>
+      </w:r>
+      <w:r>
+        <w:t xml:space="preserve">(PSO-GBM)</w:t>
+      </w:r>
+      <w:r>
+        <w:t xml:space="preserve"> </w:t>
+      </w:r>
+      <w:r>
+        <w:t xml:space="preserve">and</w:t>
+      </w:r>
+      <w:r>
+        <w:t xml:space="preserve"> </w:t>
+      </w:r>
+      <w:r>
+        <w:t xml:space="preserve">Alnaqbi et al. (2025a)</w:t>
+      </w:r>
+      <w:r>
+        <w:t xml:space="preserve"> </w:t>
+      </w:r>
+      <w:r>
+        <w:t xml:space="preserve">(GA-SVR) all predict IRI on what the papers describe as the</w:t>
+      </w:r>
+      <w:r>
+        <w:t xml:space="preserve"> </w:t>
+      </w:r>
+      <w:r>
+        <w:t xml:space="preserve">identical 395-observation, 33-section pool.</w:t>
       </w:r>
     </w:p>
     <w:p>
@@ -4427,55 +4559,64 @@
         <w:pStyle w:val="BodyText"/>
       </w:pPr>
       <w:r>
-        <w:t xml:space="preserve">Wei et al.</w:t>
-      </w:r>
-      <w:r>
-        <w:t xml:space="preserve"> </w:t>
-      </w:r>
-      <w:r>
-        <w:t xml:space="preserve">(</w:t>
-      </w:r>
-      <w:r>
-        <w:t xml:space="preserve">Wei et al.</w:t>
-      </w:r>
-      <w:r>
-        <w:t xml:space="preserve">, 2023)</w:t>
-      </w:r>
-      <w:r>
-        <w:t xml:space="preserve"> </w:t>
-      </w:r>
-      <w:r>
-        <w:t xml:space="preserve">illustrate the same concern in a different form: a</w:t>
-      </w:r>
-      <w:r>
-        <w:t xml:space="preserve"> </w:t>
-      </w:r>
-      <w:r>
-        <w:t xml:space="preserve">tree-structured Parzen estimator tunes a CatBoost model for rigid-pavement faulting</w:t>
-      </w:r>
-      <w:r>
-        <w:t xml:space="preserve"> </w:t>
-      </w:r>
-      <w:r>
-        <w:t xml:space="preserve">on 160 LTPP observations across 17 candidate variables, with Boruta feature</w:t>
-      </w:r>
-      <w:r>
-        <w:t xml:space="preserve"> </w:t>
-      </w:r>
-      <w:r>
-        <w:t xml:space="preserve">selection applied as a preprocessing step whose position relative to the train/test</w:t>
-      </w:r>
-      <w:r>
-        <w:t xml:space="preserve"> </w:t>
-      </w:r>
-      <w:r>
-        <w:t xml:space="preserve">split is not established from the abstract alone — precisely the ambiguous case the</w:t>
-      </w:r>
-      <w:r>
-        <w:t xml:space="preserve"> </w:t>
-      </w:r>
-      <w:r>
-        <w:t xml:space="preserve">PAVE-ML leakage-risk rule (§10) codes as</w:t>
+        <w:t xml:space="preserve">None of this is concealed —</w:t>
+      </w:r>
+      <w:r>
+        <w:t xml:space="preserve"> </w:t>
+      </w:r>
+      <w:r>
+        <w:t xml:space="preserve">Alnaqbi et al. (2025c)</w:t>
+      </w:r>
+      <w:r>
+        <w:t xml:space="preserve">’s own reference list cites six</w:t>
+      </w:r>
+      <w:r>
+        <w:t xml:space="preserve"> </w:t>
+      </w:r>
+      <w:r>
+        <w:t xml:space="preserve">other papers from the same series, so the pattern is not hidden, only</w:t>
+      </w:r>
+      <w:r>
+        <w:t xml:space="preserve"> </w:t>
+      </w:r>
+      <w:r>
+        <w:t xml:space="preserve">undiscussed. What none of the eight papers examined so far states explicitly is</w:t>
+      </w:r>
+      <w:r>
+        <w:t xml:space="preserve"> </w:t>
+      </w:r>
+      <w:r>
+        <w:t xml:space="preserve">whether the five-fold cross-validation in each is grouped at the section level, so</w:t>
+      </w:r>
+      <w:r>
+        <w:t xml:space="preserve"> </w:t>
+      </w:r>
+      <w:r>
+        <w:t xml:space="preserve">that no CRCP section contributes observations to both the training and the test</w:t>
+      </w:r>
+      <w:r>
+        <w:t xml:space="preserve"> </w:t>
+      </w:r>
+      <w:r>
+        <w:t xml:space="preserve">partition within a fold. With roughly twelve observations per section on average</w:t>
+      </w:r>
+      <w:r>
+        <w:t xml:space="preserve"> </w:t>
+      </w:r>
+      <w:r>
+        <w:t xml:space="preserve">(395 observations across 33 sections), an ungrouped random split would place</w:t>
+      </w:r>
+      <w:r>
+        <w:t xml:space="preserve"> </w:t>
+      </w:r>
+      <w:r>
+        <w:t xml:space="preserve">multiple, highly correlated records from the same physical section on both sides</w:t>
+      </w:r>
+      <w:r>
+        <w:t xml:space="preserve"> </w:t>
+      </w:r>
+      <w:r>
+        <w:t xml:space="preserve">of most folds — precisely the leakage pathway the PAVE-ML rule for</w:t>
       </w:r>
       <w:r>
         <w:t xml:space="preserve"> </w:t>
@@ -4484,19 +4625,162 @@
         <w:rPr>
           <w:rStyle w:val="VerbatimChar"/>
         </w:rPr>
-        <w:t xml:space="preserve">moderate</w:t>
-      </w:r>
-      <w:r>
-        <w:t xml:space="preserve"> </w:t>
-      </w:r>
-      <w:r>
-        <w:t xml:space="preserve">pending full-text confirmation,</w:t>
-      </w:r>
-      <w:r>
-        <w:t xml:space="preserve"> </w:t>
-      </w:r>
-      <w:r>
-        <w:t xml:space="preserve">rather than assumed innocent or guilty by default.</w:t>
+        <w:t xml:space="preserve">leakage_risk</w:t>
+      </w:r>
+      <w:r>
+        <w:t xml:space="preserve"> </w:t>
+      </w:r>
+      <w:r>
+        <w:t xml:space="preserve">(§10) is written to catch, and precisely the reason each of these</w:t>
+      </w:r>
+      <w:r>
+        <w:t xml:space="preserve"> </w:t>
+      </w:r>
+      <w:r>
+        <w:t xml:space="preserve">eight papers is coded</w:t>
+      </w:r>
+      <w:r>
+        <w:t xml:space="preserve"> </w:t>
+      </w:r>
+      <w:r>
+        <w:rPr>
+          <w:rStyle w:val="VerbatimChar"/>
+        </w:rPr>
+        <w:t xml:space="preserve">high</w:t>
+      </w:r>
+      <w:r>
+        <w:t xml:space="preserve"> </w:t>
+      </w:r>
+      <w:r>
+        <w:t xml:space="preserve">risk pending full-text confirmation rather than</w:t>
+      </w:r>
+      <w:r>
+        <w:t xml:space="preserve"> </w:t>
+      </w:r>
+      <w:r>
+        <w:t xml:space="preserve">assumed innocent by the convention adopted in §2. Xiao et al.’s TPE-CatBoost</w:t>
+      </w:r>
+      <w:r>
+        <w:t xml:space="preserve"> </w:t>
+      </w:r>
+      <w:r>
+        <w:t xml:space="preserve">faulting model</w:t>
+      </w:r>
+      <w:r>
+        <w:t xml:space="preserve"> </w:t>
+      </w:r>
+      <w:r>
+        <w:t xml:space="preserve">(Xiao et al., 2023)</w:t>
+      </w:r>
+      <w:r>
+        <w:t xml:space="preserve"> </w:t>
+      </w:r>
+      <w:r>
+        <w:t xml:space="preserve">adds a second, independent instance of the</w:t>
+      </w:r>
+      <w:r>
+        <w:t xml:space="preserve"> </w:t>
+      </w:r>
+      <w:r>
+        <w:t xml:space="preserve">same ambiguity on a different substrate: Boruta feature selection is described as</w:t>
+      </w:r>
+      <w:r>
+        <w:t xml:space="preserve"> </w:t>
+      </w:r>
+      <w:r>
+        <w:t xml:space="preserve">preceding TPE hyperparameter tuning, but neither the paper’s abstract nor its</w:t>
+      </w:r>
+      <w:r>
+        <w:t xml:space="preserve"> </w:t>
+      </w:r>
+      <w:r>
+        <w:t xml:space="preserve">available summary states whether Boruta was fitted on the training partition alone</w:t>
+      </w:r>
+      <w:r>
+        <w:t xml:space="preserve"> </w:t>
+      </w:r>
+      <w:r>
+        <w:t xml:space="preserve">or on the full 160-observation pool before any split was made.</w:t>
+      </w:r>
+    </w:p>
+    <w:p>
+      <w:pPr>
+        <w:pStyle w:val="BodyText"/>
+      </w:pPr>
+      <w:r>
+        <w:t xml:space="preserve">Two things distinguish this section’s treatment of the near-duplicate-substrate</w:t>
+      </w:r>
+      <w:r>
+        <w:t xml:space="preserve"> </w:t>
+      </w:r>
+      <w:r>
+        <w:t xml:space="preserve">problem from a general methodological aside. First, the count is now large enough</w:t>
+      </w:r>
+      <w:r>
+        <w:t xml:space="preserve"> </w:t>
+      </w:r>
+      <w:r>
+        <w:t xml:space="preserve">— eight identified papers, likely more once the full harvest is complete — that</w:t>
+      </w:r>
+      <w:r>
+        <w:t xml:space="preserve"> </w:t>
+      </w:r>
+      <w:r>
+        <w:t xml:space="preserve">the completed review can report a systematic finding rather than gesture at a</w:t>
+      </w:r>
+      <w:r>
+        <w:t xml:space="preserve"> </w:t>
+      </w:r>
+      <w:r>
+        <w:t xml:space="preserve">concern: what fraction of this specific author team’s substrate-sharing series</w:t>
+      </w:r>
+      <w:r>
+        <w:t xml:space="preserve"> </w:t>
+      </w:r>
+      <w:r>
+        <w:t xml:space="preserve">groups its cross-validation folds by section, once every paper’s methods section</w:t>
+      </w:r>
+      <w:r>
+        <w:t xml:space="preserve"> </w:t>
+      </w:r>
+      <w:r>
+        <w:t xml:space="preserve">has been read in full. Second, the pattern usefully illustrates a broader point</w:t>
+      </w:r>
+      <w:r>
+        <w:t xml:space="preserve"> </w:t>
+      </w:r>
+      <w:r>
+        <w:t xml:space="preserve">this review returns to in §11: an unlimited supply of near-identical papers</w:t>
+      </w:r>
+      <w:r>
+        <w:t xml:space="preserve"> </w:t>
+      </w:r>
+      <w:r>
+        <w:t xml:space="preserve">reporting R</w:t>
+      </w:r>
+      <w:r>
+        <w:rPr>
+          <w:vertAlign w:val="superscript"/>
+        </w:rPr>
+        <w:t xml:space="preserve">2</w:t>
+      </w:r>
+      <w:r>
+        <w:t xml:space="preserve"> </w:t>
+      </w:r>
+      <w:r>
+        <w:t xml:space="preserve">above 0.90 on the same underlying 33 physical objects, whatever its</w:t>
+      </w:r>
+      <w:r>
+        <w:t xml:space="preserve"> </w:t>
+      </w:r>
+      <w:r>
+        <w:t xml:space="preserve">cause, produces exactly the appearance of a mature and thoroughly validated</w:t>
+      </w:r>
+      <w:r>
+        <w:t xml:space="preserve"> </w:t>
+      </w:r>
+      <w:r>
+        <w:t xml:space="preserve">sub-field that the rigour audit is designed to test.</w:t>
       </w:r>
     </w:p>
     <w:p>
@@ -7111,37 +7395,55 @@
           <w:b/>
           <w:bCs/>
         </w:rPr>
-        <w:t xml:space="preserve">Section-grouped partitioning for LTPP-derived studies.</w:t>
-      </w:r>
-      <w:r>
-        <w:t xml:space="preserve"> </w:t>
-      </w:r>
-      <w:r>
-        <w:t xml:space="preserve">Several</w:t>
-      </w:r>
-      <w:r>
-        <w:t xml:space="preserve"> </w:t>
-      </w:r>
-      <w:r>
-        <w:t xml:space="preserve">performance-prediction studies share overlapping LTPP substrates (§7). A</w:t>
-      </w:r>
-      <w:r>
-        <w:t xml:space="preserve"> </w:t>
-      </w:r>
-      <w:r>
-        <w:t xml:space="preserve">systematic re-derivation, from the LTPP database directly, of whether published</w:t>
-      </w:r>
-      <w:r>
-        <w:t xml:space="preserve"> </w:t>
-      </w:r>
-      <w:r>
-        <w:t xml:space="preserve">cross-validation folds respect section-level grouping would settle a question</w:t>
-      </w:r>
-      <w:r>
-        <w:t xml:space="preserve"> </w:t>
-      </w:r>
-      <w:r>
-        <w:t xml:space="preserve">the published papers’ abstracts cannot.</w:t>
+        <w:t xml:space="preserve">Section-grouped partitioning for the CRCP substrate series.</w:t>
+      </w:r>
+      <w:r>
+        <w:t xml:space="preserve"> </w:t>
+      </w:r>
+      <w:r>
+        <w:t xml:space="preserve">At least eight</w:t>
+      </w:r>
+      <w:r>
+        <w:t xml:space="preserve"> </w:t>
+      </w:r>
+      <w:r>
+        <w:t xml:space="preserve">papers by one overlapping author team share a single ~33-section CRCP LTPP</w:t>
+      </w:r>
+      <w:r>
+        <w:t xml:space="preserve"> </w:t>
+      </w:r>
+      <w:r>
+        <w:t xml:space="preserve">substrate (§7). A systematic re-derivation, from the LTPP database directly,</w:t>
+      </w:r>
+      <w:r>
+        <w:t xml:space="preserve"> </w:t>
+      </w:r>
+      <w:r>
+        <w:t xml:space="preserve">of whether each paper’s published cross-validation folds respect section-level</w:t>
+      </w:r>
+      <w:r>
+        <w:t xml:space="preserve"> </w:t>
+      </w:r>
+      <w:r>
+        <w:t xml:space="preserve">grouping would settle a question none of the eight papers’ available abstracts</w:t>
+      </w:r>
+      <w:r>
+        <w:t xml:space="preserve"> </w:t>
+      </w:r>
+      <w:r>
+        <w:t xml:space="preserve">answers, and would be the single highest-value full-text verification task for</w:t>
+      </w:r>
+      <w:r>
+        <w:t xml:space="preserve"> </w:t>
+      </w:r>
+      <w:r>
+        <w:t xml:space="preserve">the completed audit given how much of the corpus’s rutting/cracking/IRI</w:t>
+      </w:r>
+      <w:r>
+        <w:t xml:space="preserve"> </w:t>
+      </w:r>
+      <w:r>
+        <w:t xml:space="preserve">evidence currently traces to this one substrate.</w:t>
       </w:r>
     </w:p>
     <w:p>
@@ -7792,7 +8094,7 @@
       </w:r>
     </w:p>
     <w:bookmarkEnd w:id="48"/>
-    <w:bookmarkStart w:id="112" w:name="references"/>
+    <w:bookmarkStart w:id="126" w:name="references"/>
     <w:p>
       <w:pPr>
         <w:pStyle w:val="Heading1"/>
@@ -7801,7 +8103,7 @@
         <w:t xml:space="preserve">References</w:t>
       </w:r>
     </w:p>
-    <w:bookmarkStart w:id="111" w:name="refs"/>
+    <w:bookmarkStart w:id="125" w:name="refs"/>
     <w:bookmarkStart w:id="50" w:name="ref-Alhussan2022pothole"/>
     <w:p>
       <w:pPr>
@@ -7823,18 +8125,165 @@
       </w:hyperlink>
     </w:p>
     <w:bookmarkEnd w:id="50"/>
-    <w:bookmarkStart w:id="52" w:name="ref-Alnaqbi2025learning"/>
+    <w:bookmarkStart w:id="52" w:name="ref-Alnaqbi2025high"/>
     <w:p>
       <w:pPr>
         <w:pStyle w:val="Bibliography"/>
       </w:pPr>
       <w:r>
-        <w:t xml:space="preserve">Alnaqbi, A., Zeiada, W., Al-Khateeb, G.G., 2025. A hybrid machine learning method of support vector regression with particle swarm optimization for predicting IRI in continuously reinforced concrete pavement. J. Eng. Appl. Sci.</w:t>
+        <w:t xml:space="preserve">Alnaqbi, A., Al-Khateeb, G.G., Zeiada, W., 2025a. High-accuracy prediction of roughness in CRCP using a hybrid genetic algorithm–SVR approach. J. Umm Al-Qura Univ. Eng. Archit.</w:t>
       </w:r>
       <w:r>
         <w:t xml:space="preserve"> </w:t>
       </w:r>
       <w:hyperlink r:id="rId51">
+        <w:r>
+          <w:rPr>
+            <w:rStyle w:val="Hyperlink"/>
+          </w:rPr>
+          <w:t xml:space="preserve">https://doi.org/10.1007/s43995-025-00214-0</w:t>
+        </w:r>
+      </w:hyperlink>
+    </w:p>
+    <w:bookmarkEnd w:id="52"/>
+    <w:bookmarkStart w:id="54" w:name="ref-Alnaqbi2025optimized"/>
+    <w:p>
+      <w:pPr>
+        <w:pStyle w:val="Bibliography"/>
+      </w:pPr>
+      <w:r>
+        <w:t xml:space="preserve">Alnaqbi, A., Al-Khateeb, G.G., Zeiada, W., 2025b. Optimized prediction of longitudinal cracking in concrete pavements using hybrid GA-GBM models. J. Building Pathol. Rehabil.</w:t>
+      </w:r>
+      <w:r>
+        <w:t xml:space="preserve"> </w:t>
+      </w:r>
+      <w:hyperlink r:id="rId53">
+        <w:r>
+          <w:rPr>
+            <w:rStyle w:val="Hyperlink"/>
+          </w:rPr>
+          <w:t xml:space="preserve">https://doi.org/10.1007/s41024-025-00667-9</w:t>
+        </w:r>
+      </w:hyperlink>
+    </w:p>
+    <w:bookmarkEnd w:id="54"/>
+    <w:bookmarkStart w:id="56" w:name="ref-Alnaqbi2025optimizing"/>
+    <w:p>
+      <w:pPr>
+        <w:pStyle w:val="Bibliography"/>
+      </w:pPr>
+      <w:r>
+        <w:t xml:space="preserve">Alnaqbi, A., Al-Khateeb, G.G., Zeiada, W., 2025c. Optimizing punchout prediction in rigid pavement using a hybrid GA-SVR approach. Discover Civil Engineering.</w:t>
+      </w:r>
+      <w:r>
+        <w:t xml:space="preserve"> </w:t>
+      </w:r>
+      <w:hyperlink r:id="rId55">
+        <w:r>
+          <w:rPr>
+            <w:rStyle w:val="Hyperlink"/>
+          </w:rPr>
+          <w:t xml:space="preserve">https://doi.org/10.1007/s44290-025-00381-y</w:t>
+        </w:r>
+      </w:hyperlink>
+    </w:p>
+    <w:bookmarkEnd w:id="56"/>
+    <w:bookmarkStart w:id="58" w:name="ref-Alnaqbi2025predictive"/>
+    <w:p>
+      <w:pPr>
+        <w:pStyle w:val="Bibliography"/>
+      </w:pPr>
+      <w:r>
+        <w:t xml:space="preserve">Alnaqbi, A., Al-Khateeb, G., Zeiada, W., 2025d. Predictive modeling of longitudinal cracking in CRCP using PSO-tuned gradient boosting machines. J. Eng. Appl. Sci.</w:t>
+      </w:r>
+      <w:r>
+        <w:t xml:space="preserve"> </w:t>
+      </w:r>
+      <w:hyperlink r:id="rId57">
+        <w:r>
+          <w:rPr>
+            <w:rStyle w:val="Hyperlink"/>
+          </w:rPr>
+          <w:t xml:space="preserve">https://doi.org/10.1186/s44147-025-00623-x</w:t>
+        </w:r>
+      </w:hyperlink>
+    </w:p>
+    <w:bookmarkEnd w:id="58"/>
+    <w:bookmarkStart w:id="60" w:name="ref-Alnaqbi2024approach"/>
+    <w:p>
+      <w:pPr>
+        <w:pStyle w:val="Bibliography"/>
+      </w:pPr>
+      <w:r>
+        <w:t xml:space="preserve">Alnaqbi, A., Al-Khateeb, G., Zeiada, W., 2024. A hybrid approach of support vector regression with genetic algorithm optimization for predicting spalling in continuously reinforced concrete pavement. J. Building Pathol. Rehabil.</w:t>
+      </w:r>
+      <w:r>
+        <w:t xml:space="preserve"> </w:t>
+      </w:r>
+      <w:hyperlink r:id="rId59">
+        <w:r>
+          <w:rPr>
+            <w:rStyle w:val="Hyperlink"/>
+          </w:rPr>
+          <w:t xml:space="preserve">https://doi.org/10.1007/s41024-024-00499-z</w:t>
+        </w:r>
+      </w:hyperlink>
+    </w:p>
+    <w:bookmarkEnd w:id="60"/>
+    <w:bookmarkStart w:id="62" w:name="ref-Alnaqbi2026friction"/>
+    <w:p>
+      <w:pPr>
+        <w:pStyle w:val="Bibliography"/>
+      </w:pPr>
+      <w:r>
+        <w:t xml:space="preserve">Alnaqbi, A.J., Zeiada, W., Al-Khateeb, G.G., 2026. Predicting friction number in CRCP using GA-optimized gradient boosting machines. Construction Materials.</w:t>
+      </w:r>
+      <w:r>
+        <w:t xml:space="preserve"> </w:t>
+      </w:r>
+      <w:hyperlink r:id="rId61">
+        <w:r>
+          <w:rPr>
+            <w:rStyle w:val="Hyperlink"/>
+          </w:rPr>
+          <w:t xml:space="preserve">https://doi.org/10.3390/constrmater6010006</w:t>
+        </w:r>
+      </w:hyperlink>
+    </w:p>
+    <w:bookmarkEnd w:id="62"/>
+    <w:bookmarkStart w:id="64" w:name="ref-Alnaqbi2025tuned"/>
+    <w:p>
+      <w:pPr>
+        <w:pStyle w:val="Bibliography"/>
+      </w:pPr>
+      <w:r>
+        <w:t xml:space="preserve">Alnaqbi, A., Zeiada, W., Al-Khateeb, G., 2025e. A PSO-tuned gradient boosting model for accurate IRI prediction in continuously reinforced concrete pavements. Innovative Infrastructure Solutions.</w:t>
+      </w:r>
+      <w:r>
+        <w:t xml:space="preserve"> </w:t>
+      </w:r>
+      <w:hyperlink r:id="rId63">
+        <w:r>
+          <w:rPr>
+            <w:rStyle w:val="Hyperlink"/>
+          </w:rPr>
+          <w:t xml:space="preserve">https://doi.org/10.1007/s41062-025-02249-7</w:t>
+        </w:r>
+      </w:hyperlink>
+    </w:p>
+    <w:bookmarkEnd w:id="64"/>
+    <w:bookmarkStart w:id="66" w:name="ref-Alnaqbi2025learning"/>
+    <w:p>
+      <w:pPr>
+        <w:pStyle w:val="Bibliography"/>
+      </w:pPr>
+      <w:r>
+        <w:t xml:space="preserve">Alnaqbi, A., Zeiada, W., Al-Khateeb, G.G., 2025f. A hybrid machine learning method of support vector regression with particle swarm optimization for predicting IRI in continuously reinforced concrete pavement. J. Eng. Appl. Sci.</w:t>
+      </w:r>
+      <w:r>
+        <w:t xml:space="preserve"> </w:t>
+      </w:r>
+      <w:hyperlink r:id="rId65">
         <w:r>
           <w:rPr>
             <w:rStyle w:val="Hyperlink"/>
@@ -7843,8 +8292,8 @@
         </w:r>
       </w:hyperlink>
     </w:p>
-    <w:bookmarkEnd w:id="52"/>
-    <w:bookmarkStart w:id="54" w:name="ref-Alshawabkeh2023automated"/>
+    <w:bookmarkEnd w:id="66"/>
+    <w:bookmarkStart w:id="68" w:name="ref-Alshawabkeh2023automated"/>
     <w:p>
       <w:pPr>
         <w:pStyle w:val="Bibliography"/>
@@ -7858,7 +8307,7 @@
       <w:r>
         <w:t xml:space="preserve"> </w:t>
       </w:r>
-      <w:hyperlink r:id="rId53">
+      <w:hyperlink r:id="rId67">
         <w:r>
           <w:rPr>
             <w:rStyle w:val="Hyperlink"/>
@@ -7867,8 +8316,8 @@
         </w:r>
       </w:hyperlink>
     </w:p>
-    <w:bookmarkEnd w:id="54"/>
-    <w:bookmarkStart w:id="56" w:name="ref-Azam2022resilient"/>
+    <w:bookmarkEnd w:id="68"/>
+    <w:bookmarkStart w:id="70" w:name="ref-Azam2022resilient"/>
     <w:p>
       <w:pPr>
         <w:pStyle w:val="Bibliography"/>
@@ -7882,7 +8331,7 @@
       <w:r>
         <w:t xml:space="preserve"> </w:t>
       </w:r>
-      <w:hyperlink r:id="rId55">
+      <w:hyperlink r:id="rId69">
         <w:r>
           <w:rPr>
             <w:rStyle w:val="Hyperlink"/>
@@ -7891,8 +8340,8 @@
         </w:r>
       </w:hyperlink>
     </w:p>
-    <w:bookmarkEnd w:id="56"/>
-    <w:bookmarkStart w:id="58" w:name="ref-Cao2020pavement"/>
+    <w:bookmarkEnd w:id="70"/>
+    <w:bookmarkStart w:id="72" w:name="ref-Cao2020pavement"/>
     <w:p>
       <w:pPr>
         <w:pStyle w:val="Bibliography"/>
@@ -7903,7 +8352,7 @@
       <w:r>
         <w:t xml:space="preserve"> </w:t>
       </w:r>
-      <w:hyperlink r:id="rId57">
+      <w:hyperlink r:id="rId71">
         <w:r>
           <w:rPr>
             <w:rStyle w:val="Hyperlink"/>
@@ -7912,8 +8361,8 @@
         </w:r>
       </w:hyperlink>
     </w:p>
-    <w:bookmarkEnd w:id="58"/>
-    <w:bookmarkStart w:id="60" w:name="ref-Deng2023rutting"/>
+    <w:bookmarkEnd w:id="72"/>
+    <w:bookmarkStart w:id="74" w:name="ref-Deng2023rutting"/>
     <w:p>
       <w:pPr>
         <w:pStyle w:val="Bibliography"/>
@@ -7924,7 +8373,7 @@
       <w:r>
         <w:t xml:space="preserve"> </w:t>
       </w:r>
-      <w:hyperlink r:id="rId59">
+      <w:hyperlink r:id="rId73">
         <w:r>
           <w:rPr>
             <w:rStyle w:val="Hyperlink"/>
@@ -7933,8 +8382,8 @@
         </w:r>
       </w:hyperlink>
     </w:p>
-    <w:bookmarkEnd w:id="60"/>
-    <w:bookmarkStart w:id="62" w:name="ref-Elbagalati2017neural"/>
+    <w:bookmarkEnd w:id="74"/>
+    <w:bookmarkStart w:id="76" w:name="ref-Elbagalati2017neural"/>
     <w:p>
       <w:pPr>
         <w:pStyle w:val="Bibliography"/>
@@ -7948,7 +8397,7 @@
       <w:r>
         <w:t xml:space="preserve"> </w:t>
       </w:r>
-      <w:hyperlink r:id="rId61">
+      <w:hyperlink r:id="rId75">
         <w:r>
           <w:rPr>
             <w:rStyle w:val="Hyperlink"/>
@@ -7957,8 +8406,8 @@
         </w:r>
       </w:hyperlink>
     </w:p>
-    <w:bookmarkEnd w:id="62"/>
-    <w:bookmarkStart w:id="64" w:name="ref-Elhariri2020filter"/>
+    <w:bookmarkEnd w:id="76"/>
+    <w:bookmarkStart w:id="78" w:name="ref-Elhariri2020filter"/>
     <w:p>
       <w:pPr>
         <w:pStyle w:val="Bibliography"/>
@@ -7969,7 +8418,7 @@
       <w:r>
         <w:t xml:space="preserve"> </w:t>
       </w:r>
-      <w:hyperlink r:id="rId63">
+      <w:hyperlink r:id="rId77">
         <w:r>
           <w:rPr>
             <w:rStyle w:val="Hyperlink"/>
@@ -7978,8 +8427,8 @@
         </w:r>
       </w:hyperlink>
     </w:p>
-    <w:bookmarkEnd w:id="64"/>
-    <w:bookmarkStart w:id="66" w:name="ref-Georgouli2026impact"/>
+    <w:bookmarkEnd w:id="78"/>
+    <w:bookmarkStart w:id="80" w:name="ref-Georgouli2026impact"/>
     <w:p>
       <w:pPr>
         <w:pStyle w:val="Bibliography"/>
@@ -7990,7 +8439,7 @@
       <w:r>
         <w:t xml:space="preserve"> </w:t>
       </w:r>
-      <w:hyperlink r:id="rId65">
+      <w:hyperlink r:id="rId79">
         <w:r>
           <w:rPr>
             <w:rStyle w:val="Hyperlink"/>
@@ -7999,8 +8448,8 @@
         </w:r>
       </w:hyperlink>
     </w:p>
-    <w:bookmarkEnd w:id="66"/>
-    <w:bookmarkStart w:id="68" w:name="ref-Ghanizadeh2020neural"/>
+    <w:bookmarkEnd w:id="80"/>
+    <w:bookmarkStart w:id="82" w:name="ref-Ghanizadeh2020neural"/>
     <w:p>
       <w:pPr>
         <w:pStyle w:val="Bibliography"/>
@@ -8011,7 +8460,7 @@
       <w:r>
         <w:t xml:space="preserve"> </w:t>
       </w:r>
-      <w:hyperlink r:id="rId67">
+      <w:hyperlink r:id="rId81">
         <w:r>
           <w:rPr>
             <w:rStyle w:val="Hyperlink"/>
@@ -8020,8 +8469,8 @@
         </w:r>
       </w:hyperlink>
     </w:p>
-    <w:bookmarkEnd w:id="68"/>
-    <w:bookmarkStart w:id="70" w:name="ref-Ghanizadeh2025metabackcal"/>
+    <w:bookmarkEnd w:id="82"/>
+    <w:bookmarkStart w:id="84" w:name="ref-Ghanizadeh2025metabackcal"/>
     <w:p>
       <w:pPr>
         <w:pStyle w:val="Bibliography"/>
@@ -8032,7 +8481,7 @@
       <w:r>
         <w:t xml:space="preserve"> </w:t>
       </w:r>
-      <w:hyperlink r:id="rId69">
+      <w:hyperlink r:id="rId83">
         <w:r>
           <w:rPr>
             <w:rStyle w:val="Hyperlink"/>
@@ -8041,8 +8490,8 @@
         </w:r>
       </w:hyperlink>
     </w:p>
-    <w:bookmarkEnd w:id="70"/>
-    <w:bookmarkStart w:id="72" w:name="ref-Ghanizadeh2024formulation"/>
+    <w:bookmarkEnd w:id="84"/>
+    <w:bookmarkStart w:id="86" w:name="ref-Ghanizadeh2024formulation"/>
     <w:p>
       <w:pPr>
         <w:pStyle w:val="Bibliography"/>
@@ -8056,7 +8505,7 @@
       <w:r>
         <w:t xml:space="preserve"> </w:t>
       </w:r>
-      <w:hyperlink r:id="rId71">
+      <w:hyperlink r:id="rId85">
         <w:r>
           <w:rPr>
             <w:rStyle w:val="Hyperlink"/>
@@ -8065,8 +8514,8 @@
         </w:r>
       </w:hyperlink>
     </w:p>
-    <w:bookmarkEnd w:id="72"/>
-    <w:bookmarkStart w:id="74" w:name="ref-Ghorbani2020genetic"/>
+    <w:bookmarkEnd w:id="86"/>
+    <w:bookmarkStart w:id="88" w:name="ref-Ghorbani2020genetic"/>
     <w:p>
       <w:pPr>
         <w:pStyle w:val="Bibliography"/>
@@ -8080,7 +8529,7 @@
       <w:r>
         <w:t xml:space="preserve"> </w:t>
       </w:r>
-      <w:hyperlink r:id="rId73">
+      <w:hyperlink r:id="rId87">
         <w:r>
           <w:rPr>
             <w:rStyle w:val="Hyperlink"/>
@@ -8089,8 +8538,8 @@
         </w:r>
       </w:hyperlink>
     </w:p>
-    <w:bookmarkEnd w:id="74"/>
-    <w:bookmarkStart w:id="76" w:name="ref-Gopalakrishnan2018learning"/>
+    <w:bookmarkEnd w:id="88"/>
+    <w:bookmarkStart w:id="90" w:name="ref-Gopalakrishnan2018learning"/>
     <w:p>
       <w:pPr>
         <w:pStyle w:val="Bibliography"/>
@@ -8101,7 +8550,7 @@
       <w:r>
         <w:t xml:space="preserve"> </w:t>
       </w:r>
-      <w:hyperlink r:id="rId75">
+      <w:hyperlink r:id="rId89">
         <w:r>
           <w:rPr>
             <w:rStyle w:val="Hyperlink"/>
@@ -8110,8 +8559,8 @@
         </w:r>
       </w:hyperlink>
     </w:p>
-    <w:bookmarkEnd w:id="76"/>
-    <w:bookmarkStart w:id="78" w:name="ref-Guo2025learning"/>
+    <w:bookmarkEnd w:id="90"/>
+    <w:bookmarkStart w:id="92" w:name="ref-Guo2025learning"/>
     <w:p>
       <w:pPr>
         <w:pStyle w:val="Bibliography"/>
@@ -8125,7 +8574,7 @@
       <w:r>
         <w:t xml:space="preserve"> </w:t>
       </w:r>
-      <w:hyperlink r:id="rId77">
+      <w:hyperlink r:id="rId91">
         <w:r>
           <w:rPr>
             <w:rStyle w:val="Hyperlink"/>
@@ -8134,8 +8583,8 @@
         </w:r>
       </w:hyperlink>
     </w:p>
-    <w:bookmarkEnd w:id="78"/>
-    <w:bookmarkStart w:id="80" w:name="ref-Hanandeh2022introducing"/>
+    <w:bookmarkEnd w:id="92"/>
+    <w:bookmarkStart w:id="94" w:name="ref-Hanandeh2022introducing"/>
     <w:p>
       <w:pPr>
         <w:pStyle w:val="Bibliography"/>
@@ -8146,7 +8595,7 @@
       <w:r>
         <w:t xml:space="preserve"> </w:t>
       </w:r>
-      <w:hyperlink r:id="rId79">
+      <w:hyperlink r:id="rId93">
         <w:r>
           <w:rPr>
             <w:rStyle w:val="Hyperlink"/>
@@ -8155,8 +8604,8 @@
         </w:r>
       </w:hyperlink>
     </w:p>
-    <w:bookmarkEnd w:id="80"/>
-    <w:bookmarkStart w:id="82" w:name="ref-Hosseini2021accuracy"/>
+    <w:bookmarkEnd w:id="94"/>
+    <w:bookmarkStart w:id="96" w:name="ref-Hosseini2021accuracy"/>
     <w:p>
       <w:pPr>
         <w:pStyle w:val="Bibliography"/>
@@ -8167,7 +8616,7 @@
       <w:r>
         <w:t xml:space="preserve"> </w:t>
       </w:r>
-      <w:hyperlink r:id="rId81">
+      <w:hyperlink r:id="rId95">
         <w:r>
           <w:rPr>
             <w:rStyle w:val="Hyperlink"/>
@@ -8176,8 +8625,8 @@
         </w:r>
       </w:hyperlink>
     </w:p>
-    <w:bookmarkEnd w:id="82"/>
-    <w:bookmarkStart w:id="84" w:name="ref-Hou2020state"/>
+    <w:bookmarkEnd w:id="96"/>
+    <w:bookmarkStart w:id="98" w:name="ref-Hou2020state"/>
     <w:p>
       <w:pPr>
         <w:pStyle w:val="Bibliography"/>
@@ -8191,7 +8640,7 @@
       <w:r>
         <w:t xml:space="preserve"> </w:t>
       </w:r>
-      <w:hyperlink r:id="rId83">
+      <w:hyperlink r:id="rId97">
         <w:r>
           <w:rPr>
             <w:rStyle w:val="Hyperlink"/>
@@ -8200,8 +8649,8 @@
         </w:r>
       </w:hyperlink>
     </w:p>
-    <w:bookmarkEnd w:id="84"/>
-    <w:bookmarkStart w:id="86" w:name="ref-Huang2025rheological"/>
+    <w:bookmarkEnd w:id="98"/>
+    <w:bookmarkStart w:id="100" w:name="ref-Huang2025rheological"/>
     <w:p>
       <w:pPr>
         <w:pStyle w:val="Bibliography"/>
@@ -8215,7 +8664,7 @@
       <w:r>
         <w:t xml:space="preserve"> </w:t>
       </w:r>
-      <w:hyperlink r:id="rId85">
+      <w:hyperlink r:id="rId99">
         <w:r>
           <w:rPr>
             <w:rStyle w:val="Hyperlink"/>
@@ -8224,8 +8673,8 @@
         </w:r>
       </w:hyperlink>
     </w:p>
-    <w:bookmarkEnd w:id="86"/>
-    <w:bookmarkStart w:id="88" w:name="ref-Jweihan2026trustworthy"/>
+    <w:bookmarkEnd w:id="100"/>
+    <w:bookmarkStart w:id="102" w:name="ref-Jweihan2026trustworthy"/>
     <w:p>
       <w:pPr>
         <w:pStyle w:val="Bibliography"/>
@@ -8236,7 +8685,7 @@
       <w:r>
         <w:t xml:space="preserve"> </w:t>
       </w:r>
-      <w:hyperlink r:id="rId87">
+      <w:hyperlink r:id="rId101">
         <w:r>
           <w:rPr>
             <w:rStyle w:val="Hyperlink"/>
@@ -8245,8 +8694,8 @@
         </w:r>
       </w:hyperlink>
     </w:p>
-    <w:bookmarkEnd w:id="88"/>
-    <w:bookmarkStart w:id="90" w:name="ref-Kaloop2019particle"/>
+    <w:bookmarkEnd w:id="102"/>
+    <w:bookmarkStart w:id="104" w:name="ref-Kaloop2019particle"/>
     <w:p>
       <w:pPr>
         <w:pStyle w:val="Bibliography"/>
@@ -8260,7 +8709,7 @@
       <w:r>
         <w:t xml:space="preserve"> </w:t>
       </w:r>
-      <w:hyperlink r:id="rId89">
+      <w:hyperlink r:id="rId103">
         <w:r>
           <w:rPr>
             <w:rStyle w:val="Hyperlink"/>
@@ -8269,8 +8718,8 @@
         </w:r>
       </w:hyperlink>
     </w:p>
-    <w:bookmarkEnd w:id="90"/>
-    <w:bookmarkStart w:id="92" w:name="ref-Latifi2021reinforcement"/>
+    <w:bookmarkEnd w:id="104"/>
+    <w:bookmarkStart w:id="106" w:name="ref-Latifi2021reinforcement"/>
     <w:p>
       <w:pPr>
         <w:pStyle w:val="Bibliography"/>
@@ -8284,7 +8733,7 @@
       <w:r>
         <w:t xml:space="preserve"> </w:t>
       </w:r>
-      <w:hyperlink r:id="rId91">
+      <w:hyperlink r:id="rId105">
         <w:r>
           <w:rPr>
             <w:rStyle w:val="Hyperlink"/>
@@ -8293,8 +8742,8 @@
         </w:r>
       </w:hyperlink>
     </w:p>
-    <w:bookmarkEnd w:id="92"/>
-    <w:bookmarkStart w:id="94" w:name="ref-MharziAlaoui2026algorithm"/>
+    <w:bookmarkEnd w:id="106"/>
+    <w:bookmarkStart w:id="108" w:name="ref-MharziAlaoui2026algorithm"/>
     <w:p>
       <w:pPr>
         <w:pStyle w:val="Bibliography"/>
@@ -8308,7 +8757,7 @@
       <w:r>
         <w:t xml:space="preserve"> </w:t>
       </w:r>
-      <w:hyperlink r:id="rId93">
+      <w:hyperlink r:id="rId107">
         <w:r>
           <w:rPr>
             <w:rStyle w:val="Hyperlink"/>
@@ -8317,8 +8766,8 @@
         </w:r>
       </w:hyperlink>
     </w:p>
-    <w:bookmarkEnd w:id="94"/>
-    <w:bookmarkStart w:id="96" w:name="ref-Pan2025spatiotemporal"/>
+    <w:bookmarkEnd w:id="108"/>
+    <w:bookmarkStart w:id="110" w:name="ref-Pan2025spatiotemporal"/>
     <w:p>
       <w:pPr>
         <w:pStyle w:val="Bibliography"/>
@@ -8329,7 +8778,7 @@
       <w:r>
         <w:t xml:space="preserve"> </w:t>
       </w:r>
-      <w:hyperlink r:id="rId95">
+      <w:hyperlink r:id="rId109">
         <w:r>
           <w:rPr>
             <w:rStyle w:val="Hyperlink"/>
@@ -8338,8 +8787,8 @@
         </w:r>
       </w:hyperlink>
     </w:p>
-    <w:bookmarkEnd w:id="96"/>
-    <w:bookmarkStart w:id="98" w:name="ref-Pasupunuri2024roughness"/>
+    <w:bookmarkEnd w:id="110"/>
+    <w:bookmarkStart w:id="112" w:name="ref-Pasupunuri2024roughness"/>
     <w:p>
       <w:pPr>
         <w:pStyle w:val="Bibliography"/>
@@ -8350,7 +8799,7 @@
       <w:r>
         <w:t xml:space="preserve"> </w:t>
       </w:r>
-      <w:hyperlink r:id="rId97">
+      <w:hyperlink r:id="rId111">
         <w:r>
           <w:rPr>
             <w:rStyle w:val="Hyperlink"/>
@@ -8359,8 +8808,8 @@
         </w:r>
       </w:hyperlink>
     </w:p>
-    <w:bookmarkEnd w:id="98"/>
-    <w:bookmarkStart w:id="100" w:name="ref-Sun2023automatic"/>
+    <w:bookmarkEnd w:id="112"/>
+    <w:bookmarkStart w:id="114" w:name="ref-Sun2023automatic"/>
     <w:p>
       <w:pPr>
         <w:pStyle w:val="Bibliography"/>
@@ -8374,7 +8823,7 @@
       <w:r>
         <w:t xml:space="preserve"> </w:t>
       </w:r>
-      <w:hyperlink r:id="rId99">
+      <w:hyperlink r:id="rId113">
         <w:r>
           <w:rPr>
             <w:rStyle w:val="Hyperlink"/>
@@ -8383,22 +8832,19 @@
         </w:r>
       </w:hyperlink>
     </w:p>
-    <w:bookmarkEnd w:id="100"/>
-    <w:bookmarkStart w:id="102" w:name="ref-Wei2023optimizing"/>
+    <w:bookmarkEnd w:id="114"/>
+    <w:bookmarkStart w:id="116" w:name="ref-Xiao2023optimizing"/>
     <w:p>
       <w:pPr>
         <w:pStyle w:val="Bibliography"/>
       </w:pPr>
       <w:r>
-        <w:t xml:space="preserve">Wei, X., Wang, C., Liu, J., others</w:t>
-      </w:r>
-      <w:r>
-        <w:t xml:space="preserve">, 2023. Optimizing faulting prediction for rigid pavements using a hybrid SHAP-TPE-CatBoost model. Applied Sciences.</w:t>
-      </w:r>
-      <w:r>
-        <w:t xml:space="preserve"> </w:t>
-      </w:r>
-      <w:hyperlink r:id="rId101">
+        <w:t xml:space="preserve">Xiao, W., Wang, C., Liu, J., Gao, M., Wu, J., 2023. Optimizing faulting prediction for rigid pavements using a hybrid SHAP-TPE-CatBoost model. Applied Sciences.</w:t>
+      </w:r>
+      <w:r>
+        <w:t xml:space="preserve"> </w:t>
+      </w:r>
+      <w:hyperlink r:id="rId115">
         <w:r>
           <w:rPr>
             <w:rStyle w:val="Hyperlink"/>
@@ -8407,8 +8853,8 @@
         </w:r>
       </w:hyperlink>
     </w:p>
-    <w:bookmarkEnd w:id="102"/>
-    <w:bookmarkStart w:id="104" w:name="ref-Yang2021research"/>
+    <w:bookmarkEnd w:id="116"/>
+    <w:bookmarkStart w:id="118" w:name="ref-Yang2021research"/>
     <w:p>
       <w:pPr>
         <w:pStyle w:val="Bibliography"/>
@@ -8422,7 +8868,7 @@
       <w:r>
         <w:t xml:space="preserve"> </w:t>
       </w:r>
-      <w:hyperlink r:id="rId103">
+      <w:hyperlink r:id="rId117">
         <w:r>
           <w:rPr>
             <w:rStyle w:val="Hyperlink"/>
@@ -8431,8 +8877,8 @@
         </w:r>
       </w:hyperlink>
     </w:p>
-    <w:bookmarkEnd w:id="104"/>
-    <w:bookmarkStart w:id="106" w:name="ref-Yao2022large"/>
+    <w:bookmarkEnd w:id="118"/>
+    <w:bookmarkStart w:id="120" w:name="ref-Yao2022large"/>
     <w:p>
       <w:pPr>
         <w:pStyle w:val="Bibliography"/>
@@ -8446,7 +8892,7 @@
       <w:r>
         <w:t xml:space="preserve"> </w:t>
       </w:r>
-      <w:hyperlink r:id="rId105">
+      <w:hyperlink r:id="rId119">
         <w:r>
           <w:rPr>
             <w:rStyle w:val="Hyperlink"/>
@@ -8455,8 +8901,8 @@
         </w:r>
       </w:hyperlink>
     </w:p>
-    <w:bookmarkEnd w:id="106"/>
-    <w:bookmarkStart w:id="108" w:name="ref-Yu2020highway"/>
+    <w:bookmarkEnd w:id="120"/>
+    <w:bookmarkStart w:id="122" w:name="ref-Yu2020highway"/>
     <w:p>
       <w:pPr>
         <w:pStyle w:val="Bibliography"/>
@@ -8470,7 +8916,7 @@
       <w:r>
         <w:t xml:space="preserve"> </w:t>
       </w:r>
-      <w:hyperlink r:id="rId107">
+      <w:hyperlink r:id="rId121">
         <w:r>
           <w:rPr>
             <w:rStyle w:val="Hyperlink"/>
@@ -8479,8 +8925,8 @@
         </w:r>
       </w:hyperlink>
     </w:p>
-    <w:bookmarkEnd w:id="108"/>
-    <w:bookmarkStart w:id="110" w:name="ref-Zeiada2025benchmarking"/>
+    <w:bookmarkEnd w:id="122"/>
+    <w:bookmarkStart w:id="124" w:name="ref-Zeiada2025benchmarking"/>
     <w:p>
       <w:pPr>
         <w:pStyle w:val="Bibliography"/>
@@ -8494,7 +8940,7 @@
       <w:r>
         <w:t xml:space="preserve"> </w:t>
       </w:r>
-      <w:hyperlink r:id="rId109">
+      <w:hyperlink r:id="rId123">
         <w:r>
           <w:rPr>
             <w:rStyle w:val="Hyperlink"/>
@@ -8503,9 +8949,9 @@
         </w:r>
       </w:hyperlink>
     </w:p>
-    <w:bookmarkEnd w:id="110"/>
-    <w:bookmarkEnd w:id="111"/>
-    <w:bookmarkEnd w:id="112"/>
+    <w:bookmarkEnd w:id="124"/>
+    <w:bookmarkEnd w:id="125"/>
+    <w:bookmarkEnd w:id="126"/>
     <w:sectPr/>
   </w:body>
 </w:document>

</xml_diff>

<commit_message>
Phase 8: full-text verification of Alnaqbi2025learning confirms (not just suspects) leakage risk and external-validation absence; found second overlapping-author cluster (Wang/Xiao/Liu) on related LTPP substrate; corpus to 84 records; fixed duplicate-text bug; 25-page clean render
</commit_message>
<xml_diff>
--- a/output/manuscript.docx
+++ b/output/manuscript.docx
@@ -2635,7 +2635,7 @@
         <w:pStyle w:val="FirstParagraph"/>
       </w:pPr>
       <w:r>
-        <w:t xml:space="preserve">Of the 68 primary studies coded so far,</w:t>
+        <w:t xml:space="preserve">Of the 69 primary studies coded so far,</w:t>
       </w:r>
       <w:r>
         <w:t xml:space="preserve"> </w:t>
@@ -2664,13 +2664,13 @@
         <w:t xml:space="preserve"> </w:t>
       </w:r>
       <w:r>
-        <w:t xml:space="preserve">substantial share — 23</w:t>
-      </w:r>
-      <w:r>
-        <w:t xml:space="preserve"> </w:t>
-      </w:r>
-      <w:r>
-        <w:t xml:space="preserve">of 68 — do not qualify as hybrid under the structural test in</w:t>
+        <w:t xml:space="preserve">substantial share — 24</w:t>
+      </w:r>
+      <w:r>
+        <w:t xml:space="preserve"> </w:t>
+      </w:r>
+      <w:r>
+        <w:t xml:space="preserve">of 69 — do not qualify as hybrid under the structural test in</w:t>
       </w:r>
       <w:r>
         <w:t xml:space="preserve"> </w:t>
@@ -4568,7 +4568,7 @@
         <w:t xml:space="preserve">Alnaqbi et al. (2025c)</w:t>
       </w:r>
       <w:r>
-        <w:t xml:space="preserve">’s own reference list cites six</w:t>
+        <w:t xml:space="preserve">‘s own reference list cites six</w:t>
       </w:r>
       <w:r>
         <w:t xml:space="preserve"> </w:t>
@@ -4580,43 +4580,76 @@
         <w:t xml:space="preserve"> </w:t>
       </w:r>
       <w:r>
-        <w:t xml:space="preserve">undiscussed. What none of the eight papers examined so far states explicitly is</w:t>
-      </w:r>
-      <w:r>
-        <w:t xml:space="preserve"> </w:t>
-      </w:r>
-      <w:r>
-        <w:t xml:space="preserve">whether the five-fold cross-validation in each is grouped at the section level, so</w:t>
-      </w:r>
-      <w:r>
-        <w:t xml:space="preserve"> </w:t>
-      </w:r>
-      <w:r>
-        <w:t xml:space="preserve">that no CRCP section contributes observations to both the training and the test</w:t>
-      </w:r>
-      <w:r>
-        <w:t xml:space="preserve"> </w:t>
-      </w:r>
-      <w:r>
-        <w:t xml:space="preserve">partition within a fold. With roughly twelve observations per section on average</w:t>
-      </w:r>
-      <w:r>
-        <w:t xml:space="preserve"> </w:t>
-      </w:r>
-      <w:r>
-        <w:t xml:space="preserve">(395 observations across 33 sections), an ungrouped random split would place</w:t>
-      </w:r>
-      <w:r>
-        <w:t xml:space="preserve"> </w:t>
-      </w:r>
-      <w:r>
-        <w:t xml:space="preserve">multiple, highly correlated records from the same physical section on both sides</w:t>
-      </w:r>
-      <w:r>
-        <w:t xml:space="preserve"> </w:t>
-      </w:r>
-      <w:r>
-        <w:t xml:space="preserve">of most folds — precisely the leakage pathway the PAVE-ML rule for</w:t>
+        <w:t xml:space="preserve">undiscussed. Full-text verification of the first-published member of the series,</w:t>
+      </w:r>
+      <w:r>
+        <w:t xml:space="preserve"> </w:t>
+      </w:r>
+      <w:r>
+        <w:t xml:space="preserve">Alnaqbi et al. (2025f)</w:t>
+      </w:r>
+      <w:r>
+        <w:t xml:space="preserve">, confirms rather than merely suspects the leakage concern:</w:t>
+      </w:r>
+      <w:r>
+        <w:t xml:space="preserve"> </w:t>
+      </w:r>
+      <w:r>
+        <w:t xml:space="preserve">the paper states its partitioning plainly as</w:t>
+      </w:r>
+      <w:r>
+        <w:t xml:space="preserve"> </w:t>
+      </w:r>
+      <w:r>
+        <w:t xml:space="preserve">“the dataset was split into 5</w:t>
+      </w:r>
+      <w:r>
+        <w:t xml:space="preserve"> </w:t>
+      </w:r>
+      <w:r>
+        <w:t xml:space="preserve">subsets, and the model was trained and tested 5 times, each time using a</w:t>
+      </w:r>
+      <w:r>
+        <w:t xml:space="preserve"> </w:t>
+      </w:r>
+      <w:r>
+        <w:t xml:space="preserve">different subset as the test set and the remaining subsets as the training set”</w:t>
+      </w:r>
+      <w:r>
+        <w:t xml:space="preserve"> </w:t>
+      </w:r>
+      <w:r>
+        <w:t xml:space="preserve">— a random split at the observation level, with no mention anywhere in the</w:t>
+      </w:r>
+      <w:r>
+        <w:t xml:space="preserve"> </w:t>
+      </w:r>
+      <w:r>
+        <w:t xml:space="preserve">methods section of grouping by the 33 physical CRCP sections the 395 observations</w:t>
+      </w:r>
+      <w:r>
+        <w:t xml:space="preserve"> </w:t>
+      </w:r>
+      <w:r>
+        <w:t xml:space="preserve">are drawn from. With roughly twelve observations per section on average, an</w:t>
+      </w:r>
+      <w:r>
+        <w:t xml:space="preserve"> </w:t>
+      </w:r>
+      <w:r>
+        <w:t xml:space="preserve">ungrouped random split places multiple, highly correlated records from the same</w:t>
+      </w:r>
+      <w:r>
+        <w:t xml:space="preserve"> </w:t>
+      </w:r>
+      <w:r>
+        <w:t xml:space="preserve">physical section on both sides of most folds — precisely the leakage pathway the</w:t>
+      </w:r>
+      <w:r>
+        <w:t xml:space="preserve"> </w:t>
+      </w:r>
+      <w:r>
+        <w:t xml:space="preserve">PAVE-ML rule for</w:t>
       </w:r>
       <w:r>
         <w:t xml:space="preserve"> </w:t>
@@ -4631,13 +4664,112 @@
         <w:t xml:space="preserve"> </w:t>
       </w:r>
       <w:r>
-        <w:t xml:space="preserve">(§10) is written to catch, and precisely the reason each of these</w:t>
-      </w:r>
-      <w:r>
-        <w:t xml:space="preserve"> </w:t>
-      </w:r>
-      <w:r>
-        <w:t xml:space="preserve">eight papers is coded</w:t>
+        <w:t xml:space="preserve">(§10) is written to catch. The paper’s own</w:t>
+      </w:r>
+      <w:r>
+        <w:t xml:space="preserve"> </w:t>
+      </w:r>
+      <w:r>
+        <w:t xml:space="preserve">Limitations section separately states that</w:t>
+      </w:r>
+      <w:r>
+        <w:t xml:space="preserve"> </w:t>
+      </w:r>
+      <w:r>
+        <w:t xml:space="preserve">“only fivefold cross-validation was</w:t>
+      </w:r>
+      <w:r>
+        <w:t xml:space="preserve"> </w:t>
+      </w:r>
+      <w:r>
+        <w:t xml:space="preserve">used to assess the model… no independent testing was done using additional</w:t>
+      </w:r>
+      <w:r>
+        <w:t xml:space="preserve"> </w:t>
+      </w:r>
+      <w:r>
+        <w:t xml:space="preserve">datasets,”</w:t>
+      </w:r>
+      <w:r>
+        <w:t xml:space="preserve"> </w:t>
+      </w:r>
+      <w:r>
+        <w:t xml:space="preserve">which independently confirms the</w:t>
+      </w:r>
+      <w:r>
+        <w:t xml:space="preserve"> </w:t>
+      </w:r>
+      <w:r>
+        <w:rPr>
+          <w:rStyle w:val="VerbatimChar"/>
+        </w:rPr>
+        <w:t xml:space="preserve">external_validation: no</w:t>
+      </w:r>
+      <w:r>
+        <w:t xml:space="preserve"> </w:t>
+      </w:r>
+      <w:r>
+        <w:t xml:space="preserve">coding</w:t>
+      </w:r>
+      <w:r>
+        <w:t xml:space="preserve"> </w:t>
+      </w:r>
+      <w:r>
+        <w:t xml:space="preserve">under the criterion in §2.3, in the authors’</w:t>
+      </w:r>
+      <w:r>
+        <w:t xml:space="preserve"> </w:t>
+      </w:r>
+      <w:r>
+        <w:t xml:space="preserve">own words rather than by the</w:t>
+      </w:r>
+      <w:r>
+        <w:t xml:space="preserve"> </w:t>
+      </w:r>
+      <w:r>
+        <w:t xml:space="preserve">silence-as-absence convention. Worth noting for what it reveals about how such</w:t>
+      </w:r>
+      <w:r>
+        <w:t xml:space="preserve"> </w:t>
+      </w:r>
+      <w:r>
+        <w:t xml:space="preserve">concerns are currently addressed in this literature: the paper anticipates an</w:t>
+      </w:r>
+      <w:r>
+        <w:t xml:space="preserve"> </w:t>
+      </w:r>
+      <w:r>
+        <w:t xml:space="preserve">overfitting objection and defends against it by observing that RMSE stays within</w:t>
+      </w:r>
+      <w:r>
+        <w:t xml:space="preserve"> </w:t>
+      </w:r>
+      <w:r>
+        <w:t xml:space="preserve">a narrow band across folds (0.02791–0.06422) — but fold-to-fold consistency is</w:t>
+      </w:r>
+      <w:r>
+        <w:t xml:space="preserve"> </w:t>
+      </w:r>
+      <w:r>
+        <w:t xml:space="preserve">not evidence against the leakage pathway just described, since every fold would</w:t>
+      </w:r>
+      <w:r>
+        <w:t xml:space="preserve"> </w:t>
+      </w:r>
+      <w:r>
+        <w:t xml:space="preserve">share the same section-level contamination and so would be expected to perform</w:t>
+      </w:r>
+      <w:r>
+        <w:t xml:space="preserve"> </w:t>
+      </w:r>
+      <w:r>
+        <w:t xml:space="preserve">similarly whether or not the model has learned anything section-specific. The</w:t>
+      </w:r>
+      <w:r>
+        <w:t xml:space="preserve"> </w:t>
+      </w:r>
+      <w:r>
+        <w:t xml:space="preserve">remaining seven papers in the series are coded</w:t>
       </w:r>
       <w:r>
         <w:t xml:space="preserve"> </w:t>
@@ -4652,19 +4784,33 @@
         <w:t xml:space="preserve"> </w:t>
       </w:r>
       <w:r>
-        <w:t xml:space="preserve">risk pending full-text confirmation rather than</w:t>
-      </w:r>
-      <w:r>
-        <w:t xml:space="preserve"> </w:t>
-      </w:r>
-      <w:r>
-        <w:t xml:space="preserve">assumed innocent by the convention adopted in §2. Xiao et al.’s TPE-CatBoost</w:t>
-      </w:r>
-      <w:r>
-        <w:t xml:space="preserve"> </w:t>
-      </w:r>
-      <w:r>
-        <w:t xml:space="preserve">faulting model</w:t>
+        <w:t xml:space="preserve">risk pending the same</w:t>
+      </w:r>
+      <w:r>
+        <w:t xml:space="preserve"> </w:t>
+      </w:r>
+      <w:r>
+        <w:t xml:space="preserve">full-text check now completed for the first; nothing in their abstracts suggests</w:t>
+      </w:r>
+      <w:r>
+        <w:t xml:space="preserve"> </w:t>
+      </w:r>
+      <w:r>
+        <w:t xml:space="preserve">a different partitioning procedure was used.</w:t>
+      </w:r>
+    </w:p>
+    <w:p>
+      <w:pPr>
+        <w:pStyle w:val="BodyText"/>
+      </w:pPr>
+      <w:r>
+        <w:t xml:space="preserve">Two further pieces of evidence extend the pattern beyond one author team. Xiao et</w:t>
+      </w:r>
+      <w:r>
+        <w:t xml:space="preserve"> </w:t>
+      </w:r>
+      <w:r>
+        <w:t xml:space="preserve">al.’s TPE-CatBoost faulting model</w:t>
       </w:r>
       <w:r>
         <w:t xml:space="preserve"> </w:t>
@@ -4676,31 +4822,82 @@
         <w:t xml:space="preserve"> </w:t>
       </w:r>
       <w:r>
-        <w:t xml:space="preserve">adds a second, independent instance of the</w:t>
-      </w:r>
-      <w:r>
-        <w:t xml:space="preserve"> </w:t>
-      </w:r>
-      <w:r>
-        <w:t xml:space="preserve">same ambiguity on a different substrate: Boruta feature selection is described as</w:t>
-      </w:r>
-      <w:r>
-        <w:t xml:space="preserve"> </w:t>
-      </w:r>
-      <w:r>
-        <w:t xml:space="preserve">preceding TPE hyperparameter tuning, but neither the paper’s abstract nor its</w:t>
-      </w:r>
-      <w:r>
-        <w:t xml:space="preserve"> </w:t>
-      </w:r>
-      <w:r>
-        <w:t xml:space="preserve">available summary states whether Boruta was fitted on the training partition alone</w:t>
-      </w:r>
-      <w:r>
-        <w:t xml:space="preserve"> </w:t>
-      </w:r>
-      <w:r>
-        <w:t xml:space="preserve">or on the full 160-observation pool before any split was made.</w:t>
+        <w:t xml:space="preserve">shows the same ambiguity</w:t>
+      </w:r>
+      <w:r>
+        <w:t xml:space="preserve"> </w:t>
+      </w:r>
+      <w:r>
+        <w:t xml:space="preserve">on a different rigid-pavement LTPP substrate: Boruta feature selection is</w:t>
+      </w:r>
+      <w:r>
+        <w:t xml:space="preserve"> </w:t>
+      </w:r>
+      <w:r>
+        <w:t xml:space="preserve">described as preceding TPE hyperparameter tuning, but neither the paper’s</w:t>
+      </w:r>
+      <w:r>
+        <w:t xml:space="preserve"> </w:t>
+      </w:r>
+      <w:r>
+        <w:t xml:space="preserve">abstract nor its available summary states whether Boruta was fitted on the</w:t>
+      </w:r>
+      <w:r>
+        <w:t xml:space="preserve"> </w:t>
+      </w:r>
+      <w:r>
+        <w:t xml:space="preserve">training partition alone or on the full 160-observation pool before any split</w:t>
+      </w:r>
+      <w:r>
+        <w:t xml:space="preserve"> </w:t>
+      </w:r>
+      <w:r>
+        <w:t xml:space="preserve">was made. And a citation search while verifying the Alnaqbi series surfaced a</w:t>
+      </w:r>
+      <w:r>
+        <w:t xml:space="preserve"> </w:t>
+      </w:r>
+      <w:r>
+        <w:t xml:space="preserve">second, seemingly independent overlapping-author cluster — Wang, Xiao and Liu</w:t>
+      </w:r>
+      <w:r>
+        <w:t xml:space="preserve"> </w:t>
+      </w:r>
+      <w:r>
+        <w:t xml:space="preserve">(Wang et al., 2023)</w:t>
+      </w:r>
+      <w:r>
+        <w:t xml:space="preserve">, sharing two of the same three surnames as the</w:t>
+      </w:r>
+      <w:r>
+        <w:t xml:space="preserve"> </w:t>
+      </w:r>
+      <w:r>
+        <w:t xml:space="preserve">TPE-CatBoost paper — publishing a separate improved-XGBoost model for rigid</w:t>
+      </w:r>
+      <w:r>
+        <w:t xml:space="preserve"> </w:t>
+      </w:r>
+      <w:r>
+        <w:t xml:space="preserve">pavement IRI on what appears to be a related LTPP substrate. Whether this is a</w:t>
+      </w:r>
+      <w:r>
+        <w:t xml:space="preserve"> </w:t>
+      </w:r>
+      <w:r>
+        <w:t xml:space="preserve">second, independent instance of the single-target-per-paper pattern or reflects</w:t>
+      </w:r>
+      <w:r>
+        <w:t xml:space="preserve"> </w:t>
+      </w:r>
+      <w:r>
+        <w:t xml:space="preserve">overlapping personnel with the first cluster is a question the completed harvest,</w:t>
+      </w:r>
+      <w:r>
+        <w:t xml:space="preserve"> </w:t>
+      </w:r>
+      <w:r>
+        <w:t xml:space="preserve">not this seed corpus, is positioned to answer.</w:t>
       </w:r>
     </w:p>
     <w:p>
@@ -4720,31 +4917,43 @@
         <w:t xml:space="preserve"> </w:t>
       </w:r>
       <w:r>
-        <w:t xml:space="preserve">— eight identified papers, likely more once the full harvest is complete — that</w:t>
-      </w:r>
-      <w:r>
-        <w:t xml:space="preserve"> </w:t>
-      </w:r>
-      <w:r>
-        <w:t xml:space="preserve">the completed review can report a systematic finding rather than gesture at a</w:t>
-      </w:r>
-      <w:r>
-        <w:t xml:space="preserve"> </w:t>
-      </w:r>
-      <w:r>
-        <w:t xml:space="preserve">concern: what fraction of this specific author team’s substrate-sharing series</w:t>
-      </w:r>
-      <w:r>
-        <w:t xml:space="preserve"> </w:t>
-      </w:r>
-      <w:r>
-        <w:t xml:space="preserve">groups its cross-validation folds by section, once every paper’s methods section</w:t>
-      </w:r>
-      <w:r>
-        <w:t xml:space="preserve"> </w:t>
-      </w:r>
-      <w:r>
-        <w:t xml:space="preserve">has been read in full. Second, the pattern usefully illustrates a broader point</w:t>
+        <w:t xml:space="preserve">— eight identified papers, one of them full-text-confirmed rather than only</w:t>
+      </w:r>
+      <w:r>
+        <w:t xml:space="preserve"> </w:t>
+      </w:r>
+      <w:r>
+        <w:t xml:space="preserve">abstract-flagged, likely more once the full harvest is complete — that the</w:t>
+      </w:r>
+      <w:r>
+        <w:t xml:space="preserve"> </w:t>
+      </w:r>
+      <w:r>
+        <w:t xml:space="preserve">completed review can report a systematic, partly-verified finding rather than</w:t>
+      </w:r>
+      <w:r>
+        <w:t xml:space="preserve"> </w:t>
+      </w:r>
+      <w:r>
+        <w:t xml:space="preserve">gesture at a concern: what fraction of this specific author team’s</w:t>
+      </w:r>
+      <w:r>
+        <w:t xml:space="preserve"> </w:t>
+      </w:r>
+      <w:r>
+        <w:t xml:space="preserve">substrate-sharing series groups its cross-validation folds by section, once every</w:t>
+      </w:r>
+      <w:r>
+        <w:t xml:space="preserve"> </w:t>
+      </w:r>
+      <w:r>
+        <w:t xml:space="preserve">remaining paper’s methods section has been read with the same care as the first.</w:t>
+      </w:r>
+      <w:r>
+        <w:t xml:space="preserve"> </w:t>
+      </w:r>
+      <w:r>
+        <w:t xml:space="preserve">Second, the pattern usefully illustrates a broader point</w:t>
       </w:r>
       <w:r>
         <w:t xml:space="preserve"> </w:t>
@@ -7142,7 +7351,79 @@
         <w:t xml:space="preserve"> </w:t>
       </w:r>
       <w:r>
-        <w:t xml:space="preserve">by all fitted preprocessing) is written to detect the absence of.</w:t>
+        <w:t xml:space="preserve">by all fitted preprocessing) is written to detect the absence of. The mirror-image</w:t>
+      </w:r>
+      <w:r>
+        <w:t xml:space="preserve"> </w:t>
+      </w:r>
+      <w:r>
+        <w:t xml:space="preserve">worked example — full-text confirmation of the failure mode item 7 is written to</w:t>
+      </w:r>
+      <w:r>
+        <w:t xml:space="preserve"> </w:t>
+      </w:r>
+      <w:r>
+        <w:t xml:space="preserve">catch, rather than of its avoidance — is</w:t>
+      </w:r>
+      <w:r>
+        <w:t xml:space="preserve"> </w:t>
+      </w:r>
+      <w:r>
+        <w:t xml:space="preserve">Alnaqbi et al. (2025f)</w:t>
+      </w:r>
+      <w:r>
+        <w:t xml:space="preserve"> </w:t>
+      </w:r>
+      <w:r>
+        <w:t xml:space="preserve">(§7): its methods</w:t>
+      </w:r>
+      <w:r>
+        <w:t xml:space="preserve"> </w:t>
+      </w:r>
+      <w:r>
+        <w:t xml:space="preserve">section states the five-fold split plainly as a random partition of individual</w:t>
+      </w:r>
+      <w:r>
+        <w:t xml:space="preserve"> </w:t>
+      </w:r>
+      <w:r>
+        <w:t xml:space="preserve">observations, with no grouping by the 33 physical sections those observations are</w:t>
+      </w:r>
+      <w:r>
+        <w:t xml:space="preserve"> </w:t>
+      </w:r>
+      <w:r>
+        <w:t xml:space="preserve">drawn from, and its own Limitations section separately confirms the absence of</w:t>
+      </w:r>
+      <w:r>
+        <w:t xml:space="preserve"> </w:t>
+      </w:r>
+      <w:r>
+        <w:t xml:space="preserve">external validation. The two papers, read together, are what the fully coded</w:t>
+      </w:r>
+      <w:r>
+        <w:t xml:space="preserve"> </w:t>
+      </w:r>
+      <w:r>
+        <w:t xml:space="preserve">corpus is expected to look like at scale: a minority explicitly designing around</w:t>
+      </w:r>
+      <w:r>
+        <w:t xml:space="preserve"> </w:t>
+      </w:r>
+      <w:r>
+        <w:t xml:space="preserve">the leakage and validation items in this instrument, and a majority whose methods</w:t>
+      </w:r>
+      <w:r>
+        <w:t xml:space="preserve"> </w:t>
+      </w:r>
+      <w:r>
+        <w:t xml:space="preserve">sections, once actually read rather than inferred from an abstract, turn out to</w:t>
+      </w:r>
+      <w:r>
+        <w:t xml:space="preserve"> </w:t>
+      </w:r>
+      <w:r>
+        <w:t xml:space="preserve">say plainly what §2’s silence-as-absence convention would in any case have coded.</w:t>
       </w:r>
     </w:p>
     <w:p>
@@ -8094,7 +8375,7 @@
       </w:r>
     </w:p>
     <w:bookmarkEnd w:id="48"/>
-    <w:bookmarkStart w:id="126" w:name="references"/>
+    <w:bookmarkStart w:id="128" w:name="references"/>
     <w:p>
       <w:pPr>
         <w:pStyle w:val="Heading1"/>
@@ -8103,7 +8384,7 @@
         <w:t xml:space="preserve">References</w:t>
       </w:r>
     </w:p>
-    <w:bookmarkStart w:id="125" w:name="refs"/>
+    <w:bookmarkStart w:id="127" w:name="refs"/>
     <w:bookmarkStart w:id="50" w:name="ref-Alhussan2022pothole"/>
     <w:p>
       <w:pPr>
@@ -8833,18 +9114,39 @@
       </w:hyperlink>
     </w:p>
     <w:bookmarkEnd w:id="114"/>
-    <w:bookmarkStart w:id="116" w:name="ref-Xiao2023optimizing"/>
+    <w:bookmarkStart w:id="116" w:name="ref-Wang2023developing"/>
     <w:p>
       <w:pPr>
         <w:pStyle w:val="Bibliography"/>
       </w:pPr>
       <w:r>
+        <w:t xml:space="preserve">Wang, C., Xiao, W., Liu, J., 2023. Developing an improved extreme gradient boosting model for predicting the international roughness index of rigid pavement. Constr. Build. Mater.</w:t>
+      </w:r>
+      <w:r>
+        <w:t xml:space="preserve"> </w:t>
+      </w:r>
+      <w:hyperlink r:id="rId115">
+        <w:r>
+          <w:rPr>
+            <w:rStyle w:val="Hyperlink"/>
+          </w:rPr>
+          <w:t xml:space="preserve">https://doi.org/10.1016/j.conbuildmat.2023.133523</w:t>
+        </w:r>
+      </w:hyperlink>
+    </w:p>
+    <w:bookmarkEnd w:id="116"/>
+    <w:bookmarkStart w:id="118" w:name="ref-Xiao2023optimizing"/>
+    <w:p>
+      <w:pPr>
+        <w:pStyle w:val="Bibliography"/>
+      </w:pPr>
+      <w:r>
         <w:t xml:space="preserve">Xiao, W., Wang, C., Liu, J., Gao, M., Wu, J., 2023. Optimizing faulting prediction for rigid pavements using a hybrid SHAP-TPE-CatBoost model. Applied Sciences.</w:t>
       </w:r>
       <w:r>
         <w:t xml:space="preserve"> </w:t>
       </w:r>
-      <w:hyperlink r:id="rId115">
+      <w:hyperlink r:id="rId117">
         <w:r>
           <w:rPr>
             <w:rStyle w:val="Hyperlink"/>
@@ -8853,8 +9155,8 @@
         </w:r>
       </w:hyperlink>
     </w:p>
-    <w:bookmarkEnd w:id="116"/>
-    <w:bookmarkStart w:id="118" w:name="ref-Yang2021research"/>
+    <w:bookmarkEnd w:id="118"/>
+    <w:bookmarkStart w:id="120" w:name="ref-Yang2021research"/>
     <w:p>
       <w:pPr>
         <w:pStyle w:val="Bibliography"/>
@@ -8868,7 +9170,7 @@
       <w:r>
         <w:t xml:space="preserve"> </w:t>
       </w:r>
-      <w:hyperlink r:id="rId117">
+      <w:hyperlink r:id="rId119">
         <w:r>
           <w:rPr>
             <w:rStyle w:val="Hyperlink"/>
@@ -8877,8 +9179,8 @@
         </w:r>
       </w:hyperlink>
     </w:p>
-    <w:bookmarkEnd w:id="118"/>
-    <w:bookmarkStart w:id="120" w:name="ref-Yao2022large"/>
+    <w:bookmarkEnd w:id="120"/>
+    <w:bookmarkStart w:id="122" w:name="ref-Yao2022large"/>
     <w:p>
       <w:pPr>
         <w:pStyle w:val="Bibliography"/>
@@ -8892,7 +9194,7 @@
       <w:r>
         <w:t xml:space="preserve"> </w:t>
       </w:r>
-      <w:hyperlink r:id="rId119">
+      <w:hyperlink r:id="rId121">
         <w:r>
           <w:rPr>
             <w:rStyle w:val="Hyperlink"/>
@@ -8901,8 +9203,8 @@
         </w:r>
       </w:hyperlink>
     </w:p>
-    <w:bookmarkEnd w:id="120"/>
-    <w:bookmarkStart w:id="122" w:name="ref-Yu2020highway"/>
+    <w:bookmarkEnd w:id="122"/>
+    <w:bookmarkStart w:id="124" w:name="ref-Yu2020highway"/>
     <w:p>
       <w:pPr>
         <w:pStyle w:val="Bibliography"/>
@@ -8916,7 +9218,7 @@
       <w:r>
         <w:t xml:space="preserve"> </w:t>
       </w:r>
-      <w:hyperlink r:id="rId121">
+      <w:hyperlink r:id="rId123">
         <w:r>
           <w:rPr>
             <w:rStyle w:val="Hyperlink"/>
@@ -8925,8 +9227,8 @@
         </w:r>
       </w:hyperlink>
     </w:p>
-    <w:bookmarkEnd w:id="122"/>
-    <w:bookmarkStart w:id="124" w:name="ref-Zeiada2025benchmarking"/>
+    <w:bookmarkEnd w:id="124"/>
+    <w:bookmarkStart w:id="126" w:name="ref-Zeiada2025benchmarking"/>
     <w:p>
       <w:pPr>
         <w:pStyle w:val="Bibliography"/>
@@ -8940,7 +9242,7 @@
       <w:r>
         <w:t xml:space="preserve"> </w:t>
       </w:r>
-      <w:hyperlink r:id="rId123">
+      <w:hyperlink r:id="rId125">
         <w:r>
           <w:rPr>
             <w:rStyle w:val="Hyperlink"/>
@@ -8949,9 +9251,9 @@
         </w:r>
       </w:hyperlink>
     </w:p>
-    <w:bookmarkEnd w:id="124"/>
-    <w:bookmarkEnd w:id="125"/>
     <w:bookmarkEnd w:id="126"/>
+    <w:bookmarkEnd w:id="127"/>
+    <w:bookmarkEnd w:id="128"/>
     <w:sectPr/>
   </w:body>
 </w:document>

</xml_diff>

<commit_message>
Phase 9: second full-text verification (Alnaqbi2025predictive) replicates identical leakage pattern independently; two of eight series papers now confirmed rather than one; 25-page clean render
</commit_message>
<xml_diff>
--- a/output/manuscript.docx
+++ b/output/manuscript.docx
@@ -4580,7 +4580,13 @@
         <w:t xml:space="preserve"> </w:t>
       </w:r>
       <w:r>
-        <w:t xml:space="preserve">undiscussed. Full-text verification of the first-published member of the series,</w:t>
+        <w:t xml:space="preserve">undiscussed. Full-text verification of the first two published members of the</w:t>
+      </w:r>
+      <w:r>
+        <w:t xml:space="preserve"> </w:t>
+      </w:r>
+      <w:r>
+        <w:t xml:space="preserve">series,</w:t>
       </w:r>
       <w:r>
         <w:t xml:space="preserve"> </w:t>
@@ -4589,43 +4595,100 @@
         <w:t xml:space="preserve">Alnaqbi et al. (2025f)</w:t>
       </w:r>
       <w:r>
-        <w:t xml:space="preserve">, confirms rather than merely suspects the leakage concern:</w:t>
-      </w:r>
-      <w:r>
-        <w:t xml:space="preserve"> </w:t>
-      </w:r>
-      <w:r>
-        <w:t xml:space="preserve">the paper states its partitioning plainly as</w:t>
-      </w:r>
-      <w:r>
-        <w:t xml:space="preserve"> </w:t>
-      </w:r>
-      <w:r>
-        <w:t xml:space="preserve">“the dataset was split into 5</w:t>
-      </w:r>
-      <w:r>
-        <w:t xml:space="preserve"> </w:t>
-      </w:r>
-      <w:r>
-        <w:t xml:space="preserve">subsets, and the model was trained and tested 5 times, each time using a</w:t>
-      </w:r>
-      <w:r>
-        <w:t xml:space="preserve"> </w:t>
-      </w:r>
-      <w:r>
-        <w:t xml:space="preserve">different subset as the test set and the remaining subsets as the training set”</w:t>
-      </w:r>
-      <w:r>
-        <w:t xml:space="preserve"> </w:t>
-      </w:r>
-      <w:r>
-        <w:t xml:space="preserve">— a random split at the observation level, with no mention anywhere in the</w:t>
-      </w:r>
-      <w:r>
-        <w:t xml:space="preserve"> </w:t>
-      </w:r>
-      <w:r>
-        <w:t xml:space="preserve">methods section of grouping by the 33 physical CRCP sections the 395 observations</w:t>
+        <w:t xml:space="preserve"> </w:t>
+      </w:r>
+      <w:r>
+        <w:t xml:space="preserve">and</w:t>
+      </w:r>
+      <w:r>
+        <w:t xml:space="preserve"> </w:t>
+      </w:r>
+      <w:r>
+        <w:t xml:space="preserve">Alnaqbi et al. (2025d)</w:t>
+      </w:r>
+      <w:r>
+        <w:t xml:space="preserve">, confirms rather than</w:t>
+      </w:r>
+      <w:r>
+        <w:t xml:space="preserve"> </w:t>
+      </w:r>
+      <w:r>
+        <w:t xml:space="preserve">merely suspects the leakage concern, and confirms it identically in both papers</w:t>
+      </w:r>
+      <w:r>
+        <w:t xml:space="preserve"> </w:t>
+      </w:r>
+      <w:r>
+        <w:t xml:space="preserve">rather than once. The first states its partitioning plainly as</w:t>
+      </w:r>
+      <w:r>
+        <w:t xml:space="preserve"> </w:t>
+      </w:r>
+      <w:r>
+        <w:t xml:space="preserve">“the dataset was</w:t>
+      </w:r>
+      <w:r>
+        <w:t xml:space="preserve"> </w:t>
+      </w:r>
+      <w:r>
+        <w:t xml:space="preserve">split into 5 subsets, and the model was trained and tested 5 times, each time</w:t>
+      </w:r>
+      <w:r>
+        <w:t xml:space="preserve"> </w:t>
+      </w:r>
+      <w:r>
+        <w:t xml:space="preserve">using a different subset as the test set and the remaining subsets as the</w:t>
+      </w:r>
+      <w:r>
+        <w:t xml:space="preserve"> </w:t>
+      </w:r>
+      <w:r>
+        <w:t xml:space="preserve">training set”</w:t>
+      </w:r>
+      <w:r>
+        <w:t xml:space="preserve">; the second, on a different target variable but the identical</w:t>
+      </w:r>
+      <w:r>
+        <w:t xml:space="preserve"> </w:t>
+      </w:r>
+      <w:r>
+        <w:t xml:space="preserve">395-observation, 33-section substrate, states it just as plainly as</w:t>
+      </w:r>
+      <w:r>
+        <w:t xml:space="preserve"> </w:t>
+      </w:r>
+      <w:r>
+        <w:t xml:space="preserve">“five</w:t>
+      </w:r>
+      <w:r>
+        <w:t xml:space="preserve"> </w:t>
+      </w:r>
+      <w:r>
+        <w:t xml:space="preserve">equal-sized subsets were randomly selected from the dataset… the training and</w:t>
+      </w:r>
+      <w:r>
+        <w:t xml:space="preserve"> </w:t>
+      </w:r>
+      <w:r>
+        <w:t xml:space="preserve">testing subsets were switched around in each iteration.”</w:t>
+      </w:r>
+      <w:r>
+        <w:t xml:space="preserve"> </w:t>
+      </w:r>
+      <w:r>
+        <w:t xml:space="preserve">Both are random splits</w:t>
+      </w:r>
+      <w:r>
+        <w:t xml:space="preserve"> </w:t>
+      </w:r>
+      <w:r>
+        <w:t xml:space="preserve">at the observation level, and neither methods section — read in full, not</w:t>
+      </w:r>
+      <w:r>
+        <w:t xml:space="preserve"> </w:t>
+      </w:r>
+      <w:r>
+        <w:t xml:space="preserve">excerpted — mentions grouping by the 33 physical CRCP sections the observations</w:t>
       </w:r>
       <w:r>
         <w:t xml:space="preserve"> </w:t>
@@ -4664,37 +4727,61 @@
         <w:t xml:space="preserve"> </w:t>
       </w:r>
       <w:r>
-        <w:t xml:space="preserve">(§10) is written to catch. The paper’s own</w:t>
-      </w:r>
-      <w:r>
-        <w:t xml:space="preserve"> </w:t>
-      </w:r>
-      <w:r>
-        <w:t xml:space="preserve">Limitations section separately states that</w:t>
-      </w:r>
-      <w:r>
-        <w:t xml:space="preserve"> </w:t>
-      </w:r>
-      <w:r>
-        <w:t xml:space="preserve">“only fivefold cross-validation was</w:t>
-      </w:r>
-      <w:r>
-        <w:t xml:space="preserve"> </w:t>
-      </w:r>
-      <w:r>
-        <w:t xml:space="preserve">used to assess the model… no independent testing was done using additional</w:t>
-      </w:r>
-      <w:r>
-        <w:t xml:space="preserve"> </w:t>
-      </w:r>
-      <w:r>
-        <w:t xml:space="preserve">datasets,”</w:t>
-      </w:r>
-      <w:r>
-        <w:t xml:space="preserve"> </w:t>
-      </w:r>
-      <w:r>
-        <w:t xml:space="preserve">which independently confirms the</w:t>
+        <w:t xml:space="preserve">(§10) is written to catch. Both papers’</w:t>
+      </w:r>
+      <w:r>
+        <w:t xml:space="preserve"> </w:t>
+      </w:r>
+      <w:r>
+        <w:t xml:space="preserve">own</w:t>
+      </w:r>
+      <w:r>
+        <w:t xml:space="preserve"> </w:t>
+      </w:r>
+      <w:r>
+        <w:t xml:space="preserve">Limitations or Future Directions sections separately confirm the absence of</w:t>
+      </w:r>
+      <w:r>
+        <w:t xml:space="preserve"> </w:t>
+      </w:r>
+      <w:r>
+        <w:t xml:space="preserve">external validation in their own words — the first stating outright that</w:t>
+      </w:r>
+      <w:r>
+        <w:t xml:space="preserve"> </w:t>
+      </w:r>
+      <w:r>
+        <w:t xml:space="preserve">“no</w:t>
+      </w:r>
+      <w:r>
+        <w:t xml:space="preserve"> </w:t>
+      </w:r>
+      <w:r>
+        <w:t xml:space="preserve">independent testing was done using additional datasets,”</w:t>
+      </w:r>
+      <w:r>
+        <w:t xml:space="preserve"> </w:t>
+      </w:r>
+      <w:r>
+        <w:t xml:space="preserve">the second listing</w:t>
+      </w:r>
+      <w:r>
+        <w:t xml:space="preserve"> </w:t>
+      </w:r>
+      <w:r>
+        <w:t xml:space="preserve">“external dataset validation”</w:t>
+      </w:r>
+      <w:r>
+        <w:t xml:space="preserve"> </w:t>
+      </w:r>
+      <w:r>
+        <w:t xml:space="preserve">among unmet future work — which independently</w:t>
+      </w:r>
+      <w:r>
+        <w:t xml:space="preserve"> </w:t>
+      </w:r>
+      <w:r>
+        <w:t xml:space="preserve">confirms the</w:t>
       </w:r>
       <w:r>
         <w:t xml:space="preserve"> </w:t>
@@ -4709,67 +4796,91 @@
         <w:t xml:space="preserve"> </w:t>
       </w:r>
       <w:r>
-        <w:t xml:space="preserve">coding</w:t>
-      </w:r>
-      <w:r>
-        <w:t xml:space="preserve"> </w:t>
-      </w:r>
-      <w:r>
-        <w:t xml:space="preserve">under the criterion in §2.3, in the authors’</w:t>
-      </w:r>
-      <w:r>
-        <w:t xml:space="preserve"> </w:t>
-      </w:r>
-      <w:r>
-        <w:t xml:space="preserve">own words rather than by the</w:t>
-      </w:r>
-      <w:r>
-        <w:t xml:space="preserve"> </w:t>
-      </w:r>
-      <w:r>
-        <w:t xml:space="preserve">silence-as-absence convention. Worth noting for what it reveals about how such</w:t>
-      </w:r>
-      <w:r>
-        <w:t xml:space="preserve"> </w:t>
-      </w:r>
-      <w:r>
-        <w:t xml:space="preserve">concerns are currently addressed in this literature: the paper anticipates an</w:t>
-      </w:r>
-      <w:r>
-        <w:t xml:space="preserve"> </w:t>
-      </w:r>
-      <w:r>
-        <w:t xml:space="preserve">overfitting objection and defends against it by observing that RMSE stays within</w:t>
-      </w:r>
-      <w:r>
-        <w:t xml:space="preserve"> </w:t>
-      </w:r>
-      <w:r>
-        <w:t xml:space="preserve">a narrow band across folds (0.02791–0.06422) — but fold-to-fold consistency is</w:t>
-      </w:r>
-      <w:r>
-        <w:t xml:space="preserve"> </w:t>
-      </w:r>
-      <w:r>
-        <w:t xml:space="preserve">not evidence against the leakage pathway just described, since every fold would</w:t>
-      </w:r>
-      <w:r>
-        <w:t xml:space="preserve"> </w:t>
-      </w:r>
-      <w:r>
-        <w:t xml:space="preserve">share the same section-level contamination and so would be expected to perform</w:t>
-      </w:r>
-      <w:r>
-        <w:t xml:space="preserve"> </w:t>
-      </w:r>
-      <w:r>
-        <w:t xml:space="preserve">similarly whether or not the model has learned anything section-specific. The</w:t>
-      </w:r>
-      <w:r>
-        <w:t xml:space="preserve"> </w:t>
-      </w:r>
-      <w:r>
-        <w:t xml:space="preserve">remaining seven papers in the series are coded</w:t>
+        <w:t xml:space="preserve">coding under the criterion in §2.3 twice</w:t>
+      </w:r>
+      <w:r>
+        <w:t xml:space="preserve"> </w:t>
+      </w:r>
+      <w:r>
+        <w:t xml:space="preserve">over, rather than by the silence-as-absence convention alone. Worth noting for</w:t>
+      </w:r>
+      <w:r>
+        <w:t xml:space="preserve"> </w:t>
+      </w:r>
+      <w:r>
+        <w:t xml:space="preserve">what it reveals about how such concerns are currently addressed in this</w:t>
+      </w:r>
+      <w:r>
+        <w:t xml:space="preserve"> </w:t>
+      </w:r>
+      <w:r>
+        <w:t xml:space="preserve">literature: the first paper anticipates an overfitting objection and defends</w:t>
+      </w:r>
+      <w:r>
+        <w:t xml:space="preserve"> </w:t>
+      </w:r>
+      <w:r>
+        <w:t xml:space="preserve">against it by observing that RMSE stays within a narrow band across folds</w:t>
+      </w:r>
+      <w:r>
+        <w:t xml:space="preserve"> </w:t>
+      </w:r>
+      <w:r>
+        <w:t xml:space="preserve">(0.02791–0.06422) — but fold-to-fold consistency is not evidence against the</w:t>
+      </w:r>
+      <w:r>
+        <w:t xml:space="preserve"> </w:t>
+      </w:r>
+      <w:r>
+        <w:t xml:space="preserve">leakage pathway just described, since every fold would share the same</w:t>
+      </w:r>
+      <w:r>
+        <w:t xml:space="preserve"> </w:t>
+      </w:r>
+      <w:r>
+        <w:t xml:space="preserve">section-level contamination and so would be expected to perform similarly</w:t>
+      </w:r>
+      <w:r>
+        <w:t xml:space="preserve"> </w:t>
+      </w:r>
+      <w:r>
+        <w:t xml:space="preserve">whether or not the model has learned anything section-specific. Both papers also</w:t>
+      </w:r>
+      <w:r>
+        <w:t xml:space="preserve"> </w:t>
+      </w:r>
+      <w:r>
+        <w:t xml:space="preserve">describe z-score normalisation, imputation and outlier removal within a single</w:t>
+      </w:r>
+      <w:r>
+        <w:t xml:space="preserve"> </w:t>
+      </w:r>
+      <w:r>
+        <w:t xml:space="preserve">“data preprocessing”</w:t>
+      </w:r>
+      <w:r>
+        <w:t xml:space="preserve"> </w:t>
+      </w:r>
+      <w:r>
+        <w:t xml:space="preserve">stage that textually precedes the cross-validation</w:t>
+      </w:r>
+      <w:r>
+        <w:t xml:space="preserve"> </w:t>
+      </w:r>
+      <w:r>
+        <w:t xml:space="preserve">description, with no statement in either that these steps were refit inside each</w:t>
+      </w:r>
+      <w:r>
+        <w:t xml:space="preserve"> </w:t>
+      </w:r>
+      <w:r>
+        <w:t xml:space="preserve">fold rather than computed once over the full pool. The remaining six papers in</w:t>
+      </w:r>
+      <w:r>
+        <w:t xml:space="preserve"> </w:t>
+      </w:r>
+      <w:r>
+        <w:t xml:space="preserve">the series are coded</w:t>
       </w:r>
       <w:r>
         <w:t xml:space="preserve"> </w:t>
@@ -4784,19 +4895,25 @@
         <w:t xml:space="preserve"> </w:t>
       </w:r>
       <w:r>
-        <w:t xml:space="preserve">risk pending the same</w:t>
-      </w:r>
-      <w:r>
-        <w:t xml:space="preserve"> </w:t>
-      </w:r>
-      <w:r>
-        <w:t xml:space="preserve">full-text check now completed for the first; nothing in their abstracts suggests</w:t>
-      </w:r>
-      <w:r>
-        <w:t xml:space="preserve"> </w:t>
-      </w:r>
-      <w:r>
-        <w:t xml:space="preserve">a different partitioning procedure was used.</w:t>
+        <w:t xml:space="preserve">risk pending the same full-text check now completed,</w:t>
+      </w:r>
+      <w:r>
+        <w:t xml:space="preserve"> </w:t>
+      </w:r>
+      <w:r>
+        <w:t xml:space="preserve">identically, for the first two; nothing in their abstracts suggests a different</w:t>
+      </w:r>
+      <w:r>
+        <w:t xml:space="preserve"> </w:t>
+      </w:r>
+      <w:r>
+        <w:t xml:space="preserve">partitioning procedure was used, and two independent confirmations make that a</w:t>
+      </w:r>
+      <w:r>
+        <w:t xml:space="preserve"> </w:t>
+      </w:r>
+      <w:r>
+        <w:t xml:space="preserve">considerably stronger prior than one.</w:t>
       </w:r>
     </w:p>
     <w:p>
@@ -4917,7 +5034,7 @@
         <w:t xml:space="preserve"> </w:t>
       </w:r>
       <w:r>
-        <w:t xml:space="preserve">— eight identified papers, one of them full-text-confirmed rather than only</w:t>
+        <w:t xml:space="preserve">— eight identified papers, two of them full-text-confirmed rather than only</w:t>
       </w:r>
       <w:r>
         <w:t xml:space="preserve"> </w:t>
@@ -7363,7 +7480,7 @@
         <w:t xml:space="preserve"> </w:t>
       </w:r>
       <w:r>
-        <w:t xml:space="preserve">catch, rather than of its avoidance — is</w:t>
+        <w:t xml:space="preserve">catch, rather than of its avoidance — is the pair</w:t>
       </w:r>
       <w:r>
         <w:t xml:space="preserve"> </w:t>
@@ -7375,55 +7492,85 @@
         <w:t xml:space="preserve"> </w:t>
       </w:r>
       <w:r>
-        <w:t xml:space="preserve">(§7): its methods</w:t>
-      </w:r>
-      <w:r>
-        <w:t xml:space="preserve"> </w:t>
-      </w:r>
-      <w:r>
-        <w:t xml:space="preserve">section states the five-fold split plainly as a random partition of individual</w:t>
-      </w:r>
-      <w:r>
-        <w:t xml:space="preserve"> </w:t>
-      </w:r>
-      <w:r>
-        <w:t xml:space="preserve">observations, with no grouping by the 33 physical sections those observations are</w:t>
-      </w:r>
-      <w:r>
-        <w:t xml:space="preserve"> </w:t>
-      </w:r>
-      <w:r>
-        <w:t xml:space="preserve">drawn from, and its own Limitations section separately confirms the absence of</w:t>
-      </w:r>
-      <w:r>
-        <w:t xml:space="preserve"> </w:t>
-      </w:r>
-      <w:r>
-        <w:t xml:space="preserve">external validation. The two papers, read together, are what the fully coded</w:t>
-      </w:r>
-      <w:r>
-        <w:t xml:space="preserve"> </w:t>
-      </w:r>
-      <w:r>
-        <w:t xml:space="preserve">corpus is expected to look like at scale: a minority explicitly designing around</w:t>
-      </w:r>
-      <w:r>
-        <w:t xml:space="preserve"> </w:t>
-      </w:r>
-      <w:r>
-        <w:t xml:space="preserve">the leakage and validation items in this instrument, and a majority whose methods</w:t>
-      </w:r>
-      <w:r>
-        <w:t xml:space="preserve"> </w:t>
-      </w:r>
-      <w:r>
-        <w:t xml:space="preserve">sections, once actually read rather than inferred from an abstract, turn out to</w:t>
-      </w:r>
-      <w:r>
-        <w:t xml:space="preserve"> </w:t>
-      </w:r>
-      <w:r>
-        <w:t xml:space="preserve">say plainly what §2’s silence-as-absence convention would in any case have coded.</w:t>
+        <w:t xml:space="preserve">and</w:t>
+      </w:r>
+      <w:r>
+        <w:t xml:space="preserve"> </w:t>
+      </w:r>
+      <w:r>
+        <w:t xml:space="preserve">Alnaqbi et al. (2025d)</w:t>
+      </w:r>
+      <w:r>
+        <w:t xml:space="preserve"> </w:t>
+      </w:r>
+      <w:r>
+        <w:t xml:space="preserve">(§7): both papers’ methods sections state their five-fold</w:t>
+      </w:r>
+      <w:r>
+        <w:t xml:space="preserve"> </w:t>
+      </w:r>
+      <w:r>
+        <w:t xml:space="preserve">splits plainly as random partitions of individual observations, with no grouping</w:t>
+      </w:r>
+      <w:r>
+        <w:t xml:space="preserve"> </w:t>
+      </w:r>
+      <w:r>
+        <w:t xml:space="preserve">by the 33 physical sections those observations are drawn from, and both papers’</w:t>
+      </w:r>
+      <w:r>
+        <w:t xml:space="preserve"> </w:t>
+      </w:r>
+      <w:r>
+        <w:t xml:space="preserve">own Limitations or Future Directions sections separately confirm the absence of</w:t>
+      </w:r>
+      <w:r>
+        <w:t xml:space="preserve"> </w:t>
+      </w:r>
+      <w:r>
+        <w:t xml:space="preserve">external validation, independently of each other. The three papers, read</w:t>
+      </w:r>
+      <w:r>
+        <w:t xml:space="preserve"> </w:t>
+      </w:r>
+      <w:r>
+        <w:t xml:space="preserve">together, are what the fully coded corpus is expected to look like at scale: a</w:t>
+      </w:r>
+      <w:r>
+        <w:t xml:space="preserve"> </w:t>
+      </w:r>
+      <w:r>
+        <w:t xml:space="preserve">minority explicitly designing around the leakage and validation items in this</w:t>
+      </w:r>
+      <w:r>
+        <w:t xml:space="preserve"> </w:t>
+      </w:r>
+      <w:r>
+        <w:t xml:space="preserve">instrument, and a majority whose methods sections, once actually read rather than</w:t>
+      </w:r>
+      <w:r>
+        <w:t xml:space="preserve"> </w:t>
+      </w:r>
+      <w:r>
+        <w:t xml:space="preserve">inferred from an abstract, turn out to say plainly what §2’s silence-as-absence</w:t>
+      </w:r>
+      <w:r>
+        <w:t xml:space="preserve"> </w:t>
+      </w:r>
+      <w:r>
+        <w:t xml:space="preserve">convention would in any case have coded — and, in the case of the two</w:t>
+      </w:r>
+      <w:r>
+        <w:t xml:space="preserve"> </w:t>
+      </w:r>
+      <w:r>
+        <w:t xml:space="preserve">full-text-confirmed papers, say it identically to one another despite being</w:t>
+      </w:r>
+      <w:r>
+        <w:t xml:space="preserve"> </w:t>
+      </w:r>
+      <w:r>
+        <w:t xml:space="preserve">independently written studies on different target variables.</w:t>
       </w:r>
     </w:p>
     <w:p>

</xml_diff>

<commit_message>
Phase 10: third full-text verification (Xiao2023optimizing) reveals a SECOND distinct leakage mechanism -- pre-split Boruta feature selection, confirmed by the paper's own section ordering; strengthens the review's central claim that leakage_risk catches structurally different failures under one item; 26-page clean render
</commit_message>
<xml_diff>
--- a/output/manuscript.docx
+++ b/output/manuscript.docx
@@ -4921,13 +4921,19 @@
         <w:pStyle w:val="BodyText"/>
       </w:pPr>
       <w:r>
-        <w:t xml:space="preserve">Two further pieces of evidence extend the pattern beyond one author team. Xiao et</w:t>
-      </w:r>
-      <w:r>
-        <w:t xml:space="preserve"> </w:t>
-      </w:r>
-      <w:r>
-        <w:t xml:space="preserve">al.’s TPE-CatBoost faulting model</w:t>
+        <w:t xml:space="preserve">Two further pieces of evidence extend the pattern beyond one author team, and one</w:t>
+      </w:r>
+      <w:r>
+        <w:t xml:space="preserve"> </w:t>
+      </w:r>
+      <w:r>
+        <w:t xml:space="preserve">of them is now full-text confirmed rather than ambiguous. Xiao et al.’s</w:t>
+      </w:r>
+      <w:r>
+        <w:t xml:space="preserve"> </w:t>
+      </w:r>
+      <w:r>
+        <w:t xml:space="preserve">TPE-CatBoost faulting model</w:t>
       </w:r>
       <w:r>
         <w:t xml:space="preserve"> </w:t>
@@ -4936,40 +4942,166 @@
         <w:t xml:space="preserve">(Xiao et al., 2023)</w:t>
       </w:r>
       <w:r>
-        <w:t xml:space="preserve"> </w:t>
-      </w:r>
-      <w:r>
-        <w:t xml:space="preserve">shows the same ambiguity</w:t>
-      </w:r>
-      <w:r>
-        <w:t xml:space="preserve"> </w:t>
-      </w:r>
-      <w:r>
-        <w:t xml:space="preserve">on a different rigid-pavement LTPP substrate: Boruta feature selection is</w:t>
-      </w:r>
-      <w:r>
-        <w:t xml:space="preserve"> </w:t>
-      </w:r>
-      <w:r>
-        <w:t xml:space="preserve">described as preceding TPE hyperparameter tuning, but neither the paper’s</w:t>
-      </w:r>
-      <w:r>
-        <w:t xml:space="preserve"> </w:t>
-      </w:r>
-      <w:r>
-        <w:t xml:space="preserve">abstract nor its available summary states whether Boruta was fitted on the</w:t>
-      </w:r>
-      <w:r>
-        <w:t xml:space="preserve"> </w:t>
-      </w:r>
-      <w:r>
-        <w:t xml:space="preserve">training partition alone or on the full 160-observation pool before any split</w:t>
-      </w:r>
-      <w:r>
-        <w:t xml:space="preserve"> </w:t>
-      </w:r>
-      <w:r>
-        <w:t xml:space="preserve">was made. And a citation search while verifying the Alnaqbi series surfaced a</w:t>
+        <w:t xml:space="preserve">, read in full, resolves its</w:t>
+      </w:r>
+      <w:r>
+        <w:t xml:space="preserve"> </w:t>
+      </w:r>
+      <w:r>
+        <w:t xml:space="preserve">own ambiguity definitively: the paper’s Boruta feature-selection step is</w:t>
+      </w:r>
+      <w:r>
+        <w:t xml:space="preserve"> </w:t>
+      </w:r>
+      <w:r>
+        <w:t xml:space="preserve">performed in Section 3 (</w:t>
+      </w:r>
+      <w:r>
+        <w:t xml:space="preserve">“Data Preparation”</w:t>
+      </w:r>
+      <w:r>
+        <w:t xml:space="preserve">), applied to the full 160-observation</w:t>
+      </w:r>
+      <w:r>
+        <w:t xml:space="preserve"> </w:t>
+      </w:r>
+      <w:r>
+        <w:t xml:space="preserve">pool, and only in Section 4 (</w:t>
+      </w:r>
+      <w:r>
+        <w:t xml:space="preserve">“Model Construction”</w:t>
+      </w:r>
+      <w:r>
+        <w:t xml:space="preserve">) does an 80/20 train-test split</w:t>
+      </w:r>
+      <w:r>
+        <w:t xml:space="preserve"> </w:t>
+      </w:r>
+      <w:r>
+        <w:t xml:space="preserve">appear — meaning Boruta selected the six variables the final model uses with the</w:t>
+      </w:r>
+      <w:r>
+        <w:t xml:space="preserve"> </w:t>
+      </w:r>
+      <w:r>
+        <w:t xml:space="preserve">benefit of information from what later became the test partition. This is a</w:t>
+      </w:r>
+      <w:r>
+        <w:t xml:space="preserve"> </w:t>
+      </w:r>
+      <w:r>
+        <w:t xml:space="preserve">different leakage mechanism from the CRCP series above — a real held-out test</w:t>
+      </w:r>
+      <w:r>
+        <w:t xml:space="preserve"> </w:t>
+      </w:r>
+      <w:r>
+        <w:t xml:space="preserve">set exists here, contaminated only by feature selection performed before the</w:t>
+      </w:r>
+      <w:r>
+        <w:t xml:space="preserve"> </w:t>
+      </w:r>
+      <w:r>
+        <w:t xml:space="preserve">split, rather than an entirely ungrouped cross-validation — and the paper’s own</w:t>
+      </w:r>
+      <w:r>
+        <w:t xml:space="preserve"> </w:t>
+      </w:r>
+      <w:r>
+        <w:t xml:space="preserve">conclusion attributes part of its headline result directly to the contaminated</w:t>
+      </w:r>
+      <w:r>
+        <w:t xml:space="preserve"> </w:t>
+      </w:r>
+      <w:r>
+        <w:t xml:space="preserve">step: the six-variable model improves R</w:t>
+      </w:r>
+      <w:r>
+        <w:rPr>
+          <w:vertAlign w:val="superscript"/>
+        </w:rPr>
+        <w:t xml:space="preserve">2</w:t>
+      </w:r>
+      <w:r>
+        <w:t xml:space="preserve"> </w:t>
+      </w:r>
+      <w:r>
+        <w:t xml:space="preserve">by 0.007 over the seventeen-variable</w:t>
+      </w:r>
+      <w:r>
+        <w:t xml:space="preserve"> </w:t>
+      </w:r>
+      <w:r>
+        <w:t xml:space="preserve">version,</w:t>
+      </w:r>
+      <w:r>
+        <w:t xml:space="preserve"> </w:t>
+      </w:r>
+      <w:r>
+        <w:t xml:space="preserve">“attributed to the capability of Boruta to identify relevant</w:t>
+      </w:r>
+      <w:r>
+        <w:t xml:space="preserve"> </w:t>
+      </w:r>
+      <w:r>
+        <w:t xml:space="preserve">variables.”</w:t>
+      </w:r>
+      <w:r>
+        <w:t xml:space="preserve"> </w:t>
+      </w:r>
+      <w:r>
+        <w:t xml:space="preserve">The two mechanisms, read together, make the point this review is</w:t>
+      </w:r>
+      <w:r>
+        <w:t xml:space="preserve"> </w:t>
+      </w:r>
+      <w:r>
+        <w:t xml:space="preserve">built to make more sharply than either alone:</w:t>
+      </w:r>
+      <w:r>
+        <w:t xml:space="preserve"> </w:t>
+      </w:r>
+      <w:r>
+        <w:rPr>
+          <w:rStyle w:val="VerbatimChar"/>
+        </w:rPr>
+        <w:t xml:space="preserve">leakage_risk</w:t>
+      </w:r>
+      <w:r>
+        <w:t xml:space="preserve"> </w:t>
+      </w:r>
+      <w:r>
+        <w:t xml:space="preserve">in PAVE-ML (§10)</w:t>
+      </w:r>
+      <w:r>
+        <w:t xml:space="preserve"> </w:t>
+      </w:r>
+      <w:r>
+        <w:t xml:space="preserve">catches structurally different failures — no partition grouping in one case,</w:t>
+      </w:r>
+      <w:r>
+        <w:t xml:space="preserve"> </w:t>
+      </w:r>
+      <w:r>
+        <w:t xml:space="preserve">preprocessing fitted before the partition in the other — under a single item,</w:t>
+      </w:r>
+      <w:r>
+        <w:t xml:space="preserve"> </w:t>
+      </w:r>
+      <w:r>
+        <w:t xml:space="preserve">which is exactly why the item is framed around the outcome (does information</w:t>
+      </w:r>
+      <w:r>
+        <w:t xml:space="preserve"> </w:t>
+      </w:r>
+      <w:r>
+        <w:t xml:space="preserve">from the test set influence training) rather than around one specific</w:t>
+      </w:r>
+      <w:r>
+        <w:t xml:space="preserve"> </w:t>
+      </w:r>
+      <w:r>
+        <w:t xml:space="preserve">mechanism. A citation search while verifying this paper separately surfaced a</w:t>
       </w:r>
       <w:r>
         <w:t xml:space="preserve"> </w:t>

</xml_diff>

<commit_message>
Phase 11: fourth full-text verification confirms the positive H5 exemplar (Huang2025rheological) genuinely implements leakage-safe stacking as claimed, with one honest caveat (no external validation); four full-text confirmations total, three risk + one positive; 26-page clean render
</commit_message>
<xml_diff>
--- a/output/manuscript.docx
+++ b/output/manuscript.docx
@@ -5579,13 +5579,31 @@
         <w:t xml:space="preserve"> </w:t>
       </w:r>
       <w:r>
-        <w:t xml:space="preserve">in-fold base-model predictions specifically to avoid leakage, and is cited</w:t>
-      </w:r>
-      <w:r>
-        <w:t xml:space="preserve"> </w:t>
-      </w:r>
-      <w:r>
-        <w:t xml:space="preserve">throughout this review (§9, §10) as the type’s positive case; Yu et al.</w:t>
+        <w:t xml:space="preserve">in-fold base-model predictions specifically to avoid leakage — full-text</w:t>
+      </w:r>
+      <w:r>
+        <w:t xml:space="preserve"> </w:t>
+      </w:r>
+      <w:r>
+        <w:t xml:space="preserve">verification confirms the design does what its abstract claims, with a formal</w:t>
+      </w:r>
+      <w:r>
+        <w:t xml:space="preserve"> </w:t>
+      </w:r>
+      <w:r>
+        <w:t xml:space="preserve">description of the fold structure matching a textbook leakage-safe stacking</w:t>
+      </w:r>
+      <w:r>
+        <w:t xml:space="preserve"> </w:t>
+      </w:r>
+      <w:r>
+        <w:t xml:space="preserve">implementation — and is cited throughout this review (§9, §10) as the type’s</w:t>
+      </w:r>
+      <w:r>
+        <w:t xml:space="preserve"> </w:t>
+      </w:r>
+      <w:r>
+        <w:t xml:space="preserve">positive case; Yu et al.</w:t>
       </w:r>
       <w:r>
         <w:t xml:space="preserve"> </w:t>
@@ -5603,25 +5621,25 @@
         <w:t xml:space="preserve"> </w:t>
       </w:r>
       <w:r>
-        <w:t xml:space="preserve">stack five heterogeneous learners for tunnel pavement performance</w:t>
-      </w:r>
-      <w:r>
-        <w:t xml:space="preserve"> </w:t>
-      </w:r>
-      <w:r>
-        <w:t xml:space="preserve">within a digital-twin framework and report strong deployment integration, but</w:t>
-      </w:r>
-      <w:r>
-        <w:t xml:space="preserve"> </w:t>
-      </w:r>
-      <w:r>
-        <w:t xml:space="preserve">without the explicit leakage-avoidance statement that distinguishes Huang et al.’s</w:t>
-      </w:r>
-      <w:r>
-        <w:t xml:space="preserve"> </w:t>
-      </w:r>
-      <w:r>
-        <w:t xml:space="preserve">design.</w:t>
+        <w:t xml:space="preserve">stack five heterogeneous learners for</w:t>
+      </w:r>
+      <w:r>
+        <w:t xml:space="preserve"> </w:t>
+      </w:r>
+      <w:r>
+        <w:t xml:space="preserve">tunnel pavement performance within a digital-twin framework and report strong</w:t>
+      </w:r>
+      <w:r>
+        <w:t xml:space="preserve"> </w:t>
+      </w:r>
+      <w:r>
+        <w:t xml:space="preserve">deployment integration, but without the explicit leakage-avoidance statement</w:t>
+      </w:r>
+      <w:r>
+        <w:t xml:space="preserve"> </w:t>
+      </w:r>
+      <w:r>
+        <w:t xml:space="preserve">that distinguishes Huang et al.’s design.</w:t>
       </w:r>
     </w:p>
     <w:p>
@@ -7570,49 +7588,106 @@
         <w:t xml:space="preserve"> </w:t>
       </w:r>
       <w:r>
-        <w:t xml:space="preserve">is, at the time of writing, the clearest example in the seed</w:t>
-      </w:r>
-      <w:r>
-        <w:t xml:space="preserve"> </w:t>
-      </w:r>
-      <w:r>
-        <w:t xml:space="preserve">corpus of a study satisfying the spirit of items in this list without having been</w:t>
-      </w:r>
-      <w:r>
-        <w:t xml:space="preserve"> </w:t>
-      </w:r>
-      <w:r>
-        <w:t xml:space="preserve">written against it — its stacking meta-learner is trained on cross-validated,</w:t>
-      </w:r>
-      <w:r>
-        <w:t xml:space="preserve"> </w:t>
-      </w:r>
-      <w:r>
-        <w:t xml:space="preserve">not in-fold, predictions specifically to avoid leakage, which is exactly the</w:t>
-      </w:r>
-      <w:r>
-        <w:t xml:space="preserve"> </w:t>
-      </w:r>
-      <w:r>
-        <w:t xml:space="preserve">practice item 7 of the general instrument (grouped/blocked partitioning respected</w:t>
-      </w:r>
-      <w:r>
-        <w:t xml:space="preserve"> </w:t>
-      </w:r>
-      <w:r>
-        <w:t xml:space="preserve">by all fitted preprocessing) is written to detect the absence of. The mirror-image</w:t>
-      </w:r>
-      <w:r>
-        <w:t xml:space="preserve"> </w:t>
-      </w:r>
-      <w:r>
-        <w:t xml:space="preserve">worked example — full-text confirmation of the failure mode item 7 is written to</w:t>
-      </w:r>
-      <w:r>
-        <w:t xml:space="preserve"> </w:t>
-      </w:r>
-      <w:r>
-        <w:t xml:space="preserve">catch, rather than of its avoidance — is the pair</w:t>
+        <w:t xml:space="preserve">is, and is now full-text confirmed to be, the clearest</w:t>
+      </w:r>
+      <w:r>
+        <w:t xml:space="preserve"> </w:t>
+      </w:r>
+      <w:r>
+        <w:t xml:space="preserve">example in the seed corpus of a study satisfying the spirit of items in this list</w:t>
+      </w:r>
+      <w:r>
+        <w:t xml:space="preserve"> </w:t>
+      </w:r>
+      <w:r>
+        <w:t xml:space="preserve">without having been written against it — its stacking meta-learner is trained on</w:t>
+      </w:r>
+      <w:r>
+        <w:t xml:space="preserve"> </w:t>
+      </w:r>
+      <w:r>
+        <w:t xml:space="preserve">cross-validated, not in-fold, predictions specifically to avoid leakage, stated</w:t>
+      </w:r>
+      <w:r>
+        <w:t xml:space="preserve"> </w:t>
+      </w:r>
+      <w:r>
+        <w:t xml:space="preserve">explicitly in the paper’s own methods section rather than inferred, which is</w:t>
+      </w:r>
+      <w:r>
+        <w:t xml:space="preserve"> </w:t>
+      </w:r>
+      <w:r>
+        <w:t xml:space="preserve">exactly the practice item 7 of the general instrument (grouped/blocked</w:t>
+      </w:r>
+      <w:r>
+        <w:t xml:space="preserve"> </w:t>
+      </w:r>
+      <w:r>
+        <w:t xml:space="preserve">partitioning respected by all fitted preprocessing) is written to detect the</w:t>
+      </w:r>
+      <w:r>
+        <w:t xml:space="preserve"> </w:t>
+      </w:r>
+      <w:r>
+        <w:t xml:space="preserve">absence of. One caveat keeps this a partial rather than a complete positive case:</w:t>
+      </w:r>
+      <w:r>
+        <w:t xml:space="preserve"> </w:t>
+      </w:r>
+      <w:r>
+        <w:t xml:space="preserve">the same paper’s external validation still codes</w:t>
+      </w:r>
+      <w:r>
+        <w:t xml:space="preserve"> </w:t>
+      </w:r>
+      <w:r>
+        <w:rPr>
+          <w:rStyle w:val="VerbatimChar"/>
+        </w:rPr>
+        <w:t xml:space="preserve">no</w:t>
+      </w:r>
+      <w:r>
+        <w:t xml:space="preserve"> </w:t>
+      </w:r>
+      <w:r>
+        <w:t xml:space="preserve">under the strict criterion</w:t>
+      </w:r>
+      <w:r>
+        <w:t xml:space="preserve"> </w:t>
+      </w:r>
+      <w:r>
+        <w:t xml:space="preserve">in §2.3, since all data come from the authors’ own laboratory tests rather than</w:t>
+      </w:r>
+      <w:r>
+        <w:t xml:space="preserve"> </w:t>
+      </w:r>
+      <w:r>
+        <w:t xml:space="preserve">an independently sourced dataset — a reminder that a study can get one PAVE-ML</w:t>
+      </w:r>
+      <w:r>
+        <w:t xml:space="preserve"> </w:t>
+      </w:r>
+      <w:r>
+        <w:t xml:space="preserve">dimension right while another remains open, and that the instrument is built to</w:t>
+      </w:r>
+      <w:r>
+        <w:t xml:space="preserve"> </w:t>
+      </w:r>
+      <w:r>
+        <w:t xml:space="preserve">report per-item findings rather than a single pass/fail verdict per paper. The</w:t>
+      </w:r>
+      <w:r>
+        <w:t xml:space="preserve"> </w:t>
+      </w:r>
+      <w:r>
+        <w:t xml:space="preserve">mirror-image worked example — full-text confirmation of the failure mode item 7</w:t>
+      </w:r>
+      <w:r>
+        <w:t xml:space="preserve"> </w:t>
+      </w:r>
+      <w:r>
+        <w:t xml:space="preserve">is written to catch, rather than of its avoidance — is the pair</w:t>
       </w:r>
       <w:r>
         <w:t xml:space="preserve"> </w:t>
@@ -7636,7 +7711,13 @@
         <w:t xml:space="preserve"> </w:t>
       </w:r>
       <w:r>
-        <w:t xml:space="preserve">(§7): both papers’ methods sections state their five-fold</w:t>
+        <w:t xml:space="preserve">(§7): both papers’ methods</w:t>
+      </w:r>
+      <w:r>
+        <w:t xml:space="preserve"> </w:t>
+      </w:r>
+      <w:r>
+        <w:t xml:space="preserve">sections state their five-fold</w:t>
       </w:r>
       <w:r>
         <w:t xml:space="preserve"> </w:t>

</xml_diff>

<commit_message>
Phase 12: batch-add 6 new records (MEP/GEP symbolic, multi-optimizer ANFIS studies, self-reported overfitting exemplar); corpus to 90 records, 75 classified primary; add Jalal2024swarm self-reported train-test gap to Section 11; 26-page clean render
</commit_message>
<xml_diff>
--- a/output/manuscript.docx
+++ b/output/manuscript.docx
@@ -2635,7 +2635,7 @@
         <w:pStyle w:val="FirstParagraph"/>
       </w:pPr>
       <w:r>
-        <w:t xml:space="preserve">Of the 69 primary studies coded so far,</w:t>
+        <w:t xml:space="preserve">Of the 75 primary studies coded so far,</w:t>
       </w:r>
       <w:r>
         <w:t xml:space="preserve"> </w:t>
@@ -2670,7 +2670,7 @@
         <w:t xml:space="preserve"> </w:t>
       </w:r>
       <w:r>
-        <w:t xml:space="preserve">of 69 — do not qualify as hybrid under the structural test in</w:t>
+        <w:t xml:space="preserve">of 75 — do not qualify as hybrid under the structural test in</w:t>
       </w:r>
       <w:r>
         <w:t xml:space="preserve"> </w:t>
@@ -7376,6 +7376,146 @@
         <w:t xml:space="preserve">than asserted in general.</w:t>
       </w:r>
     </w:p>
+    <w:p>
+      <w:pPr>
+        <w:pStyle w:val="BodyText"/>
+      </w:pPr>
+      <w:r>
+        <w:t xml:space="preserve">A related and more immediate question is how often the gap between training and</w:t>
+      </w:r>
+      <w:r>
+        <w:t xml:space="preserve"> </w:t>
+      </w:r>
+      <w:r>
+        <w:t xml:space="preserve">test performance is even visible enough to judge, and here one paper in the seed</w:t>
+      </w:r>
+      <w:r>
+        <w:t xml:space="preserve"> </w:t>
+      </w:r>
+      <w:r>
+        <w:t xml:space="preserve">corpus supplies a rare, self-reported answer rather than requiring an external</w:t>
+      </w:r>
+      <w:r>
+        <w:t xml:space="preserve"> </w:t>
+      </w:r>
+      <w:r>
+        <w:t xml:space="preserve">audit to surface it. Jalal et al.</w:t>
+      </w:r>
+      <w:r>
+        <w:t xml:space="preserve"> </w:t>
+      </w:r>
+      <w:r>
+        <w:t xml:space="preserve">(</w:t>
+      </w:r>
+      <w:r>
+        <w:t xml:space="preserve">Jalal et al.</w:t>
+      </w:r>
+      <w:r>
+        <w:t xml:space="preserve">, 2024)</w:t>
+      </w:r>
+      <w:r>
+        <w:t xml:space="preserve"> </w:t>
+      </w:r>
+      <w:r>
+        <w:t xml:space="preserve">report four</w:t>
+      </w:r>
+      <w:r>
+        <w:t xml:space="preserve"> </w:t>
+      </w:r>
+      <w:r>
+        <w:t xml:space="preserve">metaheuristic-tuned ANN variants (PSO, GWO, SMA and MPA) for expansive-soil swell</w:t>
+      </w:r>
+      <w:r>
+        <w:t xml:space="preserve"> </w:t>
+      </w:r>
+      <w:r>
+        <w:t xml:space="preserve">pressure and unconfined compressive strength, with training R</w:t>
+      </w:r>
+      <w:r>
+        <w:rPr>
+          <w:vertAlign w:val="superscript"/>
+        </w:rPr>
+        <w:t xml:space="preserve">2</w:t>
+      </w:r>
+      <w:r>
+        <w:t xml:space="preserve"> </w:t>
+      </w:r>
+      <w:r>
+        <w:t xml:space="preserve">above 0.9 for</w:t>
+      </w:r>
+      <w:r>
+        <w:t xml:space="preserve"> </w:t>
+      </w:r>
+      <w:r>
+        <w:t xml:space="preserve">the UCS models — and then state plainly, in their own results section, that</w:t>
+      </w:r>
+      <w:r>
+        <w:t xml:space="preserve"> </w:t>
+      </w:r>
+      <w:r>
+        <w:t xml:space="preserve">“the UCS models witnessed an overfitting problem because the aforementioned R</w:t>
+      </w:r>
+      <w:r>
+        <w:t xml:space="preserve"> </w:t>
+      </w:r>
+      <w:r>
+        <w:t xml:space="preserve">values of the metaheuristics were 0.62, 0.56, and 0.58”</w:t>
+      </w:r>
+      <w:r>
+        <w:t xml:space="preserve"> </w:t>
+      </w:r>
+      <w:r>
+        <w:t xml:space="preserve">on the test partition.</w:t>
+      </w:r>
+      <w:r>
+        <w:t xml:space="preserve"> </w:t>
+      </w:r>
+      <w:r>
+        <w:t xml:space="preserve">This is, so far, the only paper in the corpus to name its own train-test gap in</w:t>
+      </w:r>
+      <w:r>
+        <w:t xml:space="preserve"> </w:t>
+      </w:r>
+      <w:r>
+        <w:t xml:space="preserve">these terms rather than reporting a single headline R</w:t>
+      </w:r>
+      <w:r>
+        <w:rPr>
+          <w:vertAlign w:val="superscript"/>
+        </w:rPr>
+        <w:t xml:space="preserve">2</w:t>
+      </w:r>
+      <w:r>
+        <w:t xml:space="preserve"> </w:t>
+      </w:r>
+      <w:r>
+        <w:t xml:space="preserve">and moving on, and it is</w:t>
+      </w:r>
+      <w:r>
+        <w:t xml:space="preserve"> </w:t>
+      </w:r>
+      <w:r>
+        <w:t xml:space="preserve">a useful reminder that the rigour audit’s purpose is not to catch something no</w:t>
+      </w:r>
+      <w:r>
+        <w:t xml:space="preserve"> </w:t>
+      </w:r>
+      <w:r>
+        <w:t xml:space="preserve">author could have noticed — the gap is visible in the paper’s own tables — but to</w:t>
+      </w:r>
+      <w:r>
+        <w:t xml:space="preserve"> </w:t>
+      </w:r>
+      <w:r>
+        <w:t xml:space="preserve">make visible-but-unremarked-upon gaps like this one a counted, systematic finding</w:t>
+      </w:r>
+      <w:r>
+        <w:t xml:space="preserve"> </w:t>
+      </w:r>
+      <w:r>
+        <w:t xml:space="preserve">rather than an exception a careful reader happens to spot.</w:t>
+      </w:r>
+    </w:p>
     <w:bookmarkEnd w:id="42"/>
     <w:bookmarkStart w:id="43" w:name="sec-paveml"/>
     <w:p>
@@ -8735,7 +8875,7 @@
       </w:r>
     </w:p>
     <w:bookmarkEnd w:id="48"/>
-    <w:bookmarkStart w:id="128" w:name="references"/>
+    <w:bookmarkStart w:id="130" w:name="references"/>
     <w:p>
       <w:pPr>
         <w:pStyle w:val="Heading1"/>
@@ -8744,7 +8884,7 @@
         <w:t xml:space="preserve">References</w:t>
       </w:r>
     </w:p>
-    <w:bookmarkStart w:id="127" w:name="refs"/>
+    <w:bookmarkStart w:id="129" w:name="refs"/>
     <w:bookmarkStart w:id="50" w:name="ref-Alhussan2022pothole"/>
     <w:p>
       <w:pPr>
@@ -9315,18 +9455,42 @@
       </w:hyperlink>
     </w:p>
     <w:bookmarkEnd w:id="100"/>
-    <w:bookmarkStart w:id="102" w:name="ref-Jweihan2026trustworthy"/>
+    <w:bookmarkStart w:id="102" w:name="ref-Jalal2024swarm"/>
     <w:p>
       <w:pPr>
         <w:pStyle w:val="Bibliography"/>
       </w:pPr>
       <w:r>
+        <w:t xml:space="preserve">Jalal, F.E., Iqbal, M., Khan, W.A., others</w:t>
+      </w:r>
+      <w:r>
+        <w:t xml:space="preserve">, 2024. ANN-based swarm intelligence for predicting expansive soil swell pressure and compression strength. Scientific Reports.</w:t>
+      </w:r>
+      <w:r>
+        <w:t xml:space="preserve"> </w:t>
+      </w:r>
+      <w:hyperlink r:id="rId101">
+        <w:r>
+          <w:rPr>
+            <w:rStyle w:val="Hyperlink"/>
+          </w:rPr>
+          <w:t xml:space="preserve">https://doi.org/10.1038/s41598-024-65547-7</w:t>
+        </w:r>
+      </w:hyperlink>
+    </w:p>
+    <w:bookmarkEnd w:id="102"/>
+    <w:bookmarkStart w:id="104" w:name="ref-Jweihan2026trustworthy"/>
+    <w:p>
+      <w:pPr>
+        <w:pStyle w:val="Bibliography"/>
+      </w:pPr>
+      <w:r>
         <w:t xml:space="preserve">Jweihan, Y.S., 2026. Trustworthy explainable AI for asphalt pavement engineering: A systematic scoping review of materials, performance, and decision support. Applied System Innovation.</w:t>
       </w:r>
       <w:r>
         <w:t xml:space="preserve"> </w:t>
       </w:r>
-      <w:hyperlink r:id="rId101">
+      <w:hyperlink r:id="rId103">
         <w:r>
           <w:rPr>
             <w:rStyle w:val="Hyperlink"/>
@@ -9335,8 +9499,8 @@
         </w:r>
       </w:hyperlink>
     </w:p>
-    <w:bookmarkEnd w:id="102"/>
-    <w:bookmarkStart w:id="104" w:name="ref-Kaloop2019particle"/>
+    <w:bookmarkEnd w:id="104"/>
+    <w:bookmarkStart w:id="106" w:name="ref-Kaloop2019particle"/>
     <w:p>
       <w:pPr>
         <w:pStyle w:val="Bibliography"/>
@@ -9350,7 +9514,7 @@
       <w:r>
         <w:t xml:space="preserve"> </w:t>
       </w:r>
-      <w:hyperlink r:id="rId103">
+      <w:hyperlink r:id="rId105">
         <w:r>
           <w:rPr>
             <w:rStyle w:val="Hyperlink"/>
@@ -9359,8 +9523,8 @@
         </w:r>
       </w:hyperlink>
     </w:p>
-    <w:bookmarkEnd w:id="104"/>
-    <w:bookmarkStart w:id="106" w:name="ref-Latifi2021reinforcement"/>
+    <w:bookmarkEnd w:id="106"/>
+    <w:bookmarkStart w:id="108" w:name="ref-Latifi2021reinforcement"/>
     <w:p>
       <w:pPr>
         <w:pStyle w:val="Bibliography"/>
@@ -9374,7 +9538,7 @@
       <w:r>
         <w:t xml:space="preserve"> </w:t>
       </w:r>
-      <w:hyperlink r:id="rId105">
+      <w:hyperlink r:id="rId107">
         <w:r>
           <w:rPr>
             <w:rStyle w:val="Hyperlink"/>
@@ -9383,8 +9547,8 @@
         </w:r>
       </w:hyperlink>
     </w:p>
-    <w:bookmarkEnd w:id="106"/>
-    <w:bookmarkStart w:id="108" w:name="ref-MharziAlaoui2026algorithm"/>
+    <w:bookmarkEnd w:id="108"/>
+    <w:bookmarkStart w:id="110" w:name="ref-MharziAlaoui2026algorithm"/>
     <w:p>
       <w:pPr>
         <w:pStyle w:val="Bibliography"/>
@@ -9398,7 +9562,7 @@
       <w:r>
         <w:t xml:space="preserve"> </w:t>
       </w:r>
-      <w:hyperlink r:id="rId107">
+      <w:hyperlink r:id="rId109">
         <w:r>
           <w:rPr>
             <w:rStyle w:val="Hyperlink"/>
@@ -9407,8 +9571,8 @@
         </w:r>
       </w:hyperlink>
     </w:p>
-    <w:bookmarkEnd w:id="108"/>
-    <w:bookmarkStart w:id="110" w:name="ref-Pan2025spatiotemporal"/>
+    <w:bookmarkEnd w:id="110"/>
+    <w:bookmarkStart w:id="112" w:name="ref-Pan2025spatiotemporal"/>
     <w:p>
       <w:pPr>
         <w:pStyle w:val="Bibliography"/>
@@ -9419,7 +9583,7 @@
       <w:r>
         <w:t xml:space="preserve"> </w:t>
       </w:r>
-      <w:hyperlink r:id="rId109">
+      <w:hyperlink r:id="rId111">
         <w:r>
           <w:rPr>
             <w:rStyle w:val="Hyperlink"/>
@@ -9428,8 +9592,8 @@
         </w:r>
       </w:hyperlink>
     </w:p>
-    <w:bookmarkEnd w:id="110"/>
-    <w:bookmarkStart w:id="112" w:name="ref-Pasupunuri2024roughness"/>
+    <w:bookmarkEnd w:id="112"/>
+    <w:bookmarkStart w:id="114" w:name="ref-Pasupunuri2024roughness"/>
     <w:p>
       <w:pPr>
         <w:pStyle w:val="Bibliography"/>
@@ -9440,7 +9604,7 @@
       <w:r>
         <w:t xml:space="preserve"> </w:t>
       </w:r>
-      <w:hyperlink r:id="rId111">
+      <w:hyperlink r:id="rId113">
         <w:r>
           <w:rPr>
             <w:rStyle w:val="Hyperlink"/>
@@ -9449,8 +9613,8 @@
         </w:r>
       </w:hyperlink>
     </w:p>
-    <w:bookmarkEnd w:id="112"/>
-    <w:bookmarkStart w:id="114" w:name="ref-Sun2023automatic"/>
+    <w:bookmarkEnd w:id="114"/>
+    <w:bookmarkStart w:id="116" w:name="ref-Sun2023automatic"/>
     <w:p>
       <w:pPr>
         <w:pStyle w:val="Bibliography"/>
@@ -9464,7 +9628,7 @@
       <w:r>
         <w:t xml:space="preserve"> </w:t>
       </w:r>
-      <w:hyperlink r:id="rId113">
+      <w:hyperlink r:id="rId115">
         <w:r>
           <w:rPr>
             <w:rStyle w:val="Hyperlink"/>
@@ -9473,8 +9637,8 @@
         </w:r>
       </w:hyperlink>
     </w:p>
-    <w:bookmarkEnd w:id="114"/>
-    <w:bookmarkStart w:id="116" w:name="ref-Wang2023developing"/>
+    <w:bookmarkEnd w:id="116"/>
+    <w:bookmarkStart w:id="118" w:name="ref-Wang2023developing"/>
     <w:p>
       <w:pPr>
         <w:pStyle w:val="Bibliography"/>
@@ -9485,7 +9649,7 @@
       <w:r>
         <w:t xml:space="preserve"> </w:t>
       </w:r>
-      <w:hyperlink r:id="rId115">
+      <w:hyperlink r:id="rId117">
         <w:r>
           <w:rPr>
             <w:rStyle w:val="Hyperlink"/>
@@ -9494,8 +9658,8 @@
         </w:r>
       </w:hyperlink>
     </w:p>
-    <w:bookmarkEnd w:id="116"/>
-    <w:bookmarkStart w:id="118" w:name="ref-Xiao2023optimizing"/>
+    <w:bookmarkEnd w:id="118"/>
+    <w:bookmarkStart w:id="120" w:name="ref-Xiao2023optimizing"/>
     <w:p>
       <w:pPr>
         <w:pStyle w:val="Bibliography"/>
@@ -9506,7 +9670,7 @@
       <w:r>
         <w:t xml:space="preserve"> </w:t>
       </w:r>
-      <w:hyperlink r:id="rId117">
+      <w:hyperlink r:id="rId119">
         <w:r>
           <w:rPr>
             <w:rStyle w:val="Hyperlink"/>
@@ -9515,8 +9679,8 @@
         </w:r>
       </w:hyperlink>
     </w:p>
-    <w:bookmarkEnd w:id="118"/>
-    <w:bookmarkStart w:id="120" w:name="ref-Yang2021research"/>
+    <w:bookmarkEnd w:id="120"/>
+    <w:bookmarkStart w:id="122" w:name="ref-Yang2021research"/>
     <w:p>
       <w:pPr>
         <w:pStyle w:val="Bibliography"/>
@@ -9530,7 +9694,7 @@
       <w:r>
         <w:t xml:space="preserve"> </w:t>
       </w:r>
-      <w:hyperlink r:id="rId119">
+      <w:hyperlink r:id="rId121">
         <w:r>
           <w:rPr>
             <w:rStyle w:val="Hyperlink"/>
@@ -9539,8 +9703,8 @@
         </w:r>
       </w:hyperlink>
     </w:p>
-    <w:bookmarkEnd w:id="120"/>
-    <w:bookmarkStart w:id="122" w:name="ref-Yao2022large"/>
+    <w:bookmarkEnd w:id="122"/>
+    <w:bookmarkStart w:id="124" w:name="ref-Yao2022large"/>
     <w:p>
       <w:pPr>
         <w:pStyle w:val="Bibliography"/>
@@ -9554,7 +9718,7 @@
       <w:r>
         <w:t xml:space="preserve"> </w:t>
       </w:r>
-      <w:hyperlink r:id="rId121">
+      <w:hyperlink r:id="rId123">
         <w:r>
           <w:rPr>
             <w:rStyle w:val="Hyperlink"/>
@@ -9563,8 +9727,8 @@
         </w:r>
       </w:hyperlink>
     </w:p>
-    <w:bookmarkEnd w:id="122"/>
-    <w:bookmarkStart w:id="124" w:name="ref-Yu2020highway"/>
+    <w:bookmarkEnd w:id="124"/>
+    <w:bookmarkStart w:id="126" w:name="ref-Yu2020highway"/>
     <w:p>
       <w:pPr>
         <w:pStyle w:val="Bibliography"/>
@@ -9578,7 +9742,7 @@
       <w:r>
         <w:t xml:space="preserve"> </w:t>
       </w:r>
-      <w:hyperlink r:id="rId123">
+      <w:hyperlink r:id="rId125">
         <w:r>
           <w:rPr>
             <w:rStyle w:val="Hyperlink"/>
@@ -9587,8 +9751,8 @@
         </w:r>
       </w:hyperlink>
     </w:p>
-    <w:bookmarkEnd w:id="124"/>
-    <w:bookmarkStart w:id="126" w:name="ref-Zeiada2025benchmarking"/>
+    <w:bookmarkEnd w:id="126"/>
+    <w:bookmarkStart w:id="128" w:name="ref-Zeiada2025benchmarking"/>
     <w:p>
       <w:pPr>
         <w:pStyle w:val="Bibliography"/>
@@ -9602,7 +9766,7 @@
       <w:r>
         <w:t xml:space="preserve"> </w:t>
       </w:r>
-      <w:hyperlink r:id="rId125">
+      <w:hyperlink r:id="rId127">
         <w:r>
           <w:rPr>
             <w:rStyle w:val="Hyperlink"/>
@@ -9611,9 +9775,9 @@
         </w:r>
       </w:hyperlink>
     </w:p>
-    <w:bookmarkEnd w:id="126"/>
-    <w:bookmarkEnd w:id="127"/>
     <w:bookmarkEnd w:id="128"/>
+    <w:bookmarkEnd w:id="129"/>
+    <w:bookmarkEnd w:id="130"/>
     <w:sectPr/>
   </w:body>
 </w:document>

</xml_diff>

<commit_message>
Fix critical bugs found by external review: Section 10 (Interpretability) was silently empty while manuscript referenced it 13 times meaning PAVE-ML (actually Section 12) -- wrote real Section 10 content, corrected all cross-references; added full 24-item PAVE-ML table to main text (was previously only described, not shown); added Figure 4 leakage mechanism diagram grounded in the confirmed Alnaqbi case; fixed a LaTeX-breaking unicode character; 32-page clean render
</commit_message>
<xml_diff>
--- a/output/manuscript.docx
+++ b/output/manuscript.docx
@@ -793,7 +793,7 @@
         <w:t xml:space="preserve"> </w:t>
       </w:r>
       <w:r>
-        <w:t xml:space="preserve">proposes in §10. The honest distinction is not that this territory is unoccupied;</w:t>
+        <w:t xml:space="preserve">proposes in §12. The honest distinction is not that this territory is unoccupied;</w:t>
       </w:r>
       <w:r>
         <w:t xml:space="preserve"> </w:t>
@@ -847,7 +847,7 @@
         <w:t xml:space="preserve"> </w:t>
       </w:r>
       <w:r>
-        <w:t xml:space="preserve">instruments are complementary rather than competing, and §10 states explicitly</w:t>
+        <w:t xml:space="preserve">instruments are complementary rather than competing, and §12 states explicitly</w:t>
       </w:r>
       <w:r>
         <w:t xml:space="preserve"> </w:t>
@@ -1155,7 +1155,7 @@
         <w:t xml:space="preserve"> </w:t>
       </w:r>
       <w:r>
-        <w:t xml:space="preserve">(§10), so that the next study in this field can report what this review finds</w:t>
+        <w:t xml:space="preserve">(§12), so that the next study in this field can report what this review finds</w:t>
       </w:r>
       <w:r>
         <w:t xml:space="preserve"> </w:t>
@@ -4303,7 +4303,7 @@
       </w:r>
     </w:p>
     <w:bookmarkEnd w:id="33"/>
-    <w:bookmarkStart w:id="34" w:name="sec-performance"/>
+    <w:bookmarkStart w:id="38" w:name="sec-performance"/>
     <w:p>
       <w:pPr>
         <w:pStyle w:val="Heading1"/>
@@ -4727,7 +4727,7 @@
         <w:t xml:space="preserve"> </w:t>
       </w:r>
       <w:r>
-        <w:t xml:space="preserve">(§10) is written to catch. Both papers’</w:t>
+        <w:t xml:space="preserve">(§12) is written to catch. Both papers’</w:t>
       </w:r>
       <w:r>
         <w:t xml:space="preserve"> </w:t>
@@ -4844,7 +4844,198 @@
         <w:t xml:space="preserve"> </w:t>
       </w:r>
       <w:r>
-        <w:t xml:space="preserve">whether or not the model has learned anything section-specific. Both papers also</w:t>
+        <w:t xml:space="preserve">whether or not the model has learned anything section-specific.</w:t>
+      </w:r>
+      <w:r>
+        <w:t xml:space="preserve"> </w:t>
+      </w:r>
+      <w:hyperlink w:anchor="fig-leakage">
+        <w:r>
+          <w:rPr>
+            <w:rStyle w:val="Hyperlink"/>
+          </w:rPr>
+          <w:t xml:space="preserve">Figure 4</w:t>
+        </w:r>
+      </w:hyperlink>
+      <w:r>
+        <w:t xml:space="preserve"> </w:t>
+      </w:r>
+      <w:r>
+        <w:t xml:space="preserve">makes the mechanism concrete: with roughly twelve observations per section, an</w:t>
+      </w:r>
+      <w:r>
+        <w:t xml:space="preserve"> </w:t>
+      </w:r>
+      <w:r>
+        <w:t xml:space="preserve">ungrouped random assignment (Panel A) all but guarantees that most sections</w:t>
+      </w:r>
+      <w:r>
+        <w:t xml:space="preserve"> </w:t>
+      </w:r>
+      <w:r>
+        <w:t xml:space="preserve">contribute records to more than one fold, so a model can be trained on 10–11 of a</w:t>
+      </w:r>
+      <w:r>
+        <w:t xml:space="preserve"> </w:t>
+      </w:r>
+      <w:r>
+        <w:t xml:space="preserve">section’s 12 observations and then</w:t>
+      </w:r>
+      <w:r>
+        <w:t xml:space="preserve"> </w:t>
+      </w:r>
+      <w:r>
+        <w:t xml:space="preserve">“tested”</w:t>
+      </w:r>
+      <w:r>
+        <w:t xml:space="preserve"> </w:t>
+      </w:r>
+      <w:r>
+        <w:t xml:space="preserve">on the 12th — a near-duplicate,</w:t>
+      </w:r>
+      <w:r>
+        <w:t xml:space="preserve"> </w:t>
+      </w:r>
+      <w:r>
+        <w:t xml:space="preserve">spatially correlated record rather than a genuinely unseen one. A section-grouped</w:t>
+      </w:r>
+      <w:r>
+        <w:t xml:space="preserve"> </w:t>
+      </w:r>
+      <w:r>
+        <w:t xml:space="preserve">assignment (Panel B), which the reviewed papers’ methods sections do not describe</w:t>
+      </w:r>
+      <w:r>
+        <w:t xml:space="preserve"> </w:t>
+      </w:r>
+      <w:r>
+        <w:t xml:space="preserve">using, holds each section entirely within one fold, so the test fold contains no</w:t>
+      </w:r>
+      <w:r>
+        <w:t xml:space="preserve"> </w:t>
+      </w:r>
+      <w:r>
+        <w:t xml:space="preserve">information the model could have seen during training.</w:t>
+      </w:r>
+    </w:p>
+    <w:tbl>
+      <w:tblPr>
+        <w:tblStyle w:val="Table"/>
+        <w:tblW w:type="pct" w:w="5000"/>
+        <w:tblLayout w:type="fixed"/>
+        <w:tblLook w:firstRow="0" w:lastRow="0" w:firstColumn="0" w:lastColumn="0" w:noHBand="0" w:noVBand="0" w:val="0000"/>
+      </w:tblPr>
+      <w:tblGrid>
+        <w:gridCol w:w="7920"/>
+      </w:tblGrid>
+      <w:tr>
+        <w:tc>
+          <w:tcPr/>
+          <w:bookmarkStart w:id="37" w:name="fig-leakage"/>
+          <w:p>
+            <w:pPr>
+              <w:pStyle w:val="Compact"/>
+              <w:jc w:val="center"/>
+            </w:pPr>
+            <w:r>
+              <w:drawing>
+                <wp:inline>
+                  <wp:extent cx="5067300" cy="3901228"/>
+                  <wp:effectExtent b="0" l="0" r="0" t="0"/>
+                  <wp:docPr descr="" title="" id="35" name="Picture"/>
+                  <a:graphic>
+                    <a:graphicData uri="http://schemas.openxmlformats.org/drawingml/2006/picture">
+                      <pic:pic>
+                        <pic:nvPicPr>
+                          <pic:cNvPr descr="figures/fig04_leakage_diagram.png" id="36" name="Picture"/>
+                          <pic:cNvPicPr>
+                            <a:picLocks noChangeArrowheads="1" noChangeAspect="1"/>
+                          </pic:cNvPicPr>
+                        </pic:nvPicPr>
+                        <pic:blipFill>
+                          <a:blip r:embed="rId34"/>
+                          <a:stretch>
+                            <a:fillRect/>
+                          </a:stretch>
+                        </pic:blipFill>
+                        <pic:spPr bwMode="auto">
+                          <a:xfrm>
+                            <a:off x="0" y="0"/>
+                            <a:ext cx="5067300" cy="3901228"/>
+                          </a:xfrm>
+                          <a:prstGeom prst="rect">
+                            <a:avLst/>
+                          </a:prstGeom>
+                          <a:noFill/>
+                          <a:ln w="9525">
+                            <a:noFill/>
+                            <a:headEnd/>
+                            <a:tailEnd/>
+                          </a:ln>
+                        </pic:spPr>
+                      </pic:pic>
+                    </a:graphicData>
+                  </a:graphic>
+                </wp:inline>
+              </w:drawing>
+            </w:r>
+          </w:p>
+          <w:p>
+            <w:pPr>
+              <w:jc w:val="center"/>
+            </w:pPr>
+            <w:pPr>
+              <w:jc w:val="left"/>
+              <w:spacing w:before="200"/>
+              <w:pStyle w:val="ImageCaption"/>
+            </w:pPr>
+            <w:r>
+              <w:t xml:space="preserve">Figure 4: Random versus section-grouped 5-fold cross-validation on a 33-section, ~12-observation-per-section</w:t>
+            </w:r>
+            <w:r>
+              <w:t xml:space="preserve"> </w:t>
+            </w:r>
+            <w:r>
+              <w:t xml:space="preserve">substrate matching the CRCP data audited in this section. Panel A reproduces the</w:t>
+            </w:r>
+            <w:r>
+              <w:t xml:space="preserve"> </w:t>
+            </w:r>
+            <w:r>
+              <w:t xml:space="preserve">partitioning</w:t>
+            </w:r>
+            <w:r>
+              <w:t xml:space="preserve"> </w:t>
+            </w:r>
+            <w:r>
+              <w:t xml:space="preserve">Alnaqbi et al. (2025f)</w:t>
+            </w:r>
+            <w:r>
+              <w:t xml:space="preserve">’s methods section describes; Panel B shows the</w:t>
+            </w:r>
+            <w:r>
+              <w:t xml:space="preserve"> </w:t>
+            </w:r>
+            <w:r>
+              <w:t xml:space="preserve">section-grouped alternative not used in the reviewed</w:t>
+            </w:r>
+            <w:r>
+              <w:t xml:space="preserve"> </w:t>
+            </w:r>
+            <w:r>
+              <w:t xml:space="preserve">papers.</w:t>
+            </w:r>
+          </w:p>
+          <w:bookmarkEnd w:id="37"/>
+        </w:tc>
+      </w:tr>
+    </w:tbl>
+    <w:p>
+      <w:pPr>
+        <w:pStyle w:val="BodyText"/>
+      </w:pPr>
+      <w:r>
+        <w:t xml:space="preserve">Both papers also</w:t>
       </w:r>
       <w:r>
         <w:t xml:space="preserve"> </w:t>
@@ -5071,7 +5262,7 @@
         <w:t xml:space="preserve"> </w:t>
       </w:r>
       <w:r>
-        <w:t xml:space="preserve">in PAVE-ML (§10)</w:t>
+        <w:t xml:space="preserve">in PAVE-ML (§12)</w:t>
       </w:r>
       <w:r>
         <w:t xml:space="preserve"> </w:t>
@@ -5276,7 +5467,7 @@
         <w:t xml:space="preserve"> </w:t>
       </w:r>
       <w:r>
-        <w:t xml:space="preserve">detail belongs with the deployment-evidence discussion in §9 and §10 as one of the</w:t>
+        <w:t xml:space="preserve">detail belongs with the deployment-evidence discussion in §9 and §12 as one of the</w:t>
       </w:r>
       <w:r>
         <w:t xml:space="preserve"> </w:t>
@@ -5297,8 +5488,8 @@
         <w:t xml:space="preserve">not report.</w:t>
       </w:r>
     </w:p>
-    <w:bookmarkEnd w:id="34"/>
-    <w:bookmarkStart w:id="35" w:name="sec-other-hybrids"/>
+    <w:bookmarkEnd w:id="38"/>
+    <w:bookmarkStart w:id="39" w:name="sec-other-hybrids"/>
     <w:p>
       <w:pPr>
         <w:pStyle w:val="Heading1"/>
@@ -5597,7 +5788,7 @@
         <w:t xml:space="preserve"> </w:t>
       </w:r>
       <w:r>
-        <w:t xml:space="preserve">implementation — and is cited throughout this review (§9, §10) as the type’s</w:t>
+        <w:t xml:space="preserve">implementation — and is cited throughout this review (§9, §12) as the type’s</w:t>
       </w:r>
       <w:r>
         <w:t xml:space="preserve"> </w:t>
@@ -5797,8 +5988,8 @@
         <w:t xml:space="preserve">explanation of an unvalidated model cannot.</w:t>
       </w:r>
     </w:p>
-    <w:bookmarkEnd w:id="35"/>
-    <w:bookmarkStart w:id="40" w:name="sec-premium"/>
+    <w:bookmarkEnd w:id="39"/>
+    <w:bookmarkStart w:id="44" w:name="sec-premium"/>
     <w:p>
       <w:pPr>
         <w:pStyle w:val="Heading1"/>
@@ -5807,7 +5998,7 @@
         <w:t xml:space="preserve">9. The hybridisation premium</w:t>
       </w:r>
     </w:p>
-    <w:bookmarkStart w:id="36" w:name="definition"/>
+    <w:bookmarkStart w:id="40" w:name="definition"/>
     <w:p>
       <w:pPr>
         <w:pStyle w:val="Heading2"/>
@@ -6130,8 +6321,8 @@
         <w:t xml:space="preserve">what hybridisation contributes — it is a measure of what tuning contributes, mislabelled.</w:t>
       </w:r>
     </w:p>
-    <w:bookmarkEnd w:id="36"/>
-    <w:bookmarkStart w:id="37" w:name="what-the-completed-audit-will-report"/>
+    <w:bookmarkEnd w:id="40"/>
+    <w:bookmarkStart w:id="41" w:name="what-the-completed-audit-will-report"/>
     <w:p>
       <w:pPr>
         <w:pStyle w:val="Heading2"/>
@@ -6231,7 +6422,7 @@
         <w:t xml:space="preserve"> </w:t>
       </w:r>
       <w:r>
-        <w:t xml:space="preserve">examples, in the PAVE-ML instrument (§10) and were fixed before full-text coding</w:t>
+        <w:t xml:space="preserve">examples, in the PAVE-ML instrument (§12) and were fixed before full-text coding</w:t>
       </w:r>
       <w:r>
         <w:t xml:space="preserve"> </w:t>
@@ -6240,8 +6431,8 @@
         <w:t xml:space="preserve">began.</w:t>
       </w:r>
     </w:p>
-    <w:bookmarkEnd w:id="37"/>
-    <w:bookmarkStart w:id="39" w:name="X7f25b91c7f8b674ee1023e90faae5a96e47348b"/>
+    <w:bookmarkEnd w:id="41"/>
+    <w:bookmarkStart w:id="43" w:name="X7f25b91c7f8b674ee1023e90faae5a96e47348b"/>
     <w:p>
       <w:pPr>
         <w:pStyle w:val="Heading2"/>
@@ -6312,7 +6503,7 @@
       <w:tr>
         <w:tc>
           <w:tcPr/>
-          <w:bookmarkStart w:id="38" w:name="tbl-premium-evidence"/>
+          <w:bookmarkStart w:id="42" w:name="tbl-premium-evidence"/>
           <w:p>
             <w:pPr>
               <w:jc w:val="center"/>
@@ -6877,7 +7068,7 @@
               </w:tc>
             </w:tr>
           </w:tbl>
-          <w:bookmarkEnd w:id="38"/>
+          <w:bookmarkEnd w:id="42"/>
           <w:p/>
         </w:tc>
       </w:tr>
@@ -7103,7 +7294,7 @@
         <w:t xml:space="preserve"> </w:t>
       </w:r>
       <w:r>
-        <w:t xml:space="preserve">cited in §10 as the positive PAVE-ML exemplar for exactly this reason.</w:t>
+        <w:t xml:space="preserve">cited in §12 as the positive PAVE-ML exemplar for exactly this reason.</w:t>
       </w:r>
     </w:p>
     <w:p>
@@ -7126,9 +7317,9 @@
         <w:t xml:space="preserve">completing, not as its substitute.</w:t>
       </w:r>
     </w:p>
-    <w:bookmarkEnd w:id="39"/>
-    <w:bookmarkEnd w:id="40"/>
-    <w:bookmarkStart w:id="41" w:name="sec-interpretability"/>
+    <w:bookmarkEnd w:id="43"/>
+    <w:bookmarkEnd w:id="44"/>
+    <w:bookmarkStart w:id="48" w:name="sec-interpretability"/>
     <w:p>
       <w:pPr>
         <w:pStyle w:val="Heading1"/>
@@ -7142,11 +7333,606 @@
         <w:pStyle w:val="FirstParagraph"/>
       </w:pPr>
       <w:r>
-        <w:t xml:space="preserve">PLACEHOLDER.</w:t>
-      </w:r>
-    </w:p>
-    <w:bookmarkEnd w:id="41"/>
-    <w:bookmarkStart w:id="42" w:name="sec-decision"/>
+        <w:t xml:space="preserve">Two constructs recur across the hybrid-model literature under the banner of</w:t>
+      </w:r>
+      <w:r>
+        <w:t xml:space="preserve"> </w:t>
+      </w:r>
+      <w:r>
+        <w:t xml:space="preserve">trustworthiness — interpretability and uncertainty quantification — and both are</w:t>
+      </w:r>
+      <w:r>
+        <w:t xml:space="preserve"> </w:t>
+      </w:r>
+      <w:r>
+        <w:t xml:space="preserve">applied in this corpus in ways that, on inspection, often do less than their</w:t>
+      </w:r>
+      <w:r>
+        <w:t xml:space="preserve"> </w:t>
+      </w:r>
+      <w:r>
+        <w:t xml:space="preserve">presence in a paper’s keyword list implies.</w:t>
+      </w:r>
+    </w:p>
+    <w:bookmarkStart w:id="45" w:name="X49cb7ec1024df583123906f939cb2b3118205d9"/>
+    <w:p>
+      <w:pPr>
+        <w:pStyle w:val="Heading2"/>
+      </w:pPr>
+      <w:r>
+        <w:t xml:space="preserve">10.1 What</w:t>
+      </w:r>
+      <w:r>
+        <w:t xml:space="preserve"> </w:t>
+      </w:r>
+      <w:r>
+        <w:t xml:space="preserve">“interpretability”</w:t>
+      </w:r>
+      <w:r>
+        <w:t xml:space="preserve"> </w:t>
+      </w:r>
+      <w:r>
+        <w:t xml:space="preserve">means for a hybrid pipeline</w:t>
+      </w:r>
+    </w:p>
+    <w:p>
+      <w:pPr>
+        <w:pStyle w:val="FirstParagraph"/>
+      </w:pPr>
+      <w:r>
+        <w:t xml:space="preserve">The interpretability methods visible in the seed corpus fall into two families with</w:t>
+      </w:r>
+      <w:r>
+        <w:t xml:space="preserve"> </w:t>
+      </w:r>
+      <w:r>
+        <w:t xml:space="preserve">different epistemic status. The first is</w:t>
+      </w:r>
+      <w:r>
+        <w:t xml:space="preserve"> </w:t>
+      </w:r>
+      <w:r>
+        <w:rPr>
+          <w:b/>
+          <w:bCs/>
+        </w:rPr>
+        <w:t xml:space="preserve">post-hoc attribution on an opaque</w:t>
+      </w:r>
+      <w:r>
+        <w:rPr>
+          <w:b/>
+          <w:bCs/>
+        </w:rPr>
+        <w:t xml:space="preserve"> </w:t>
+      </w:r>
+      <w:r>
+        <w:rPr>
+          <w:b/>
+          <w:bCs/>
+        </w:rPr>
+        <w:t xml:space="preserve">model</w:t>
+      </w:r>
+      <w:r>
+        <w:t xml:space="preserve">: Garson’s algorithm and connection-weight decomposition</w:t>
+      </w:r>
+      <w:r>
+        <w:t xml:space="preserve"> </w:t>
+      </w:r>
+      <w:r>
+        <w:t xml:space="preserve">(Ghanizadeh et al., 2020)</w:t>
+      </w:r>
+      <w:r>
+        <w:t xml:space="preserve">, SHAP applied to gradient-boosted or stacked ensembles</w:t>
+      </w:r>
+      <w:r>
+        <w:t xml:space="preserve"> </w:t>
+      </w:r>
+      <w:r>
+        <w:t xml:space="preserve">(</w:t>
+      </w:r>
+      <w:r>
+        <w:t xml:space="preserve">Huang et al.</w:t>
+      </w:r>
+      <w:r>
+        <w:t xml:space="preserve">, 2025; Xiao et al., 2023)</w:t>
+      </w:r>
+      <w:r>
+        <w:t xml:space="preserve">, and neighbourhood component analysis</w:t>
+      </w:r>
+      <w:r>
+        <w:t xml:space="preserve"> </w:t>
+      </w:r>
+      <w:r>
+        <w:t xml:space="preserve">(</w:t>
+      </w:r>
+      <w:r>
+        <w:t xml:space="preserve">Ghanizadeh et al.</w:t>
+      </w:r>
+      <w:r>
+        <w:t xml:space="preserve">, 2023)</w:t>
+      </w:r>
+      <w:r>
+        <w:t xml:space="preserve">. These methods answer a well-defined but narrow question —</w:t>
+      </w:r>
+      <w:r>
+        <w:t xml:space="preserve"> </w:t>
+      </w:r>
+      <w:r>
+        <w:t xml:space="preserve">which inputs moved this particular model’s output, on this particular data — and</w:t>
+      </w:r>
+      <w:r>
+        <w:t xml:space="preserve"> </w:t>
+      </w:r>
+      <w:r>
+        <w:t xml:space="preserve">answer nothing at all about whether the model’s predictions are trustworthy off</w:t>
+      </w:r>
+      <w:r>
+        <w:t xml:space="preserve"> </w:t>
+      </w:r>
+      <w:r>
+        <w:t xml:space="preserve">that data. The second is</w:t>
+      </w:r>
+      <w:r>
+        <w:t xml:space="preserve"> </w:t>
+      </w:r>
+      <w:r>
+        <w:rPr>
+          <w:b/>
+          <w:bCs/>
+        </w:rPr>
+        <w:t xml:space="preserve">intrinsic interpretability</w:t>
+      </w:r>
+      <w:r>
+        <w:t xml:space="preserve">: symbolic-regression</w:t>
+      </w:r>
+      <w:r>
+        <w:t xml:space="preserve"> </w:t>
+      </w:r>
+      <w:r>
+        <w:t xml:space="preserve">methods (GEP, MEP, EPR, MGGP) that yield a closed-form equation rather than a</w:t>
+      </w:r>
+      <w:r>
+        <w:t xml:space="preserve"> </w:t>
+      </w:r>
+      <w:r>
+        <w:t xml:space="preserve">black-box function</w:t>
+      </w:r>
+      <w:r>
+        <w:t xml:space="preserve"> </w:t>
+      </w:r>
+      <w:r>
+        <w:t xml:space="preserve">(</w:t>
+      </w:r>
+      <w:r>
+        <w:t xml:space="preserve">Ghanizadeh et al.</w:t>
+      </w:r>
+      <w:r>
+        <w:t xml:space="preserve">, 2024;</w:t>
+      </w:r>
+      <w:r>
+        <w:t xml:space="preserve"> </w:t>
+      </w:r>
+      <w:r>
+        <w:t xml:space="preserve">Jalal et al.</w:t>
+      </w:r>
+      <w:r>
+        <w:t xml:space="preserve">, 2023; Mazari and Rodriguez, 2016)</w:t>
+      </w:r>
+      <w:r>
+        <w:t xml:space="preserve">. An</w:t>
+      </w:r>
+      <w:r>
+        <w:t xml:space="preserve"> </w:t>
+      </w:r>
+      <w:r>
+        <w:t xml:space="preserve">equation can be inspected for physical plausibility — does the sign of each</w:t>
+      </w:r>
+      <w:r>
+        <w:t xml:space="preserve"> </w:t>
+      </w:r>
+      <w:r>
+        <w:t xml:space="preserve">coefficient match known mechanics, does the functional form saturate or diverge</w:t>
+      </w:r>
+      <w:r>
+        <w:t xml:space="preserve"> </w:t>
+      </w:r>
+      <w:r>
+        <w:t xml:space="preserve">where it should — in a way a SHAP plot cannot be, because SHAP explains what the</w:t>
+      </w:r>
+      <w:r>
+        <w:t xml:space="preserve"> </w:t>
+      </w:r>
+      <w:r>
+        <w:t xml:space="preserve">model learned, not whether what it learned is correct.</w:t>
+      </w:r>
+    </w:p>
+    <w:p>
+      <w:pPr>
+        <w:pStyle w:val="BodyText"/>
+      </w:pPr>
+      <w:r>
+        <w:t xml:space="preserve">This distinction sharpens the point §7 and §9 make about validation. An</w:t>
+      </w:r>
+      <w:r>
+        <w:t xml:space="preserve"> </w:t>
+      </w:r>
+      <w:r>
+        <w:t xml:space="preserve">attribution method applied to a model that has not been externally validated</w:t>
+      </w:r>
+      <w:r>
+        <w:t xml:space="preserve"> </w:t>
+      </w:r>
+      <w:r>
+        <w:t xml:space="preserve">(the majority of the corpus, by the audit’s own count) ranks the structure of</w:t>
+      </w:r>
+      <w:r>
+        <w:t xml:space="preserve"> </w:t>
+      </w:r>
+      <w:r>
+        <w:t xml:space="preserve">that model’s training data, not the physics of the pavement — and every one of</w:t>
+      </w:r>
+      <w:r>
+        <w:t xml:space="preserve"> </w:t>
+      </w:r>
+      <w:r>
+        <w:t xml:space="preserve">the corpus’s SHAP applications identified so far</w:t>
+      </w:r>
+      <w:r>
+        <w:t xml:space="preserve"> </w:t>
+      </w:r>
+      <w:r>
+        <w:t xml:space="preserve">(</w:t>
+      </w:r>
+      <w:r>
+        <w:t xml:space="preserve">Huang et al.</w:t>
+      </w:r>
+      <w:r>
+        <w:t xml:space="preserve">, 2025; Xiao et al., 2023)</w:t>
+      </w:r>
+      <w:r>
+        <w:t xml:space="preserve"> </w:t>
+      </w:r>
+      <w:r>
+        <w:t xml:space="preserve">is computed on a model whose external validation, under</w:t>
+      </w:r>
+      <w:r>
+        <w:t xml:space="preserve"> </w:t>
+      </w:r>
+      <w:r>
+        <w:t xml:space="preserve">the criterion in §2.3, codes</w:t>
+      </w:r>
+      <w:r>
+        <w:t xml:space="preserve"> </w:t>
+      </w:r>
+      <w:r>
+        <w:rPr>
+          <w:rStyle w:val="VerbatimChar"/>
+        </w:rPr>
+        <w:t xml:space="preserve">no</w:t>
+      </w:r>
+      <w:r>
+        <w:t xml:space="preserve">. This is not a claim that the attributions are</w:t>
+      </w:r>
+      <w:r>
+        <w:t xml:space="preserve"> </w:t>
+      </w:r>
+      <w:r>
+        <w:t xml:space="preserve">wrong; it is a claim that their scope is narrower than the surrounding prose</w:t>
+      </w:r>
+      <w:r>
+        <w:t xml:space="preserve"> </w:t>
+      </w:r>
+      <w:r>
+        <w:t xml:space="preserve">typically implies. A useful negative case makes the point concretely:</w:t>
+      </w:r>
+      <w:r>
+        <w:t xml:space="preserve"> </w:t>
+      </w:r>
+      <w:r>
+        <w:t xml:space="preserve">Sandamal et al.</w:t>
+      </w:r>
+      <w:r>
+        <w:t xml:space="preserve"> </w:t>
+      </w:r>
+      <w:r>
+        <w:t xml:space="preserve">(2023)</w:t>
+      </w:r>
+      <w:r>
+        <w:t xml:space="preserve"> </w:t>
+      </w:r>
+      <w:r>
+        <w:t xml:space="preserve">apply SHAP to a two-predictor roughness model (age and</w:t>
+      </w:r>
+      <w:r>
+        <w:t xml:space="preserve"> </w:t>
+      </w:r>
+      <w:r>
+        <w:t xml:space="preserve">cumulative traffic) — with only two inputs, a SHAP decomposition can say little a</w:t>
+      </w:r>
+      <w:r>
+        <w:t xml:space="preserve"> </w:t>
+      </w:r>
+      <w:r>
+        <w:t xml:space="preserve">simple partial-dependence plot would not already show, and the paper illustrates</w:t>
+      </w:r>
+      <w:r>
+        <w:t xml:space="preserve"> </w:t>
+      </w:r>
+      <w:r>
+        <w:t xml:space="preserve">how readily explainability tooling is reached for even where the underlying model</w:t>
+      </w:r>
+      <w:r>
+        <w:t xml:space="preserve"> </w:t>
+      </w:r>
+      <w:r>
+        <w:t xml:space="preserve">offers little for it to explain. At the other end,</w:t>
+      </w:r>
+      <w:r>
+        <w:t xml:space="preserve"> </w:t>
+      </w:r>
+      <w:r>
+        <w:t xml:space="preserve">Jalal et al.</w:t>
+      </w:r>
+      <w:r>
+        <w:t xml:space="preserve"> </w:t>
+      </w:r>
+      <w:r>
+        <w:t xml:space="preserve">(2023)</w:t>
+      </w:r>
+      <w:r>
+        <w:t xml:space="preserve"> </w:t>
+      </w:r>
+      <w:r>
+        <w:t xml:space="preserve">make the</w:t>
+      </w:r>
+      <w:r>
+        <w:t xml:space="preserve"> </w:t>
+      </w:r>
+      <w:r>
+        <w:t xml:space="preserve">trade-off explicit rather than leaving it implicit: their ANN outperforms GEP and</w:t>
+      </w:r>
+      <w:r>
+        <w:t xml:space="preserve"> </w:t>
+      </w:r>
+      <w:r>
+        <w:t xml:space="preserve">MEP numerically, and they recommend the symbolic alternatives anyway, stating</w:t>
+      </w:r>
+      <w:r>
+        <w:t xml:space="preserve"> </w:t>
+      </w:r>
+      <w:r>
+        <w:t xml:space="preserve">plainly that this is</w:t>
+      </w:r>
+      <w:r>
+        <w:t xml:space="preserve"> </w:t>
+      </w:r>
+      <w:r>
+        <w:t xml:space="preserve">“due to the blackbox nature of the ANN”</w:t>
+      </w:r>
+      <w:r>
+        <w:t xml:space="preserve"> </w:t>
+      </w:r>
+      <w:r>
+        <w:t xml:space="preserve">— one of the only</w:t>
+      </w:r>
+      <w:r>
+        <w:t xml:space="preserve"> </w:t>
+      </w:r>
+      <w:r>
+        <w:t xml:space="preserve">studies in the corpus to treat interpretability as a design objective competing</w:t>
+      </w:r>
+      <w:r>
+        <w:t xml:space="preserve"> </w:t>
+      </w:r>
+      <w:r>
+        <w:t xml:space="preserve">with accuracy, rather than as a figure added after the fact.</w:t>
+      </w:r>
+    </w:p>
+    <w:bookmarkEnd w:id="45"/>
+    <w:bookmarkStart w:id="46" w:name="X91e2116918ce5fd5ce72980b074ec362577273d"/>
+    <w:p>
+      <w:pPr>
+        <w:pStyle w:val="Heading2"/>
+      </w:pPr>
+      <w:r>
+        <w:t xml:space="preserve">10.2 Uncertainty quantification: absent, not merely under-reported</w:t>
+      </w:r>
+    </w:p>
+    <w:p>
+      <w:pPr>
+        <w:pStyle w:val="FirstParagraph"/>
+      </w:pPr>
+      <w:r>
+        <w:t xml:space="preserve">Where interpretability is present but often narrow, predictive uncertainty is, so</w:t>
+      </w:r>
+      <w:r>
+        <w:t xml:space="preserve"> </w:t>
+      </w:r>
+      <w:r>
+        <w:t xml:space="preserve">far, close to absent. None of the studies coded to date reports an interval or</w:t>
+      </w:r>
+      <w:r>
+        <w:t xml:space="preserve"> </w:t>
+      </w:r>
+      <w:r>
+        <w:t xml:space="preserve">distributional estimate for an individual prediction — no conformal intervals, no</w:t>
+      </w:r>
+      <w:r>
+        <w:t xml:space="preserve"> </w:t>
+      </w:r>
+      <w:r>
+        <w:t xml:space="preserve">deep ensembles, no Gaussian-process variance, no quantile regression. What the</w:t>
+      </w:r>
+      <w:r>
+        <w:t xml:space="preserve"> </w:t>
+      </w:r>
+      <w:r>
+        <w:t xml:space="preserve">corpus does report, frequently, is dispersion of the</w:t>
+      </w:r>
+      <w:r>
+        <w:t xml:space="preserve"> </w:t>
+      </w:r>
+      <w:r>
+        <w:rPr>
+          <w:i/>
+          <w:iCs/>
+        </w:rPr>
+        <w:t xml:space="preserve">performance estimate</w:t>
+      </w:r>
+      <w:r>
+        <w:t xml:space="preserve"> </w:t>
+      </w:r>
+      <w:r>
+        <w:t xml:space="preserve">across</w:t>
+      </w:r>
+      <w:r>
+        <w:t xml:space="preserve"> </w:t>
+      </w:r>
+      <w:r>
+        <w:t xml:space="preserve">cross-validation folds (§9’s discussion of</w:t>
+      </w:r>
+      <w:r>
+        <w:t xml:space="preserve"> </w:t>
+      </w:r>
+      <w:r>
+        <w:t xml:space="preserve">Alnaqbi et al. (2025f)</w:t>
+      </w:r>
+      <w:r>
+        <w:t xml:space="preserve">’s fold-consistent</w:t>
+      </w:r>
+      <w:r>
+        <w:t xml:space="preserve"> </w:t>
+      </w:r>
+      <w:r>
+        <w:t xml:space="preserve">RMSE is one example), which is a different quantity: it describes how stable the</w:t>
+      </w:r>
+      <w:r>
+        <w:t xml:space="preserve"> </w:t>
+      </w:r>
+      <w:r>
+        <w:t xml:space="preserve">model’s average skill is across resampling, not how confident any single</w:t>
+      </w:r>
+      <w:r>
+        <w:t xml:space="preserve"> </w:t>
+      </w:r>
+      <w:r>
+        <w:t xml:space="preserve">prediction should be treated. The two are easy to conflate and the corpus’s</w:t>
+      </w:r>
+      <w:r>
+        <w:t xml:space="preserve"> </w:t>
+      </w:r>
+      <w:r>
+        <w:t xml:space="preserve">papers do not, so far, distinguish them explicitly. Reporting this distinction is</w:t>
+      </w:r>
+      <w:r>
+        <w:t xml:space="preserve"> </w:t>
+      </w:r>
+      <w:r>
+        <w:t xml:space="preserve">itself one of the audit’s findings — a field that quantifies dispersion of its own</w:t>
+      </w:r>
+      <w:r>
+        <w:t xml:space="preserve"> </w:t>
+      </w:r>
+      <w:r>
+        <w:t xml:space="preserve">performance estimate but not of its individual predictions has a form of</w:t>
+      </w:r>
+      <w:r>
+        <w:t xml:space="preserve"> </w:t>
+      </w:r>
+      <w:r>
+        <w:t xml:space="preserve">uncertainty reporting that looks more complete than it is.</w:t>
+      </w:r>
+    </w:p>
+    <w:bookmarkEnd w:id="46"/>
+    <w:bookmarkStart w:id="47" w:name="Xd682745c7bc1f0efecf3cafadf5b85d8e31ce15"/>
+    <w:p>
+      <w:pPr>
+        <w:pStyle w:val="Heading2"/>
+      </w:pPr>
+      <w:r>
+        <w:t xml:space="preserve">10.3 Physics-informed learning as a third, structural, path</w:t>
+      </w:r>
+    </w:p>
+    <w:p>
+      <w:pPr>
+        <w:pStyle w:val="FirstParagraph"/>
+      </w:pPr>
+      <w:r>
+        <w:t xml:space="preserve">Pasupunuri et al. (2024)</w:t>
+      </w:r>
+      <w:r>
+        <w:t xml:space="preserve">’s PINN offers a genuinely different route to</w:t>
+      </w:r>
+      <w:r>
+        <w:t xml:space="preserve"> </w:t>
+      </w:r>
+      <w:r>
+        <w:t xml:space="preserve">trustworthiness than either post-hoc attribution or a closed-form equation: rather</w:t>
+      </w:r>
+      <w:r>
+        <w:t xml:space="preserve"> </w:t>
+      </w:r>
+      <w:r>
+        <w:t xml:space="preserve">than explaining a model after fitting or restricting its functional form,</w:t>
+      </w:r>
+      <w:r>
+        <w:t xml:space="preserve"> </w:t>
+      </w:r>
+      <w:r>
+        <w:t xml:space="preserve">constrain what the model is permitted to learn to what the underlying MEPDG</w:t>
+      </w:r>
+      <w:r>
+        <w:t xml:space="preserve"> </w:t>
+      </w:r>
+      <w:r>
+        <w:t xml:space="preserve">mechanics allow, expressed as a physics-loss term during training. Sensitivity</w:t>
+      </w:r>
+      <w:r>
+        <w:t xml:space="preserve"> </w:t>
+      </w:r>
+      <w:r>
+        <w:t xml:space="preserve">analysis is reported as a supplementary check, not the primary trust mechanism —</w:t>
+      </w:r>
+      <w:r>
+        <w:t xml:space="preserve"> </w:t>
+      </w:r>
+      <w:r>
+        <w:t xml:space="preserve">the mechanics constraint does that work directly. This is the only example of</w:t>
+      </w:r>
+      <w:r>
+        <w:t xml:space="preserve"> </w:t>
+      </w:r>
+      <w:r>
+        <w:t xml:space="preserve">this kind in the seed corpus (§8), and its scarcity is itself the finding: a</w:t>
+      </w:r>
+      <w:r>
+        <w:t xml:space="preserve"> </w:t>
+      </w:r>
+      <w:r>
+        <w:t xml:space="preserve">pavement engineering literature that has adopted post-hoc explanation tools</w:t>
+      </w:r>
+      <w:r>
+        <w:t xml:space="preserve"> </w:t>
+      </w:r>
+      <w:r>
+        <w:t xml:space="preserve">readily has adopted structural, mechanics-consistent alternatives far more slowly,</w:t>
+      </w:r>
+      <w:r>
+        <w:t xml:space="preserve"> </w:t>
+      </w:r>
+      <w:r>
+        <w:t xml:space="preserve">despite the domain’s underlying physics being comparatively well characterised</w:t>
+      </w:r>
+      <w:r>
+        <w:t xml:space="preserve"> </w:t>
+      </w:r>
+      <w:r>
+        <w:t xml:space="preserve">relative to many fields where PINNs originated.</w:t>
+      </w:r>
+    </w:p>
+    <w:bookmarkEnd w:id="47"/>
+    <w:bookmarkEnd w:id="48"/>
+    <w:bookmarkStart w:id="49" w:name="sec-decision"/>
     <w:p>
       <w:pPr>
         <w:pStyle w:val="Heading1"/>
@@ -7516,8 +8302,8 @@
         <w:t xml:space="preserve">rather than an exception a careful reader happens to spot.</w:t>
       </w:r>
     </w:p>
-    <w:bookmarkEnd w:id="42"/>
-    <w:bookmarkStart w:id="43" w:name="sec-paveml"/>
+    <w:bookmarkEnd w:id="49"/>
+    <w:bookmarkStart w:id="51" w:name="sec-paveml"/>
     <w:p>
       <w:pPr>
         <w:pStyle w:val="Heading1"/>
@@ -7557,37 +8343,40 @@
       <w:r>
         <w:t xml:space="preserve">score themselves against before submission.</w:t>
       </w:r>
-    </w:p>
-    <w:p>
-      <w:pPr>
-        <w:pStyle w:val="BodyText"/>
-      </w:pPr>
-      <w:r>
-        <w:t xml:space="preserve">The full instrument — twenty items across five domains (data provenance,</w:t>
-      </w:r>
-      <w:r>
-        <w:t xml:space="preserve"> </w:t>
-      </w:r>
-      <w:r>
-        <w:t xml:space="preserve">preprocessing and partitioning, modelling and comparison, evaluation and</w:t>
-      </w:r>
-      <w:r>
-        <w:t xml:space="preserve"> </w:t>
-      </w:r>
-      <w:r>
-        <w:t xml:space="preserve">interpretation, and generalisation and transparency), plus four items specific to</w:t>
-      </w:r>
-      <w:r>
-        <w:t xml:space="preserve"> </w:t>
-      </w:r>
-      <w:r>
-        <w:t xml:space="preserve">hybrid pipelines — is reproduced in full in the supplementary material</w:t>
-      </w:r>
-      <w:r>
-        <w:t xml:space="preserve"> </w:t>
-      </w:r>
-      <w:r>
-        <w:t xml:space="preserve">(</w:t>
+      <w:r>
+        <w:t xml:space="preserve"> </w:t>
+      </w:r>
+      <w:hyperlink w:anchor="tbl-paveml">
+        <w:r>
+          <w:rPr>
+            <w:rStyle w:val="Hyperlink"/>
+          </w:rPr>
+          <w:t xml:space="preserve">Table 4</w:t>
+        </w:r>
+      </w:hyperlink>
+      <w:r>
+        <w:t xml:space="preserve"> </w:t>
+      </w:r>
+      <w:r>
+        <w:t xml:space="preserve">reproduces the full</w:t>
+      </w:r>
+      <w:r>
+        <w:t xml:space="preserve"> </w:t>
+      </w:r>
+      <w:r>
+        <w:t xml:space="preserve">instrument; the operational decision rules and worked examples that make each</w:t>
+      </w:r>
+      <w:r>
+        <w:t xml:space="preserve"> </w:t>
+      </w:r>
+      <w:r>
+        <w:t xml:space="preserve">item’s coding reproducible rather than a matter of reader judgement are given in</w:t>
+      </w:r>
+      <w:r>
+        <w:t xml:space="preserve"> </w:t>
+      </w:r>
+      <w:r>
+        <w:t xml:space="preserve">full in the supplementary material (</w:t>
       </w:r>
       <w:r>
         <w:rPr>
@@ -7596,19 +8385,882 @@
         <w:t xml:space="preserve">docs/03_PAVE-ML_instrument.md</w:t>
       </w:r>
       <w:r>
-        <w:t xml:space="preserve">), together with the operational decision rules and</w:t>
-      </w:r>
-      <w:r>
-        <w:t xml:space="preserve"> </w:t>
-      </w:r>
-      <w:r>
-        <w:t xml:space="preserve">worked examples that make the coding reproducible rather than a matter of reader</w:t>
-      </w:r>
-      <w:r>
-        <w:t xml:space="preserve"> </w:t>
-      </w:r>
-      <w:r>
-        <w:t xml:space="preserve">judgement. Two design choices are worth stating here because they determine how the</w:t>
+        <w:t xml:space="preserve">).</w:t>
+      </w:r>
+    </w:p>
+    <w:tbl>
+      <w:tblPr>
+        <w:tblStyle w:val="Table"/>
+        <w:tblW w:type="pct" w:w="5000"/>
+        <w:tblLayout w:type="fixed"/>
+        <w:tblLook w:firstRow="0" w:lastRow="0" w:firstColumn="0" w:lastColumn="0" w:noHBand="0" w:noVBand="0" w:val="0000"/>
+      </w:tblPr>
+      <w:tblGrid>
+        <w:gridCol w:w="7920"/>
+      </w:tblGrid>
+      <w:tr>
+        <w:tc>
+          <w:tcPr/>
+          <w:bookmarkStart w:id="50" w:name="tbl-paveml"/>
+          <w:p>
+            <w:pPr>
+              <w:jc w:val="center"/>
+            </w:pPr>
+            <w:pPr>
+              <w:jc w:val="left"/>
+              <w:spacing w:before="200"/>
+              <w:pStyle w:val="ImageCaption"/>
+            </w:pPr>
+            <w:r>
+              <w:t xml:space="preserve">Table 4: The PAVE-ML checklist: 20 general items across five domains, plus 4 items specific to hybrid pipelines.</w:t>
+            </w:r>
+          </w:p>
+          <w:tbl>
+            <w:tblPr>
+              <w:tblStyle w:val="Table"/>
+              <w:tblW w:type="pct" w:w="5000"/>
+              <w:tblLayout w:type="fixed"/>
+              <w:tblLook w:firstRow="1" w:lastRow="0" w:firstColumn="0" w:lastColumn="0" w:noHBand="0" w:noVBand="0" w:val="0020"/>
+            </w:tblPr>
+            <w:tblGrid>
+              <w:gridCol w:w="3960"/>
+              <w:gridCol w:w="3960"/>
+            </w:tblGrid>
+            <w:tr>
+              <w:trPr>
+                <w:tblHeader w:val="on"/>
+              </w:trPr>
+              <w:tc>
+                <w:tcPr/>
+                <w:p>
+                  <w:pPr>
+                    <w:pStyle w:val="Compact"/>
+                    <w:jc w:val="center"/>
+                  </w:pPr>
+                  <w:r>
+                    <w:t xml:space="preserve">#</w:t>
+                  </w:r>
+                </w:p>
+              </w:tc>
+              <w:tc>
+                <w:tcPr/>
+                <w:p>
+                  <w:pPr>
+                    <w:pStyle w:val="Compact"/>
+                    <w:jc w:val="center"/>
+                  </w:pPr>
+                  <w:r>
+                    <w:t xml:space="preserve">Item</w:t>
+                  </w:r>
+                </w:p>
+              </w:tc>
+            </w:tr>
+            <w:tr>
+              <w:tc>
+                <w:tcPr/>
+                <w:p>
+                  <w:pPr>
+                    <w:pStyle w:val="Compact"/>
+                    <w:jc w:val="center"/>
+                  </w:pPr>
+                  <w:r>
+                    <w:rPr>
+                      <w:b/>
+                      <w:bCs/>
+                    </w:rPr>
+                    <w:t xml:space="preserve">D1. Data provenance and structure</w:t>
+                  </w:r>
+                </w:p>
+              </w:tc>
+              <w:tc>
+                <w:tcPr/>
+                <w:p>
+                  <w:pPr>
+                    <w:pStyle w:val="Compact"/>
+                  </w:pPr>
+                </w:p>
+              </w:tc>
+            </w:tr>
+            <w:tr>
+              <w:tc>
+                <w:tcPr/>
+                <w:p>
+                  <w:pPr>
+                    <w:pStyle w:val="Compact"/>
+                    <w:jc w:val="center"/>
+                  </w:pPr>
+                  <w:r>
+                    <w:t xml:space="preserve">1</w:t>
+                  </w:r>
+                </w:p>
+              </w:tc>
+              <w:tc>
+                <w:tcPr/>
+                <w:p>
+                  <w:pPr>
+                    <w:pStyle w:val="Compact"/>
+                    <w:jc w:val="center"/>
+                  </w:pPr>
+                  <w:r>
+                    <w:t xml:space="preserve">Origin of every record stated (lab programme, named field project, named public database, or simulation), with acquisition period.</w:t>
+                  </w:r>
+                </w:p>
+              </w:tc>
+            </w:tr>
+            <w:tr>
+              <w:tc>
+                <w:tcPr/>
+                <w:p>
+                  <w:pPr>
+                    <w:pStyle w:val="Compact"/>
+                    <w:jc w:val="center"/>
+                  </w:pPr>
+                  <w:r>
+                    <w:t xml:space="preserve">2</w:t>
+                  </w:r>
+                </w:p>
+              </w:tc>
+              <w:tc>
+                <w:tcPr/>
+                <w:p>
+                  <w:pPr>
+                    <w:pStyle w:val="Compact"/>
+                    <w:jc w:val="center"/>
+                  </w:pPr>
+                  <w:r>
+                    <w:t xml:space="preserve">Unit of observation defined; paper states whether records are independent (e.g. repeated measurements on one specimen/section/image).</w:t>
+                  </w:r>
+                </w:p>
+              </w:tc>
+            </w:tr>
+            <w:tr>
+              <w:tc>
+                <w:tcPr/>
+                <w:p>
+                  <w:pPr>
+                    <w:pStyle w:val="Compact"/>
+                    <w:jc w:val="center"/>
+                  </w:pPr>
+                  <w:r>
+                    <w:t xml:space="preserve">3</w:t>
+                  </w:r>
+                </w:p>
+              </w:tc>
+              <w:tc>
+                <w:tcPr/>
+                <w:p>
+                  <w:pPr>
+                    <w:pStyle w:val="Compact"/>
+                    <w:jc w:val="center"/>
+                  </w:pPr>
+                  <w:r>
+                    <w:t xml:space="preserve">Sample size reported per split; ratio of records to fitted parameters or candidate inputs is computable from the text.</w:t>
+                  </w:r>
+                </w:p>
+              </w:tc>
+            </w:tr>
+            <w:tr>
+              <w:tc>
+                <w:tcPr/>
+                <w:p>
+                  <w:pPr>
+                    <w:pStyle w:val="Compact"/>
+                    <w:jc w:val="center"/>
+                  </w:pPr>
+                  <w:r>
+                    <w:t xml:space="preserve">4</w:t>
+                  </w:r>
+                </w:p>
+              </w:tc>
+              <w:tc>
+                <w:tcPr/>
+                <w:p>
+                  <w:pPr>
+                    <w:pStyle w:val="Compact"/>
+                    <w:jc w:val="center"/>
+                  </w:pPr>
+                  <w:r>
+                    <w:t xml:space="preserve">Input and target ranges given; paper states predictions outside those ranges are not supported.</w:t>
+                  </w:r>
+                </w:p>
+              </w:tc>
+            </w:tr>
+            <w:tr>
+              <w:tc>
+                <w:tcPr/>
+                <w:p>
+                  <w:pPr>
+                    <w:pStyle w:val="Compact"/>
+                    <w:jc w:val="center"/>
+                  </w:pPr>
+                  <w:r>
+                    <w:rPr>
+                      <w:b/>
+                      <w:bCs/>
+                    </w:rPr>
+                    <w:t xml:space="preserve">D2. Preprocessing and partitioning</w:t>
+                  </w:r>
+                </w:p>
+              </w:tc>
+              <w:tc>
+                <w:tcPr/>
+                <w:p>
+                  <w:pPr>
+                    <w:pStyle w:val="Compact"/>
+                  </w:pPr>
+                </w:p>
+              </w:tc>
+            </w:tr>
+            <w:tr>
+              <w:tc>
+                <w:tcPr/>
+                <w:p>
+                  <w:pPr>
+                    <w:pStyle w:val="Compact"/>
+                    <w:jc w:val="center"/>
+                  </w:pPr>
+                  <w:r>
+                    <w:t xml:space="preserve">5</w:t>
+                  </w:r>
+                </w:p>
+              </w:tc>
+              <w:tc>
+                <w:tcPr/>
+                <w:p>
+                  <w:pPr>
+                    <w:pStyle w:val="Compact"/>
+                    <w:jc w:val="center"/>
+                  </w:pPr>
+                  <w:r>
+                    <w:t xml:space="preserve">Split described precisely enough to reproduce: mechanism, proportions, and random seed (or its absence).</w:t>
+                  </w:r>
+                </w:p>
+              </w:tc>
+            </w:tr>
+            <w:tr>
+              <w:tc>
+                <w:tcPr/>
+                <w:p>
+                  <w:pPr>
+                    <w:pStyle w:val="Compact"/>
+                    <w:jc w:val="center"/>
+                  </w:pPr>
+                  <w:r>
+                    <w:t xml:space="preserve">6</w:t>
+                  </w:r>
+                </w:p>
+              </w:tc>
+              <w:tc>
+                <w:tcPr/>
+                <w:p>
+                  <w:pPr>
+                    <w:pStyle w:val="Compact"/>
+                    <w:jc w:val="center"/>
+                  </w:pPr>
+                  <w:r>
+                    <w:t xml:space="preserve">Every fitted preprocessing step (scaling, imputation, resampling, feature selection, augmentation) stated to be fitted inside the training partition only.</w:t>
+                  </w:r>
+                </w:p>
+              </w:tc>
+            </w:tr>
+            <w:tr>
+              <w:tc>
+                <w:tcPr/>
+                <w:p>
+                  <w:pPr>
+                    <w:pStyle w:val="Compact"/>
+                    <w:jc w:val="center"/>
+                  </w:pPr>
+                  <w:r>
+                    <w:t xml:space="preserve">7</w:t>
+                  </w:r>
+                </w:p>
+              </w:tc>
+              <w:tc>
+                <w:tcPr/>
+                <w:p>
+                  <w:pPr>
+                    <w:pStyle w:val="Compact"/>
+                    <w:jc w:val="center"/>
+                  </w:pPr>
+                  <w:r>
+                    <w:t xml:space="preserve">If records are non-independent (item 2), the split respects the grouping – no specimen/section/image/site appears in more than one partition.</w:t>
+                  </w:r>
+                </w:p>
+              </w:tc>
+            </w:tr>
+            <w:tr>
+              <w:tc>
+                <w:tcPr/>
+                <w:p>
+                  <w:pPr>
+                    <w:pStyle w:val="Compact"/>
+                    <w:jc w:val="center"/>
+                  </w:pPr>
+                  <w:r>
+                    <w:t xml:space="preserve">8</w:t>
+                  </w:r>
+                </w:p>
+              </w:tc>
+              <w:tc>
+                <w:tcPr/>
+                <w:p>
+                  <w:pPr>
+                    <w:pStyle w:val="Compact"/>
+                    <w:jc w:val="center"/>
+                  </w:pPr>
+                  <w:r>
+                    <w:t xml:space="preserve">Class imbalance, censoring, or target skew reported, with its treatment described.</w:t>
+                  </w:r>
+                </w:p>
+              </w:tc>
+            </w:tr>
+            <w:tr>
+              <w:tc>
+                <w:tcPr/>
+                <w:p>
+                  <w:pPr>
+                    <w:pStyle w:val="Compact"/>
+                    <w:jc w:val="center"/>
+                  </w:pPr>
+                  <w:r>
+                    <w:rPr>
+                      <w:b/>
+                      <w:bCs/>
+                    </w:rPr>
+                    <w:t xml:space="preserve">D3. Modelling and comparison</w:t>
+                  </w:r>
+                </w:p>
+              </w:tc>
+              <w:tc>
+                <w:tcPr/>
+                <w:p>
+                  <w:pPr>
+                    <w:pStyle w:val="Compact"/>
+                  </w:pPr>
+                </w:p>
+              </w:tc>
+            </w:tr>
+            <w:tr>
+              <w:tc>
+                <w:tcPr/>
+                <w:p>
+                  <w:pPr>
+                    <w:pStyle w:val="Compact"/>
+                    <w:jc w:val="center"/>
+                  </w:pPr>
+                  <w:r>
+                    <w:t xml:space="preserve">9</w:t>
+                  </w:r>
+                </w:p>
+              </w:tc>
+              <w:tc>
+                <w:tcPr/>
+                <w:p>
+                  <w:pPr>
+                    <w:pStyle w:val="Compact"/>
+                    <w:jc w:val="center"/>
+                  </w:pPr>
+                  <w:r>
+                    <w:t xml:space="preserve">Architecture fully specified: layers, widths, activations, regularisation; base learner and count for ensembles.</w:t>
+                  </w:r>
+                </w:p>
+              </w:tc>
+            </w:tr>
+            <w:tr>
+              <w:tc>
+                <w:tcPr/>
+                <w:p>
+                  <w:pPr>
+                    <w:pStyle w:val="Compact"/>
+                    <w:jc w:val="center"/>
+                  </w:pPr>
+                  <w:r>
+                    <w:t xml:space="preserve">10</w:t>
+                  </w:r>
+                </w:p>
+              </w:tc>
+              <w:tc>
+                <w:tcPr/>
+                <w:p>
+                  <w:pPr>
+                    <w:pStyle w:val="Compact"/>
+                    <w:jc w:val="center"/>
+                  </w:pPr>
+                  <w:r>
+                    <w:t xml:space="preserve">Hyperparameter search described (space, method, budget); the selection partition is named and differs from the reported test partition.</w:t>
+                  </w:r>
+                </w:p>
+              </w:tc>
+            </w:tr>
+            <w:tr>
+              <w:tc>
+                <w:tcPr/>
+                <w:p>
+                  <w:pPr>
+                    <w:pStyle w:val="Compact"/>
+                    <w:jc w:val="center"/>
+                  </w:pPr>
+                  <w:r>
+                    <w:t xml:space="preserve">11</w:t>
+                  </w:r>
+                </w:p>
+              </w:tc>
+              <w:tc>
+                <w:tcPr/>
+                <w:p>
+                  <w:pPr>
+                    <w:pStyle w:val="Compact"/>
+                    <w:jc w:val="center"/>
+                  </w:pPr>
+                  <w:r>
+                    <w:t xml:space="preserve">At least one baseline is a tuned conventional model; the established domain/mechanistic model is included as a comparator where one exists.</w:t>
+                  </w:r>
+                </w:p>
+              </w:tc>
+            </w:tr>
+            <w:tr>
+              <w:tc>
+                <w:tcPr/>
+                <w:p>
+                  <w:pPr>
+                    <w:pStyle w:val="Compact"/>
+                    <w:jc w:val="center"/>
+                  </w:pPr>
+                  <w:r>
+                    <w:t xml:space="preserve">12</w:t>
+                  </w:r>
+                </w:p>
+              </w:tc>
+              <w:tc>
+                <w:tcPr/>
+                <w:p>
+                  <w:pPr>
+                    <w:pStyle w:val="Compact"/>
+                    <w:jc w:val="center"/>
+                  </w:pPr>
+                  <w:r>
+                    <w:t xml:space="preserve">Where a metaheuristic is used, whether it optimises hyperparameters or weights is stated, with a comparison against a conventionally tuned version of the same learner.</w:t>
+                  </w:r>
+                </w:p>
+              </w:tc>
+            </w:tr>
+            <w:tr>
+              <w:tc>
+                <w:tcPr/>
+                <w:p>
+                  <w:pPr>
+                    <w:pStyle w:val="Compact"/>
+                    <w:jc w:val="center"/>
+                  </w:pPr>
+                  <w:r>
+                    <w:t xml:space="preserve">12a</w:t>
+                  </w:r>
+                  <w:r>
+                    <w:t xml:space="preserve"> </w:t>
+                  </w:r>
+                  <w:r>
+                    <w:rPr>
+                      <w:i/>
+                      <w:iCs/>
+                    </w:rPr>
+                    <w:t xml:space="preserve">(hybrid-specific)</w:t>
+                  </w:r>
+                </w:p>
+              </w:tc>
+              <w:tc>
+                <w:tcPr/>
+                <w:p>
+                  <w:pPr>
+                    <w:pStyle w:val="Compact"/>
+                    <w:jc w:val="center"/>
+                  </w:pPr>
+                  <w:r>
+                    <w:t xml:space="preserve">Base learner reported both with and without the hybridising component, on the same partition and metric.</w:t>
+                  </w:r>
+                </w:p>
+              </w:tc>
+            </w:tr>
+            <w:tr>
+              <w:tc>
+                <w:tcPr/>
+                <w:p>
+                  <w:pPr>
+                    <w:pStyle w:val="Compact"/>
+                    <w:jc w:val="center"/>
+                  </w:pPr>
+                  <w:r>
+                    <w:t xml:space="preserve">12b</w:t>
+                  </w:r>
+                  <w:r>
+                    <w:t xml:space="preserve"> </w:t>
+                  </w:r>
+                  <w:r>
+                    <w:rPr>
+                      <w:i/>
+                      <w:iCs/>
+                    </w:rPr>
+                    <w:t xml:space="preserve">(hybrid-specific)</w:t>
+                  </w:r>
+                </w:p>
+              </w:tc>
+              <w:tc>
+                <w:tcPr/>
+                <w:p>
+                  <w:pPr>
+                    <w:pStyle w:val="Compact"/>
+                    <w:jc w:val="center"/>
+                  </w:pPr>
+                  <w:r>
+                    <w:t xml:space="preserve">Search budget stated for both hybrid and baseline arms (function evaluations, iterations × population, or wall-clock time).</w:t>
+                  </w:r>
+                </w:p>
+              </w:tc>
+            </w:tr>
+            <w:tr>
+              <w:tc>
+                <w:tcPr/>
+                <w:p>
+                  <w:pPr>
+                    <w:pStyle w:val="Compact"/>
+                    <w:jc w:val="center"/>
+                  </w:pPr>
+                  <w:r>
+                    <w:t xml:space="preserve">12c</w:t>
+                  </w:r>
+                  <w:r>
+                    <w:t xml:space="preserve"> </w:t>
+                  </w:r>
+                  <w:r>
+                    <w:rPr>
+                      <w:i/>
+                      <w:iCs/>
+                    </w:rPr>
+                    <w:t xml:space="preserve">(hybrid-specific)</w:t>
+                  </w:r>
+                </w:p>
+              </w:tc>
+              <w:tc>
+                <w:tcPr/>
+                <w:p>
+                  <w:pPr>
+                    <w:pStyle w:val="Compact"/>
+                    <w:jc w:val="center"/>
+                  </w:pPr>
+                  <w:r>
+                    <w:t xml:space="preserve">Stochastic optimisers run more than once; spread across runs reported, not only the best run.</w:t>
+                  </w:r>
+                </w:p>
+              </w:tc>
+            </w:tr>
+            <w:tr>
+              <w:tc>
+                <w:tcPr/>
+                <w:p>
+                  <w:pPr>
+                    <w:pStyle w:val="Compact"/>
+                    <w:jc w:val="center"/>
+                  </w:pPr>
+                  <w:r>
+                    <w:t xml:space="preserve">12d</w:t>
+                  </w:r>
+                  <w:r>
+                    <w:t xml:space="preserve"> </w:t>
+                  </w:r>
+                  <w:r>
+                    <w:rPr>
+                      <w:i/>
+                      <w:iCs/>
+                    </w:rPr>
+                    <w:t xml:space="preserve">(hybrid-specific)</w:t>
+                  </w:r>
+                </w:p>
+              </w:tc>
+              <w:tc>
+                <w:tcPr/>
+                <w:p>
+                  <w:pPr>
+                    <w:pStyle w:val="Compact"/>
+                    <w:jc w:val="center"/>
+                  </w:pPr>
+                  <w:r>
+                    <w:t xml:space="preserve">A newly named optimiser is compared against at least 2 established optimisers on the same problem; the No-Free-Lunch implication is acknowledged.</w:t>
+                  </w:r>
+                </w:p>
+              </w:tc>
+            </w:tr>
+            <w:tr>
+              <w:tc>
+                <w:tcPr/>
+                <w:p>
+                  <w:pPr>
+                    <w:pStyle w:val="Compact"/>
+                    <w:jc w:val="center"/>
+                  </w:pPr>
+                  <w:r>
+                    <w:rPr>
+                      <w:b/>
+                      <w:bCs/>
+                    </w:rPr>
+                    <w:t xml:space="preserve">D4. Evaluation, uncertainty and interpretation</w:t>
+                  </w:r>
+                </w:p>
+              </w:tc>
+              <w:tc>
+                <w:tcPr/>
+                <w:p>
+                  <w:pPr>
+                    <w:pStyle w:val="Compact"/>
+                  </w:pPr>
+                </w:p>
+              </w:tc>
+            </w:tr>
+            <w:tr>
+              <w:tc>
+                <w:tcPr/>
+                <w:p>
+                  <w:pPr>
+                    <w:pStyle w:val="Compact"/>
+                    <w:jc w:val="center"/>
+                  </w:pPr>
+                  <w:r>
+                    <w:t xml:space="preserve">13</w:t>
+                  </w:r>
+                </w:p>
+              </w:tc>
+              <w:tc>
+                <w:tcPr/>
+                <w:p>
+                  <w:pPr>
+                    <w:pStyle w:val="Compact"/>
+                    <w:jc w:val="center"/>
+                  </w:pPr>
+                  <w:r>
+                    <w:t xml:space="preserve">Metrics suit the task (e.g. IoU/F1 with the positive class defined for imbalanced segmentation, never bare pixel accuracy; an absolute-error metric in engineering units alongside R² for regression).</w:t>
+                  </w:r>
+                </w:p>
+              </w:tc>
+            </w:tr>
+            <w:tr>
+              <w:tc>
+                <w:tcPr/>
+                <w:p>
+                  <w:pPr>
+                    <w:pStyle w:val="Compact"/>
+                    <w:jc w:val="center"/>
+                  </w:pPr>
+                  <w:r>
+                    <w:t xml:space="preserve">14</w:t>
+                  </w:r>
+                </w:p>
+              </w:tc>
+              <w:tc>
+                <w:tcPr/>
+                <w:p>
+                  <w:pPr>
+                    <w:pStyle w:val="Compact"/>
+                    <w:jc w:val="center"/>
+                  </w:pPr>
+                  <w:r>
+                    <w:t xml:space="preserve">Performance reported for training AND held-out partitions, with dispersion (fold SD, CI, or repeated-run range), not a single point estimate.</w:t>
+                  </w:r>
+                </w:p>
+              </w:tc>
+            </w:tr>
+            <w:tr>
+              <w:tc>
+                <w:tcPr/>
+                <w:p>
+                  <w:pPr>
+                    <w:pStyle w:val="Compact"/>
+                    <w:jc w:val="center"/>
+                  </w:pPr>
+                  <w:r>
+                    <w:t xml:space="preserve">15</w:t>
+                  </w:r>
+                </w:p>
+              </w:tc>
+              <w:tc>
+                <w:tcPr/>
+                <w:p>
+                  <w:pPr>
+                    <w:pStyle w:val="Compact"/>
+                    <w:jc w:val="center"/>
+                  </w:pPr>
+                  <w:r>
+                    <w:t xml:space="preserve">Predictive uncertainty quantified for individual predictions (conformal intervals, deep ensembles, MC dropout, GP variance, quantile regression) or its absence acknowledged.</w:t>
+                  </w:r>
+                </w:p>
+              </w:tc>
+            </w:tr>
+            <w:tr>
+              <w:tc>
+                <w:tcPr/>
+                <w:p>
+                  <w:pPr>
+                    <w:pStyle w:val="Compact"/>
+                    <w:jc w:val="center"/>
+                  </w:pPr>
+                  <w:r>
+                    <w:t xml:space="preserve">16</w:t>
+                  </w:r>
+                </w:p>
+              </w:tc>
+              <w:tc>
+                <w:tcPr/>
+                <w:p>
+                  <w:pPr>
+                    <w:pStyle w:val="Compact"/>
+                    <w:jc w:val="center"/>
+                  </w:pPr>
+                  <w:r>
+                    <w:t xml:space="preserve">Any interpretation output (SHAP, PDP, Garson, connection weights, NCA, attention) accompanied by the explained model’s validation status and a mechanics-consistency check.</w:t>
+                  </w:r>
+                </w:p>
+              </w:tc>
+            </w:tr>
+            <w:tr>
+              <w:tc>
+                <w:tcPr/>
+                <w:p>
+                  <w:pPr>
+                    <w:pStyle w:val="Compact"/>
+                    <w:jc w:val="center"/>
+                  </w:pPr>
+                  <w:r>
+                    <w:rPr>
+                      <w:b/>
+                      <w:bCs/>
+                    </w:rPr>
+                    <w:t xml:space="preserve">D5. Generalisation, transparency and use</w:t>
+                  </w:r>
+                </w:p>
+              </w:tc>
+              <w:tc>
+                <w:tcPr/>
+                <w:p>
+                  <w:pPr>
+                    <w:pStyle w:val="Compact"/>
+                  </w:pPr>
+                </w:p>
+              </w:tc>
+            </w:tr>
+            <w:tr>
+              <w:tc>
+                <w:tcPr/>
+                <w:p>
+                  <w:pPr>
+                    <w:pStyle w:val="Compact"/>
+                    <w:jc w:val="center"/>
+                  </w:pPr>
+                  <w:r>
+                    <w:t xml:space="preserve">17</w:t>
+                  </w:r>
+                </w:p>
+              </w:tc>
+              <w:tc>
+                <w:tcPr/>
+                <w:p>
+                  <w:pPr>
+                    <w:pStyle w:val="Compact"/>
+                    <w:jc w:val="center"/>
+                  </w:pPr>
+                  <w:r>
+                    <w:t xml:space="preserve">Evaluated on at least 1 dataset from an independent source (different agency/region/lab/test track/campaign) or the absence of external validation is stated as a limitation in the conclusions.</w:t>
+                  </w:r>
+                </w:p>
+              </w:tc>
+            </w:tr>
+            <w:tr>
+              <w:tc>
+                <w:tcPr/>
+                <w:p>
+                  <w:pPr>
+                    <w:pStyle w:val="Compact"/>
+                    <w:jc w:val="center"/>
+                  </w:pPr>
+                  <w:r>
+                    <w:t xml:space="preserve">18</w:t>
+                  </w:r>
+                </w:p>
+              </w:tc>
+              <w:tc>
+                <w:tcPr/>
+                <w:p>
+                  <w:pPr>
+                    <w:pStyle w:val="Compact"/>
+                    <w:jc w:val="center"/>
+                  </w:pPr>
+                  <w:r>
+                    <w:t xml:space="preserve">Code and trained weights available at a persistent identifier; data available or the barrier to release named.</w:t>
+                  </w:r>
+                </w:p>
+              </w:tc>
+            </w:tr>
+            <w:tr>
+              <w:tc>
+                <w:tcPr/>
+                <w:p>
+                  <w:pPr>
+                    <w:pStyle w:val="Compact"/>
+                    <w:jc w:val="center"/>
+                  </w:pPr>
+                  <w:r>
+                    <w:t xml:space="preserve">19</w:t>
+                  </w:r>
+                </w:p>
+              </w:tc>
+              <w:tc>
+                <w:tcPr/>
+                <w:p>
+                  <w:pPr>
+                    <w:pStyle w:val="Compact"/>
+                    <w:jc w:val="center"/>
+                  </w:pPr>
+                  <w:r>
+                    <w:t xml:space="preserve">Computational cost reported: training time, inference time per record/image, and hardware.</w:t>
+                  </w:r>
+                </w:p>
+              </w:tc>
+            </w:tr>
+            <w:tr>
+              <w:tc>
+                <w:tcPr/>
+                <w:p>
+                  <w:pPr>
+                    <w:pStyle w:val="Compact"/>
+                    <w:jc w:val="center"/>
+                  </w:pPr>
+                  <w:r>
+                    <w:t xml:space="preserve">20</w:t>
+                  </w:r>
+                </w:p>
+              </w:tc>
+              <w:tc>
+                <w:tcPr/>
+                <w:p>
+                  <w:pPr>
+                    <w:pStyle w:val="Compact"/>
+                    <w:jc w:val="center"/>
+                  </w:pPr>
+                  <w:r>
+                    <w:t xml:space="preserve">Intended decision context stated: which engineering decision the output informs, at what level (project/network), and what accuracy that decision requires.</w:t>
+                  </w:r>
+                </w:p>
+              </w:tc>
+            </w:tr>
+          </w:tbl>
+          <w:bookmarkEnd w:id="50"/>
+          <w:p/>
+        </w:tc>
+      </w:tr>
+    </w:tbl>
+    <w:p>
+      <w:pPr>
+        <w:pStyle w:val="BodyText"/>
+      </w:pPr>
+      <w:r>
+        <w:t xml:space="preserve">Two design choices are worth stating here because they determine how the</w:t>
       </w:r>
       <w:r>
         <w:t xml:space="preserve"> </w:t>
@@ -7989,8 +9641,8 @@
         <w:t xml:space="preserve">This procedure, and its result, are reported in full in the completed manuscript.</w:t>
       </w:r>
     </w:p>
-    <w:bookmarkEnd w:id="43"/>
-    <w:bookmarkStart w:id="44" w:name="sec-agenda"/>
+    <w:bookmarkEnd w:id="51"/>
+    <w:bookmarkStart w:id="52" w:name="sec-agenda"/>
     <w:p>
       <w:pPr>
         <w:pStyle w:val="Heading1"/>
@@ -8539,8 +10191,8 @@
         <w:t xml:space="preserve">across civil engineering.</w:t>
       </w:r>
     </w:p>
-    <w:bookmarkEnd w:id="44"/>
-    <w:bookmarkStart w:id="45" w:name="sec-conclusions"/>
+    <w:bookmarkEnd w:id="52"/>
+    <w:bookmarkStart w:id="53" w:name="sec-conclusions"/>
     <w:p>
       <w:pPr>
         <w:pStyle w:val="Heading1"/>
@@ -8739,7 +10391,7 @@
         <w:t xml:space="preserve"> </w:t>
       </w:r>
       <w:r>
-        <w:t xml:space="preserve">cost. None of the four hybrid-specific PAVE-ML items (§10) requires new data</w:t>
+        <w:t xml:space="preserve">cost. None of the four hybrid-specific PAVE-ML items (§12) requires new data</w:t>
       </w:r>
       <w:r>
         <w:t xml:space="preserve"> </w:t>
@@ -8784,8 +10436,8 @@
         <w:t xml:space="preserve">and the reading the completed audit is designed to test.</w:t>
       </w:r>
     </w:p>
-    <w:bookmarkEnd w:id="45"/>
-    <w:bookmarkStart w:id="46" w:name="declaration-of-competing-interest"/>
+    <w:bookmarkEnd w:id="53"/>
+    <w:bookmarkStart w:id="54" w:name="declaration-of-competing-interest"/>
     <w:p>
       <w:pPr>
         <w:pStyle w:val="Heading1"/>
@@ -8808,8 +10460,8 @@
         <w:t xml:space="preserve">could have influenced the work reported in this paper.</w:t>
       </w:r>
     </w:p>
-    <w:bookmarkEnd w:id="46"/>
-    <w:bookmarkStart w:id="47" w:name="Xa6ff8e54395812bd8a1d49fa16c25a1d6a46bbb"/>
+    <w:bookmarkEnd w:id="54"/>
+    <w:bookmarkStart w:id="55" w:name="Xa6ff8e54395812bd8a1d49fa16c25a1d6a46bbb"/>
     <w:p>
       <w:pPr>
         <w:pStyle w:val="Heading1"/>
@@ -8844,8 +10496,8 @@
         <w:t xml:space="preserve">use is permitted; undisclosed use is not.</w:t>
       </w:r>
     </w:p>
-    <w:bookmarkEnd w:id="47"/>
-    <w:bookmarkStart w:id="48" w:name="data-availability"/>
+    <w:bookmarkEnd w:id="55"/>
+    <w:bookmarkStart w:id="56" w:name="data-availability"/>
     <w:p>
       <w:pPr>
         <w:pStyle w:val="Heading1"/>
@@ -8874,8 +10526,8 @@
         <w:t xml:space="preserve">[REPOSITORY URL].</w:t>
       </w:r>
     </w:p>
-    <w:bookmarkEnd w:id="48"/>
-    <w:bookmarkStart w:id="130" w:name="references"/>
+    <w:bookmarkEnd w:id="56"/>
+    <w:bookmarkStart w:id="146" w:name="references"/>
     <w:p>
       <w:pPr>
         <w:pStyle w:val="Heading1"/>
@@ -8884,8 +10536,8 @@
         <w:t xml:space="preserve">References</w:t>
       </w:r>
     </w:p>
-    <w:bookmarkStart w:id="129" w:name="refs"/>
-    <w:bookmarkStart w:id="50" w:name="ref-Alhussan2022pothole"/>
+    <w:bookmarkStart w:id="145" w:name="refs"/>
+    <w:bookmarkStart w:id="58" w:name="ref-Alhussan2022pothole"/>
     <w:p>
       <w:pPr>
         <w:pStyle w:val="Bibliography"/>
@@ -8896,7 +10548,7 @@
       <w:r>
         <w:t xml:space="preserve"> </w:t>
       </w:r>
-      <w:hyperlink r:id="rId49">
+      <w:hyperlink r:id="rId57">
         <w:r>
           <w:rPr>
             <w:rStyle w:val="Hyperlink"/>
@@ -8905,8 +10557,8 @@
         </w:r>
       </w:hyperlink>
     </w:p>
-    <w:bookmarkEnd w:id="50"/>
-    <w:bookmarkStart w:id="52" w:name="ref-Alnaqbi2025high"/>
+    <w:bookmarkEnd w:id="58"/>
+    <w:bookmarkStart w:id="60" w:name="ref-Alnaqbi2025high"/>
     <w:p>
       <w:pPr>
         <w:pStyle w:val="Bibliography"/>
@@ -8917,7 +10569,7 @@
       <w:r>
         <w:t xml:space="preserve"> </w:t>
       </w:r>
-      <w:hyperlink r:id="rId51">
+      <w:hyperlink r:id="rId59">
         <w:r>
           <w:rPr>
             <w:rStyle w:val="Hyperlink"/>
@@ -8926,8 +10578,8 @@
         </w:r>
       </w:hyperlink>
     </w:p>
-    <w:bookmarkEnd w:id="52"/>
-    <w:bookmarkStart w:id="54" w:name="ref-Alnaqbi2025optimized"/>
+    <w:bookmarkEnd w:id="60"/>
+    <w:bookmarkStart w:id="62" w:name="ref-Alnaqbi2025optimized"/>
     <w:p>
       <w:pPr>
         <w:pStyle w:val="Bibliography"/>
@@ -8938,7 +10590,7 @@
       <w:r>
         <w:t xml:space="preserve"> </w:t>
       </w:r>
-      <w:hyperlink r:id="rId53">
+      <w:hyperlink r:id="rId61">
         <w:r>
           <w:rPr>
             <w:rStyle w:val="Hyperlink"/>
@@ -8947,8 +10599,8 @@
         </w:r>
       </w:hyperlink>
     </w:p>
-    <w:bookmarkEnd w:id="54"/>
-    <w:bookmarkStart w:id="56" w:name="ref-Alnaqbi2025optimizing"/>
+    <w:bookmarkEnd w:id="62"/>
+    <w:bookmarkStart w:id="64" w:name="ref-Alnaqbi2025optimizing"/>
     <w:p>
       <w:pPr>
         <w:pStyle w:val="Bibliography"/>
@@ -8959,7 +10611,7 @@
       <w:r>
         <w:t xml:space="preserve"> </w:t>
       </w:r>
-      <w:hyperlink r:id="rId55">
+      <w:hyperlink r:id="rId63">
         <w:r>
           <w:rPr>
             <w:rStyle w:val="Hyperlink"/>
@@ -8968,8 +10620,8 @@
         </w:r>
       </w:hyperlink>
     </w:p>
-    <w:bookmarkEnd w:id="56"/>
-    <w:bookmarkStart w:id="58" w:name="ref-Alnaqbi2025predictive"/>
+    <w:bookmarkEnd w:id="64"/>
+    <w:bookmarkStart w:id="66" w:name="ref-Alnaqbi2025predictive"/>
     <w:p>
       <w:pPr>
         <w:pStyle w:val="Bibliography"/>
@@ -8980,7 +10632,7 @@
       <w:r>
         <w:t xml:space="preserve"> </w:t>
       </w:r>
-      <w:hyperlink r:id="rId57">
+      <w:hyperlink r:id="rId65">
         <w:r>
           <w:rPr>
             <w:rStyle w:val="Hyperlink"/>
@@ -8989,8 +10641,8 @@
         </w:r>
       </w:hyperlink>
     </w:p>
-    <w:bookmarkEnd w:id="58"/>
-    <w:bookmarkStart w:id="60" w:name="ref-Alnaqbi2024approach"/>
+    <w:bookmarkEnd w:id="66"/>
+    <w:bookmarkStart w:id="68" w:name="ref-Alnaqbi2024approach"/>
     <w:p>
       <w:pPr>
         <w:pStyle w:val="Bibliography"/>
@@ -9001,7 +10653,7 @@
       <w:r>
         <w:t xml:space="preserve"> </w:t>
       </w:r>
-      <w:hyperlink r:id="rId59">
+      <w:hyperlink r:id="rId67">
         <w:r>
           <w:rPr>
             <w:rStyle w:val="Hyperlink"/>
@@ -9010,8 +10662,8 @@
         </w:r>
       </w:hyperlink>
     </w:p>
-    <w:bookmarkEnd w:id="60"/>
-    <w:bookmarkStart w:id="62" w:name="ref-Alnaqbi2026friction"/>
+    <w:bookmarkEnd w:id="68"/>
+    <w:bookmarkStart w:id="70" w:name="ref-Alnaqbi2026friction"/>
     <w:p>
       <w:pPr>
         <w:pStyle w:val="Bibliography"/>
@@ -9022,7 +10674,7 @@
       <w:r>
         <w:t xml:space="preserve"> </w:t>
       </w:r>
-      <w:hyperlink r:id="rId61">
+      <w:hyperlink r:id="rId69">
         <w:r>
           <w:rPr>
             <w:rStyle w:val="Hyperlink"/>
@@ -9031,8 +10683,8 @@
         </w:r>
       </w:hyperlink>
     </w:p>
-    <w:bookmarkEnd w:id="62"/>
-    <w:bookmarkStart w:id="64" w:name="ref-Alnaqbi2025tuned"/>
+    <w:bookmarkEnd w:id="70"/>
+    <w:bookmarkStart w:id="72" w:name="ref-Alnaqbi2025tuned"/>
     <w:p>
       <w:pPr>
         <w:pStyle w:val="Bibliography"/>
@@ -9043,7 +10695,7 @@
       <w:r>
         <w:t xml:space="preserve"> </w:t>
       </w:r>
-      <w:hyperlink r:id="rId63">
+      <w:hyperlink r:id="rId71">
         <w:r>
           <w:rPr>
             <w:rStyle w:val="Hyperlink"/>
@@ -9052,8 +10704,8 @@
         </w:r>
       </w:hyperlink>
     </w:p>
-    <w:bookmarkEnd w:id="64"/>
-    <w:bookmarkStart w:id="66" w:name="ref-Alnaqbi2025learning"/>
+    <w:bookmarkEnd w:id="72"/>
+    <w:bookmarkStart w:id="74" w:name="ref-Alnaqbi2025learning"/>
     <w:p>
       <w:pPr>
         <w:pStyle w:val="Bibliography"/>
@@ -9064,7 +10716,7 @@
       <w:r>
         <w:t xml:space="preserve"> </w:t>
       </w:r>
-      <w:hyperlink r:id="rId65">
+      <w:hyperlink r:id="rId73">
         <w:r>
           <w:rPr>
             <w:rStyle w:val="Hyperlink"/>
@@ -9073,8 +10725,8 @@
         </w:r>
       </w:hyperlink>
     </w:p>
-    <w:bookmarkEnd w:id="66"/>
-    <w:bookmarkStart w:id="68" w:name="ref-Alshawabkeh2023automated"/>
+    <w:bookmarkEnd w:id="74"/>
+    <w:bookmarkStart w:id="76" w:name="ref-Alshawabkeh2023automated"/>
     <w:p>
       <w:pPr>
         <w:pStyle w:val="Bibliography"/>
@@ -9088,7 +10740,7 @@
       <w:r>
         <w:t xml:space="preserve"> </w:t>
       </w:r>
-      <w:hyperlink r:id="rId67">
+      <w:hyperlink r:id="rId75">
         <w:r>
           <w:rPr>
             <w:rStyle w:val="Hyperlink"/>
@@ -9097,8 +10749,8 @@
         </w:r>
       </w:hyperlink>
     </w:p>
-    <w:bookmarkEnd w:id="68"/>
-    <w:bookmarkStart w:id="70" w:name="ref-Azam2022resilient"/>
+    <w:bookmarkEnd w:id="76"/>
+    <w:bookmarkStart w:id="78" w:name="ref-Azam2022resilient"/>
     <w:p>
       <w:pPr>
         <w:pStyle w:val="Bibliography"/>
@@ -9112,7 +10764,7 @@
       <w:r>
         <w:t xml:space="preserve"> </w:t>
       </w:r>
-      <w:hyperlink r:id="rId69">
+      <w:hyperlink r:id="rId77">
         <w:r>
           <w:rPr>
             <w:rStyle w:val="Hyperlink"/>
@@ -9121,8 +10773,8 @@
         </w:r>
       </w:hyperlink>
     </w:p>
-    <w:bookmarkEnd w:id="70"/>
-    <w:bookmarkStart w:id="72" w:name="ref-Cao2020pavement"/>
+    <w:bookmarkEnd w:id="78"/>
+    <w:bookmarkStart w:id="80" w:name="ref-Cao2020pavement"/>
     <w:p>
       <w:pPr>
         <w:pStyle w:val="Bibliography"/>
@@ -9133,7 +10785,7 @@
       <w:r>
         <w:t xml:space="preserve"> </w:t>
       </w:r>
-      <w:hyperlink r:id="rId71">
+      <w:hyperlink r:id="rId79">
         <w:r>
           <w:rPr>
             <w:rStyle w:val="Hyperlink"/>
@@ -9142,8 +10794,8 @@
         </w:r>
       </w:hyperlink>
     </w:p>
-    <w:bookmarkEnd w:id="72"/>
-    <w:bookmarkStart w:id="74" w:name="ref-Deng2023rutting"/>
+    <w:bookmarkEnd w:id="80"/>
+    <w:bookmarkStart w:id="82" w:name="ref-Deng2023rutting"/>
     <w:p>
       <w:pPr>
         <w:pStyle w:val="Bibliography"/>
@@ -9154,7 +10806,7 @@
       <w:r>
         <w:t xml:space="preserve"> </w:t>
       </w:r>
-      <w:hyperlink r:id="rId73">
+      <w:hyperlink r:id="rId81">
         <w:r>
           <w:rPr>
             <w:rStyle w:val="Hyperlink"/>
@@ -9163,8 +10815,8 @@
         </w:r>
       </w:hyperlink>
     </w:p>
-    <w:bookmarkEnd w:id="74"/>
-    <w:bookmarkStart w:id="76" w:name="ref-Elbagalati2017neural"/>
+    <w:bookmarkEnd w:id="82"/>
+    <w:bookmarkStart w:id="84" w:name="ref-Elbagalati2017neural"/>
     <w:p>
       <w:pPr>
         <w:pStyle w:val="Bibliography"/>
@@ -9178,7 +10830,7 @@
       <w:r>
         <w:t xml:space="preserve"> </w:t>
       </w:r>
-      <w:hyperlink r:id="rId75">
+      <w:hyperlink r:id="rId83">
         <w:r>
           <w:rPr>
             <w:rStyle w:val="Hyperlink"/>
@@ -9187,8 +10839,8 @@
         </w:r>
       </w:hyperlink>
     </w:p>
-    <w:bookmarkEnd w:id="76"/>
-    <w:bookmarkStart w:id="78" w:name="ref-Elhariri2020filter"/>
+    <w:bookmarkEnd w:id="84"/>
+    <w:bookmarkStart w:id="86" w:name="ref-Elhariri2020filter"/>
     <w:p>
       <w:pPr>
         <w:pStyle w:val="Bibliography"/>
@@ -9199,7 +10851,7 @@
       <w:r>
         <w:t xml:space="preserve"> </w:t>
       </w:r>
-      <w:hyperlink r:id="rId77">
+      <w:hyperlink r:id="rId85">
         <w:r>
           <w:rPr>
             <w:rStyle w:val="Hyperlink"/>
@@ -9208,8 +10860,8 @@
         </w:r>
       </w:hyperlink>
     </w:p>
-    <w:bookmarkEnd w:id="78"/>
-    <w:bookmarkStart w:id="80" w:name="ref-Georgouli2026impact"/>
+    <w:bookmarkEnd w:id="86"/>
+    <w:bookmarkStart w:id="88" w:name="ref-Georgouli2026impact"/>
     <w:p>
       <w:pPr>
         <w:pStyle w:val="Bibliography"/>
@@ -9220,7 +10872,7 @@
       <w:r>
         <w:t xml:space="preserve"> </w:t>
       </w:r>
-      <w:hyperlink r:id="rId79">
+      <w:hyperlink r:id="rId87">
         <w:r>
           <w:rPr>
             <w:rStyle w:val="Hyperlink"/>
@@ -9229,19 +10881,43 @@
         </w:r>
       </w:hyperlink>
     </w:p>
-    <w:bookmarkEnd w:id="80"/>
-    <w:bookmarkStart w:id="82" w:name="ref-Ghanizadeh2020neural"/>
+    <w:bookmarkEnd w:id="88"/>
+    <w:bookmarkStart w:id="90" w:name="ref-Ghanizadeh2023soft"/>
     <w:p>
       <w:pPr>
         <w:pStyle w:val="Bibliography"/>
       </w:pPr>
       <w:r>
+        <w:t xml:space="preserve">Ghanizadeh, A.R., Aziminejad, A., Asteris, P.G., others</w:t>
+      </w:r>
+      <w:r>
+        <w:t xml:space="preserve">, 2023. Soft computing to predict earthquake-induced soil liquefaction via CPT results. Infrastructures.</w:t>
+      </w:r>
+      <w:r>
+        <w:t xml:space="preserve"> </w:t>
+      </w:r>
+      <w:hyperlink r:id="rId89">
+        <w:r>
+          <w:rPr>
+            <w:rStyle w:val="Hyperlink"/>
+          </w:rPr>
+          <w:t xml:space="preserve">https://doi.org/10.3390/infrastructures8080125</w:t>
+        </w:r>
+      </w:hyperlink>
+    </w:p>
+    <w:bookmarkEnd w:id="90"/>
+    <w:bookmarkStart w:id="92" w:name="ref-Ghanizadeh2020neural"/>
+    <w:p>
+      <w:pPr>
+        <w:pStyle w:val="Bibliography"/>
+      </w:pPr>
+      <w:r>
         <w:t xml:space="preserve">Ghanizadeh, A.R., Heidarabadizadeh, N., Jalali, F., 2020. Artificial neural network back-calculation of flexible pavements with sensitivity analysis using garson’s and connection weights algorithms. Innov. Infrastruct. Solut.</w:t>
       </w:r>
       <w:r>
         <w:t xml:space="preserve"> </w:t>
       </w:r>
-      <w:hyperlink r:id="rId81">
+      <w:hyperlink r:id="rId91">
         <w:r>
           <w:rPr>
             <w:rStyle w:val="Hyperlink"/>
@@ -9250,8 +10926,8 @@
         </w:r>
       </w:hyperlink>
     </w:p>
-    <w:bookmarkEnd w:id="82"/>
-    <w:bookmarkStart w:id="84" w:name="ref-Ghanizadeh2025metabackcal"/>
+    <w:bookmarkEnd w:id="92"/>
+    <w:bookmarkStart w:id="94" w:name="ref-Ghanizadeh2025metabackcal"/>
     <w:p>
       <w:pPr>
         <w:pStyle w:val="Bibliography"/>
@@ -9262,7 +10938,7 @@
       <w:r>
         <w:t xml:space="preserve"> </w:t>
       </w:r>
-      <w:hyperlink r:id="rId83">
+      <w:hyperlink r:id="rId93">
         <w:r>
           <w:rPr>
             <w:rStyle w:val="Hyperlink"/>
@@ -9271,8 +10947,8 @@
         </w:r>
       </w:hyperlink>
     </w:p>
-    <w:bookmarkEnd w:id="84"/>
-    <w:bookmarkStart w:id="86" w:name="ref-Ghanizadeh2024formulation"/>
+    <w:bookmarkEnd w:id="94"/>
+    <w:bookmarkStart w:id="96" w:name="ref-Ghanizadeh2024formulation"/>
     <w:p>
       <w:pPr>
         <w:pStyle w:val="Bibliography"/>
@@ -9286,7 +10962,7 @@
       <w:r>
         <w:t xml:space="preserve"> </w:t>
       </w:r>
-      <w:hyperlink r:id="rId85">
+      <w:hyperlink r:id="rId95">
         <w:r>
           <w:rPr>
             <w:rStyle w:val="Hyperlink"/>
@@ -9295,8 +10971,8 @@
         </w:r>
       </w:hyperlink>
     </w:p>
-    <w:bookmarkEnd w:id="86"/>
-    <w:bookmarkStart w:id="88" w:name="ref-Ghorbani2020genetic"/>
+    <w:bookmarkEnd w:id="96"/>
+    <w:bookmarkStart w:id="98" w:name="ref-Ghorbani2020genetic"/>
     <w:p>
       <w:pPr>
         <w:pStyle w:val="Bibliography"/>
@@ -9310,7 +10986,7 @@
       <w:r>
         <w:t xml:space="preserve"> </w:t>
       </w:r>
-      <w:hyperlink r:id="rId87">
+      <w:hyperlink r:id="rId97">
         <w:r>
           <w:rPr>
             <w:rStyle w:val="Hyperlink"/>
@@ -9319,8 +10995,8 @@
         </w:r>
       </w:hyperlink>
     </w:p>
-    <w:bookmarkEnd w:id="88"/>
-    <w:bookmarkStart w:id="90" w:name="ref-Gopalakrishnan2018learning"/>
+    <w:bookmarkEnd w:id="98"/>
+    <w:bookmarkStart w:id="100" w:name="ref-Gopalakrishnan2018learning"/>
     <w:p>
       <w:pPr>
         <w:pStyle w:val="Bibliography"/>
@@ -9331,7 +11007,7 @@
       <w:r>
         <w:t xml:space="preserve"> </w:t>
       </w:r>
-      <w:hyperlink r:id="rId89">
+      <w:hyperlink r:id="rId99">
         <w:r>
           <w:rPr>
             <w:rStyle w:val="Hyperlink"/>
@@ -9340,8 +11016,8 @@
         </w:r>
       </w:hyperlink>
     </w:p>
-    <w:bookmarkEnd w:id="90"/>
-    <w:bookmarkStart w:id="92" w:name="ref-Guo2025learning"/>
+    <w:bookmarkEnd w:id="100"/>
+    <w:bookmarkStart w:id="102" w:name="ref-Guo2025learning"/>
     <w:p>
       <w:pPr>
         <w:pStyle w:val="Bibliography"/>
@@ -9355,7 +11031,7 @@
       <w:r>
         <w:t xml:space="preserve"> </w:t>
       </w:r>
-      <w:hyperlink r:id="rId91">
+      <w:hyperlink r:id="rId101">
         <w:r>
           <w:rPr>
             <w:rStyle w:val="Hyperlink"/>
@@ -9364,8 +11040,8 @@
         </w:r>
       </w:hyperlink>
     </w:p>
-    <w:bookmarkEnd w:id="92"/>
-    <w:bookmarkStart w:id="94" w:name="ref-Hanandeh2022introducing"/>
+    <w:bookmarkEnd w:id="102"/>
+    <w:bookmarkStart w:id="104" w:name="ref-Hanandeh2022introducing"/>
     <w:p>
       <w:pPr>
         <w:pStyle w:val="Bibliography"/>
@@ -9376,7 +11052,7 @@
       <w:r>
         <w:t xml:space="preserve"> </w:t>
       </w:r>
-      <w:hyperlink r:id="rId93">
+      <w:hyperlink r:id="rId103">
         <w:r>
           <w:rPr>
             <w:rStyle w:val="Hyperlink"/>
@@ -9385,8 +11061,8 @@
         </w:r>
       </w:hyperlink>
     </w:p>
-    <w:bookmarkEnd w:id="94"/>
-    <w:bookmarkStart w:id="96" w:name="ref-Hosseini2021accuracy"/>
+    <w:bookmarkEnd w:id="104"/>
+    <w:bookmarkStart w:id="106" w:name="ref-Hosseini2021accuracy"/>
     <w:p>
       <w:pPr>
         <w:pStyle w:val="Bibliography"/>
@@ -9397,7 +11073,7 @@
       <w:r>
         <w:t xml:space="preserve"> </w:t>
       </w:r>
-      <w:hyperlink r:id="rId95">
+      <w:hyperlink r:id="rId105">
         <w:r>
           <w:rPr>
             <w:rStyle w:val="Hyperlink"/>
@@ -9406,8 +11082,8 @@
         </w:r>
       </w:hyperlink>
     </w:p>
-    <w:bookmarkEnd w:id="96"/>
-    <w:bookmarkStart w:id="98" w:name="ref-Hou2020state"/>
+    <w:bookmarkEnd w:id="106"/>
+    <w:bookmarkStart w:id="108" w:name="ref-Hou2020state"/>
     <w:p>
       <w:pPr>
         <w:pStyle w:val="Bibliography"/>
@@ -9421,7 +11097,7 @@
       <w:r>
         <w:t xml:space="preserve"> </w:t>
       </w:r>
-      <w:hyperlink r:id="rId97">
+      <w:hyperlink r:id="rId107">
         <w:r>
           <w:rPr>
             <w:rStyle w:val="Hyperlink"/>
@@ -9430,8 +11106,8 @@
         </w:r>
       </w:hyperlink>
     </w:p>
-    <w:bookmarkEnd w:id="98"/>
-    <w:bookmarkStart w:id="100" w:name="ref-Huang2025rheological"/>
+    <w:bookmarkEnd w:id="108"/>
+    <w:bookmarkStart w:id="110" w:name="ref-Huang2025rheological"/>
     <w:p>
       <w:pPr>
         <w:pStyle w:val="Bibliography"/>
@@ -9445,7 +11121,7 @@
       <w:r>
         <w:t xml:space="preserve"> </w:t>
       </w:r>
-      <w:hyperlink r:id="rId99">
+      <w:hyperlink r:id="rId109">
         <w:r>
           <w:rPr>
             <w:rStyle w:val="Hyperlink"/>
@@ -9454,13 +11130,37 @@
         </w:r>
       </w:hyperlink>
     </w:p>
-    <w:bookmarkEnd w:id="100"/>
-    <w:bookmarkStart w:id="102" w:name="ref-Jalal2024swarm"/>
+    <w:bookmarkEnd w:id="110"/>
+    <w:bookmarkStart w:id="112" w:name="ref-Jalal2023indirect"/>
     <w:p>
       <w:pPr>
         <w:pStyle w:val="Bibliography"/>
       </w:pPr>
       <w:r>
+        <w:t xml:space="preserve">Jalal, F.E., Iqbal, M., Khan, M.A., others</w:t>
+      </w:r>
+      <w:r>
+        <w:t xml:space="preserve">, 2023. Indirect estimation of swelling pressure of expansive soil: GEP versus MEP modelling. Adv. Mater. Sci. Eng.</w:t>
+      </w:r>
+      <w:r>
+        <w:t xml:space="preserve"> </w:t>
+      </w:r>
+      <w:hyperlink r:id="rId111">
+        <w:r>
+          <w:rPr>
+            <w:rStyle w:val="Hyperlink"/>
+          </w:rPr>
+          <w:t xml:space="preserve">https://doi.org/10.1155/2023/1827117</w:t>
+        </w:r>
+      </w:hyperlink>
+    </w:p>
+    <w:bookmarkEnd w:id="112"/>
+    <w:bookmarkStart w:id="114" w:name="ref-Jalal2024swarm"/>
+    <w:p>
+      <w:pPr>
+        <w:pStyle w:val="Bibliography"/>
+      </w:pPr>
+      <w:r>
         <w:t xml:space="preserve">Jalal, F.E., Iqbal, M., Khan, W.A., others</w:t>
       </w:r>
       <w:r>
@@ -9469,7 +11169,7 @@
       <w:r>
         <w:t xml:space="preserve"> </w:t>
       </w:r>
-      <w:hyperlink r:id="rId101">
+      <w:hyperlink r:id="rId113">
         <w:r>
           <w:rPr>
             <w:rStyle w:val="Hyperlink"/>
@@ -9478,8 +11178,8 @@
         </w:r>
       </w:hyperlink>
     </w:p>
-    <w:bookmarkEnd w:id="102"/>
-    <w:bookmarkStart w:id="104" w:name="ref-Jweihan2026trustworthy"/>
+    <w:bookmarkEnd w:id="114"/>
+    <w:bookmarkStart w:id="116" w:name="ref-Jweihan2026trustworthy"/>
     <w:p>
       <w:pPr>
         <w:pStyle w:val="Bibliography"/>
@@ -9490,7 +11190,7 @@
       <w:r>
         <w:t xml:space="preserve"> </w:t>
       </w:r>
-      <w:hyperlink r:id="rId103">
+      <w:hyperlink r:id="rId115">
         <w:r>
           <w:rPr>
             <w:rStyle w:val="Hyperlink"/>
@@ -9499,8 +11199,8 @@
         </w:r>
       </w:hyperlink>
     </w:p>
-    <w:bookmarkEnd w:id="104"/>
-    <w:bookmarkStart w:id="106" w:name="ref-Kaloop2019particle"/>
+    <w:bookmarkEnd w:id="116"/>
+    <w:bookmarkStart w:id="118" w:name="ref-Kaloop2019particle"/>
     <w:p>
       <w:pPr>
         <w:pStyle w:val="Bibliography"/>
@@ -9514,7 +11214,7 @@
       <w:r>
         <w:t xml:space="preserve"> </w:t>
       </w:r>
-      <w:hyperlink r:id="rId105">
+      <w:hyperlink r:id="rId117">
         <w:r>
           <w:rPr>
             <w:rStyle w:val="Hyperlink"/>
@@ -9523,8 +11223,8 @@
         </w:r>
       </w:hyperlink>
     </w:p>
-    <w:bookmarkEnd w:id="106"/>
-    <w:bookmarkStart w:id="108" w:name="ref-Latifi2021reinforcement"/>
+    <w:bookmarkEnd w:id="118"/>
+    <w:bookmarkStart w:id="120" w:name="ref-Latifi2021reinforcement"/>
     <w:p>
       <w:pPr>
         <w:pStyle w:val="Bibliography"/>
@@ -9538,7 +11238,7 @@
       <w:r>
         <w:t xml:space="preserve"> </w:t>
       </w:r>
-      <w:hyperlink r:id="rId107">
+      <w:hyperlink r:id="rId119">
         <w:r>
           <w:rPr>
             <w:rStyle w:val="Hyperlink"/>
@@ -9547,8 +11247,8 @@
         </w:r>
       </w:hyperlink>
     </w:p>
-    <w:bookmarkEnd w:id="108"/>
-    <w:bookmarkStart w:id="110" w:name="ref-MharziAlaoui2026algorithm"/>
+    <w:bookmarkEnd w:id="120"/>
+    <w:bookmarkStart w:id="122" w:name="ref-MharziAlaoui2026algorithm"/>
     <w:p>
       <w:pPr>
         <w:pStyle w:val="Bibliography"/>
@@ -9562,7 +11262,7 @@
       <w:r>
         <w:t xml:space="preserve"> </w:t>
       </w:r>
-      <w:hyperlink r:id="rId109">
+      <w:hyperlink r:id="rId121">
         <w:r>
           <w:rPr>
             <w:rStyle w:val="Hyperlink"/>
@@ -9571,19 +11271,40 @@
         </w:r>
       </w:hyperlink>
     </w:p>
-    <w:bookmarkEnd w:id="110"/>
-    <w:bookmarkStart w:id="112" w:name="ref-Pan2025spatiotemporal"/>
+    <w:bookmarkEnd w:id="122"/>
+    <w:bookmarkStart w:id="124" w:name="ref-Mazari2016pavement"/>
     <w:p>
       <w:pPr>
         <w:pStyle w:val="Bibliography"/>
       </w:pPr>
       <w:r>
+        <w:t xml:space="preserve">Mazari, M., Rodriguez, D.D., 2016. Prediction of pavement roughness using a hybrid gene expression programming-neural network technique. J. Traffic Transp. Eng. (Engl. Ed.).</w:t>
+      </w:r>
+      <w:r>
+        <w:t xml:space="preserve"> </w:t>
+      </w:r>
+      <w:hyperlink r:id="rId123">
+        <w:r>
+          <w:rPr>
+            <w:rStyle w:val="Hyperlink"/>
+          </w:rPr>
+          <w:t xml:space="preserve">https://doi.org/10.1016/j.jtte.2016.09.007</w:t>
+        </w:r>
+      </w:hyperlink>
+    </w:p>
+    <w:bookmarkEnd w:id="124"/>
+    <w:bookmarkStart w:id="126" w:name="ref-Pan2025spatiotemporal"/>
+    <w:p>
+      <w:pPr>
+        <w:pStyle w:val="Bibliography"/>
+      </w:pPr>
+      <w:r>
         <w:t xml:space="preserve">Pan, N., Du, Y., Parlikad, A.K., 2025. A spatiotemporal prediction method for the evolution of pavement distress in road networks. Comput.-Aided Civ. Infrastruct. Eng.</w:t>
       </w:r>
       <w:r>
         <w:t xml:space="preserve"> </w:t>
       </w:r>
-      <w:hyperlink r:id="rId111">
+      <w:hyperlink r:id="rId125">
         <w:r>
           <w:rPr>
             <w:rStyle w:val="Hyperlink"/>
@@ -9592,8 +11313,8 @@
         </w:r>
       </w:hyperlink>
     </w:p>
-    <w:bookmarkEnd w:id="112"/>
-    <w:bookmarkStart w:id="114" w:name="ref-Pasupunuri2024roughness"/>
+    <w:bookmarkEnd w:id="126"/>
+    <w:bookmarkStart w:id="128" w:name="ref-Pasupunuri2024roughness"/>
     <w:p>
       <w:pPr>
         <w:pStyle w:val="Bibliography"/>
@@ -9604,7 +11325,7 @@
       <w:r>
         <w:t xml:space="preserve"> </w:t>
       </w:r>
-      <w:hyperlink r:id="rId113">
+      <w:hyperlink r:id="rId127">
         <w:r>
           <w:rPr>
             <w:rStyle w:val="Hyperlink"/>
@@ -9613,13 +11334,37 @@
         </w:r>
       </w:hyperlink>
     </w:p>
-    <w:bookmarkEnd w:id="114"/>
-    <w:bookmarkStart w:id="116" w:name="ref-Sun2023automatic"/>
+    <w:bookmarkEnd w:id="128"/>
+    <w:bookmarkStart w:id="130" w:name="ref-Sandamal2023pavement"/>
     <w:p>
       <w:pPr>
         <w:pStyle w:val="Bibliography"/>
       </w:pPr>
       <w:r>
+        <w:t xml:space="preserve">Sandamal, K., Shashiprabha, S., Muttil, N., others</w:t>
+      </w:r>
+      <w:r>
+        <w:t xml:space="preserve">, 2023. Pavement roughness prediction using explainable and supervised machine learning technique for long-term performance. Sustainability.</w:t>
+      </w:r>
+      <w:r>
+        <w:t xml:space="preserve"> </w:t>
+      </w:r>
+      <w:hyperlink r:id="rId129">
+        <w:r>
+          <w:rPr>
+            <w:rStyle w:val="Hyperlink"/>
+          </w:rPr>
+          <w:t xml:space="preserve">https://doi.org/10.3390/su15129617</w:t>
+        </w:r>
+      </w:hyperlink>
+    </w:p>
+    <w:bookmarkEnd w:id="130"/>
+    <w:bookmarkStart w:id="132" w:name="ref-Sun2023automatic"/>
+    <w:p>
+      <w:pPr>
+        <w:pStyle w:val="Bibliography"/>
+      </w:pPr>
+      <w:r>
         <w:t xml:space="preserve">Sun, Z., Zhai, J., Pei, L., others</w:t>
       </w:r>
       <w:r>
@@ -9628,7 +11373,7 @@
       <w:r>
         <w:t xml:space="preserve"> </w:t>
       </w:r>
-      <w:hyperlink r:id="rId115">
+      <w:hyperlink r:id="rId131">
         <w:r>
           <w:rPr>
             <w:rStyle w:val="Hyperlink"/>
@@ -9637,8 +11382,8 @@
         </w:r>
       </w:hyperlink>
     </w:p>
-    <w:bookmarkEnd w:id="116"/>
-    <w:bookmarkStart w:id="118" w:name="ref-Wang2023developing"/>
+    <w:bookmarkEnd w:id="132"/>
+    <w:bookmarkStart w:id="134" w:name="ref-Wang2023developing"/>
     <w:p>
       <w:pPr>
         <w:pStyle w:val="Bibliography"/>
@@ -9649,7 +11394,7 @@
       <w:r>
         <w:t xml:space="preserve"> </w:t>
       </w:r>
-      <w:hyperlink r:id="rId117">
+      <w:hyperlink r:id="rId133">
         <w:r>
           <w:rPr>
             <w:rStyle w:val="Hyperlink"/>
@@ -9658,8 +11403,8 @@
         </w:r>
       </w:hyperlink>
     </w:p>
-    <w:bookmarkEnd w:id="118"/>
-    <w:bookmarkStart w:id="120" w:name="ref-Xiao2023optimizing"/>
+    <w:bookmarkEnd w:id="134"/>
+    <w:bookmarkStart w:id="136" w:name="ref-Xiao2023optimizing"/>
     <w:p>
       <w:pPr>
         <w:pStyle w:val="Bibliography"/>
@@ -9670,7 +11415,7 @@
       <w:r>
         <w:t xml:space="preserve"> </w:t>
       </w:r>
-      <w:hyperlink r:id="rId119">
+      <w:hyperlink r:id="rId135">
         <w:r>
           <w:rPr>
             <w:rStyle w:val="Hyperlink"/>
@@ -9679,8 +11424,8 @@
         </w:r>
       </w:hyperlink>
     </w:p>
-    <w:bookmarkEnd w:id="120"/>
-    <w:bookmarkStart w:id="122" w:name="ref-Yang2021research"/>
+    <w:bookmarkEnd w:id="136"/>
+    <w:bookmarkStart w:id="138" w:name="ref-Yang2021research"/>
     <w:p>
       <w:pPr>
         <w:pStyle w:val="Bibliography"/>
@@ -9694,7 +11439,7 @@
       <w:r>
         <w:t xml:space="preserve"> </w:t>
       </w:r>
-      <w:hyperlink r:id="rId121">
+      <w:hyperlink r:id="rId137">
         <w:r>
           <w:rPr>
             <w:rStyle w:val="Hyperlink"/>
@@ -9703,8 +11448,8 @@
         </w:r>
       </w:hyperlink>
     </w:p>
-    <w:bookmarkEnd w:id="122"/>
-    <w:bookmarkStart w:id="124" w:name="ref-Yao2022large"/>
+    <w:bookmarkEnd w:id="138"/>
+    <w:bookmarkStart w:id="140" w:name="ref-Yao2022large"/>
     <w:p>
       <w:pPr>
         <w:pStyle w:val="Bibliography"/>
@@ -9718,7 +11463,7 @@
       <w:r>
         <w:t xml:space="preserve"> </w:t>
       </w:r>
-      <w:hyperlink r:id="rId123">
+      <w:hyperlink r:id="rId139">
         <w:r>
           <w:rPr>
             <w:rStyle w:val="Hyperlink"/>
@@ -9727,8 +11472,8 @@
         </w:r>
       </w:hyperlink>
     </w:p>
-    <w:bookmarkEnd w:id="124"/>
-    <w:bookmarkStart w:id="126" w:name="ref-Yu2020highway"/>
+    <w:bookmarkEnd w:id="140"/>
+    <w:bookmarkStart w:id="142" w:name="ref-Yu2020highway"/>
     <w:p>
       <w:pPr>
         <w:pStyle w:val="Bibliography"/>
@@ -9742,7 +11487,7 @@
       <w:r>
         <w:t xml:space="preserve"> </w:t>
       </w:r>
-      <w:hyperlink r:id="rId125">
+      <w:hyperlink r:id="rId141">
         <w:r>
           <w:rPr>
             <w:rStyle w:val="Hyperlink"/>
@@ -9751,8 +11496,8 @@
         </w:r>
       </w:hyperlink>
     </w:p>
-    <w:bookmarkEnd w:id="126"/>
-    <w:bookmarkStart w:id="128" w:name="ref-Zeiada2025benchmarking"/>
+    <w:bookmarkEnd w:id="142"/>
+    <w:bookmarkStart w:id="144" w:name="ref-Zeiada2025benchmarking"/>
     <w:p>
       <w:pPr>
         <w:pStyle w:val="Bibliography"/>
@@ -9766,7 +11511,7 @@
       <w:r>
         <w:t xml:space="preserve"> </w:t>
       </w:r>
-      <w:hyperlink r:id="rId127">
+      <w:hyperlink r:id="rId143">
         <w:r>
           <w:rPr>
             <w:rStyle w:val="Hyperlink"/>
@@ -9775,9 +11520,9 @@
         </w:r>
       </w:hyperlink>
     </w:p>
-    <w:bookmarkEnd w:id="128"/>
-    <w:bookmarkEnd w:id="129"/>
-    <w:bookmarkEnd w:id="130"/>
+    <w:bookmarkEnd w:id="144"/>
+    <w:bookmarkEnd w:id="145"/>
+    <w:bookmarkEnd w:id="146"/>
     <w:sectPr/>
   </w:body>
 </w:document>

</xml_diff>

<commit_message>
Phase 13: corpus to 94 records (78 classified); traced a peer-reviewed published version of a previously-flagged preprint and superseded it; added a statistically robust hybrid-underperforms case (Nguyen 2019, 1000-run Monte Carlo, plain SVM beats two ANFIS hybrids) strengthening Section 9's core evidence; added independently-converging CBR review citation with proper paraphrase (caught and fixed a 22-word direct quote exceeding copyright limits); fixed a table rendering bug where bare DOIs overflowed PDF columns; 34-page clean render
</commit_message>
<xml_diff>
--- a/output/manuscript.docx
+++ b/output/manuscript.docx
@@ -1309,7 +1309,7 @@
         <w:t xml:space="preserve"> </w:t>
       </w:r>
       <w:r>
-        <w:t xml:space="preserve">15 prior reviews listed in</w:t>
+        <w:t xml:space="preserve">16 prior reviews listed in</w:t>
       </w:r>
       <w:r>
         <w:t xml:space="preserve"> </w:t>
@@ -1984,6 +1984,56 @@
                     <w:jc w:val="center"/>
                   </w:pPr>
                   <w:r>
+                    <w:t xml:space="preserve">Khatti et al.</w:t>
+                  </w:r>
+                </w:p>
+              </w:tc>
+              <w:tc>
+                <w:tcPr/>
+                <w:p>
+                  <w:pPr>
+                    <w:pStyle w:val="Compact"/>
+                    <w:jc w:val="center"/>
+                  </w:pPr>
+                  <w:r>
+                    <w:t xml:space="preserve">2025</w:t>
+                  </w:r>
+                </w:p>
+              </w:tc>
+              <w:tc>
+                <w:tcPr/>
+                <w:p>
+                  <w:pPr>
+                    <w:pStyle w:val="Compact"/>
+                    <w:jc w:val="center"/>
+                  </w:pPr>
+                  <w:r>
+                    <w:t xml:space="preserve">Soils and Rocks</w:t>
+                  </w:r>
+                </w:p>
+              </w:tc>
+              <w:tc>
+                <w:tcPr/>
+                <w:p>
+                  <w:pPr>
+                    <w:pStyle w:val="Compact"/>
+                    <w:jc w:val="center"/>
+                  </w:pPr>
+                  <w:r>
+                    <w:t xml:space="preserve">materials</w:t>
+                  </w:r>
+                </w:p>
+              </w:tc>
+            </w:tr>
+            <w:tr>
+              <w:tc>
+                <w:tcPr/>
+                <w:p>
+                  <w:pPr>
+                    <w:pStyle w:val="Compact"/>
+                    <w:jc w:val="center"/>
+                  </w:pPr>
+                  <w:r>
                     <w:t xml:space="preserve">M’harzi Alaoui et al.</w:t>
                   </w:r>
                 </w:p>
@@ -2635,7 +2685,7 @@
         <w:pStyle w:val="FirstParagraph"/>
       </w:pPr>
       <w:r>
-        <w:t xml:space="preserve">Of the 75 primary studies coded so far,</w:t>
+        <w:t xml:space="preserve">Of the 78 primary studies coded so far,</w:t>
       </w:r>
       <w:r>
         <w:t xml:space="preserve"> </w:t>
@@ -2670,7 +2720,7 @@
         <w:t xml:space="preserve"> </w:t>
       </w:r>
       <w:r>
-        <w:t xml:space="preserve">of 75 — do not qualify as hybrid under the structural test in</w:t>
+        <w:t xml:space="preserve">of 78 — do not qualify as hybrid under the structural test in</w:t>
       </w:r>
       <w:r>
         <w:t xml:space="preserve"> </w:t>
@@ -6671,13 +6721,13 @@
               <w:tblLook w:firstRow="1" w:lastRow="0" w:firstColumn="0" w:lastColumn="0" w:noHBand="0" w:noVBand="0" w:val="0020"/>
             </w:tblPr>
             <w:tblGrid>
-              <w:gridCol w:w="1131"/>
-              <w:gridCol w:w="1131"/>
-              <w:gridCol w:w="1131"/>
-              <w:gridCol w:w="1131"/>
-              <w:gridCol w:w="1131"/>
-              <w:gridCol w:w="1131"/>
-              <w:gridCol w:w="1131"/>
+              <w:gridCol w:w="950"/>
+              <w:gridCol w:w="1584"/>
+              <w:gridCol w:w="950"/>
+              <w:gridCol w:w="1267"/>
+              <w:gridCol w:w="1267"/>
+              <w:gridCol w:w="792"/>
+              <w:gridCol w:w="1108"/>
             </w:tblGrid>
             <w:tr>
               <w:trPr>
@@ -6780,79 +6830,79 @@
                     <w:rPr>
                       <w:rStyle w:val="VerbatimChar"/>
                     </w:rPr>
-                    <w:t xml:space="preserve">10.1038/s41598-022-17429-z</w:t>
-                  </w:r>
-                </w:p>
-              </w:tc>
-              <w:tc>
-                <w:tcPr/>
-                <w:p>
-                  <w:pPr>
-                    <w:pStyle w:val="Compact"/>
-                    <w:jc w:val="center"/>
-                  </w:pPr>
-                  <w:r>
-                    <w:t xml:space="preserve">LSSVM (best single-kernel setting reported) vs. best of 6 swarm-optimised LSSVM variants</w:t>
-                  </w:r>
-                </w:p>
-              </w:tc>
-              <w:tc>
-                <w:tcPr/>
-                <w:p>
-                  <w:pPr>
-                    <w:pStyle w:val="Compact"/>
-                    <w:jc w:val="center"/>
-                  </w:pPr>
-                  <w:r>
-                    <w:t xml:space="preserve">R2 / RMSE (MPa)</w:t>
-                  </w:r>
-                </w:p>
-              </w:tc>
-              <w:tc>
-                <w:tcPr/>
-                <w:p>
-                  <w:pPr>
-                    <w:pStyle w:val="Compact"/>
-                    <w:jc w:val="center"/>
-                  </w:pPr>
-                  <w:r>
-                    <w:t xml:space="preserve">not reported as a standalone tuned baseline</w:t>
-                  </w:r>
-                </w:p>
-              </w:tc>
-              <w:tc>
-                <w:tcPr/>
-                <w:p>
-                  <w:pPr>
-                    <w:pStyle w:val="Compact"/>
-                    <w:jc w:val="center"/>
-                  </w:pPr>
-                  <w:r>
-                    <w:t xml:space="preserve">0.942 / 6.72 (best of six, SOS)</w:t>
-                  </w:r>
-                </w:p>
-              </w:tc>
-              <w:tc>
-                <w:tcPr/>
-                <w:p>
-                  <w:pPr>
-                    <w:pStyle w:val="Compact"/>
-                    <w:jc w:val="center"/>
-                  </w:pPr>
-                  <w:r>
-                    <w:t xml:space="preserve">not computable — no tuned non-hybrid baseline reported</w:t>
-                  </w:r>
-                </w:p>
-              </w:tc>
-              <w:tc>
-                <w:tcPr/>
-                <w:p>
-                  <w:pPr>
-                    <w:pStyle w:val="Compact"/>
-                    <w:jc w:val="center"/>
-                  </w:pPr>
-                  <w:r>
-                    <w:t xml:space="preserve">The paper compares six hybrids to each other, never to a conventionally tuned LSSVM. This is the missing-baseline pattern Section 9 quantifies.</w:t>
+                    <w:t xml:space="preserve">10.3390/​app9153172</w:t>
+                  </w:r>
+                </w:p>
+              </w:tc>
+              <w:tc>
+                <w:tcPr/>
+                <w:p>
+                  <w:pPr>
+                    <w:pStyle w:val="Compact"/>
+                    <w:jc w:val="center"/>
+                  </w:pPr>
+                  <w:r>
+                    <w:t xml:space="preserve">Plain SVM vs. GA-ANFIS vs. PSO-ANFIS, all reported within one paper, 1000-run Monte Carlo</w:t>
+                  </w:r>
+                </w:p>
+              </w:tc>
+              <w:tc>
+                <w:tcPr/>
+                <w:p>
+                  <w:pPr>
+                    <w:pStyle w:val="Compact"/>
+                    <w:jc w:val="center"/>
+                  </w:pPr>
+                  <w:r>
+                    <w:t xml:space="preserve">RMSE / MAE / R (Marshall Stability)</w:t>
+                  </w:r>
+                </w:p>
+              </w:tc>
+              <w:tc>
+                <w:tcPr/>
+                <w:p>
+                  <w:pPr>
+                    <w:pStyle w:val="Compact"/>
+                    <w:jc w:val="center"/>
+                  </w:pPr>
+                  <w:r>
+                    <w:t xml:space="preserve">plain SVM (best of three by converged statistical criteria)</w:t>
+                  </w:r>
+                </w:p>
+              </w:tc>
+              <w:tc>
+                <w:tcPr/>
+                <w:p>
+                  <w:pPr>
+                    <w:pStyle w:val="Compact"/>
+                    <w:jc w:val="center"/>
+                  </w:pPr>
+                  <w:r>
+                    <w:t xml:space="preserve">GA-ANFIS and PSO-ANFIS (both hybrids)</w:t>
+                  </w:r>
+                </w:p>
+              </w:tc>
+              <w:tc>
+                <w:tcPr/>
+                <w:p>
+                  <w:pPr>
+                    <w:pStyle w:val="Compact"/>
+                    <w:jc w:val="center"/>
+                  </w:pPr>
+                  <w:r>
+                    <w:t xml:space="preserve">negative — plain SVM outperforms both hybrids</w:t>
+                  </w:r>
+                </w:p>
+              </w:tc>
+              <w:tc>
+                <w:tcPr/>
+                <w:p>
+                  <w:pPr>
+                    <w:pStyle w:val="Compact"/>
+                    <w:jc w:val="center"/>
+                  </w:pPr>
+                  <w:r>
+                    <w:t xml:space="preserve">Rare in this literature: a statistically robust (1000-simulation Monte Carlo) same-paper comparison where a plain, non-hybrid learner beats two separate metaheuristic-hybrid variants. Directly supports the review’s central claim rather than merely gesturing at a missing baseline.</w:t>
                   </w:r>
                 </w:p>
               </w:tc>
@@ -6869,79 +6919,79 @@
                     <w:rPr>
                       <w:rStyle w:val="VerbatimChar"/>
                     </w:rPr>
-                    <w:t xml:space="preserve">10.28991/cej-2025-011-01-06</w:t>
-                  </w:r>
-                </w:p>
-              </w:tc>
-              <w:tc>
-                <w:tcPr/>
-                <w:p>
-                  <w:pPr>
-                    <w:pStyle w:val="Compact"/>
-                    <w:jc w:val="center"/>
-                  </w:pPr>
-                  <w:r>
-                    <w:t xml:space="preserve">Eight individually-tuned learners (ANN, RNN, CNN among them) vs. Witczak/Hirsch mechanistic baselines</w:t>
-                  </w:r>
-                </w:p>
-              </w:tc>
-              <w:tc>
-                <w:tcPr/>
-                <w:p>
-                  <w:pPr>
-                    <w:pStyle w:val="Compact"/>
-                    <w:jc w:val="center"/>
-                  </w:pPr>
-                  <w:r>
-                    <w:t xml:space="preserve">R2 (dynamic modulus)</w:t>
-                  </w:r>
-                </w:p>
-              </w:tc>
-              <w:tc>
-                <w:tcPr/>
-                <w:p>
-                  <w:pPr>
-                    <w:pStyle w:val="Compact"/>
-                    <w:jc w:val="center"/>
-                  </w:pPr>
-                  <w:r>
-                    <w:t xml:space="preserve">Witczak 1-40D / Hirsch (mechanistic)</w:t>
-                  </w:r>
-                </w:p>
-              </w:tc>
-              <w:tc>
-                <w:tcPr/>
-                <w:p>
-                  <w:pPr>
-                    <w:pStyle w:val="Compact"/>
-                    <w:jc w:val="center"/>
-                  </w:pPr>
-                  <w:r>
-                    <w:t xml:space="preserve">bagging ensemble, individually tuned (highest of eight)</w:t>
-                  </w:r>
-                </w:p>
-              </w:tc>
-              <w:tc>
-                <w:tcPr/>
-                <w:p>
-                  <w:pPr>
-                    <w:pStyle w:val="Compact"/>
-                    <w:jc w:val="center"/>
-                  </w:pPr>
-                  <w:r>
-                    <w:t xml:space="preserve">positive but modest — mechanistic models remain competitive; deep architectures do NOT win</w:t>
-                  </w:r>
-                </w:p>
-              </w:tc>
-              <w:tc>
-                <w:tcPr/>
-                <w:p>
-                  <w:pPr>
-                    <w:pStyle w:val="Compact"/>
-                    <w:jc w:val="center"/>
-                  </w:pPr>
-                  <w:r>
-                    <w:t xml:space="preserve">The field’s clearest example of tuning parity: every learner gets its own search budget, and the winner is a tuned ensemble tree, not a hybrid or a deep net.</w:t>
+                    <w:t xml:space="preserve">10.1038/​s41598-022-17429-z</w:t>
+                  </w:r>
+                </w:p>
+              </w:tc>
+              <w:tc>
+                <w:tcPr/>
+                <w:p>
+                  <w:pPr>
+                    <w:pStyle w:val="Compact"/>
+                    <w:jc w:val="center"/>
+                  </w:pPr>
+                  <w:r>
+                    <w:t xml:space="preserve">LSSVM (best single-kernel setting reported) vs. best of 6 swarm-optimised LSSVM variants</w:t>
+                  </w:r>
+                </w:p>
+              </w:tc>
+              <w:tc>
+                <w:tcPr/>
+                <w:p>
+                  <w:pPr>
+                    <w:pStyle w:val="Compact"/>
+                    <w:jc w:val="center"/>
+                  </w:pPr>
+                  <w:r>
+                    <w:t xml:space="preserve">R2 / RMSE (MPa)</w:t>
+                  </w:r>
+                </w:p>
+              </w:tc>
+              <w:tc>
+                <w:tcPr/>
+                <w:p>
+                  <w:pPr>
+                    <w:pStyle w:val="Compact"/>
+                    <w:jc w:val="center"/>
+                  </w:pPr>
+                  <w:r>
+                    <w:t xml:space="preserve">not reported as a standalone tuned baseline</w:t>
+                  </w:r>
+                </w:p>
+              </w:tc>
+              <w:tc>
+                <w:tcPr/>
+                <w:p>
+                  <w:pPr>
+                    <w:pStyle w:val="Compact"/>
+                    <w:jc w:val="center"/>
+                  </w:pPr>
+                  <w:r>
+                    <w:t xml:space="preserve">0.942 / 6.72 (best of six, SOS)</w:t>
+                  </w:r>
+                </w:p>
+              </w:tc>
+              <w:tc>
+                <w:tcPr/>
+                <w:p>
+                  <w:pPr>
+                    <w:pStyle w:val="Compact"/>
+                    <w:jc w:val="center"/>
+                  </w:pPr>
+                  <w:r>
+                    <w:t xml:space="preserve">not computable — no tuned non-hybrid baseline reported</w:t>
+                  </w:r>
+                </w:p>
+              </w:tc>
+              <w:tc>
+                <w:tcPr/>
+                <w:p>
+                  <w:pPr>
+                    <w:pStyle w:val="Compact"/>
+                    <w:jc w:val="center"/>
+                  </w:pPr>
+                  <w:r>
+                    <w:t xml:space="preserve">The paper compares six hybrids to each other, never to a conventionally tuned LSSVM. This is the missing-baseline pattern Section 9 quantifies.</w:t>
                   </w:r>
                 </w:p>
               </w:tc>
@@ -6958,79 +7008,79 @@
                     <w:rPr>
                       <w:rStyle w:val="VerbatimChar"/>
                     </w:rPr>
-                    <w:t xml:space="preserve">10.1016/j.sandf.2020.02.010</w:t>
-                  </w:r>
-                </w:p>
-              </w:tc>
-              <w:tc>
-                <w:tcPr/>
-                <w:p>
-                  <w:pPr>
-                    <w:pStyle w:val="Compact"/>
-                    <w:jc w:val="center"/>
-                  </w:pPr>
-                  <w:r>
-                    <w:t xml:space="preserve">GA-fitted symbolic equation (H7-adjacent) vs. ANN-GA (GA on ANN weights, H2)</w:t>
-                  </w:r>
-                </w:p>
-              </w:tc>
-              <w:tc>
-                <w:tcPr/>
-                <w:p>
-                  <w:pPr>
-                    <w:pStyle w:val="Compact"/>
-                    <w:jc w:val="center"/>
-                  </w:pPr>
-                  <w:r>
-                    <w:t xml:space="preserve">R2 (resilient modulus)</w:t>
-                  </w:r>
-                </w:p>
-              </w:tc>
-              <w:tc>
-                <w:tcPr/>
-                <w:p>
-                  <w:pPr>
-                    <w:pStyle w:val="Compact"/>
-                    <w:jc w:val="center"/>
-                  </w:pPr>
-                  <w:r>
-                    <w:t xml:space="preserve">GA-only symbolic model</w:t>
-                  </w:r>
-                </w:p>
-              </w:tc>
-              <w:tc>
-                <w:tcPr/>
-                <w:p>
-                  <w:pPr>
-                    <w:pStyle w:val="Compact"/>
-                    <w:jc w:val="center"/>
-                  </w:pPr>
-                  <w:r>
-                    <w:t xml:space="preserve">ANN-GA hybrid</w:t>
-                  </w:r>
-                </w:p>
-              </w:tc>
-              <w:tc>
-                <w:tcPr/>
-                <w:p>
-                  <w:pPr>
-                    <w:pStyle w:val="Compact"/>
-                    <w:jc w:val="center"/>
-                  </w:pPr>
-                  <w:r>
-                    <w:t xml:space="preserve">ANN-GA reported higher R2, but adds a black-box layer over an already-competitive symbolic model</w:t>
-                  </w:r>
-                </w:p>
-              </w:tc>
-              <w:tc>
-                <w:tcPr/>
-                <w:p>
-                  <w:pPr>
-                    <w:pStyle w:val="Compact"/>
-                    <w:jc w:val="center"/>
-                  </w:pPr>
-                  <w:r>
-                    <w:t xml:space="preserve">Rare true head-to-head between two hybrid types on identical data — flagged for full-text extraction of exact R2 values.</w:t>
+                    <w:t xml:space="preserve">10.28991/​cej-2025-011-01-06</w:t>
+                  </w:r>
+                </w:p>
+              </w:tc>
+              <w:tc>
+                <w:tcPr/>
+                <w:p>
+                  <w:pPr>
+                    <w:pStyle w:val="Compact"/>
+                    <w:jc w:val="center"/>
+                  </w:pPr>
+                  <w:r>
+                    <w:t xml:space="preserve">Eight individually-tuned learners (ANN, RNN, CNN among them) vs. Witczak/Hirsch mechanistic baselines</w:t>
+                  </w:r>
+                </w:p>
+              </w:tc>
+              <w:tc>
+                <w:tcPr/>
+                <w:p>
+                  <w:pPr>
+                    <w:pStyle w:val="Compact"/>
+                    <w:jc w:val="center"/>
+                  </w:pPr>
+                  <w:r>
+                    <w:t xml:space="preserve">R2 (dynamic modulus)</w:t>
+                  </w:r>
+                </w:p>
+              </w:tc>
+              <w:tc>
+                <w:tcPr/>
+                <w:p>
+                  <w:pPr>
+                    <w:pStyle w:val="Compact"/>
+                    <w:jc w:val="center"/>
+                  </w:pPr>
+                  <w:r>
+                    <w:t xml:space="preserve">Witczak 1-40D / Hirsch (mechanistic)</w:t>
+                  </w:r>
+                </w:p>
+              </w:tc>
+              <w:tc>
+                <w:tcPr/>
+                <w:p>
+                  <w:pPr>
+                    <w:pStyle w:val="Compact"/>
+                    <w:jc w:val="center"/>
+                  </w:pPr>
+                  <w:r>
+                    <w:t xml:space="preserve">bagging ensemble, individually tuned (highest of eight)</w:t>
+                  </w:r>
+                </w:p>
+              </w:tc>
+              <w:tc>
+                <w:tcPr/>
+                <w:p>
+                  <w:pPr>
+                    <w:pStyle w:val="Compact"/>
+                    <w:jc w:val="center"/>
+                  </w:pPr>
+                  <w:r>
+                    <w:t xml:space="preserve">positive but modest — mechanistic models remain competitive; deep architectures do NOT win</w:t>
+                  </w:r>
+                </w:p>
+              </w:tc>
+              <w:tc>
+                <w:tcPr/>
+                <w:p>
+                  <w:pPr>
+                    <w:pStyle w:val="Compact"/>
+                    <w:jc w:val="center"/>
+                  </w:pPr>
+                  <w:r>
+                    <w:t xml:space="preserve">The field’s clearest example of tuning parity: every learner gets its own search budget, and the winner is a tuned ensemble tree, not a hybrid or a deep net.</w:t>
                   </w:r>
                 </w:p>
               </w:tc>
@@ -7047,79 +7097,79 @@
                     <w:rPr>
                       <w:rStyle w:val="VerbatimChar"/>
                     </w:rPr>
-                    <w:t xml:space="preserve">10.3390/app9163221</w:t>
-                  </w:r>
-                </w:p>
-              </w:tc>
-              <w:tc>
-                <w:tcPr/>
-                <w:p>
-                  <w:pPr>
-                    <w:pStyle w:val="Compact"/>
-                    <w:jc w:val="center"/>
-                  </w:pPr>
-                  <w:r>
-                    <w:t xml:space="preserve">PSO-ANN vs. PSO-ELM vs. kernel-ELM, all reported within one paper</w:t>
-                  </w:r>
-                </w:p>
-              </w:tc>
-              <w:tc>
-                <w:tcPr/>
-                <w:p>
-                  <w:pPr>
-                    <w:pStyle w:val="Compact"/>
-                    <w:jc w:val="center"/>
-                  </w:pPr>
-                  <w:r>
-                    <w:t xml:space="preserve">RMSE / R2</w:t>
-                  </w:r>
-                </w:p>
-              </w:tc>
-              <w:tc>
-                <w:tcPr/>
-                <w:p>
-                  <w:pPr>
-                    <w:pStyle w:val="Compact"/>
-                    <w:jc w:val="center"/>
-                  </w:pPr>
-                  <w:r>
-                    <w:t xml:space="preserve">PSO-ANN (same optimiser, different base learner)</w:t>
-                  </w:r>
-                </w:p>
-              </w:tc>
-              <w:tc>
-                <w:tcPr/>
-                <w:p>
-                  <w:pPr>
-                    <w:pStyle w:val="Compact"/>
-                    <w:jc w:val="center"/>
-                  </w:pPr>
-                  <w:r>
-                    <w:t xml:space="preserve">PSO-ELM (best reported)</w:t>
-                  </w:r>
-                </w:p>
-              </w:tc>
-              <w:tc>
-                <w:tcPr/>
-                <w:p>
-                  <w:pPr>
-                    <w:pStyle w:val="Compact"/>
-                    <w:jc w:val="center"/>
-                  </w:pPr>
-                  <w:r>
-                    <w:t xml:space="preserve">small, same-optimiser architecture comparison — isolates base-learner choice, not optimiser value</w:t>
-                  </w:r>
-                </w:p>
-              </w:tc>
-              <w:tc>
-                <w:tcPr/>
-                <w:p>
-                  <w:pPr>
-                    <w:pStyle w:val="Compact"/>
-                    <w:jc w:val="center"/>
-                  </w:pPr>
-                  <w:r>
-                    <w:t xml:space="preserve">Useful for a different question than the premium: it holds the optimiser constant and varies the learner, the mirror image of what Section 9 needs.</w:t>
+                    <w:t xml:space="preserve">10.1016/​j.sandf.2020.02.010</w:t>
+                  </w:r>
+                </w:p>
+              </w:tc>
+              <w:tc>
+                <w:tcPr/>
+                <w:p>
+                  <w:pPr>
+                    <w:pStyle w:val="Compact"/>
+                    <w:jc w:val="center"/>
+                  </w:pPr>
+                  <w:r>
+                    <w:t xml:space="preserve">GA-fitted symbolic equation (H7-adjacent) vs. ANN-GA (GA on ANN weights, H2)</w:t>
+                  </w:r>
+                </w:p>
+              </w:tc>
+              <w:tc>
+                <w:tcPr/>
+                <w:p>
+                  <w:pPr>
+                    <w:pStyle w:val="Compact"/>
+                    <w:jc w:val="center"/>
+                  </w:pPr>
+                  <w:r>
+                    <w:t xml:space="preserve">R2 (resilient modulus)</w:t>
+                  </w:r>
+                </w:p>
+              </w:tc>
+              <w:tc>
+                <w:tcPr/>
+                <w:p>
+                  <w:pPr>
+                    <w:pStyle w:val="Compact"/>
+                    <w:jc w:val="center"/>
+                  </w:pPr>
+                  <w:r>
+                    <w:t xml:space="preserve">GA-only symbolic model</w:t>
+                  </w:r>
+                </w:p>
+              </w:tc>
+              <w:tc>
+                <w:tcPr/>
+                <w:p>
+                  <w:pPr>
+                    <w:pStyle w:val="Compact"/>
+                    <w:jc w:val="center"/>
+                  </w:pPr>
+                  <w:r>
+                    <w:t xml:space="preserve">ANN-GA hybrid</w:t>
+                  </w:r>
+                </w:p>
+              </w:tc>
+              <w:tc>
+                <w:tcPr/>
+                <w:p>
+                  <w:pPr>
+                    <w:pStyle w:val="Compact"/>
+                    <w:jc w:val="center"/>
+                  </w:pPr>
+                  <w:r>
+                    <w:t xml:space="preserve">ANN-GA reported higher R2, but adds a black-box layer over an already-competitive symbolic model</w:t>
+                  </w:r>
+                </w:p>
+              </w:tc>
+              <w:tc>
+                <w:tcPr/>
+                <w:p>
+                  <w:pPr>
+                    <w:pStyle w:val="Compact"/>
+                    <w:jc w:val="center"/>
+                  </w:pPr>
+                  <w:r>
+                    <w:t xml:space="preserve">Rare true head-to-head between two hybrid types on identical data — flagged for full-text extraction of exact R2 values.</w:t>
                   </w:r>
                 </w:p>
               </w:tc>
@@ -7136,7 +7186,96 @@
                     <w:rPr>
                       <w:rStyle w:val="VerbatimChar"/>
                     </w:rPr>
-                    <w:t xml:space="preserve">10.3390/ma18122913</w:t>
+                    <w:t xml:space="preserve">10.3390/​app9163221</w:t>
+                  </w:r>
+                </w:p>
+              </w:tc>
+              <w:tc>
+                <w:tcPr/>
+                <w:p>
+                  <w:pPr>
+                    <w:pStyle w:val="Compact"/>
+                    <w:jc w:val="center"/>
+                  </w:pPr>
+                  <w:r>
+                    <w:t xml:space="preserve">PSO-ANN vs. PSO-ELM vs. kernel-ELM, all reported within one paper</w:t>
+                  </w:r>
+                </w:p>
+              </w:tc>
+              <w:tc>
+                <w:tcPr/>
+                <w:p>
+                  <w:pPr>
+                    <w:pStyle w:val="Compact"/>
+                    <w:jc w:val="center"/>
+                  </w:pPr>
+                  <w:r>
+                    <w:t xml:space="preserve">RMSE / R2</w:t>
+                  </w:r>
+                </w:p>
+              </w:tc>
+              <w:tc>
+                <w:tcPr/>
+                <w:p>
+                  <w:pPr>
+                    <w:pStyle w:val="Compact"/>
+                    <w:jc w:val="center"/>
+                  </w:pPr>
+                  <w:r>
+                    <w:t xml:space="preserve">PSO-ANN (same optimiser, different base learner)</w:t>
+                  </w:r>
+                </w:p>
+              </w:tc>
+              <w:tc>
+                <w:tcPr/>
+                <w:p>
+                  <w:pPr>
+                    <w:pStyle w:val="Compact"/>
+                    <w:jc w:val="center"/>
+                  </w:pPr>
+                  <w:r>
+                    <w:t xml:space="preserve">PSO-ELM (best reported)</w:t>
+                  </w:r>
+                </w:p>
+              </w:tc>
+              <w:tc>
+                <w:tcPr/>
+                <w:p>
+                  <w:pPr>
+                    <w:pStyle w:val="Compact"/>
+                    <w:jc w:val="center"/>
+                  </w:pPr>
+                  <w:r>
+                    <w:t xml:space="preserve">small, same-optimiser architecture comparison — isolates base-learner choice, not optimiser value</w:t>
+                  </w:r>
+                </w:p>
+              </w:tc>
+              <w:tc>
+                <w:tcPr/>
+                <w:p>
+                  <w:pPr>
+                    <w:pStyle w:val="Compact"/>
+                    <w:jc w:val="center"/>
+                  </w:pPr>
+                  <w:r>
+                    <w:t xml:space="preserve">Useful for a different question than the premium: it holds the optimiser constant and varies the learner, the mirror image of what Section 9 needs.</w:t>
+                  </w:r>
+                </w:p>
+              </w:tc>
+            </w:tr>
+            <w:tr>
+              <w:tc>
+                <w:tcPr/>
+                <w:p>
+                  <w:pPr>
+                    <w:pStyle w:val="Compact"/>
+                    <w:jc w:val="center"/>
+                  </w:pPr>
+                  <w:r>
+                    <w:rPr>
+                      <w:rStyle w:val="VerbatimChar"/>
+                    </w:rPr>
+                    <w:t xml:space="preserve">10.3390/​ma18122913</w:t>
                   </w:r>
                 </w:p>
               </w:tc>
@@ -7224,7 +7363,7 @@
         <w:pStyle w:val="BodyText"/>
       </w:pPr>
       <w:r>
-        <w:t xml:space="preserve">Two readings of this table matter more than any single row. First,</w:t>
+        <w:t xml:space="preserve">Three readings of this table matter more than any single row. First,</w:t>
       </w:r>
       <w:r>
         <w:t xml:space="preserve"> </w:t>
@@ -7240,7 +7379,7 @@
         <w:t xml:space="preserve"> </w:t>
       </w:r>
       <w:r>
-        <w:t xml:space="preserve">Of the five rows, only two</w:t>
+        <w:t xml:space="preserve">Of the six rows, only three</w:t>
       </w:r>
       <w:r>
         <w:t xml:space="preserve"> </w:t>
@@ -7261,19 +7400,28 @@
         <w:t xml:space="preserve">Huang et al.</w:t>
       </w:r>
       <w:r>
-        <w:t xml:space="preserve">, 2025)</w:t>
-      </w:r>
-      <w:r>
-        <w:t xml:space="preserve"> </w:t>
-      </w:r>
-      <w:r>
-        <w:t xml:space="preserve">involve a</w:t>
-      </w:r>
-      <w:r>
-        <w:t xml:space="preserve"> </w:t>
-      </w:r>
-      <w:r>
-        <w:t xml:space="preserve">paper that reports enough to attempt a premium calculation at all, and</w:t>
+        <w:t xml:space="preserve">, 2025;</w:t>
+      </w:r>
+      <w:r>
+        <w:t xml:space="preserve"> </w:t>
+      </w:r>
+      <w:r>
+        <w:t xml:space="preserve">Nguyen et al.</w:t>
+      </w:r>
+      <w:r>
+        <w:t xml:space="preserve">, 2019)</w:t>
+      </w:r>
+      <w:r>
+        <w:t xml:space="preserve"> </w:t>
+      </w:r>
+      <w:r>
+        <w:t xml:space="preserve">involve a paper that reports enough to attempt a premium</w:t>
+      </w:r>
+      <w:r>
+        <w:t xml:space="preserve"> </w:t>
+      </w:r>
+      <w:r>
+        <w:t xml:space="preserve">calculation at all, and</w:t>
       </w:r>
       <w:r>
         <w:t xml:space="preserve"> </w:t>
@@ -7288,19 +7436,19 @@
         <w:t xml:space="preserve">(2022)</w:t>
       </w:r>
       <w:r>
-        <w:t xml:space="preserve">’s own six-optimiser comparison never includes the one</w:t>
-      </w:r>
-      <w:r>
-        <w:t xml:space="preserve"> </w:t>
-      </w:r>
-      <w:r>
-        <w:t xml:space="preserve">comparator — a conventionally tuned, non-hybrid version of the same LSSVM — that</w:t>
-      </w:r>
-      <w:r>
-        <w:t xml:space="preserve"> </w:t>
-      </w:r>
-      <w:r>
-        <w:t xml:space="preserve">would let a reader compute</w:t>
+        <w:t xml:space="preserve">’s own six-optimiser comparison never</w:t>
+      </w:r>
+      <w:r>
+        <w:t xml:space="preserve"> </w:t>
+      </w:r>
+      <w:r>
+        <w:t xml:space="preserve">includes the one comparator — a conventionally tuned, non-hybrid version of the</w:t>
+      </w:r>
+      <w:r>
+        <w:t xml:space="preserve"> </w:t>
+      </w:r>
+      <w:r>
+        <w:t xml:space="preserve">same LSSVM — that would let a reader compute</w:t>
       </w:r>
       <w:r>
         <w:t xml:space="preserve"> </w:t>
@@ -7314,19 +7462,19 @@
         </m:r>
       </m:oMath>
       <w:r>
-        <w:t xml:space="preserve">. This is the pattern the full audit is built to</w:t>
-      </w:r>
-      <w:r>
-        <w:t xml:space="preserve"> </w:t>
-      </w:r>
-      <w:r>
-        <w:t xml:space="preserve">quantify: the missing baseline, not a negative result, is the dominant finding so</w:t>
-      </w:r>
-      <w:r>
-        <w:t xml:space="preserve"> </w:t>
-      </w:r>
-      <w:r>
-        <w:t xml:space="preserve">far. Second,</w:t>
+        <w:t xml:space="preserve">. This is the pattern the full</w:t>
+      </w:r>
+      <w:r>
+        <w:t xml:space="preserve"> </w:t>
+      </w:r>
+      <w:r>
+        <w:t xml:space="preserve">audit is built to quantify: the missing baseline, not a negative result, is the</w:t>
+      </w:r>
+      <w:r>
+        <w:t xml:space="preserve"> </w:t>
+      </w:r>
+      <w:r>
+        <w:t xml:space="preserve">dominant finding so far. Second,</w:t>
       </w:r>
       <w:r>
         <w:t xml:space="preserve"> </w:t>
@@ -7336,7 +7484,7 @@
           <w:b/>
           <w:bCs/>
         </w:rPr>
-        <w:t xml:space="preserve">where tuning parity is closest to being honoured, the hybrid or</w:t>
+        <w:t xml:space="preserve">where tuning parity is closest to being</w:t>
       </w:r>
       <w:r>
         <w:rPr>
@@ -7350,7 +7498,21 @@
           <w:b/>
           <w:bCs/>
         </w:rPr>
-        <w:t xml:space="preserve">deep-architecture advantage narrows.</w:t>
+        <w:t xml:space="preserve">honoured, the hybrid or deep-architecture advantage narrows — and can reverse</w:t>
+      </w:r>
+      <w:r>
+        <w:rPr>
+          <w:b/>
+          <w:bCs/>
+        </w:rPr>
+        <w:t xml:space="preserve"> </w:t>
+      </w:r>
+      <w:r>
+        <w:rPr>
+          <w:b/>
+          <w:bCs/>
+        </w:rPr>
+        <w:t xml:space="preserve">outright.</w:t>
       </w:r>
       <w:r>
         <w:t xml:space="preserve"> </w:t>
@@ -7368,31 +7530,73 @@
         <w:t xml:space="preserve"> </w:t>
       </w:r>
       <w:r>
-        <w:t xml:space="preserve">tunes eight</w:t>
-      </w:r>
-      <w:r>
-        <w:t xml:space="preserve"> </w:t>
-      </w:r>
-      <w:r>
-        <w:t xml:space="preserve">architectures individually, including deep networks, against both each other and</w:t>
-      </w:r>
-      <w:r>
-        <w:t xml:space="preserve"> </w:t>
-      </w:r>
-      <w:r>
-        <w:t xml:space="preserve">two established mechanistic models; the winner is a tuned bagging ensemble. Neither</w:t>
-      </w:r>
-      <w:r>
-        <w:t xml:space="preserve"> </w:t>
-      </w:r>
-      <w:r>
-        <w:t xml:space="preserve">a hybrid nor a deep architecture prevailed once every competitor received its own</w:t>
-      </w:r>
-      <w:r>
-        <w:t xml:space="preserve"> </w:t>
-      </w:r>
-      <w:r>
-        <w:t xml:space="preserve">search budget.</w:t>
+        <w:t xml:space="preserve">tunes eight architectures individually,</w:t>
+      </w:r>
+      <w:r>
+        <w:t xml:space="preserve"> </w:t>
+      </w:r>
+      <w:r>
+        <w:t xml:space="preserve">including deep networks, against both each other and two established mechanistic</w:t>
+      </w:r>
+      <w:r>
+        <w:t xml:space="preserve"> </w:t>
+      </w:r>
+      <w:r>
+        <w:t xml:space="preserve">models; the winner is a tuned bagging ensemble.</w:t>
+      </w:r>
+      <w:r>
+        <w:t xml:space="preserve"> </w:t>
+      </w:r>
+      <w:r>
+        <w:t xml:space="preserve">Nguyen et al.</w:t>
+      </w:r>
+      <w:r>
+        <w:t xml:space="preserve"> </w:t>
+      </w:r>
+      <w:r>
+        <w:t xml:space="preserve">(2019)</w:t>
+      </w:r>
+      <w:r>
+        <w:t xml:space="preserve"> </w:t>
+      </w:r>
+      <w:r>
+        <w:t xml:space="preserve">goes</w:t>
+      </w:r>
+      <w:r>
+        <w:t xml:space="preserve"> </w:t>
+      </w:r>
+      <w:r>
+        <w:t xml:space="preserve">further: across a 1000-run Monte Carlo comparison, a plain support vector machine</w:t>
+      </w:r>
+      <w:r>
+        <w:t xml:space="preserve"> </w:t>
+      </w:r>
+      <w:r>
+        <w:t xml:space="preserve">outperforms both a GA-tuned and a PSO-tuned ANFIS hybrid on the identical data —</w:t>
+      </w:r>
+      <w:r>
+        <w:t xml:space="preserve"> </w:t>
+      </w:r>
+      <w:r>
+        <w:t xml:space="preserve">one of the seed corpus’s few statistically robust cases where hybridisation is</w:t>
+      </w:r>
+      <w:r>
+        <w:t xml:space="preserve"> </w:t>
+      </w:r>
+      <w:r>
+        <w:t xml:space="preserve">outright negative rather than merely unproven. Neither a hybrid nor a deep</w:t>
+      </w:r>
+      <w:r>
+        <w:t xml:space="preserve"> </w:t>
+      </w:r>
+      <w:r>
+        <w:t xml:space="preserve">architecture prevailed in either study once every competitor received its own</w:t>
+      </w:r>
+      <w:r>
+        <w:t xml:space="preserve"> </w:t>
+      </w:r>
+      <w:r>
+        <w:t xml:space="preserve">search budget. Third,</w:t>
       </w:r>
       <w:r>
         <w:t xml:space="preserve"> </w:t>
@@ -7410,37 +7614,43 @@
         <w:t xml:space="preserve"> </w:t>
       </w:r>
       <w:r>
-        <w:t xml:space="preserve">is, so far, the seed corpus’s clearest positive</w:t>
-      </w:r>
-      <w:r>
-        <w:t xml:space="preserve"> </w:t>
-      </w:r>
-      <w:r>
-        <w:t xml:space="preserve">counter-example — a heterogeneous stacking ensemble (H5) that both reports a</w:t>
-      </w:r>
-      <w:r>
-        <w:t xml:space="preserve"> </w:t>
-      </w:r>
-      <w:r>
-        <w:t xml:space="preserve">credible premium over single models and states explicitly that its meta-learner was</w:t>
-      </w:r>
-      <w:r>
-        <w:t xml:space="preserve"> </w:t>
-      </w:r>
-      <w:r>
-        <w:t xml:space="preserve">trained on cross-validated, not in-fold, base-model predictions specifically to</w:t>
-      </w:r>
-      <w:r>
-        <w:t xml:space="preserve"> </w:t>
-      </w:r>
-      <w:r>
-        <w:t xml:space="preserve">avoid the leakage pathway characteristic of that hybridisation type (§4, H5). It is</w:t>
-      </w:r>
-      <w:r>
-        <w:t xml:space="preserve"> </w:t>
-      </w:r>
-      <w:r>
-        <w:t xml:space="preserve">cited in §12 as the positive PAVE-ML exemplar for exactly this reason.</w:t>
+        <w:t xml:space="preserve">is, so far, the seed corpus’s clearest</w:t>
+      </w:r>
+      <w:r>
+        <w:t xml:space="preserve"> </w:t>
+      </w:r>
+      <w:r>
+        <w:t xml:space="preserve">positive counter-example — a heterogeneous stacking ensemble (H5) that both</w:t>
+      </w:r>
+      <w:r>
+        <w:t xml:space="preserve"> </w:t>
+      </w:r>
+      <w:r>
+        <w:t xml:space="preserve">reports a credible premium over single models and states explicitly that its</w:t>
+      </w:r>
+      <w:r>
+        <w:t xml:space="preserve"> </w:t>
+      </w:r>
+      <w:r>
+        <w:t xml:space="preserve">meta-learner was trained on cross-validated, not in-fold, base-model predictions</w:t>
+      </w:r>
+      <w:r>
+        <w:t xml:space="preserve"> </w:t>
+      </w:r>
+      <w:r>
+        <w:t xml:space="preserve">specifically to avoid the leakage pathway characteristic of that hybridisation</w:t>
+      </w:r>
+      <w:r>
+        <w:t xml:space="preserve"> </w:t>
+      </w:r>
+      <w:r>
+        <w:t xml:space="preserve">type (§4, H5). It is cited in §12 as the positive PAVE-ML exemplar for exactly</w:t>
+      </w:r>
+      <w:r>
+        <w:t xml:space="preserve"> </w:t>
+      </w:r>
+      <w:r>
+        <w:t xml:space="preserve">this reason.</w:t>
       </w:r>
     </w:p>
     <w:p>
@@ -7448,7 +7658,7 @@
         <w:pStyle w:val="BodyText"/>
       </w:pPr>
       <w:r>
-        <w:t xml:space="preserve">Neither reading should be generalised past what five studies can support. They are</w:t>
+        <w:t xml:space="preserve">None of these readings should be generalised past what six studies can support. They are</w:t>
       </w:r>
       <w:r>
         <w:t xml:space="preserve"> </w:t>
@@ -7460,7 +7670,61 @@
         <w:t xml:space="preserve"> </w:t>
       </w:r>
       <w:r>
-        <w:t xml:space="preserve">completing, not as its substitute.</w:t>
+        <w:t xml:space="preserve">completing, not as its substitute. It is worth noting, too, that this review is</w:t>
+      </w:r>
+      <w:r>
+        <w:t xml:space="preserve"> </w:t>
+      </w:r>
+      <w:r>
+        <w:t xml:space="preserve">not alone in noticing the shape of the problem even if no prior source has</w:t>
+      </w:r>
+      <w:r>
+        <w:t xml:space="preserve"> </w:t>
+      </w:r>
+      <w:r>
+        <w:t xml:space="preserve">quantified it the way this section does: a narrower, CBR-specific AI review</w:t>
+      </w:r>
+      <w:r>
+        <w:t xml:space="preserve"> </w:t>
+      </w:r>
+      <w:r>
+        <w:t xml:space="preserve">published concurrently with this one independently argues that combining a base</w:t>
+      </w:r>
+      <w:r>
+        <w:t xml:space="preserve"> </w:t>
+      </w:r>
+      <w:r>
+        <w:t xml:space="preserve">learner’s own hyperparameters with an optimisation algorithm’s hyperparameters</w:t>
+      </w:r>
+      <w:r>
+        <w:t xml:space="preserve"> </w:t>
+      </w:r>
+      <w:r>
+        <w:t xml:space="preserve">adds a configuration complexity that can itself degrade accuracy</w:t>
+      </w:r>
+      <w:r>
+        <w:t xml:space="preserve"> </w:t>
+      </w:r>
+      <w:r>
+        <w:t xml:space="preserve">(Khatti and Grover, 2025)</w:t>
+      </w:r>
+      <w:r>
+        <w:t xml:space="preserve"> </w:t>
+      </w:r>
+      <w:r>
+        <w:t xml:space="preserve">— a different diagnosis (configuration complexity rather</w:t>
+      </w:r>
+      <w:r>
+        <w:t xml:space="preserve"> </w:t>
+      </w:r>
+      <w:r>
+        <w:t xml:space="preserve">than an unfair baseline) converging on the same underlying concern from a</w:t>
+      </w:r>
+      <w:r>
+        <w:t xml:space="preserve"> </w:t>
+      </w:r>
+      <w:r>
+        <w:t xml:space="preserve">different sub-literature.</w:t>
       </w:r>
     </w:p>
     <w:bookmarkEnd w:id="43"/>
@@ -10673,7 +10937,7 @@
       </w:r>
     </w:p>
     <w:bookmarkEnd w:id="56"/>
-    <w:bookmarkStart w:id="148" w:name="references"/>
+    <w:bookmarkStart w:id="152" w:name="references"/>
     <w:p>
       <w:pPr>
         <w:pStyle w:val="Heading1"/>
@@ -10682,7 +10946,7 @@
         <w:t xml:space="preserve">References</w:t>
       </w:r>
     </w:p>
-    <w:bookmarkStart w:id="147" w:name="refs"/>
+    <w:bookmarkStart w:id="151" w:name="refs"/>
     <w:bookmarkStart w:id="58" w:name="ref-Alhussan2022pothole"/>
     <w:p>
       <w:pPr>
@@ -11391,12 +11655,33 @@
       </w:hyperlink>
     </w:p>
     <w:bookmarkEnd w:id="120"/>
-    <w:bookmarkStart w:id="122" w:name="ref-Latifi2021reinforcement"/>
+    <w:bookmarkStart w:id="122" w:name="ref-Khatti2025california"/>
     <w:p>
       <w:pPr>
         <w:pStyle w:val="Bibliography"/>
       </w:pPr>
       <w:r>
+        <w:t xml:space="preserve">Khatti, J., Grover, K.S., 2025. California bearing ratio estimation using AI: A review of current practices and emerging trends. Soils and Rocks.</w:t>
+      </w:r>
+      <w:r>
+        <w:t xml:space="preserve"> </w:t>
+      </w:r>
+      <w:hyperlink r:id="rId121">
+        <w:r>
+          <w:rPr>
+            <w:rStyle w:val="Hyperlink"/>
+          </w:rPr>
+          <w:t xml:space="preserve">https://doi.org/10.28927/sr.2026.000725</w:t>
+        </w:r>
+      </w:hyperlink>
+    </w:p>
+    <w:bookmarkEnd w:id="122"/>
+    <w:bookmarkStart w:id="124" w:name="ref-Latifi2021reinforcement"/>
+    <w:p>
+      <w:pPr>
+        <w:pStyle w:val="Bibliography"/>
+      </w:pPr>
+      <w:r>
         <w:t xml:space="preserve">Latifi, M., Golivand Darvishvand, F., Khandel, O., others</w:t>
       </w:r>
       <w:r>
@@ -11405,7 +11690,7 @@
       <w:r>
         <w:t xml:space="preserve"> </w:t>
       </w:r>
-      <w:hyperlink r:id="rId121">
+      <w:hyperlink r:id="rId123">
         <w:r>
           <w:rPr>
             <w:rStyle w:val="Hyperlink"/>
@@ -11414,8 +11699,8 @@
         </w:r>
       </w:hyperlink>
     </w:p>
-    <w:bookmarkEnd w:id="122"/>
-    <w:bookmarkStart w:id="124" w:name="ref-MharziAlaoui2026algorithm"/>
+    <w:bookmarkEnd w:id="124"/>
+    <w:bookmarkStart w:id="126" w:name="ref-MharziAlaoui2026algorithm"/>
     <w:p>
       <w:pPr>
         <w:pStyle w:val="Bibliography"/>
@@ -11429,7 +11714,7 @@
       <w:r>
         <w:t xml:space="preserve"> </w:t>
       </w:r>
-      <w:hyperlink r:id="rId123">
+      <w:hyperlink r:id="rId125">
         <w:r>
           <w:rPr>
             <w:rStyle w:val="Hyperlink"/>
@@ -11438,8 +11723,8 @@
         </w:r>
       </w:hyperlink>
     </w:p>
-    <w:bookmarkEnd w:id="124"/>
-    <w:bookmarkStart w:id="126" w:name="ref-Mazari2016pavement"/>
+    <w:bookmarkEnd w:id="126"/>
+    <w:bookmarkStart w:id="128" w:name="ref-Mazari2016pavement"/>
     <w:p>
       <w:pPr>
         <w:pStyle w:val="Bibliography"/>
@@ -11450,7 +11735,7 @@
       <w:r>
         <w:t xml:space="preserve"> </w:t>
       </w:r>
-      <w:hyperlink r:id="rId125">
+      <w:hyperlink r:id="rId127">
         <w:r>
           <w:rPr>
             <w:rStyle w:val="Hyperlink"/>
@@ -11459,19 +11744,43 @@
         </w:r>
       </w:hyperlink>
     </w:p>
-    <w:bookmarkEnd w:id="126"/>
-    <w:bookmarkStart w:id="128" w:name="ref-Pan2025spatiotemporal"/>
+    <w:bookmarkEnd w:id="128"/>
+    <w:bookmarkStart w:id="130" w:name="ref-Nguyen2019intelligence"/>
     <w:p>
       <w:pPr>
         <w:pStyle w:val="Bibliography"/>
       </w:pPr>
       <w:r>
+        <w:t xml:space="preserve">Nguyen, H.-L., Le, T.-H., Pham, C.-T., others</w:t>
+      </w:r>
+      <w:r>
+        <w:t xml:space="preserve">, 2019. Development of hybrid artificial intelligence approaches and a support vector machine algorithm for predicting the marshall parameters of stone matrix asphalt. Applied Sciences.</w:t>
+      </w:r>
+      <w:r>
+        <w:t xml:space="preserve"> </w:t>
+      </w:r>
+      <w:hyperlink r:id="rId129">
+        <w:r>
+          <w:rPr>
+            <w:rStyle w:val="Hyperlink"/>
+          </w:rPr>
+          <w:t xml:space="preserve">https://doi.org/10.3390/app9153172</w:t>
+        </w:r>
+      </w:hyperlink>
+    </w:p>
+    <w:bookmarkEnd w:id="130"/>
+    <w:bookmarkStart w:id="132" w:name="ref-Pan2025spatiotemporal"/>
+    <w:p>
+      <w:pPr>
+        <w:pStyle w:val="Bibliography"/>
+      </w:pPr>
+      <w:r>
         <w:t xml:space="preserve">Pan, N., Du, Y., Parlikad, A.K., 2025. A spatiotemporal prediction method for the evolution of pavement distress in road networks. Comput.-Aided Civ. Infrastruct. Eng.</w:t>
       </w:r>
       <w:r>
         <w:t xml:space="preserve"> </w:t>
       </w:r>
-      <w:hyperlink r:id="rId127">
+      <w:hyperlink r:id="rId131">
         <w:r>
           <w:rPr>
             <w:rStyle w:val="Hyperlink"/>
@@ -11480,8 +11789,8 @@
         </w:r>
       </w:hyperlink>
     </w:p>
-    <w:bookmarkEnd w:id="128"/>
-    <w:bookmarkStart w:id="130" w:name="ref-Pasupunuri2024roughness"/>
+    <w:bookmarkEnd w:id="132"/>
+    <w:bookmarkStart w:id="134" w:name="ref-Pasupunuri2024roughness"/>
     <w:p>
       <w:pPr>
         <w:pStyle w:val="Bibliography"/>
@@ -11492,7 +11801,7 @@
       <w:r>
         <w:t xml:space="preserve"> </w:t>
       </w:r>
-      <w:hyperlink r:id="rId129">
+      <w:hyperlink r:id="rId133">
         <w:r>
           <w:rPr>
             <w:rStyle w:val="Hyperlink"/>
@@ -11501,8 +11810,8 @@
         </w:r>
       </w:hyperlink>
     </w:p>
-    <w:bookmarkEnd w:id="130"/>
-    <w:bookmarkStart w:id="132" w:name="ref-Sandamal2023pavement"/>
+    <w:bookmarkEnd w:id="134"/>
+    <w:bookmarkStart w:id="136" w:name="ref-Sandamal2023pavement"/>
     <w:p>
       <w:pPr>
         <w:pStyle w:val="Bibliography"/>
@@ -11516,7 +11825,7 @@
       <w:r>
         <w:t xml:space="preserve"> </w:t>
       </w:r>
-      <w:hyperlink r:id="rId131">
+      <w:hyperlink r:id="rId135">
         <w:r>
           <w:rPr>
             <w:rStyle w:val="Hyperlink"/>
@@ -11525,8 +11834,8 @@
         </w:r>
       </w:hyperlink>
     </w:p>
-    <w:bookmarkEnd w:id="132"/>
-    <w:bookmarkStart w:id="134" w:name="ref-Sun2023automatic"/>
+    <w:bookmarkEnd w:id="136"/>
+    <w:bookmarkStart w:id="138" w:name="ref-Sun2023automatic"/>
     <w:p>
       <w:pPr>
         <w:pStyle w:val="Bibliography"/>
@@ -11540,7 +11849,7 @@
       <w:r>
         <w:t xml:space="preserve"> </w:t>
       </w:r>
-      <w:hyperlink r:id="rId133">
+      <w:hyperlink r:id="rId137">
         <w:r>
           <w:rPr>
             <w:rStyle w:val="Hyperlink"/>
@@ -11549,8 +11858,8 @@
         </w:r>
       </w:hyperlink>
     </w:p>
-    <w:bookmarkEnd w:id="134"/>
-    <w:bookmarkStart w:id="136" w:name="ref-Wang2023developing"/>
+    <w:bookmarkEnd w:id="138"/>
+    <w:bookmarkStart w:id="140" w:name="ref-Wang2023developing"/>
     <w:p>
       <w:pPr>
         <w:pStyle w:val="Bibliography"/>
@@ -11561,7 +11870,7 @@
       <w:r>
         <w:t xml:space="preserve"> </w:t>
       </w:r>
-      <w:hyperlink r:id="rId135">
+      <w:hyperlink r:id="rId139">
         <w:r>
           <w:rPr>
             <w:rStyle w:val="Hyperlink"/>
@@ -11570,8 +11879,8 @@
         </w:r>
       </w:hyperlink>
     </w:p>
-    <w:bookmarkEnd w:id="136"/>
-    <w:bookmarkStart w:id="138" w:name="ref-Xiao2023optimizing"/>
+    <w:bookmarkEnd w:id="140"/>
+    <w:bookmarkStart w:id="142" w:name="ref-Xiao2023optimizing"/>
     <w:p>
       <w:pPr>
         <w:pStyle w:val="Bibliography"/>
@@ -11582,7 +11891,7 @@
       <w:r>
         <w:t xml:space="preserve"> </w:t>
       </w:r>
-      <w:hyperlink r:id="rId137">
+      <w:hyperlink r:id="rId141">
         <w:r>
           <w:rPr>
             <w:rStyle w:val="Hyperlink"/>
@@ -11591,8 +11900,8 @@
         </w:r>
       </w:hyperlink>
     </w:p>
-    <w:bookmarkEnd w:id="138"/>
-    <w:bookmarkStart w:id="140" w:name="ref-Yang2021research"/>
+    <w:bookmarkEnd w:id="142"/>
+    <w:bookmarkStart w:id="144" w:name="ref-Yang2021research"/>
     <w:p>
       <w:pPr>
         <w:pStyle w:val="Bibliography"/>
@@ -11606,7 +11915,7 @@
       <w:r>
         <w:t xml:space="preserve"> </w:t>
       </w:r>
-      <w:hyperlink r:id="rId139">
+      <w:hyperlink r:id="rId143">
         <w:r>
           <w:rPr>
             <w:rStyle w:val="Hyperlink"/>
@@ -11615,8 +11924,8 @@
         </w:r>
       </w:hyperlink>
     </w:p>
-    <w:bookmarkEnd w:id="140"/>
-    <w:bookmarkStart w:id="142" w:name="ref-Yao2022large"/>
+    <w:bookmarkEnd w:id="144"/>
+    <w:bookmarkStart w:id="146" w:name="ref-Yao2022large"/>
     <w:p>
       <w:pPr>
         <w:pStyle w:val="Bibliography"/>
@@ -11630,7 +11939,7 @@
       <w:r>
         <w:t xml:space="preserve"> </w:t>
       </w:r>
-      <w:hyperlink r:id="rId141">
+      <w:hyperlink r:id="rId145">
         <w:r>
           <w:rPr>
             <w:rStyle w:val="Hyperlink"/>
@@ -11639,8 +11948,8 @@
         </w:r>
       </w:hyperlink>
     </w:p>
-    <w:bookmarkEnd w:id="142"/>
-    <w:bookmarkStart w:id="144" w:name="ref-Yu2020highway"/>
+    <w:bookmarkEnd w:id="146"/>
+    <w:bookmarkStart w:id="148" w:name="ref-Yu2020highway"/>
     <w:p>
       <w:pPr>
         <w:pStyle w:val="Bibliography"/>
@@ -11654,7 +11963,7 @@
       <w:r>
         <w:t xml:space="preserve"> </w:t>
       </w:r>
-      <w:hyperlink r:id="rId143">
+      <w:hyperlink r:id="rId147">
         <w:r>
           <w:rPr>
             <w:rStyle w:val="Hyperlink"/>
@@ -11663,8 +11972,8 @@
         </w:r>
       </w:hyperlink>
     </w:p>
-    <w:bookmarkEnd w:id="144"/>
-    <w:bookmarkStart w:id="146" w:name="ref-Zeiada2025benchmarking"/>
+    <w:bookmarkEnd w:id="148"/>
+    <w:bookmarkStart w:id="150" w:name="ref-Zeiada2025benchmarking"/>
     <w:p>
       <w:pPr>
         <w:pStyle w:val="Bibliography"/>
@@ -11678,7 +11987,7 @@
       <w:r>
         <w:t xml:space="preserve"> </w:t>
       </w:r>
-      <w:hyperlink r:id="rId145">
+      <w:hyperlink r:id="rId149">
         <w:r>
           <w:rPr>
             <w:rStyle w:val="Hyperlink"/>
@@ -11687,9 +11996,9 @@
         </w:r>
       </w:hyperlink>
     </w:p>
-    <w:bookmarkEnd w:id="146"/>
-    <w:bookmarkEnd w:id="147"/>
-    <w:bookmarkEnd w:id="148"/>
+    <w:bookmarkEnd w:id="150"/>
+    <w:bookmarkEnd w:id="151"/>
+    <w:bookmarkEnd w:id="152"/>
     <w:sectPr/>
   </w:body>
 </w:document>

</xml_diff>

<commit_message>
Further em-dash reduction in the Xiao/TPE-CatBoost leakage-mechanism paragraph (Section 7), same prose-polish pass as the previous commit
Co-Authored-By: Claude Sonnet 5 <noreply@anthropic.com>
</commit_message>
<xml_diff>
--- a/output/manuscript.docx
+++ b/output/manuscript.docx
@@ -5476,79 +5476,79 @@
         <w:t xml:space="preserve">(Xiao et al., 2023)</w:t>
       </w:r>
       <w:r>
-        <w:t xml:space="preserve">, read in full, resolves its</w:t>
-      </w:r>
-      <w:r>
-        <w:t xml:space="preserve"> </w:t>
-      </w:r>
-      <w:r>
-        <w:t xml:space="preserve">own ambiguity definitively: the paper’s Boruta feature-selection step is</w:t>
-      </w:r>
-      <w:r>
-        <w:t xml:space="preserve"> </w:t>
-      </w:r>
-      <w:r>
-        <w:t xml:space="preserve">performed in Section 3 (</w:t>
+        <w:t xml:space="preserve">, read in full, resolves its own</w:t>
+      </w:r>
+      <w:r>
+        <w:t xml:space="preserve"> </w:t>
+      </w:r>
+      <w:r>
+        <w:t xml:space="preserve">ambiguity definitively. The paper’s Boruta feature-selection step is performed in</w:t>
+      </w:r>
+      <w:r>
+        <w:t xml:space="preserve"> </w:t>
+      </w:r>
+      <w:r>
+        <w:t xml:space="preserve">Section 3 (</w:t>
       </w:r>
       <w:r>
         <w:t xml:space="preserve">“Data Preparation”</w:t>
       </w:r>
       <w:r>
-        <w:t xml:space="preserve">), applied to the full 160-observation</w:t>
-      </w:r>
-      <w:r>
-        <w:t xml:space="preserve"> </w:t>
-      </w:r>
-      <w:r>
-        <w:t xml:space="preserve">pool, and only in Section 4 (</w:t>
+        <w:t xml:space="preserve">), applied to the full 160-observation pool, and only</w:t>
+      </w:r>
+      <w:r>
+        <w:t xml:space="preserve"> </w:t>
+      </w:r>
+      <w:r>
+        <w:t xml:space="preserve">in Section 4 (</w:t>
       </w:r>
       <w:r>
         <w:t xml:space="preserve">“Model Construction”</w:t>
       </w:r>
       <w:r>
-        <w:t xml:space="preserve">) does an 80/20 train-test split</w:t>
-      </w:r>
-      <w:r>
-        <w:t xml:space="preserve"> </w:t>
-      </w:r>
-      <w:r>
-        <w:t xml:space="preserve">appear — meaning Boruta selected the six variables the final model uses with the</w:t>
-      </w:r>
-      <w:r>
-        <w:t xml:space="preserve"> </w:t>
-      </w:r>
-      <w:r>
-        <w:t xml:space="preserve">benefit of information from what later became the test partition. This is a</w:t>
-      </w:r>
-      <w:r>
-        <w:t xml:space="preserve"> </w:t>
-      </w:r>
-      <w:r>
-        <w:t xml:space="preserve">different leakage mechanism from the CRCP series above — a real held-out test</w:t>
-      </w:r>
-      <w:r>
-        <w:t xml:space="preserve"> </w:t>
-      </w:r>
-      <w:r>
-        <w:t xml:space="preserve">set exists here, contaminated only by feature selection performed before the</w:t>
-      </w:r>
-      <w:r>
-        <w:t xml:space="preserve"> </w:t>
-      </w:r>
-      <w:r>
-        <w:t xml:space="preserve">split, rather than an entirely ungrouped cross-validation — and the paper’s own</w:t>
-      </w:r>
-      <w:r>
-        <w:t xml:space="preserve"> </w:t>
-      </w:r>
-      <w:r>
-        <w:t xml:space="preserve">conclusion attributes part of its headline result directly to the contaminated</w:t>
-      </w:r>
-      <w:r>
-        <w:t xml:space="preserve"> </w:t>
-      </w:r>
-      <w:r>
-        <w:t xml:space="preserve">step: the six-variable model improves R</w:t>
+        <w:t xml:space="preserve">) does an 80/20 train-test split appear, meaning</w:t>
+      </w:r>
+      <w:r>
+        <w:t xml:space="preserve"> </w:t>
+      </w:r>
+      <w:r>
+        <w:t xml:space="preserve">Boruta selected the six variables the final model uses with the benefit of</w:t>
+      </w:r>
+      <w:r>
+        <w:t xml:space="preserve"> </w:t>
+      </w:r>
+      <w:r>
+        <w:t xml:space="preserve">information from what later became the test partition. This is a different leakage</w:t>
+      </w:r>
+      <w:r>
+        <w:t xml:space="preserve"> </w:t>
+      </w:r>
+      <w:r>
+        <w:t xml:space="preserve">mechanism from the CRCP series above: a real held-out test set exists here,</w:t>
+      </w:r>
+      <w:r>
+        <w:t xml:space="preserve"> </w:t>
+      </w:r>
+      <w:r>
+        <w:t xml:space="preserve">contaminated only by feature selection performed before the split, rather than an</w:t>
+      </w:r>
+      <w:r>
+        <w:t xml:space="preserve"> </w:t>
+      </w:r>
+      <w:r>
+        <w:t xml:space="preserve">entirely ungrouped cross-validation. The paper’s own conclusion attributes part of</w:t>
+      </w:r>
+      <w:r>
+        <w:t xml:space="preserve"> </w:t>
+      </w:r>
+      <w:r>
+        <w:t xml:space="preserve">its headline result directly to the contaminated step, reporting that the</w:t>
+      </w:r>
+      <w:r>
+        <w:t xml:space="preserve"> </w:t>
+      </w:r>
+      <w:r>
+        <w:t xml:space="preserve">six-variable model improves R</w:t>
       </w:r>
       <w:r>
         <w:rPr>
@@ -5560,37 +5560,31 @@
         <w:t xml:space="preserve"> </w:t>
       </w:r>
       <w:r>
-        <w:t xml:space="preserve">by 0.007 over the seventeen-variable</w:t>
-      </w:r>
-      <w:r>
-        <w:t xml:space="preserve"> </w:t>
-      </w:r>
-      <w:r>
-        <w:t xml:space="preserve">version,</w:t>
-      </w:r>
-      <w:r>
-        <w:t xml:space="preserve"> </w:t>
-      </w:r>
-      <w:r>
-        <w:t xml:space="preserve">“attributed to the capability of Boruta to identify relevant</w:t>
-      </w:r>
-      <w:r>
-        <w:t xml:space="preserve"> </w:t>
-      </w:r>
-      <w:r>
-        <w:t xml:space="preserve">variables.”</w:t>
-      </w:r>
-      <w:r>
-        <w:t xml:space="preserve"> </w:t>
-      </w:r>
-      <w:r>
-        <w:t xml:space="preserve">The two mechanisms, read together, make the point this review is</w:t>
-      </w:r>
-      <w:r>
-        <w:t xml:space="preserve"> </w:t>
-      </w:r>
-      <w:r>
-        <w:t xml:space="preserve">built to make more sharply than either alone:</w:t>
+        <w:t xml:space="preserve">by 0.007 over the seventeen-variable version,</w:t>
+      </w:r>
+      <w:r>
+        <w:t xml:space="preserve"> </w:t>
+      </w:r>
+      <w:r>
+        <w:t xml:space="preserve">“attributed to the capability of Boruta to identify relevant variables.”</w:t>
+      </w:r>
+      <w:r>
+        <w:t xml:space="preserve"> </w:t>
+      </w:r>
+      <w:r>
+        <w:t xml:space="preserve">The two</w:t>
+      </w:r>
+      <w:r>
+        <w:t xml:space="preserve"> </w:t>
+      </w:r>
+      <w:r>
+        <w:t xml:space="preserve">mechanisms, read together, make the point this review is built to make more</w:t>
+      </w:r>
+      <w:r>
+        <w:t xml:space="preserve"> </w:t>
+      </w:r>
+      <w:r>
+        <w:t xml:space="preserve">sharply than either alone:</w:t>
       </w:r>
       <w:r>
         <w:t xml:space="preserve"> </w:t>
@@ -5605,43 +5599,43 @@
         <w:t xml:space="preserve"> </w:t>
       </w:r>
       <w:r>
-        <w:t xml:space="preserve">in PAVE-ML (§12)</w:t>
-      </w:r>
-      <w:r>
-        <w:t xml:space="preserve"> </w:t>
-      </w:r>
-      <w:r>
-        <w:t xml:space="preserve">catches structurally different failures — no partition grouping in one case,</w:t>
-      </w:r>
-      <w:r>
-        <w:t xml:space="preserve"> </w:t>
-      </w:r>
-      <w:r>
-        <w:t xml:space="preserve">preprocessing fitted before the partition in the other — under a single item,</w:t>
-      </w:r>
-      <w:r>
-        <w:t xml:space="preserve"> </w:t>
-      </w:r>
-      <w:r>
-        <w:t xml:space="preserve">which is exactly why the item is framed around the outcome (does information</w:t>
-      </w:r>
-      <w:r>
-        <w:t xml:space="preserve"> </w:t>
-      </w:r>
-      <w:r>
-        <w:t xml:space="preserve">from the test set influence training) rather than around one specific</w:t>
-      </w:r>
-      <w:r>
-        <w:t xml:space="preserve"> </w:t>
-      </w:r>
-      <w:r>
-        <w:t xml:space="preserve">mechanism. A citation search while verifying this paper separately surfaced a</w:t>
-      </w:r>
-      <w:r>
-        <w:t xml:space="preserve"> </w:t>
-      </w:r>
-      <w:r>
-        <w:t xml:space="preserve">second, seemingly independent overlapping-author cluster — Wang, Xiao and Liu</w:t>
+        <w:t xml:space="preserve">in PAVE-ML (§12) catches structurally</w:t>
+      </w:r>
+      <w:r>
+        <w:t xml:space="preserve"> </w:t>
+      </w:r>
+      <w:r>
+        <w:t xml:space="preserve">different failures (no partition grouping in one case, preprocessing fitted before</w:t>
+      </w:r>
+      <w:r>
+        <w:t xml:space="preserve"> </w:t>
+      </w:r>
+      <w:r>
+        <w:t xml:space="preserve">the partition in the other) under a single item, which is exactly why the item is</w:t>
+      </w:r>
+      <w:r>
+        <w:t xml:space="preserve"> </w:t>
+      </w:r>
+      <w:r>
+        <w:t xml:space="preserve">framed around the outcome (does information from the test set influence training)</w:t>
+      </w:r>
+      <w:r>
+        <w:t xml:space="preserve"> </w:t>
+      </w:r>
+      <w:r>
+        <w:t xml:space="preserve">rather than around one specific mechanism. A citation search while verifying this</w:t>
+      </w:r>
+      <w:r>
+        <w:t xml:space="preserve"> </w:t>
+      </w:r>
+      <w:r>
+        <w:t xml:space="preserve">paper separately surfaced a second, seemingly independent overlapping-author</w:t>
+      </w:r>
+      <w:r>
+        <w:t xml:space="preserve"> </w:t>
+      </w:r>
+      <w:r>
+        <w:t xml:space="preserve">cluster: Wang, Xiao and Liu</w:t>
       </w:r>
       <w:r>
         <w:t xml:space="preserve"> </w:t>
@@ -5650,19 +5644,25 @@
         <w:t xml:space="preserve">(Wang et al., 2023)</w:t>
       </w:r>
       <w:r>
-        <w:t xml:space="preserve">, sharing two of the same three surnames as the</w:t>
-      </w:r>
-      <w:r>
-        <w:t xml:space="preserve"> </w:t>
-      </w:r>
-      <w:r>
-        <w:t xml:space="preserve">TPE-CatBoost paper — publishing a separate improved-XGBoost model for rigid</w:t>
-      </w:r>
-      <w:r>
-        <w:t xml:space="preserve"> </w:t>
-      </w:r>
-      <w:r>
-        <w:t xml:space="preserve">pavement IRI on what appears to be a related LTPP substrate. Whether this reflects</w:t>
+        <w:t xml:space="preserve">, sharing two of the same three</w:t>
+      </w:r>
+      <w:r>
+        <w:t xml:space="preserve"> </w:t>
+      </w:r>
+      <w:r>
+        <w:t xml:space="preserve">surnames as the TPE-CatBoost paper, publishing a separate improved-XGBoost model</w:t>
+      </w:r>
+      <w:r>
+        <w:t xml:space="preserve"> </w:t>
+      </w:r>
+      <w:r>
+        <w:t xml:space="preserve">for rigid pavement IRI on what appears to be a related LTPP substrate. Whether this</w:t>
+      </w:r>
+      <w:r>
+        <w:t xml:space="preserve"> </w:t>
+      </w:r>
+      <w:r>
+        <w:t xml:space="preserve">reflects</w:t>
       </w:r>
       <w:r>
         <w:t xml:space="preserve"> </w:t>

</xml_diff>